<commit_message>
Date: 12 Mar 2026
</commit_message>
<xml_diff>
--- a/Selenium_Notes.docx
+++ b/Selenium_Notes.docx
@@ -1610,6 +1610,7 @@
           <w:lang w:val="en-US"/>
         </w:rPr>
       </w:pPr>
+      <w:proofErr w:type="spellStart"/>
       <w:r>
         <w:rPr>
           <w:sz w:val="24"/>
@@ -1618,6 +1619,7 @@
         </w:rPr>
         <w:t>JMeeter</w:t>
       </w:r>
+      <w:proofErr w:type="spellEnd"/>
     </w:p>
     <w:p>
       <w:pPr>
@@ -2088,8 +2090,18 @@
           <w:szCs w:val="22"/>
           <w:lang w:val="en-US"/>
         </w:rPr>
-        <w:t>Idea Itellij</w:t>
-      </w:r>
+        <w:t xml:space="preserve">Idea </w:t>
+      </w:r>
+      <w:proofErr w:type="spellStart"/>
+      <w:r>
+        <w:rPr>
+          <w:sz w:val="24"/>
+          <w:szCs w:val="22"/>
+          <w:lang w:val="en-US"/>
+        </w:rPr>
+        <w:t>Itellij</w:t>
+      </w:r>
+      <w:proofErr w:type="spellEnd"/>
     </w:p>
     <w:p>
       <w:pPr>
@@ -2218,6 +2230,7 @@
           <w:lang w:val="en-US"/>
         </w:rPr>
       </w:pPr>
+      <w:proofErr w:type="spellStart"/>
       <w:r>
         <w:rPr>
           <w:sz w:val="24"/>
@@ -2226,6 +2239,7 @@
         </w:rPr>
         <w:t>YourName_SeleniumDemos</w:t>
       </w:r>
+      <w:proofErr w:type="spellEnd"/>
     </w:p>
     <w:p>
       <w:pPr>
@@ -2269,7 +2283,25 @@
           <w:szCs w:val="22"/>
           <w:lang w:val="en-US"/>
         </w:rPr>
-        <w:t>Open selenium.dev site</w:t>
+        <w:t xml:space="preserve">Open </w:t>
+      </w:r>
+      <w:proofErr w:type="spellStart"/>
+      <w:r>
+        <w:rPr>
+          <w:sz w:val="24"/>
+          <w:szCs w:val="22"/>
+          <w:lang w:val="en-US"/>
+        </w:rPr>
+        <w:t>selenium.dev</w:t>
+      </w:r>
+      <w:proofErr w:type="spellEnd"/>
+      <w:r>
+        <w:rPr>
+          <w:sz w:val="24"/>
+          <w:szCs w:val="22"/>
+          <w:lang w:val="en-US"/>
+        </w:rPr>
+        <w:t xml:space="preserve"> site</w:t>
       </w:r>
     </w:p>
     <w:p>
@@ -2488,7 +2520,25 @@
           <w:szCs w:val="22"/>
           <w:lang w:val="en-US"/>
         </w:rPr>
-        <w:t>Create a Package inside this project (com.WebDriverDemos)</w:t>
+        <w:t>Create a Package inside this project (</w:t>
+      </w:r>
+      <w:proofErr w:type="spellStart"/>
+      <w:r>
+        <w:rPr>
+          <w:sz w:val="24"/>
+          <w:szCs w:val="22"/>
+          <w:lang w:val="en-US"/>
+        </w:rPr>
+        <w:t>com.WebDriverDemos</w:t>
+      </w:r>
+      <w:proofErr w:type="spellEnd"/>
+      <w:r>
+        <w:rPr>
+          <w:sz w:val="24"/>
+          <w:szCs w:val="22"/>
+          <w:lang w:val="en-US"/>
+        </w:rPr>
+        <w:t>)</w:t>
       </w:r>
     </w:p>
     <w:p>
@@ -2705,13 +2755,23 @@
           <w:lang w:val="en-US"/>
         </w:rPr>
       </w:pPr>
-      <w:r>
-        <w:rPr>
-          <w:sz w:val="24"/>
-          <w:szCs w:val="22"/>
-          <w:lang w:val="en-US"/>
-        </w:rPr>
-        <w:t xml:space="preserve">get() </w:t>
+      <w:proofErr w:type="gramStart"/>
+      <w:r>
+        <w:rPr>
+          <w:sz w:val="24"/>
+          <w:szCs w:val="22"/>
+          <w:lang w:val="en-US"/>
+        </w:rPr>
+        <w:t>get(</w:t>
+      </w:r>
+      <w:proofErr w:type="gramEnd"/>
+      <w:r>
+        <w:rPr>
+          <w:sz w:val="24"/>
+          <w:szCs w:val="22"/>
+          <w:lang w:val="en-US"/>
+        </w:rPr>
+        <w:t xml:space="preserve">) </w:t>
       </w:r>
       <w:r>
         <w:rPr>
@@ -2743,13 +2803,33 @@
           <w:lang w:val="en-US"/>
         </w:rPr>
       </w:pPr>
-      <w:r>
-        <w:rPr>
-          <w:sz w:val="24"/>
-          <w:szCs w:val="22"/>
-          <w:lang w:val="en-US"/>
-        </w:rPr>
-        <w:t xml:space="preserve">driver.manage().window().maximize() </w:t>
+      <w:proofErr w:type="spellStart"/>
+      <w:proofErr w:type="gramStart"/>
+      <w:r>
+        <w:rPr>
+          <w:sz w:val="24"/>
+          <w:szCs w:val="22"/>
+          <w:lang w:val="en-US"/>
+        </w:rPr>
+        <w:t>driver.manage</w:t>
+      </w:r>
+      <w:proofErr w:type="spellEnd"/>
+      <w:r>
+        <w:rPr>
+          <w:sz w:val="24"/>
+          <w:szCs w:val="22"/>
+          <w:lang w:val="en-US"/>
+        </w:rPr>
+        <w:t>(</w:t>
+      </w:r>
+      <w:proofErr w:type="gramEnd"/>
+      <w:r>
+        <w:rPr>
+          <w:sz w:val="24"/>
+          <w:szCs w:val="22"/>
+          <w:lang w:val="en-US"/>
+        </w:rPr>
+        <w:t xml:space="preserve">).window().maximize() </w:t>
       </w:r>
       <w:r>
         <w:rPr>
@@ -2781,13 +2861,23 @@
           <w:lang w:val="en-US"/>
         </w:rPr>
       </w:pPr>
-      <w:r>
-        <w:rPr>
-          <w:sz w:val="24"/>
-          <w:szCs w:val="22"/>
-          <w:lang w:val="en-US"/>
-        </w:rPr>
-        <w:t xml:space="preserve">close() </w:t>
+      <w:proofErr w:type="gramStart"/>
+      <w:r>
+        <w:rPr>
+          <w:sz w:val="24"/>
+          <w:szCs w:val="22"/>
+          <w:lang w:val="en-US"/>
+        </w:rPr>
+        <w:t>close(</w:t>
+      </w:r>
+      <w:proofErr w:type="gramEnd"/>
+      <w:r>
+        <w:rPr>
+          <w:sz w:val="24"/>
+          <w:szCs w:val="22"/>
+          <w:lang w:val="en-US"/>
+        </w:rPr>
+        <w:t xml:space="preserve">) </w:t>
       </w:r>
       <w:r>
         <w:rPr>
@@ -2845,13 +2935,23 @@
           <w:lang w:val="en-US"/>
         </w:rPr>
       </w:pPr>
-      <w:r>
-        <w:rPr>
-          <w:sz w:val="24"/>
-          <w:szCs w:val="22"/>
-          <w:lang w:val="en-US"/>
-        </w:rPr>
-        <w:t xml:space="preserve">getTitle() </w:t>
+      <w:proofErr w:type="gramStart"/>
+      <w:r>
+        <w:rPr>
+          <w:sz w:val="24"/>
+          <w:szCs w:val="22"/>
+          <w:lang w:val="en-US"/>
+        </w:rPr>
+        <w:t>getTitle(</w:t>
+      </w:r>
+      <w:proofErr w:type="gramEnd"/>
+      <w:r>
+        <w:rPr>
+          <w:sz w:val="24"/>
+          <w:szCs w:val="22"/>
+          <w:lang w:val="en-US"/>
+        </w:rPr>
+        <w:t xml:space="preserve">) </w:t>
       </w:r>
       <w:r>
         <w:rPr>
@@ -2921,13 +3021,23 @@
           <w:lang w:val="en-US"/>
         </w:rPr>
       </w:pPr>
-      <w:r>
-        <w:rPr>
-          <w:sz w:val="24"/>
-          <w:szCs w:val="22"/>
-          <w:lang w:val="en-US"/>
-        </w:rPr>
-        <w:t xml:space="preserve">getPageSource() </w:t>
+      <w:proofErr w:type="gramStart"/>
+      <w:r>
+        <w:rPr>
+          <w:sz w:val="24"/>
+          <w:szCs w:val="22"/>
+          <w:lang w:val="en-US"/>
+        </w:rPr>
+        <w:t>getPageSource(</w:t>
+      </w:r>
+      <w:proofErr w:type="gramEnd"/>
+      <w:r>
+        <w:rPr>
+          <w:sz w:val="24"/>
+          <w:szCs w:val="22"/>
+          <w:lang w:val="en-US"/>
+        </w:rPr>
+        <w:t xml:space="preserve">) </w:t>
       </w:r>
       <w:r>
         <w:rPr>
@@ -2959,13 +3069,23 @@
           <w:lang w:val="en-US"/>
         </w:rPr>
       </w:pPr>
-      <w:r>
-        <w:rPr>
-          <w:sz w:val="24"/>
-          <w:szCs w:val="22"/>
-          <w:lang w:val="en-US"/>
-        </w:rPr>
-        <w:t xml:space="preserve">findElement() </w:t>
+      <w:proofErr w:type="gramStart"/>
+      <w:r>
+        <w:rPr>
+          <w:sz w:val="24"/>
+          <w:szCs w:val="22"/>
+          <w:lang w:val="en-US"/>
+        </w:rPr>
+        <w:t>findElement(</w:t>
+      </w:r>
+      <w:proofErr w:type="gramEnd"/>
+      <w:r>
+        <w:rPr>
+          <w:sz w:val="24"/>
+          <w:szCs w:val="22"/>
+          <w:lang w:val="en-US"/>
+        </w:rPr>
+        <w:t xml:space="preserve">) </w:t>
       </w:r>
       <w:r>
         <w:rPr>
@@ -3309,8 +3429,6 @@
         </w:rPr>
         <w:t xml:space="preserve"> If the condition from ExplicitWait or FluentWait is not getting satisfying within specified time duration.</w:t>
       </w:r>
-      <w:bookmarkStart w:id="0" w:name="_GoBack"/>
-      <w:bookmarkEnd w:id="0"/>
     </w:p>
     <w:p>
       <w:pPr>
@@ -3331,15 +3449,7 @@
           <w:szCs w:val="22"/>
           <w:lang w:val="en-US"/>
         </w:rPr>
-        <w:t>SessionTimeOutException</w:t>
-      </w:r>
-      <w:r>
-        <w:rPr>
-          <w:sz w:val="24"/>
-          <w:szCs w:val="22"/>
-          <w:lang w:val="en-US"/>
-        </w:rPr>
-        <w:t xml:space="preserve"> </w:t>
+        <w:t xml:space="preserve">SessionTimeOutException </w:t>
       </w:r>
       <w:r>
         <w:rPr>
@@ -3355,7 +3465,35 @@
           <w:szCs w:val="22"/>
           <w:lang w:val="en-US"/>
         </w:rPr>
-        <w:t xml:space="preserve"> If the specific page (URL) is not getting loaded within 30 seconds while calling driver.get().</w:t>
+        <w:t xml:space="preserve"> If the specific page (URL) is not getting loaded within 30 seconds while calling </w:t>
+      </w:r>
+      <w:proofErr w:type="spellStart"/>
+      <w:proofErr w:type="gramStart"/>
+      <w:r>
+        <w:rPr>
+          <w:sz w:val="24"/>
+          <w:szCs w:val="22"/>
+          <w:lang w:val="en-US"/>
+        </w:rPr>
+        <w:t>driver.get</w:t>
+      </w:r>
+      <w:proofErr w:type="spellEnd"/>
+      <w:r>
+        <w:rPr>
+          <w:sz w:val="24"/>
+          <w:szCs w:val="22"/>
+          <w:lang w:val="en-US"/>
+        </w:rPr>
+        <w:t>(</w:t>
+      </w:r>
+      <w:proofErr w:type="gramEnd"/>
+      <w:r>
+        <w:rPr>
+          <w:sz w:val="24"/>
+          <w:szCs w:val="22"/>
+          <w:lang w:val="en-US"/>
+        </w:rPr>
+        <w:t>).</w:t>
       </w:r>
     </w:p>
     <w:p>
@@ -3489,13 +3627,23 @@
           <w:lang w:val="en-US"/>
         </w:rPr>
       </w:pPr>
-      <w:r>
-        <w:rPr>
-          <w:sz w:val="24"/>
-          <w:szCs w:val="22"/>
-          <w:lang w:val="en-US"/>
-        </w:rPr>
-        <w:t xml:space="preserve">sendKeys() </w:t>
+      <w:proofErr w:type="gramStart"/>
+      <w:r>
+        <w:rPr>
+          <w:sz w:val="24"/>
+          <w:szCs w:val="22"/>
+          <w:lang w:val="en-US"/>
+        </w:rPr>
+        <w:t>sendKeys(</w:t>
+      </w:r>
+      <w:proofErr w:type="gramEnd"/>
+      <w:r>
+        <w:rPr>
+          <w:sz w:val="24"/>
+          <w:szCs w:val="22"/>
+          <w:lang w:val="en-US"/>
+        </w:rPr>
+        <w:t xml:space="preserve">) </w:t>
       </w:r>
       <w:r>
         <w:rPr>
@@ -3535,13 +3683,23 @@
           <w:lang w:val="en-US"/>
         </w:rPr>
       </w:pPr>
-      <w:r>
-        <w:rPr>
-          <w:sz w:val="24"/>
-          <w:szCs w:val="22"/>
-          <w:lang w:val="en-US"/>
-        </w:rPr>
-        <w:t xml:space="preserve">click() </w:t>
+      <w:proofErr w:type="gramStart"/>
+      <w:r>
+        <w:rPr>
+          <w:sz w:val="24"/>
+          <w:szCs w:val="22"/>
+          <w:lang w:val="en-US"/>
+        </w:rPr>
+        <w:t>click(</w:t>
+      </w:r>
+      <w:proofErr w:type="gramEnd"/>
+      <w:r>
+        <w:rPr>
+          <w:sz w:val="24"/>
+          <w:szCs w:val="22"/>
+          <w:lang w:val="en-US"/>
+        </w:rPr>
+        <w:t xml:space="preserve">) </w:t>
       </w:r>
       <w:r>
         <w:rPr>
@@ -3573,13 +3731,23 @@
           <w:lang w:val="en-US"/>
         </w:rPr>
       </w:pPr>
-      <w:r>
-        <w:rPr>
-          <w:sz w:val="24"/>
-          <w:szCs w:val="22"/>
-          <w:lang w:val="en-US"/>
-        </w:rPr>
-        <w:t xml:space="preserve">getText() </w:t>
+      <w:proofErr w:type="gramStart"/>
+      <w:r>
+        <w:rPr>
+          <w:sz w:val="24"/>
+          <w:szCs w:val="22"/>
+          <w:lang w:val="en-US"/>
+        </w:rPr>
+        <w:t>getText(</w:t>
+      </w:r>
+      <w:proofErr w:type="gramEnd"/>
+      <w:r>
+        <w:rPr>
+          <w:sz w:val="24"/>
+          <w:szCs w:val="22"/>
+          <w:lang w:val="en-US"/>
+        </w:rPr>
+        <w:t xml:space="preserve">) </w:t>
       </w:r>
       <w:r>
         <w:rPr>
@@ -3611,13 +3779,23 @@
           <w:lang w:val="en-US"/>
         </w:rPr>
       </w:pPr>
-      <w:r>
-        <w:rPr>
-          <w:sz w:val="24"/>
-          <w:szCs w:val="22"/>
-          <w:lang w:val="en-US"/>
-        </w:rPr>
-        <w:t xml:space="preserve">getAttribute() / getDomAttribute() </w:t>
+      <w:proofErr w:type="gramStart"/>
+      <w:r>
+        <w:rPr>
+          <w:sz w:val="24"/>
+          <w:szCs w:val="22"/>
+          <w:lang w:val="en-US"/>
+        </w:rPr>
+        <w:t>getAttribute(</w:t>
+      </w:r>
+      <w:proofErr w:type="gramEnd"/>
+      <w:r>
+        <w:rPr>
+          <w:sz w:val="24"/>
+          <w:szCs w:val="22"/>
+          <w:lang w:val="en-US"/>
+        </w:rPr>
+        <w:t xml:space="preserve">) / getDomAttribute() </w:t>
       </w:r>
       <w:r>
         <w:rPr>
@@ -4278,7 +4456,25 @@
           <w:szCs w:val="22"/>
           <w:lang w:val="en-US"/>
         </w:rPr>
-        <w:t>data-testid="royal-email"]</w:t>
+        <w:t>data-</w:t>
+      </w:r>
+      <w:proofErr w:type="spellStart"/>
+      <w:r>
+        <w:rPr>
+          <w:sz w:val="24"/>
+          <w:szCs w:val="22"/>
+          <w:lang w:val="en-US"/>
+        </w:rPr>
+        <w:t>testid</w:t>
+      </w:r>
+      <w:proofErr w:type="spellEnd"/>
+      <w:r>
+        <w:rPr>
+          <w:sz w:val="24"/>
+          <w:szCs w:val="22"/>
+          <w:lang w:val="en-US"/>
+        </w:rPr>
+        <w:t>="royal-email"]</w:t>
       </w:r>
     </w:p>
     <w:p>
@@ -4882,7 +5078,25 @@
           <w:szCs w:val="22"/>
           <w:lang w:val="en-US"/>
         </w:rPr>
-        <w:t xml:space="preserve">Selenium has a special class to handle such a drop down list ie. </w:t>
+        <w:t xml:space="preserve">Selenium has a special class to handle such a drop down list </w:t>
+      </w:r>
+      <w:proofErr w:type="spellStart"/>
+      <w:r>
+        <w:rPr>
+          <w:sz w:val="24"/>
+          <w:szCs w:val="22"/>
+          <w:lang w:val="en-US"/>
+        </w:rPr>
+        <w:t>ie</w:t>
+      </w:r>
+      <w:proofErr w:type="spellEnd"/>
+      <w:r>
+        <w:rPr>
+          <w:sz w:val="24"/>
+          <w:szCs w:val="22"/>
+          <w:lang w:val="en-US"/>
+        </w:rPr>
+        <w:t xml:space="preserve">. </w:t>
       </w:r>
       <w:r>
         <w:rPr>
@@ -4970,13 +5184,23 @@
           <w:lang w:val="en-US"/>
         </w:rPr>
       </w:pPr>
-      <w:r>
-        <w:rPr>
-          <w:sz w:val="24"/>
-          <w:szCs w:val="22"/>
-          <w:lang w:val="en-US"/>
-        </w:rPr>
-        <w:t xml:space="preserve">getOptions() </w:t>
+      <w:proofErr w:type="gramStart"/>
+      <w:r>
+        <w:rPr>
+          <w:sz w:val="24"/>
+          <w:szCs w:val="22"/>
+          <w:lang w:val="en-US"/>
+        </w:rPr>
+        <w:t>getOptions(</w:t>
+      </w:r>
+      <w:proofErr w:type="gramEnd"/>
+      <w:r>
+        <w:rPr>
+          <w:sz w:val="24"/>
+          <w:szCs w:val="22"/>
+          <w:lang w:val="en-US"/>
+        </w:rPr>
+        <w:t xml:space="preserve">) </w:t>
       </w:r>
       <w:r>
         <w:rPr>
@@ -5085,13 +5309,23 @@
           <w:lang w:val="en-US"/>
         </w:rPr>
       </w:pPr>
-      <w:r>
-        <w:rPr>
-          <w:sz w:val="24"/>
-          <w:szCs w:val="22"/>
-          <w:lang w:val="en-US"/>
-        </w:rPr>
-        <w:t xml:space="preserve">selectByValue() </w:t>
+      <w:proofErr w:type="gramStart"/>
+      <w:r>
+        <w:rPr>
+          <w:sz w:val="24"/>
+          <w:szCs w:val="22"/>
+          <w:lang w:val="en-US"/>
+        </w:rPr>
+        <w:t>selectByValue(</w:t>
+      </w:r>
+      <w:proofErr w:type="gramEnd"/>
+      <w:r>
+        <w:rPr>
+          <w:sz w:val="24"/>
+          <w:szCs w:val="22"/>
+          <w:lang w:val="en-US"/>
+        </w:rPr>
+        <w:t xml:space="preserve">) </w:t>
       </w:r>
       <w:r>
         <w:rPr>
@@ -5161,13 +5395,23 @@
           <w:lang w:val="en-US"/>
         </w:rPr>
       </w:pPr>
-      <w:r>
-        <w:rPr>
-          <w:sz w:val="24"/>
-          <w:szCs w:val="22"/>
-          <w:lang w:val="en-US"/>
-        </w:rPr>
-        <w:t xml:space="preserve">isMultiple() </w:t>
+      <w:proofErr w:type="gramStart"/>
+      <w:r>
+        <w:rPr>
+          <w:sz w:val="24"/>
+          <w:szCs w:val="22"/>
+          <w:lang w:val="en-US"/>
+        </w:rPr>
+        <w:t>isMultiple(</w:t>
+      </w:r>
+      <w:proofErr w:type="gramEnd"/>
+      <w:r>
+        <w:rPr>
+          <w:sz w:val="24"/>
+          <w:szCs w:val="22"/>
+          <w:lang w:val="en-US"/>
+        </w:rPr>
+        <w:t xml:space="preserve">) </w:t>
       </w:r>
       <w:r>
         <w:rPr>
@@ -5371,13 +5615,23 @@
           <w:lang w:val="en-US"/>
         </w:rPr>
       </w:pPr>
-      <w:r>
-        <w:rPr>
-          <w:sz w:val="24"/>
-          <w:szCs w:val="22"/>
-          <w:lang w:val="en-US"/>
-        </w:rPr>
-        <w:t>Thread.sleep()</w:t>
+      <w:proofErr w:type="spellStart"/>
+      <w:r>
+        <w:rPr>
+          <w:sz w:val="24"/>
+          <w:szCs w:val="22"/>
+          <w:lang w:val="en-US"/>
+        </w:rPr>
+        <w:t>Thread.sleep</w:t>
+      </w:r>
+      <w:proofErr w:type="spellEnd"/>
+      <w:r>
+        <w:rPr>
+          <w:sz w:val="24"/>
+          <w:szCs w:val="22"/>
+          <w:lang w:val="en-US"/>
+        </w:rPr>
+        <w:t>()</w:t>
       </w:r>
       <w:r>
         <w:rPr>
@@ -5605,7 +5859,25 @@
           <w:szCs w:val="22"/>
           <w:lang w:val="en-US"/>
         </w:rPr>
-        <w:t xml:space="preserve"> It is combination of Thread.sleep &amp; Implicit Wait</w:t>
+        <w:t xml:space="preserve"> It is combination of </w:t>
+      </w:r>
+      <w:proofErr w:type="spellStart"/>
+      <w:r>
+        <w:rPr>
+          <w:sz w:val="24"/>
+          <w:szCs w:val="22"/>
+          <w:lang w:val="en-US"/>
+        </w:rPr>
+        <w:t>Thread.sleep</w:t>
+      </w:r>
+      <w:proofErr w:type="spellEnd"/>
+      <w:r>
+        <w:rPr>
+          <w:sz w:val="24"/>
+          <w:szCs w:val="22"/>
+          <w:lang w:val="en-US"/>
+        </w:rPr>
+        <w:t xml:space="preserve"> &amp; Implicit Wait</w:t>
       </w:r>
     </w:p>
     <w:p>
@@ -5649,15 +5921,7 @@
           <w:szCs w:val="22"/>
           <w:lang w:val="en-US"/>
         </w:rPr>
-        <w:t>It is applicable to single statement only</w:t>
-      </w:r>
-      <w:r>
-        <w:rPr>
-          <w:sz w:val="24"/>
-          <w:szCs w:val="22"/>
-          <w:lang w:val="en-US"/>
-        </w:rPr>
-        <w:t>.</w:t>
+        <w:t>It is applicable to single statement only.</w:t>
       </w:r>
     </w:p>
     <w:p>
@@ -5679,7 +5943,43 @@
           <w:szCs w:val="22"/>
           <w:lang w:val="en-US"/>
         </w:rPr>
-        <w:t>We can handle some specific condition for wait (ElementToBeClickable, AlertToPresent, VisibilityOfElementLocateBy)</w:t>
+        <w:t xml:space="preserve">We can handle some specific condition for wait (ElementToBeClickable, </w:t>
+      </w:r>
+      <w:proofErr w:type="spellStart"/>
+      <w:r>
+        <w:rPr>
+          <w:sz w:val="24"/>
+          <w:szCs w:val="22"/>
+          <w:lang w:val="en-US"/>
+        </w:rPr>
+        <w:t>AlertToPresent</w:t>
+      </w:r>
+      <w:proofErr w:type="spellEnd"/>
+      <w:r>
+        <w:rPr>
+          <w:sz w:val="24"/>
+          <w:szCs w:val="22"/>
+          <w:lang w:val="en-US"/>
+        </w:rPr>
+        <w:t xml:space="preserve">, </w:t>
+      </w:r>
+      <w:proofErr w:type="spellStart"/>
+      <w:r>
+        <w:rPr>
+          <w:sz w:val="24"/>
+          <w:szCs w:val="22"/>
+          <w:lang w:val="en-US"/>
+        </w:rPr>
+        <w:t>VisibilityOfElementLocateBy</w:t>
+      </w:r>
+      <w:proofErr w:type="spellEnd"/>
+      <w:r>
+        <w:rPr>
+          <w:sz w:val="24"/>
+          <w:szCs w:val="22"/>
+          <w:lang w:val="en-US"/>
+        </w:rPr>
+        <w:t>)</w:t>
       </w:r>
     </w:p>
     <w:p>
@@ -5791,7 +6091,43 @@
           <w:szCs w:val="22"/>
           <w:lang w:val="en-US"/>
         </w:rPr>
-        <w:t>We can handle some specific condition for wait (ElementToBeClickable, AlertToPresent, VisibilityOfElementLocateBy)</w:t>
+        <w:t xml:space="preserve">We can handle some specific condition for wait (ElementToBeClickable, </w:t>
+      </w:r>
+      <w:proofErr w:type="spellStart"/>
+      <w:r>
+        <w:rPr>
+          <w:sz w:val="24"/>
+          <w:szCs w:val="22"/>
+          <w:lang w:val="en-US"/>
+        </w:rPr>
+        <w:t>AlertToPresent</w:t>
+      </w:r>
+      <w:proofErr w:type="spellEnd"/>
+      <w:r>
+        <w:rPr>
+          <w:sz w:val="24"/>
+          <w:szCs w:val="22"/>
+          <w:lang w:val="en-US"/>
+        </w:rPr>
+        <w:t xml:space="preserve">, </w:t>
+      </w:r>
+      <w:proofErr w:type="spellStart"/>
+      <w:r>
+        <w:rPr>
+          <w:sz w:val="24"/>
+          <w:szCs w:val="22"/>
+          <w:lang w:val="en-US"/>
+        </w:rPr>
+        <w:t>VisibilityOfElementLocateBy</w:t>
+      </w:r>
+      <w:proofErr w:type="spellEnd"/>
+      <w:r>
+        <w:rPr>
+          <w:sz w:val="24"/>
+          <w:szCs w:val="22"/>
+          <w:lang w:val="en-US"/>
+        </w:rPr>
+        <w:t>)</w:t>
       </w:r>
     </w:p>
     <w:p>
@@ -5873,13 +6209,23 @@
           <w:lang w:val="en-US"/>
         </w:rPr>
       </w:pPr>
-      <w:r>
-        <w:rPr>
-          <w:sz w:val="24"/>
-          <w:szCs w:val="22"/>
-          <w:lang w:val="en-US"/>
-        </w:rPr>
-        <w:t>i - ignoring</w:t>
+      <w:proofErr w:type="spellStart"/>
+      <w:r>
+        <w:rPr>
+          <w:sz w:val="24"/>
+          <w:szCs w:val="22"/>
+          <w:lang w:val="en-US"/>
+        </w:rPr>
+        <w:t>i</w:t>
+      </w:r>
+      <w:proofErr w:type="spellEnd"/>
+      <w:r>
+        <w:rPr>
+          <w:sz w:val="24"/>
+          <w:szCs w:val="22"/>
+          <w:lang w:val="en-US"/>
+        </w:rPr>
+        <w:t xml:space="preserve"> - ignoring</w:t>
       </w:r>
     </w:p>
     <w:p>
@@ -5961,13 +6307,23 @@
           <w:lang w:val="en-US"/>
         </w:rPr>
       </w:pPr>
-      <w:r>
-        <w:rPr>
-          <w:sz w:val="24"/>
-          <w:szCs w:val="22"/>
-          <w:lang w:val="en-US"/>
-        </w:rPr>
-        <w:t>driver.get() is having implicit wait for 30 seconds</w:t>
+      <w:proofErr w:type="spellStart"/>
+      <w:r>
+        <w:rPr>
+          <w:sz w:val="24"/>
+          <w:szCs w:val="22"/>
+          <w:lang w:val="en-US"/>
+        </w:rPr>
+        <w:t>driver.get</w:t>
+      </w:r>
+      <w:proofErr w:type="spellEnd"/>
+      <w:r>
+        <w:rPr>
+          <w:sz w:val="24"/>
+          <w:szCs w:val="22"/>
+          <w:lang w:val="en-US"/>
+        </w:rPr>
+        <w:t>() is having implicit wait for 30 seconds</w:t>
       </w:r>
     </w:p>
     <w:p>
@@ -6024,6 +6380,3685 @@
         </w:rPr>
         <w:t>To avoid SessionTimeoutException you can use PageLoadTimeout method of synchronization.</w:t>
       </w:r>
+    </w:p>
+    <w:p>
+      <w:pPr>
+        <w:rPr>
+          <w:sz w:val="24"/>
+          <w:szCs w:val="22"/>
+          <w:lang w:val="en-US"/>
+        </w:rPr>
+      </w:pPr>
+    </w:p>
+    <w:p>
+      <w:pPr>
+        <w:rPr>
+          <w:sz w:val="24"/>
+          <w:szCs w:val="22"/>
+          <w:lang w:val="en-US"/>
+        </w:rPr>
+      </w:pPr>
+    </w:p>
+    <w:p>
+      <w:pPr>
+        <w:rPr>
+          <w:sz w:val="24"/>
+          <w:szCs w:val="22"/>
+          <w:lang w:val="en-US"/>
+        </w:rPr>
+      </w:pPr>
+      <w:r>
+        <w:rPr>
+          <w:sz w:val="24"/>
+          <w:szCs w:val="22"/>
+          <w:lang w:val="en-US"/>
+        </w:rPr>
+        <w:br w:type="page"/>
+      </w:r>
+    </w:p>
+    <w:p>
+      <w:pPr>
+        <w:rPr>
+          <w:sz w:val="24"/>
+          <w:szCs w:val="22"/>
+          <w:lang w:val="en-US"/>
+        </w:rPr>
+      </w:pPr>
+      <w:r>
+        <w:rPr>
+          <w:sz w:val="24"/>
+          <w:szCs w:val="22"/>
+          <w:lang w:val="en-US"/>
+        </w:rPr>
+        <w:lastRenderedPageBreak/>
+        <w:t>Extent Report</w:t>
+      </w:r>
+    </w:p>
+    <w:p>
+      <w:pPr>
+        <w:shd w:val="clear" w:color="auto" w:fill="1E1F22"/>
+        <w:tabs>
+          <w:tab w:val="left" w:pos="916"/>
+          <w:tab w:val="left" w:pos="1832"/>
+          <w:tab w:val="left" w:pos="2748"/>
+          <w:tab w:val="left" w:pos="3664"/>
+          <w:tab w:val="left" w:pos="4580"/>
+          <w:tab w:val="left" w:pos="5496"/>
+          <w:tab w:val="left" w:pos="6412"/>
+          <w:tab w:val="left" w:pos="7328"/>
+          <w:tab w:val="left" w:pos="8244"/>
+          <w:tab w:val="left" w:pos="9160"/>
+          <w:tab w:val="left" w:pos="10076"/>
+          <w:tab w:val="left" w:pos="10992"/>
+          <w:tab w:val="left" w:pos="11908"/>
+          <w:tab w:val="left" w:pos="12824"/>
+          <w:tab w:val="left" w:pos="13740"/>
+          <w:tab w:val="left" w:pos="14656"/>
+        </w:tabs>
+        <w:spacing w:after="0" w:line="240" w:lineRule="auto"/>
+        <w:rPr>
+          <w:rFonts w:ascii="Courier New" w:eastAsia="Times New Roman" w:hAnsi="Courier New" w:cs="Courier New"/>
+          <w:color w:val="BCBEC4"/>
+          <w:sz w:val="23"/>
+          <w:szCs w:val="23"/>
+          <w:lang w:eastAsia="en-IN"/>
+        </w:rPr>
+      </w:pPr>
+      <w:r>
+        <w:rPr>
+          <w:rFonts w:ascii="Courier New" w:eastAsia="Times New Roman" w:hAnsi="Courier New" w:cs="Courier New"/>
+          <w:color w:val="CF8E6D"/>
+          <w:sz w:val="23"/>
+          <w:szCs w:val="23"/>
+          <w:lang w:eastAsia="en-IN"/>
+        </w:rPr>
+        <w:t xml:space="preserve">package </w:t>
+      </w:r>
+      <w:proofErr w:type="spellStart"/>
+      <w:r>
+        <w:rPr>
+          <w:rFonts w:ascii="Courier New" w:eastAsia="Times New Roman" w:hAnsi="Courier New" w:cs="Courier New"/>
+          <w:color w:val="BCBEC4"/>
+          <w:sz w:val="23"/>
+          <w:szCs w:val="23"/>
+          <w:lang w:eastAsia="en-IN"/>
+        </w:rPr>
+        <w:t>com.WebTests</w:t>
+      </w:r>
+      <w:proofErr w:type="spellEnd"/>
+      <w:r>
+        <w:rPr>
+          <w:rFonts w:ascii="Courier New" w:eastAsia="Times New Roman" w:hAnsi="Courier New" w:cs="Courier New"/>
+          <w:color w:val="BCBEC4"/>
+          <w:sz w:val="23"/>
+          <w:szCs w:val="23"/>
+          <w:lang w:eastAsia="en-IN"/>
+        </w:rPr>
+        <w:t>;</w:t>
+      </w:r>
+      <w:r>
+        <w:rPr>
+          <w:rFonts w:ascii="Courier New" w:eastAsia="Times New Roman" w:hAnsi="Courier New" w:cs="Courier New"/>
+          <w:color w:val="BCBEC4"/>
+          <w:sz w:val="23"/>
+          <w:szCs w:val="23"/>
+          <w:lang w:eastAsia="en-IN"/>
+        </w:rPr>
+        <w:br/>
+      </w:r>
+      <w:r>
+        <w:rPr>
+          <w:rFonts w:ascii="Courier New" w:eastAsia="Times New Roman" w:hAnsi="Courier New" w:cs="Courier New"/>
+          <w:color w:val="BCBEC4"/>
+          <w:sz w:val="23"/>
+          <w:szCs w:val="23"/>
+          <w:lang w:eastAsia="en-IN"/>
+        </w:rPr>
+        <w:br/>
+      </w:r>
+      <w:r>
+        <w:rPr>
+          <w:rFonts w:ascii="Courier New" w:eastAsia="Times New Roman" w:hAnsi="Courier New" w:cs="Courier New"/>
+          <w:color w:val="CF8E6D"/>
+          <w:sz w:val="23"/>
+          <w:szCs w:val="23"/>
+          <w:lang w:eastAsia="en-IN"/>
+        </w:rPr>
+        <w:t xml:space="preserve">import </w:t>
+      </w:r>
+      <w:proofErr w:type="spellStart"/>
+      <w:r>
+        <w:rPr>
+          <w:rFonts w:ascii="Courier New" w:eastAsia="Times New Roman" w:hAnsi="Courier New" w:cs="Courier New"/>
+          <w:color w:val="BCBEC4"/>
+          <w:sz w:val="23"/>
+          <w:szCs w:val="23"/>
+          <w:lang w:eastAsia="en-IN"/>
+        </w:rPr>
+        <w:t>com.aventstack.extentreports.ExtentReports</w:t>
+      </w:r>
+      <w:proofErr w:type="spellEnd"/>
+      <w:r>
+        <w:rPr>
+          <w:rFonts w:ascii="Courier New" w:eastAsia="Times New Roman" w:hAnsi="Courier New" w:cs="Courier New"/>
+          <w:color w:val="BCBEC4"/>
+          <w:sz w:val="23"/>
+          <w:szCs w:val="23"/>
+          <w:lang w:eastAsia="en-IN"/>
+        </w:rPr>
+        <w:t>;</w:t>
+      </w:r>
+      <w:r>
+        <w:rPr>
+          <w:rFonts w:ascii="Courier New" w:eastAsia="Times New Roman" w:hAnsi="Courier New" w:cs="Courier New"/>
+          <w:color w:val="BCBEC4"/>
+          <w:sz w:val="23"/>
+          <w:szCs w:val="23"/>
+          <w:lang w:eastAsia="en-IN"/>
+        </w:rPr>
+        <w:br/>
+      </w:r>
+      <w:r>
+        <w:rPr>
+          <w:rFonts w:ascii="Courier New" w:eastAsia="Times New Roman" w:hAnsi="Courier New" w:cs="Courier New"/>
+          <w:color w:val="CF8E6D"/>
+          <w:sz w:val="23"/>
+          <w:szCs w:val="23"/>
+          <w:lang w:eastAsia="en-IN"/>
+        </w:rPr>
+        <w:t xml:space="preserve">import </w:t>
+      </w:r>
+      <w:proofErr w:type="spellStart"/>
+      <w:r>
+        <w:rPr>
+          <w:rFonts w:ascii="Courier New" w:eastAsia="Times New Roman" w:hAnsi="Courier New" w:cs="Courier New"/>
+          <w:color w:val="BCBEC4"/>
+          <w:sz w:val="23"/>
+          <w:szCs w:val="23"/>
+          <w:lang w:eastAsia="en-IN"/>
+        </w:rPr>
+        <w:t>com.aventstack.extentreports.ExtentTest</w:t>
+      </w:r>
+      <w:proofErr w:type="spellEnd"/>
+      <w:r>
+        <w:rPr>
+          <w:rFonts w:ascii="Courier New" w:eastAsia="Times New Roman" w:hAnsi="Courier New" w:cs="Courier New"/>
+          <w:color w:val="BCBEC4"/>
+          <w:sz w:val="23"/>
+          <w:szCs w:val="23"/>
+          <w:lang w:eastAsia="en-IN"/>
+        </w:rPr>
+        <w:t>;</w:t>
+      </w:r>
+      <w:r>
+        <w:rPr>
+          <w:rFonts w:ascii="Courier New" w:eastAsia="Times New Roman" w:hAnsi="Courier New" w:cs="Courier New"/>
+          <w:color w:val="BCBEC4"/>
+          <w:sz w:val="23"/>
+          <w:szCs w:val="23"/>
+          <w:lang w:eastAsia="en-IN"/>
+        </w:rPr>
+        <w:br/>
+      </w:r>
+      <w:r>
+        <w:rPr>
+          <w:rFonts w:ascii="Courier New" w:eastAsia="Times New Roman" w:hAnsi="Courier New" w:cs="Courier New"/>
+          <w:color w:val="CF8E6D"/>
+          <w:sz w:val="23"/>
+          <w:szCs w:val="23"/>
+          <w:lang w:eastAsia="en-IN"/>
+        </w:rPr>
+        <w:t xml:space="preserve">import </w:t>
+      </w:r>
+      <w:proofErr w:type="spellStart"/>
+      <w:r>
+        <w:rPr>
+          <w:rFonts w:ascii="Courier New" w:eastAsia="Times New Roman" w:hAnsi="Courier New" w:cs="Courier New"/>
+          <w:color w:val="BCBEC4"/>
+          <w:sz w:val="23"/>
+          <w:szCs w:val="23"/>
+          <w:lang w:eastAsia="en-IN"/>
+        </w:rPr>
+        <w:t>com.aventstack.extentreports.MediaEntityBuilder</w:t>
+      </w:r>
+      <w:proofErr w:type="spellEnd"/>
+      <w:r>
+        <w:rPr>
+          <w:rFonts w:ascii="Courier New" w:eastAsia="Times New Roman" w:hAnsi="Courier New" w:cs="Courier New"/>
+          <w:color w:val="BCBEC4"/>
+          <w:sz w:val="23"/>
+          <w:szCs w:val="23"/>
+          <w:lang w:eastAsia="en-IN"/>
+        </w:rPr>
+        <w:t>;</w:t>
+      </w:r>
+      <w:r>
+        <w:rPr>
+          <w:rFonts w:ascii="Courier New" w:eastAsia="Times New Roman" w:hAnsi="Courier New" w:cs="Courier New"/>
+          <w:color w:val="BCBEC4"/>
+          <w:sz w:val="23"/>
+          <w:szCs w:val="23"/>
+          <w:lang w:eastAsia="en-IN"/>
+        </w:rPr>
+        <w:br/>
+      </w:r>
+      <w:r>
+        <w:rPr>
+          <w:rFonts w:ascii="Courier New" w:eastAsia="Times New Roman" w:hAnsi="Courier New" w:cs="Courier New"/>
+          <w:color w:val="CF8E6D"/>
+          <w:sz w:val="23"/>
+          <w:szCs w:val="23"/>
+          <w:lang w:eastAsia="en-IN"/>
+        </w:rPr>
+        <w:t xml:space="preserve">import </w:t>
+      </w:r>
+      <w:proofErr w:type="spellStart"/>
+      <w:r>
+        <w:rPr>
+          <w:rFonts w:ascii="Courier New" w:eastAsia="Times New Roman" w:hAnsi="Courier New" w:cs="Courier New"/>
+          <w:color w:val="BCBEC4"/>
+          <w:sz w:val="23"/>
+          <w:szCs w:val="23"/>
+          <w:lang w:eastAsia="en-IN"/>
+        </w:rPr>
+        <w:t>com.aventstack.extentreports.Status</w:t>
+      </w:r>
+      <w:proofErr w:type="spellEnd"/>
+      <w:r>
+        <w:rPr>
+          <w:rFonts w:ascii="Courier New" w:eastAsia="Times New Roman" w:hAnsi="Courier New" w:cs="Courier New"/>
+          <w:color w:val="BCBEC4"/>
+          <w:sz w:val="23"/>
+          <w:szCs w:val="23"/>
+          <w:lang w:eastAsia="en-IN"/>
+        </w:rPr>
+        <w:t>;</w:t>
+      </w:r>
+      <w:r>
+        <w:rPr>
+          <w:rFonts w:ascii="Courier New" w:eastAsia="Times New Roman" w:hAnsi="Courier New" w:cs="Courier New"/>
+          <w:color w:val="BCBEC4"/>
+          <w:sz w:val="23"/>
+          <w:szCs w:val="23"/>
+          <w:lang w:eastAsia="en-IN"/>
+        </w:rPr>
+        <w:br/>
+      </w:r>
+      <w:r>
+        <w:rPr>
+          <w:rFonts w:ascii="Courier New" w:eastAsia="Times New Roman" w:hAnsi="Courier New" w:cs="Courier New"/>
+          <w:color w:val="CF8E6D"/>
+          <w:sz w:val="23"/>
+          <w:szCs w:val="23"/>
+          <w:lang w:eastAsia="en-IN"/>
+        </w:rPr>
+        <w:t xml:space="preserve">import </w:t>
+      </w:r>
+      <w:proofErr w:type="spellStart"/>
+      <w:r>
+        <w:rPr>
+          <w:rFonts w:ascii="Courier New" w:eastAsia="Times New Roman" w:hAnsi="Courier New" w:cs="Courier New"/>
+          <w:color w:val="BCBEC4"/>
+          <w:sz w:val="23"/>
+          <w:szCs w:val="23"/>
+          <w:lang w:eastAsia="en-IN"/>
+        </w:rPr>
+        <w:t>com.aventstack.extentreports.markuputils.ExtentColor</w:t>
+      </w:r>
+      <w:proofErr w:type="spellEnd"/>
+      <w:r>
+        <w:rPr>
+          <w:rFonts w:ascii="Courier New" w:eastAsia="Times New Roman" w:hAnsi="Courier New" w:cs="Courier New"/>
+          <w:color w:val="BCBEC4"/>
+          <w:sz w:val="23"/>
+          <w:szCs w:val="23"/>
+          <w:lang w:eastAsia="en-IN"/>
+        </w:rPr>
+        <w:t>;</w:t>
+      </w:r>
+      <w:r>
+        <w:rPr>
+          <w:rFonts w:ascii="Courier New" w:eastAsia="Times New Roman" w:hAnsi="Courier New" w:cs="Courier New"/>
+          <w:color w:val="BCBEC4"/>
+          <w:sz w:val="23"/>
+          <w:szCs w:val="23"/>
+          <w:lang w:eastAsia="en-IN"/>
+        </w:rPr>
+        <w:br/>
+      </w:r>
+      <w:r>
+        <w:rPr>
+          <w:rFonts w:ascii="Courier New" w:eastAsia="Times New Roman" w:hAnsi="Courier New" w:cs="Courier New"/>
+          <w:color w:val="CF8E6D"/>
+          <w:sz w:val="23"/>
+          <w:szCs w:val="23"/>
+          <w:lang w:eastAsia="en-IN"/>
+        </w:rPr>
+        <w:t xml:space="preserve">import </w:t>
+      </w:r>
+      <w:proofErr w:type="spellStart"/>
+      <w:r>
+        <w:rPr>
+          <w:rFonts w:ascii="Courier New" w:eastAsia="Times New Roman" w:hAnsi="Courier New" w:cs="Courier New"/>
+          <w:color w:val="BCBEC4"/>
+          <w:sz w:val="23"/>
+          <w:szCs w:val="23"/>
+          <w:lang w:eastAsia="en-IN"/>
+        </w:rPr>
+        <w:t>com.aventstack.extentreports.markuputils.MarkupHelper</w:t>
+      </w:r>
+      <w:proofErr w:type="spellEnd"/>
+      <w:r>
+        <w:rPr>
+          <w:rFonts w:ascii="Courier New" w:eastAsia="Times New Roman" w:hAnsi="Courier New" w:cs="Courier New"/>
+          <w:color w:val="BCBEC4"/>
+          <w:sz w:val="23"/>
+          <w:szCs w:val="23"/>
+          <w:lang w:eastAsia="en-IN"/>
+        </w:rPr>
+        <w:t>;</w:t>
+      </w:r>
+      <w:r>
+        <w:rPr>
+          <w:rFonts w:ascii="Courier New" w:eastAsia="Times New Roman" w:hAnsi="Courier New" w:cs="Courier New"/>
+          <w:color w:val="BCBEC4"/>
+          <w:sz w:val="23"/>
+          <w:szCs w:val="23"/>
+          <w:lang w:eastAsia="en-IN"/>
+        </w:rPr>
+        <w:br/>
+      </w:r>
+      <w:r>
+        <w:rPr>
+          <w:rFonts w:ascii="Courier New" w:eastAsia="Times New Roman" w:hAnsi="Courier New" w:cs="Courier New"/>
+          <w:color w:val="CF8E6D"/>
+          <w:sz w:val="23"/>
+          <w:szCs w:val="23"/>
+          <w:lang w:eastAsia="en-IN"/>
+        </w:rPr>
+        <w:t xml:space="preserve">import </w:t>
+      </w:r>
+      <w:proofErr w:type="spellStart"/>
+      <w:r>
+        <w:rPr>
+          <w:rFonts w:ascii="Courier New" w:eastAsia="Times New Roman" w:hAnsi="Courier New" w:cs="Courier New"/>
+          <w:color w:val="BCBEC4"/>
+          <w:sz w:val="23"/>
+          <w:szCs w:val="23"/>
+          <w:lang w:eastAsia="en-IN"/>
+        </w:rPr>
+        <w:t>com.aventstack.extentreports.reporter.ExtentSparkReporter</w:t>
+      </w:r>
+      <w:proofErr w:type="spellEnd"/>
+      <w:r>
+        <w:rPr>
+          <w:rFonts w:ascii="Courier New" w:eastAsia="Times New Roman" w:hAnsi="Courier New" w:cs="Courier New"/>
+          <w:color w:val="BCBEC4"/>
+          <w:sz w:val="23"/>
+          <w:szCs w:val="23"/>
+          <w:lang w:eastAsia="en-IN"/>
+        </w:rPr>
+        <w:t>;</w:t>
+      </w:r>
+      <w:r>
+        <w:rPr>
+          <w:rFonts w:ascii="Courier New" w:eastAsia="Times New Roman" w:hAnsi="Courier New" w:cs="Courier New"/>
+          <w:color w:val="BCBEC4"/>
+          <w:sz w:val="23"/>
+          <w:szCs w:val="23"/>
+          <w:lang w:eastAsia="en-IN"/>
+        </w:rPr>
+        <w:br/>
+      </w:r>
+      <w:r>
+        <w:rPr>
+          <w:rFonts w:ascii="Courier New" w:eastAsia="Times New Roman" w:hAnsi="Courier New" w:cs="Courier New"/>
+          <w:color w:val="CF8E6D"/>
+          <w:sz w:val="23"/>
+          <w:szCs w:val="23"/>
+          <w:lang w:eastAsia="en-IN"/>
+        </w:rPr>
+        <w:t xml:space="preserve">import </w:t>
+      </w:r>
+      <w:proofErr w:type="spellStart"/>
+      <w:r>
+        <w:rPr>
+          <w:rFonts w:ascii="Courier New" w:eastAsia="Times New Roman" w:hAnsi="Courier New" w:cs="Courier New"/>
+          <w:color w:val="BCBEC4"/>
+          <w:sz w:val="23"/>
+          <w:szCs w:val="23"/>
+          <w:lang w:eastAsia="en-IN"/>
+        </w:rPr>
+        <w:t>com.aventstack.extentreports.reporter.configuration.Theme</w:t>
+      </w:r>
+      <w:proofErr w:type="spellEnd"/>
+      <w:r>
+        <w:rPr>
+          <w:rFonts w:ascii="Courier New" w:eastAsia="Times New Roman" w:hAnsi="Courier New" w:cs="Courier New"/>
+          <w:color w:val="BCBEC4"/>
+          <w:sz w:val="23"/>
+          <w:szCs w:val="23"/>
+          <w:lang w:eastAsia="en-IN"/>
+        </w:rPr>
+        <w:t>;</w:t>
+      </w:r>
+      <w:r>
+        <w:rPr>
+          <w:rFonts w:ascii="Courier New" w:eastAsia="Times New Roman" w:hAnsi="Courier New" w:cs="Courier New"/>
+          <w:color w:val="BCBEC4"/>
+          <w:sz w:val="23"/>
+          <w:szCs w:val="23"/>
+          <w:lang w:eastAsia="en-IN"/>
+        </w:rPr>
+        <w:br/>
+      </w:r>
+      <w:r>
+        <w:rPr>
+          <w:rFonts w:ascii="Courier New" w:eastAsia="Times New Roman" w:hAnsi="Courier New" w:cs="Courier New"/>
+          <w:color w:val="CF8E6D"/>
+          <w:sz w:val="23"/>
+          <w:szCs w:val="23"/>
+          <w:lang w:eastAsia="en-IN"/>
+        </w:rPr>
+        <w:t xml:space="preserve">import </w:t>
+      </w:r>
+      <w:proofErr w:type="spellStart"/>
+      <w:r>
+        <w:rPr>
+          <w:rFonts w:ascii="Courier New" w:eastAsia="Times New Roman" w:hAnsi="Courier New" w:cs="Courier New"/>
+          <w:color w:val="BCBEC4"/>
+          <w:sz w:val="23"/>
+          <w:szCs w:val="23"/>
+          <w:lang w:eastAsia="en-IN"/>
+        </w:rPr>
+        <w:t>org.openqa.selenium</w:t>
+      </w:r>
+      <w:proofErr w:type="spellEnd"/>
+      <w:r>
+        <w:rPr>
+          <w:rFonts w:ascii="Courier New" w:eastAsia="Times New Roman" w:hAnsi="Courier New" w:cs="Courier New"/>
+          <w:color w:val="BCBEC4"/>
+          <w:sz w:val="23"/>
+          <w:szCs w:val="23"/>
+          <w:lang w:eastAsia="en-IN"/>
+        </w:rPr>
+        <w:t>.*;</w:t>
+      </w:r>
+      <w:r>
+        <w:rPr>
+          <w:rFonts w:ascii="Courier New" w:eastAsia="Times New Roman" w:hAnsi="Courier New" w:cs="Courier New"/>
+          <w:color w:val="BCBEC4"/>
+          <w:sz w:val="23"/>
+          <w:szCs w:val="23"/>
+          <w:lang w:eastAsia="en-IN"/>
+        </w:rPr>
+        <w:br/>
+      </w:r>
+      <w:r>
+        <w:rPr>
+          <w:rFonts w:ascii="Courier New" w:eastAsia="Times New Roman" w:hAnsi="Courier New" w:cs="Courier New"/>
+          <w:color w:val="CF8E6D"/>
+          <w:sz w:val="23"/>
+          <w:szCs w:val="23"/>
+          <w:lang w:eastAsia="en-IN"/>
+        </w:rPr>
+        <w:t xml:space="preserve">import </w:t>
+      </w:r>
+      <w:proofErr w:type="spellStart"/>
+      <w:r>
+        <w:rPr>
+          <w:rFonts w:ascii="Courier New" w:eastAsia="Times New Roman" w:hAnsi="Courier New" w:cs="Courier New"/>
+          <w:color w:val="BCBEC4"/>
+          <w:sz w:val="23"/>
+          <w:szCs w:val="23"/>
+          <w:lang w:eastAsia="en-IN"/>
+        </w:rPr>
+        <w:t>org.openqa.selenium.chrome.ChromeDriver</w:t>
+      </w:r>
+      <w:proofErr w:type="spellEnd"/>
+      <w:r>
+        <w:rPr>
+          <w:rFonts w:ascii="Courier New" w:eastAsia="Times New Roman" w:hAnsi="Courier New" w:cs="Courier New"/>
+          <w:color w:val="BCBEC4"/>
+          <w:sz w:val="23"/>
+          <w:szCs w:val="23"/>
+          <w:lang w:eastAsia="en-IN"/>
+        </w:rPr>
+        <w:t>;</w:t>
+      </w:r>
+      <w:r>
+        <w:rPr>
+          <w:rFonts w:ascii="Courier New" w:eastAsia="Times New Roman" w:hAnsi="Courier New" w:cs="Courier New"/>
+          <w:color w:val="BCBEC4"/>
+          <w:sz w:val="23"/>
+          <w:szCs w:val="23"/>
+          <w:lang w:eastAsia="en-IN"/>
+        </w:rPr>
+        <w:br/>
+      </w:r>
+      <w:r>
+        <w:rPr>
+          <w:rFonts w:ascii="Courier New" w:eastAsia="Times New Roman" w:hAnsi="Courier New" w:cs="Courier New"/>
+          <w:color w:val="CF8E6D"/>
+          <w:sz w:val="23"/>
+          <w:szCs w:val="23"/>
+          <w:lang w:eastAsia="en-IN"/>
+        </w:rPr>
+        <w:t xml:space="preserve">import </w:t>
+      </w:r>
+      <w:proofErr w:type="spellStart"/>
+      <w:r>
+        <w:rPr>
+          <w:rFonts w:ascii="Courier New" w:eastAsia="Times New Roman" w:hAnsi="Courier New" w:cs="Courier New"/>
+          <w:color w:val="BCBEC4"/>
+          <w:sz w:val="23"/>
+          <w:szCs w:val="23"/>
+          <w:lang w:eastAsia="en-IN"/>
+        </w:rPr>
+        <w:t>org.openqa.selenium.io.FileHandler</w:t>
+      </w:r>
+      <w:proofErr w:type="spellEnd"/>
+      <w:r>
+        <w:rPr>
+          <w:rFonts w:ascii="Courier New" w:eastAsia="Times New Roman" w:hAnsi="Courier New" w:cs="Courier New"/>
+          <w:color w:val="BCBEC4"/>
+          <w:sz w:val="23"/>
+          <w:szCs w:val="23"/>
+          <w:lang w:eastAsia="en-IN"/>
+        </w:rPr>
+        <w:t>;</w:t>
+      </w:r>
+      <w:r>
+        <w:rPr>
+          <w:rFonts w:ascii="Courier New" w:eastAsia="Times New Roman" w:hAnsi="Courier New" w:cs="Courier New"/>
+          <w:color w:val="BCBEC4"/>
+          <w:sz w:val="23"/>
+          <w:szCs w:val="23"/>
+          <w:lang w:eastAsia="en-IN"/>
+        </w:rPr>
+        <w:br/>
+      </w:r>
+      <w:r>
+        <w:rPr>
+          <w:rFonts w:ascii="Courier New" w:eastAsia="Times New Roman" w:hAnsi="Courier New" w:cs="Courier New"/>
+          <w:color w:val="BCBEC4"/>
+          <w:sz w:val="23"/>
+          <w:szCs w:val="23"/>
+          <w:lang w:eastAsia="en-IN"/>
+        </w:rPr>
+        <w:br/>
+      </w:r>
+      <w:r>
+        <w:rPr>
+          <w:rFonts w:ascii="Courier New" w:eastAsia="Times New Roman" w:hAnsi="Courier New" w:cs="Courier New"/>
+          <w:color w:val="CF8E6D"/>
+          <w:sz w:val="23"/>
+          <w:szCs w:val="23"/>
+          <w:lang w:eastAsia="en-IN"/>
+        </w:rPr>
+        <w:t xml:space="preserve">import </w:t>
+      </w:r>
+      <w:proofErr w:type="spellStart"/>
+      <w:r>
+        <w:rPr>
+          <w:rFonts w:ascii="Courier New" w:eastAsia="Times New Roman" w:hAnsi="Courier New" w:cs="Courier New"/>
+          <w:color w:val="BCBEC4"/>
+          <w:sz w:val="23"/>
+          <w:szCs w:val="23"/>
+          <w:lang w:eastAsia="en-IN"/>
+        </w:rPr>
+        <w:t>java.io.File</w:t>
+      </w:r>
+      <w:proofErr w:type="spellEnd"/>
+      <w:r>
+        <w:rPr>
+          <w:rFonts w:ascii="Courier New" w:eastAsia="Times New Roman" w:hAnsi="Courier New" w:cs="Courier New"/>
+          <w:color w:val="BCBEC4"/>
+          <w:sz w:val="23"/>
+          <w:szCs w:val="23"/>
+          <w:lang w:eastAsia="en-IN"/>
+        </w:rPr>
+        <w:t>;</w:t>
+      </w:r>
+      <w:r>
+        <w:rPr>
+          <w:rFonts w:ascii="Courier New" w:eastAsia="Times New Roman" w:hAnsi="Courier New" w:cs="Courier New"/>
+          <w:color w:val="BCBEC4"/>
+          <w:sz w:val="23"/>
+          <w:szCs w:val="23"/>
+          <w:lang w:eastAsia="en-IN"/>
+        </w:rPr>
+        <w:br/>
+      </w:r>
+      <w:r>
+        <w:rPr>
+          <w:rFonts w:ascii="Courier New" w:eastAsia="Times New Roman" w:hAnsi="Courier New" w:cs="Courier New"/>
+          <w:color w:val="CF8E6D"/>
+          <w:sz w:val="23"/>
+          <w:szCs w:val="23"/>
+          <w:lang w:eastAsia="en-IN"/>
+        </w:rPr>
+        <w:t xml:space="preserve">import </w:t>
+      </w:r>
+      <w:proofErr w:type="spellStart"/>
+      <w:r>
+        <w:rPr>
+          <w:rFonts w:ascii="Courier New" w:eastAsia="Times New Roman" w:hAnsi="Courier New" w:cs="Courier New"/>
+          <w:color w:val="BCBEC4"/>
+          <w:sz w:val="23"/>
+          <w:szCs w:val="23"/>
+          <w:lang w:eastAsia="en-IN"/>
+        </w:rPr>
+        <w:t>java.io.IOException</w:t>
+      </w:r>
+      <w:proofErr w:type="spellEnd"/>
+      <w:r>
+        <w:rPr>
+          <w:rFonts w:ascii="Courier New" w:eastAsia="Times New Roman" w:hAnsi="Courier New" w:cs="Courier New"/>
+          <w:color w:val="BCBEC4"/>
+          <w:sz w:val="23"/>
+          <w:szCs w:val="23"/>
+          <w:lang w:eastAsia="en-IN"/>
+        </w:rPr>
+        <w:t>;</w:t>
+      </w:r>
+      <w:r>
+        <w:rPr>
+          <w:rFonts w:ascii="Courier New" w:eastAsia="Times New Roman" w:hAnsi="Courier New" w:cs="Courier New"/>
+          <w:color w:val="BCBEC4"/>
+          <w:sz w:val="23"/>
+          <w:szCs w:val="23"/>
+          <w:lang w:eastAsia="en-IN"/>
+        </w:rPr>
+        <w:br/>
+      </w:r>
+      <w:r>
+        <w:rPr>
+          <w:rFonts w:ascii="Courier New" w:eastAsia="Times New Roman" w:hAnsi="Courier New" w:cs="Courier New"/>
+          <w:color w:val="CF8E6D"/>
+          <w:sz w:val="23"/>
+          <w:szCs w:val="23"/>
+          <w:lang w:eastAsia="en-IN"/>
+        </w:rPr>
+        <w:t xml:space="preserve">import </w:t>
+      </w:r>
+      <w:proofErr w:type="spellStart"/>
+      <w:r>
+        <w:rPr>
+          <w:rFonts w:ascii="Courier New" w:eastAsia="Times New Roman" w:hAnsi="Courier New" w:cs="Courier New"/>
+          <w:color w:val="BCBEC4"/>
+          <w:sz w:val="23"/>
+          <w:szCs w:val="23"/>
+          <w:lang w:eastAsia="en-IN"/>
+        </w:rPr>
+        <w:t>java.time.Duration</w:t>
+      </w:r>
+      <w:proofErr w:type="spellEnd"/>
+      <w:r>
+        <w:rPr>
+          <w:rFonts w:ascii="Courier New" w:eastAsia="Times New Roman" w:hAnsi="Courier New" w:cs="Courier New"/>
+          <w:color w:val="BCBEC4"/>
+          <w:sz w:val="23"/>
+          <w:szCs w:val="23"/>
+          <w:lang w:eastAsia="en-IN"/>
+        </w:rPr>
+        <w:t>;</w:t>
+      </w:r>
+      <w:r>
+        <w:rPr>
+          <w:rFonts w:ascii="Courier New" w:eastAsia="Times New Roman" w:hAnsi="Courier New" w:cs="Courier New"/>
+          <w:color w:val="BCBEC4"/>
+          <w:sz w:val="23"/>
+          <w:szCs w:val="23"/>
+          <w:lang w:eastAsia="en-IN"/>
+        </w:rPr>
+        <w:br/>
+      </w:r>
+      <w:r>
+        <w:rPr>
+          <w:rFonts w:ascii="Courier New" w:eastAsia="Times New Roman" w:hAnsi="Courier New" w:cs="Courier New"/>
+          <w:color w:val="BCBEC4"/>
+          <w:sz w:val="23"/>
+          <w:szCs w:val="23"/>
+          <w:lang w:eastAsia="en-IN"/>
+        </w:rPr>
+        <w:br/>
+      </w:r>
+      <w:r>
+        <w:rPr>
+          <w:rFonts w:ascii="Courier New" w:eastAsia="Times New Roman" w:hAnsi="Courier New" w:cs="Courier New"/>
+          <w:color w:val="CF8E6D"/>
+          <w:sz w:val="23"/>
+          <w:szCs w:val="23"/>
+          <w:lang w:eastAsia="en-IN"/>
+        </w:rPr>
+        <w:t xml:space="preserve">public class </w:t>
+      </w:r>
+      <w:r>
+        <w:rPr>
+          <w:rFonts w:ascii="Courier New" w:eastAsia="Times New Roman" w:hAnsi="Courier New" w:cs="Courier New"/>
+          <w:color w:val="BCBEC4"/>
+          <w:sz w:val="23"/>
+          <w:szCs w:val="23"/>
+          <w:lang w:eastAsia="en-IN"/>
+        </w:rPr>
+        <w:t>D04SimpleExtentReport {</w:t>
+      </w:r>
+      <w:r>
+        <w:rPr>
+          <w:rFonts w:ascii="Courier New" w:eastAsia="Times New Roman" w:hAnsi="Courier New" w:cs="Courier New"/>
+          <w:color w:val="BCBEC4"/>
+          <w:sz w:val="23"/>
+          <w:szCs w:val="23"/>
+          <w:lang w:eastAsia="en-IN"/>
+        </w:rPr>
+        <w:br/>
+        <w:t xml:space="preserve">    </w:t>
+      </w:r>
+      <w:r>
+        <w:rPr>
+          <w:rFonts w:ascii="Courier New" w:eastAsia="Times New Roman" w:hAnsi="Courier New" w:cs="Courier New"/>
+          <w:color w:val="CF8E6D"/>
+          <w:sz w:val="23"/>
+          <w:szCs w:val="23"/>
+          <w:lang w:eastAsia="en-IN"/>
+        </w:rPr>
+        <w:t xml:space="preserve">public static void </w:t>
+      </w:r>
+      <w:r>
+        <w:rPr>
+          <w:rFonts w:ascii="Courier New" w:eastAsia="Times New Roman" w:hAnsi="Courier New" w:cs="Courier New"/>
+          <w:color w:val="56A8F5"/>
+          <w:sz w:val="23"/>
+          <w:szCs w:val="23"/>
+          <w:lang w:eastAsia="en-IN"/>
+        </w:rPr>
+        <w:t>main</w:t>
+      </w:r>
+      <w:r>
+        <w:rPr>
+          <w:rFonts w:ascii="Courier New" w:eastAsia="Times New Roman" w:hAnsi="Courier New" w:cs="Courier New"/>
+          <w:color w:val="BCBEC4"/>
+          <w:sz w:val="23"/>
+          <w:szCs w:val="23"/>
+          <w:lang w:eastAsia="en-IN"/>
+        </w:rPr>
+        <w:t xml:space="preserve">(String[] </w:t>
+      </w:r>
+      <w:proofErr w:type="spellStart"/>
+      <w:r>
+        <w:rPr>
+          <w:rFonts w:ascii="Courier New" w:eastAsia="Times New Roman" w:hAnsi="Courier New" w:cs="Courier New"/>
+          <w:color w:val="BCBEC4"/>
+          <w:sz w:val="23"/>
+          <w:szCs w:val="23"/>
+          <w:lang w:eastAsia="en-IN"/>
+        </w:rPr>
+        <w:t>args</w:t>
+      </w:r>
+      <w:proofErr w:type="spellEnd"/>
+      <w:r>
+        <w:rPr>
+          <w:rFonts w:ascii="Courier New" w:eastAsia="Times New Roman" w:hAnsi="Courier New" w:cs="Courier New"/>
+          <w:color w:val="BCBEC4"/>
+          <w:sz w:val="23"/>
+          <w:szCs w:val="23"/>
+          <w:lang w:eastAsia="en-IN"/>
+        </w:rPr>
+        <w:t xml:space="preserve">) </w:t>
+      </w:r>
+      <w:r>
+        <w:rPr>
+          <w:rFonts w:ascii="Courier New" w:eastAsia="Times New Roman" w:hAnsi="Courier New" w:cs="Courier New"/>
+          <w:color w:val="CF8E6D"/>
+          <w:sz w:val="23"/>
+          <w:szCs w:val="23"/>
+          <w:lang w:eastAsia="en-IN"/>
+        </w:rPr>
+        <w:t xml:space="preserve">throws </w:t>
+      </w:r>
+      <w:r>
+        <w:rPr>
+          <w:rFonts w:ascii="Courier New" w:eastAsia="Times New Roman" w:hAnsi="Courier New" w:cs="Courier New"/>
+          <w:color w:val="BCBEC4"/>
+          <w:sz w:val="23"/>
+          <w:szCs w:val="23"/>
+          <w:lang w:eastAsia="en-IN"/>
+        </w:rPr>
+        <w:t>IOException {</w:t>
+      </w:r>
+      <w:r>
+        <w:rPr>
+          <w:rFonts w:ascii="Courier New" w:eastAsia="Times New Roman" w:hAnsi="Courier New" w:cs="Courier New"/>
+          <w:color w:val="BCBEC4"/>
+          <w:sz w:val="23"/>
+          <w:szCs w:val="23"/>
+          <w:lang w:eastAsia="en-IN"/>
+        </w:rPr>
+        <w:br/>
+        <w:t xml:space="preserve">        WebDriver driver;</w:t>
+      </w:r>
+      <w:r>
+        <w:rPr>
+          <w:rFonts w:ascii="Courier New" w:eastAsia="Times New Roman" w:hAnsi="Courier New" w:cs="Courier New"/>
+          <w:color w:val="BCBEC4"/>
+          <w:sz w:val="23"/>
+          <w:szCs w:val="23"/>
+          <w:lang w:eastAsia="en-IN"/>
+        </w:rPr>
+        <w:br/>
+        <w:t xml:space="preserve">        </w:t>
+      </w:r>
+      <w:proofErr w:type="spellStart"/>
+      <w:r>
+        <w:rPr>
+          <w:rFonts w:ascii="Courier New" w:eastAsia="Times New Roman" w:hAnsi="Courier New" w:cs="Courier New"/>
+          <w:color w:val="BCBEC4"/>
+          <w:sz w:val="23"/>
+          <w:szCs w:val="23"/>
+          <w:lang w:eastAsia="en-IN"/>
+        </w:rPr>
+        <w:t>ExtentSparkReporter</w:t>
+      </w:r>
+      <w:proofErr w:type="spellEnd"/>
+      <w:r>
+        <w:rPr>
+          <w:rFonts w:ascii="Courier New" w:eastAsia="Times New Roman" w:hAnsi="Courier New" w:cs="Courier New"/>
+          <w:color w:val="BCBEC4"/>
+          <w:sz w:val="23"/>
+          <w:szCs w:val="23"/>
+          <w:lang w:eastAsia="en-IN"/>
+        </w:rPr>
+        <w:t xml:space="preserve"> </w:t>
+      </w:r>
+      <w:proofErr w:type="spellStart"/>
+      <w:r>
+        <w:rPr>
+          <w:rFonts w:ascii="Courier New" w:eastAsia="Times New Roman" w:hAnsi="Courier New" w:cs="Courier New"/>
+          <w:color w:val="BCBEC4"/>
+          <w:sz w:val="23"/>
+          <w:szCs w:val="23"/>
+          <w:lang w:eastAsia="en-IN"/>
+        </w:rPr>
+        <w:t>htmlReport</w:t>
+      </w:r>
+      <w:proofErr w:type="spellEnd"/>
+      <w:r>
+        <w:rPr>
+          <w:rFonts w:ascii="Courier New" w:eastAsia="Times New Roman" w:hAnsi="Courier New" w:cs="Courier New"/>
+          <w:color w:val="BCBEC4"/>
+          <w:sz w:val="23"/>
+          <w:szCs w:val="23"/>
+          <w:lang w:eastAsia="en-IN"/>
+        </w:rPr>
+        <w:t xml:space="preserve"> = </w:t>
+      </w:r>
+      <w:r>
+        <w:rPr>
+          <w:rFonts w:ascii="Courier New" w:eastAsia="Times New Roman" w:hAnsi="Courier New" w:cs="Courier New"/>
+          <w:color w:val="CF8E6D"/>
+          <w:sz w:val="23"/>
+          <w:szCs w:val="23"/>
+          <w:lang w:eastAsia="en-IN"/>
+        </w:rPr>
+        <w:t xml:space="preserve">new </w:t>
+      </w:r>
+      <w:proofErr w:type="spellStart"/>
+      <w:r>
+        <w:rPr>
+          <w:rFonts w:ascii="Courier New" w:eastAsia="Times New Roman" w:hAnsi="Courier New" w:cs="Courier New"/>
+          <w:color w:val="BCBEC4"/>
+          <w:sz w:val="23"/>
+          <w:szCs w:val="23"/>
+          <w:lang w:eastAsia="en-IN"/>
+        </w:rPr>
+        <w:t>ExtentSparkReporter</w:t>
+      </w:r>
+      <w:proofErr w:type="spellEnd"/>
+      <w:r>
+        <w:rPr>
+          <w:rFonts w:ascii="Courier New" w:eastAsia="Times New Roman" w:hAnsi="Courier New" w:cs="Courier New"/>
+          <w:color w:val="BCBEC4"/>
+          <w:sz w:val="23"/>
+          <w:szCs w:val="23"/>
+          <w:lang w:eastAsia="en-IN"/>
+        </w:rPr>
+        <w:t>(</w:t>
+      </w:r>
+      <w:r>
+        <w:rPr>
+          <w:rFonts w:ascii="Courier New" w:eastAsia="Times New Roman" w:hAnsi="Courier New" w:cs="Courier New"/>
+          <w:color w:val="6AAB73"/>
+          <w:sz w:val="23"/>
+          <w:szCs w:val="23"/>
+          <w:lang w:eastAsia="en-IN"/>
+        </w:rPr>
+        <w:t>"SimpleReport.html"</w:t>
+      </w:r>
+      <w:r>
+        <w:rPr>
+          <w:rFonts w:ascii="Courier New" w:eastAsia="Times New Roman" w:hAnsi="Courier New" w:cs="Courier New"/>
+          <w:color w:val="BCBEC4"/>
+          <w:sz w:val="23"/>
+          <w:szCs w:val="23"/>
+          <w:lang w:eastAsia="en-IN"/>
+        </w:rPr>
+        <w:t>);</w:t>
+      </w:r>
+      <w:r>
+        <w:rPr>
+          <w:rFonts w:ascii="Courier New" w:eastAsia="Times New Roman" w:hAnsi="Courier New" w:cs="Courier New"/>
+          <w:color w:val="BCBEC4"/>
+          <w:sz w:val="23"/>
+          <w:szCs w:val="23"/>
+          <w:lang w:eastAsia="en-IN"/>
+        </w:rPr>
+        <w:br/>
+        <w:t xml:space="preserve">        </w:t>
+      </w:r>
+      <w:r>
+        <w:rPr>
+          <w:rFonts w:ascii="Courier New" w:eastAsia="Times New Roman" w:hAnsi="Courier New" w:cs="Courier New"/>
+          <w:color w:val="7A7E85"/>
+          <w:sz w:val="23"/>
+          <w:szCs w:val="23"/>
+          <w:lang w:eastAsia="en-IN"/>
+        </w:rPr>
+        <w:t>//This object represents the HTML file in which we are storing the report</w:t>
+      </w:r>
+      <w:r>
+        <w:rPr>
+          <w:rFonts w:ascii="Courier New" w:eastAsia="Times New Roman" w:hAnsi="Courier New" w:cs="Courier New"/>
+          <w:color w:val="7A7E85"/>
+          <w:sz w:val="23"/>
+          <w:szCs w:val="23"/>
+          <w:lang w:eastAsia="en-IN"/>
+        </w:rPr>
+        <w:br/>
+        <w:t xml:space="preserve">        </w:t>
+      </w:r>
+      <w:proofErr w:type="spellStart"/>
+      <w:r>
+        <w:rPr>
+          <w:rFonts w:ascii="Courier New" w:eastAsia="Times New Roman" w:hAnsi="Courier New" w:cs="Courier New"/>
+          <w:color w:val="BCBEC4"/>
+          <w:sz w:val="23"/>
+          <w:szCs w:val="23"/>
+          <w:lang w:eastAsia="en-IN"/>
+        </w:rPr>
+        <w:t>ExtentReports</w:t>
+      </w:r>
+      <w:proofErr w:type="spellEnd"/>
+      <w:r>
+        <w:rPr>
+          <w:rFonts w:ascii="Courier New" w:eastAsia="Times New Roman" w:hAnsi="Courier New" w:cs="Courier New"/>
+          <w:color w:val="BCBEC4"/>
+          <w:sz w:val="23"/>
+          <w:szCs w:val="23"/>
+          <w:lang w:eastAsia="en-IN"/>
+        </w:rPr>
+        <w:t xml:space="preserve"> report = </w:t>
+      </w:r>
+      <w:r>
+        <w:rPr>
+          <w:rFonts w:ascii="Courier New" w:eastAsia="Times New Roman" w:hAnsi="Courier New" w:cs="Courier New"/>
+          <w:color w:val="CF8E6D"/>
+          <w:sz w:val="23"/>
+          <w:szCs w:val="23"/>
+          <w:lang w:eastAsia="en-IN"/>
+        </w:rPr>
+        <w:t xml:space="preserve">new </w:t>
+      </w:r>
+      <w:proofErr w:type="spellStart"/>
+      <w:r>
+        <w:rPr>
+          <w:rFonts w:ascii="Courier New" w:eastAsia="Times New Roman" w:hAnsi="Courier New" w:cs="Courier New"/>
+          <w:color w:val="BCBEC4"/>
+          <w:sz w:val="23"/>
+          <w:szCs w:val="23"/>
+          <w:lang w:eastAsia="en-IN"/>
+        </w:rPr>
+        <w:t>ExtentReports</w:t>
+      </w:r>
+      <w:proofErr w:type="spellEnd"/>
+      <w:r>
+        <w:rPr>
+          <w:rFonts w:ascii="Courier New" w:eastAsia="Times New Roman" w:hAnsi="Courier New" w:cs="Courier New"/>
+          <w:color w:val="BCBEC4"/>
+          <w:sz w:val="23"/>
+          <w:szCs w:val="23"/>
+          <w:lang w:eastAsia="en-IN"/>
+        </w:rPr>
+        <w:t>();</w:t>
+      </w:r>
+      <w:r>
+        <w:rPr>
+          <w:rFonts w:ascii="Courier New" w:eastAsia="Times New Roman" w:hAnsi="Courier New" w:cs="Courier New"/>
+          <w:color w:val="BCBEC4"/>
+          <w:sz w:val="23"/>
+          <w:szCs w:val="23"/>
+          <w:lang w:eastAsia="en-IN"/>
+        </w:rPr>
+        <w:br/>
+        <w:t xml:space="preserve">        </w:t>
+      </w:r>
+      <w:r>
+        <w:rPr>
+          <w:rFonts w:ascii="Courier New" w:eastAsia="Times New Roman" w:hAnsi="Courier New" w:cs="Courier New"/>
+          <w:color w:val="7A7E85"/>
+          <w:sz w:val="23"/>
+          <w:szCs w:val="23"/>
+          <w:lang w:eastAsia="en-IN"/>
+        </w:rPr>
+        <w:t>//This object represents the report</w:t>
+      </w:r>
+      <w:r>
+        <w:rPr>
+          <w:rFonts w:ascii="Courier New" w:eastAsia="Times New Roman" w:hAnsi="Courier New" w:cs="Courier New"/>
+          <w:color w:val="7A7E85"/>
+          <w:sz w:val="23"/>
+          <w:szCs w:val="23"/>
+          <w:lang w:eastAsia="en-IN"/>
+        </w:rPr>
+        <w:br/>
+        <w:t xml:space="preserve">        </w:t>
+      </w:r>
+      <w:proofErr w:type="spellStart"/>
+      <w:r>
+        <w:rPr>
+          <w:rFonts w:ascii="Courier New" w:eastAsia="Times New Roman" w:hAnsi="Courier New" w:cs="Courier New"/>
+          <w:color w:val="BCBEC4"/>
+          <w:sz w:val="23"/>
+          <w:szCs w:val="23"/>
+          <w:lang w:eastAsia="en-IN"/>
+        </w:rPr>
+        <w:t>ExtentTest</w:t>
+      </w:r>
+      <w:proofErr w:type="spellEnd"/>
+      <w:r>
+        <w:rPr>
+          <w:rFonts w:ascii="Courier New" w:eastAsia="Times New Roman" w:hAnsi="Courier New" w:cs="Courier New"/>
+          <w:color w:val="BCBEC4"/>
+          <w:sz w:val="23"/>
+          <w:szCs w:val="23"/>
+          <w:lang w:eastAsia="en-IN"/>
+        </w:rPr>
+        <w:t xml:space="preserve"> test;</w:t>
+      </w:r>
+      <w:r>
+        <w:rPr>
+          <w:rFonts w:ascii="Courier New" w:eastAsia="Times New Roman" w:hAnsi="Courier New" w:cs="Courier New"/>
+          <w:color w:val="BCBEC4"/>
+          <w:sz w:val="23"/>
+          <w:szCs w:val="23"/>
+          <w:lang w:eastAsia="en-IN"/>
+        </w:rPr>
+        <w:br/>
+        <w:t xml:space="preserve">        </w:t>
+      </w:r>
+      <w:r>
+        <w:rPr>
+          <w:rFonts w:ascii="Courier New" w:eastAsia="Times New Roman" w:hAnsi="Courier New" w:cs="Courier New"/>
+          <w:color w:val="7A7E85"/>
+          <w:sz w:val="23"/>
+          <w:szCs w:val="23"/>
+          <w:lang w:eastAsia="en-IN"/>
+        </w:rPr>
+        <w:t>//This object represents the test case</w:t>
+      </w:r>
+      <w:r>
+        <w:rPr>
+          <w:rFonts w:ascii="Courier New" w:eastAsia="Times New Roman" w:hAnsi="Courier New" w:cs="Courier New"/>
+          <w:color w:val="7A7E85"/>
+          <w:sz w:val="23"/>
+          <w:szCs w:val="23"/>
+          <w:lang w:eastAsia="en-IN"/>
+        </w:rPr>
+        <w:br/>
+      </w:r>
+      <w:r>
+        <w:rPr>
+          <w:rFonts w:ascii="Courier New" w:eastAsia="Times New Roman" w:hAnsi="Courier New" w:cs="Courier New"/>
+          <w:color w:val="7A7E85"/>
+          <w:sz w:val="23"/>
+          <w:szCs w:val="23"/>
+          <w:lang w:eastAsia="en-IN"/>
+        </w:rPr>
+        <w:br/>
+        <w:t xml:space="preserve">        </w:t>
+      </w:r>
+      <w:proofErr w:type="spellStart"/>
+      <w:r>
+        <w:rPr>
+          <w:rFonts w:ascii="Courier New" w:eastAsia="Times New Roman" w:hAnsi="Courier New" w:cs="Courier New"/>
+          <w:color w:val="BCBEC4"/>
+          <w:sz w:val="23"/>
+          <w:szCs w:val="23"/>
+          <w:lang w:eastAsia="en-IN"/>
+        </w:rPr>
+        <w:t>report.attachReporter</w:t>
+      </w:r>
+      <w:proofErr w:type="spellEnd"/>
+      <w:r>
+        <w:rPr>
+          <w:rFonts w:ascii="Courier New" w:eastAsia="Times New Roman" w:hAnsi="Courier New" w:cs="Courier New"/>
+          <w:color w:val="BCBEC4"/>
+          <w:sz w:val="23"/>
+          <w:szCs w:val="23"/>
+          <w:lang w:eastAsia="en-IN"/>
+        </w:rPr>
+        <w:t>(</w:t>
+      </w:r>
+      <w:proofErr w:type="spellStart"/>
+      <w:r>
+        <w:rPr>
+          <w:rFonts w:ascii="Courier New" w:eastAsia="Times New Roman" w:hAnsi="Courier New" w:cs="Courier New"/>
+          <w:color w:val="BCBEC4"/>
+          <w:sz w:val="23"/>
+          <w:szCs w:val="23"/>
+          <w:lang w:eastAsia="en-IN"/>
+        </w:rPr>
+        <w:t>htmlReport</w:t>
+      </w:r>
+      <w:proofErr w:type="spellEnd"/>
+      <w:r>
+        <w:rPr>
+          <w:rFonts w:ascii="Courier New" w:eastAsia="Times New Roman" w:hAnsi="Courier New" w:cs="Courier New"/>
+          <w:color w:val="BCBEC4"/>
+          <w:sz w:val="23"/>
+          <w:szCs w:val="23"/>
+          <w:lang w:eastAsia="en-IN"/>
+        </w:rPr>
+        <w:t>);</w:t>
+      </w:r>
+      <w:r>
+        <w:rPr>
+          <w:rFonts w:ascii="Courier New" w:eastAsia="Times New Roman" w:hAnsi="Courier New" w:cs="Courier New"/>
+          <w:color w:val="BCBEC4"/>
+          <w:sz w:val="23"/>
+          <w:szCs w:val="23"/>
+          <w:lang w:eastAsia="en-IN"/>
+        </w:rPr>
+        <w:br/>
+        <w:t xml:space="preserve">        </w:t>
+      </w:r>
+      <w:r>
+        <w:rPr>
+          <w:rFonts w:ascii="Courier New" w:eastAsia="Times New Roman" w:hAnsi="Courier New" w:cs="Courier New"/>
+          <w:color w:val="7A7E85"/>
+          <w:sz w:val="23"/>
+          <w:szCs w:val="23"/>
+          <w:lang w:eastAsia="en-IN"/>
+        </w:rPr>
+        <w:t>//Store this report in the said HTML file</w:t>
+      </w:r>
+      <w:r>
+        <w:rPr>
+          <w:rFonts w:ascii="Courier New" w:eastAsia="Times New Roman" w:hAnsi="Courier New" w:cs="Courier New"/>
+          <w:color w:val="7A7E85"/>
+          <w:sz w:val="23"/>
+          <w:szCs w:val="23"/>
+          <w:lang w:eastAsia="en-IN"/>
+        </w:rPr>
+        <w:br/>
+      </w:r>
+      <w:r>
+        <w:rPr>
+          <w:rFonts w:ascii="Courier New" w:eastAsia="Times New Roman" w:hAnsi="Courier New" w:cs="Courier New"/>
+          <w:color w:val="7A7E85"/>
+          <w:sz w:val="23"/>
+          <w:szCs w:val="23"/>
+          <w:lang w:eastAsia="en-IN"/>
+        </w:rPr>
+        <w:br/>
+        <w:t xml:space="preserve">        //Set the environment details those will be displayed on the report</w:t>
+      </w:r>
+      <w:r>
+        <w:rPr>
+          <w:rFonts w:ascii="Courier New" w:eastAsia="Times New Roman" w:hAnsi="Courier New" w:cs="Courier New"/>
+          <w:color w:val="7A7E85"/>
+          <w:sz w:val="23"/>
+          <w:szCs w:val="23"/>
+          <w:lang w:eastAsia="en-IN"/>
+        </w:rPr>
+        <w:br/>
+        <w:t xml:space="preserve">        </w:t>
+      </w:r>
+      <w:proofErr w:type="spellStart"/>
+      <w:r>
+        <w:rPr>
+          <w:rFonts w:ascii="Courier New" w:eastAsia="Times New Roman" w:hAnsi="Courier New" w:cs="Courier New"/>
+          <w:color w:val="BCBEC4"/>
+          <w:sz w:val="23"/>
+          <w:szCs w:val="23"/>
+          <w:lang w:eastAsia="en-IN"/>
+        </w:rPr>
+        <w:t>report.setSystemInfo</w:t>
+      </w:r>
+      <w:proofErr w:type="spellEnd"/>
+      <w:r>
+        <w:rPr>
+          <w:rFonts w:ascii="Courier New" w:eastAsia="Times New Roman" w:hAnsi="Courier New" w:cs="Courier New"/>
+          <w:color w:val="BCBEC4"/>
+          <w:sz w:val="23"/>
+          <w:szCs w:val="23"/>
+          <w:lang w:eastAsia="en-IN"/>
+        </w:rPr>
+        <w:t>(</w:t>
+      </w:r>
+      <w:r>
+        <w:rPr>
+          <w:rFonts w:ascii="Courier New" w:eastAsia="Times New Roman" w:hAnsi="Courier New" w:cs="Courier New"/>
+          <w:color w:val="6AAB73"/>
+          <w:sz w:val="23"/>
+          <w:szCs w:val="23"/>
+          <w:lang w:eastAsia="en-IN"/>
+        </w:rPr>
+        <w:t>"Application Name"</w:t>
+      </w:r>
+      <w:r>
+        <w:rPr>
+          <w:rFonts w:ascii="Courier New" w:eastAsia="Times New Roman" w:hAnsi="Courier New" w:cs="Courier New"/>
+          <w:color w:val="BCBEC4"/>
+          <w:sz w:val="23"/>
+          <w:szCs w:val="23"/>
+          <w:lang w:eastAsia="en-IN"/>
+        </w:rPr>
+        <w:t xml:space="preserve">, </w:t>
+      </w:r>
+      <w:r>
+        <w:rPr>
+          <w:rFonts w:ascii="Courier New" w:eastAsia="Times New Roman" w:hAnsi="Courier New" w:cs="Courier New"/>
+          <w:color w:val="6AAB73"/>
+          <w:sz w:val="23"/>
+          <w:szCs w:val="23"/>
+          <w:lang w:eastAsia="en-IN"/>
+        </w:rPr>
+        <w:t>"Google"</w:t>
+      </w:r>
+      <w:r>
+        <w:rPr>
+          <w:rFonts w:ascii="Courier New" w:eastAsia="Times New Roman" w:hAnsi="Courier New" w:cs="Courier New"/>
+          <w:color w:val="BCBEC4"/>
+          <w:sz w:val="23"/>
+          <w:szCs w:val="23"/>
+          <w:lang w:eastAsia="en-IN"/>
+        </w:rPr>
+        <w:t>);</w:t>
+      </w:r>
+      <w:r>
+        <w:rPr>
+          <w:rFonts w:ascii="Courier New" w:eastAsia="Times New Roman" w:hAnsi="Courier New" w:cs="Courier New"/>
+          <w:color w:val="BCBEC4"/>
+          <w:sz w:val="23"/>
+          <w:szCs w:val="23"/>
+          <w:lang w:eastAsia="en-IN"/>
+        </w:rPr>
+        <w:br/>
+        <w:t xml:space="preserve">        </w:t>
+      </w:r>
+      <w:proofErr w:type="spellStart"/>
+      <w:r>
+        <w:rPr>
+          <w:rFonts w:ascii="Courier New" w:eastAsia="Times New Roman" w:hAnsi="Courier New" w:cs="Courier New"/>
+          <w:color w:val="BCBEC4"/>
+          <w:sz w:val="23"/>
+          <w:szCs w:val="23"/>
+          <w:lang w:eastAsia="en-IN"/>
+        </w:rPr>
+        <w:t>report.setSystemInfo</w:t>
+      </w:r>
+      <w:proofErr w:type="spellEnd"/>
+      <w:r>
+        <w:rPr>
+          <w:rFonts w:ascii="Courier New" w:eastAsia="Times New Roman" w:hAnsi="Courier New" w:cs="Courier New"/>
+          <w:color w:val="BCBEC4"/>
+          <w:sz w:val="23"/>
+          <w:szCs w:val="23"/>
+          <w:lang w:eastAsia="en-IN"/>
+        </w:rPr>
+        <w:t>(</w:t>
+      </w:r>
+      <w:r>
+        <w:rPr>
+          <w:rFonts w:ascii="Courier New" w:eastAsia="Times New Roman" w:hAnsi="Courier New" w:cs="Courier New"/>
+          <w:color w:val="6AAB73"/>
+          <w:sz w:val="23"/>
+          <w:szCs w:val="23"/>
+          <w:lang w:eastAsia="en-IN"/>
+        </w:rPr>
+        <w:t>"Operating System"</w:t>
+      </w:r>
+      <w:r>
+        <w:rPr>
+          <w:rFonts w:ascii="Courier New" w:eastAsia="Times New Roman" w:hAnsi="Courier New" w:cs="Courier New"/>
+          <w:color w:val="BCBEC4"/>
+          <w:sz w:val="23"/>
+          <w:szCs w:val="23"/>
+          <w:lang w:eastAsia="en-IN"/>
+        </w:rPr>
+        <w:t xml:space="preserve">, </w:t>
+      </w:r>
+      <w:r>
+        <w:rPr>
+          <w:rFonts w:ascii="Courier New" w:eastAsia="Times New Roman" w:hAnsi="Courier New" w:cs="Courier New"/>
+          <w:color w:val="6AAB73"/>
+          <w:sz w:val="23"/>
+          <w:szCs w:val="23"/>
+          <w:lang w:eastAsia="en-IN"/>
+        </w:rPr>
+        <w:t>"Windows 10"</w:t>
+      </w:r>
+      <w:r>
+        <w:rPr>
+          <w:rFonts w:ascii="Courier New" w:eastAsia="Times New Roman" w:hAnsi="Courier New" w:cs="Courier New"/>
+          <w:color w:val="BCBEC4"/>
+          <w:sz w:val="23"/>
+          <w:szCs w:val="23"/>
+          <w:lang w:eastAsia="en-IN"/>
+        </w:rPr>
+        <w:t>);</w:t>
+      </w:r>
+      <w:r>
+        <w:rPr>
+          <w:rFonts w:ascii="Courier New" w:eastAsia="Times New Roman" w:hAnsi="Courier New" w:cs="Courier New"/>
+          <w:color w:val="BCBEC4"/>
+          <w:sz w:val="23"/>
+          <w:szCs w:val="23"/>
+          <w:lang w:eastAsia="en-IN"/>
+        </w:rPr>
+        <w:br/>
+        <w:t xml:space="preserve">        </w:t>
+      </w:r>
+      <w:proofErr w:type="spellStart"/>
+      <w:r>
+        <w:rPr>
+          <w:rFonts w:ascii="Courier New" w:eastAsia="Times New Roman" w:hAnsi="Courier New" w:cs="Courier New"/>
+          <w:color w:val="BCBEC4"/>
+          <w:sz w:val="23"/>
+          <w:szCs w:val="23"/>
+          <w:lang w:eastAsia="en-IN"/>
+        </w:rPr>
+        <w:t>report.setSystemInfo</w:t>
+      </w:r>
+      <w:proofErr w:type="spellEnd"/>
+      <w:r>
+        <w:rPr>
+          <w:rFonts w:ascii="Courier New" w:eastAsia="Times New Roman" w:hAnsi="Courier New" w:cs="Courier New"/>
+          <w:color w:val="BCBEC4"/>
+          <w:sz w:val="23"/>
+          <w:szCs w:val="23"/>
+          <w:lang w:eastAsia="en-IN"/>
+        </w:rPr>
+        <w:t>(</w:t>
+      </w:r>
+      <w:r>
+        <w:rPr>
+          <w:rFonts w:ascii="Courier New" w:eastAsia="Times New Roman" w:hAnsi="Courier New" w:cs="Courier New"/>
+          <w:color w:val="6AAB73"/>
+          <w:sz w:val="23"/>
+          <w:szCs w:val="23"/>
+          <w:lang w:eastAsia="en-IN"/>
+        </w:rPr>
+        <w:t>"User Name"</w:t>
+      </w:r>
+      <w:r>
+        <w:rPr>
+          <w:rFonts w:ascii="Courier New" w:eastAsia="Times New Roman" w:hAnsi="Courier New" w:cs="Courier New"/>
+          <w:color w:val="BCBEC4"/>
+          <w:sz w:val="23"/>
+          <w:szCs w:val="23"/>
+          <w:lang w:eastAsia="en-IN"/>
+        </w:rPr>
+        <w:t xml:space="preserve">, </w:t>
+      </w:r>
+      <w:r>
+        <w:rPr>
+          <w:rFonts w:ascii="Courier New" w:eastAsia="Times New Roman" w:hAnsi="Courier New" w:cs="Courier New"/>
+          <w:color w:val="6AAB73"/>
+          <w:sz w:val="23"/>
+          <w:szCs w:val="23"/>
+          <w:lang w:eastAsia="en-IN"/>
+        </w:rPr>
+        <w:t>"</w:t>
+      </w:r>
+      <w:proofErr w:type="spellStart"/>
+      <w:r>
+        <w:rPr>
+          <w:rFonts w:ascii="Courier New" w:eastAsia="Times New Roman" w:hAnsi="Courier New" w:cs="Courier New"/>
+          <w:color w:val="6AAB73"/>
+          <w:sz w:val="23"/>
+          <w:szCs w:val="23"/>
+          <w:lang w:eastAsia="en-IN"/>
+        </w:rPr>
+        <w:t>Ila</w:t>
+      </w:r>
+      <w:proofErr w:type="spellEnd"/>
+      <w:r>
+        <w:rPr>
+          <w:rFonts w:ascii="Courier New" w:eastAsia="Times New Roman" w:hAnsi="Courier New" w:cs="Courier New"/>
+          <w:color w:val="6AAB73"/>
+          <w:sz w:val="23"/>
+          <w:szCs w:val="23"/>
+          <w:lang w:eastAsia="en-IN"/>
+        </w:rPr>
+        <w:t xml:space="preserve"> V"</w:t>
+      </w:r>
+      <w:r>
+        <w:rPr>
+          <w:rFonts w:ascii="Courier New" w:eastAsia="Times New Roman" w:hAnsi="Courier New" w:cs="Courier New"/>
+          <w:color w:val="BCBEC4"/>
+          <w:sz w:val="23"/>
+          <w:szCs w:val="23"/>
+          <w:lang w:eastAsia="en-IN"/>
+        </w:rPr>
+        <w:t>);</w:t>
+      </w:r>
+      <w:r>
+        <w:rPr>
+          <w:rFonts w:ascii="Courier New" w:eastAsia="Times New Roman" w:hAnsi="Courier New" w:cs="Courier New"/>
+          <w:color w:val="BCBEC4"/>
+          <w:sz w:val="23"/>
+          <w:szCs w:val="23"/>
+          <w:lang w:eastAsia="en-IN"/>
+        </w:rPr>
+        <w:br/>
+        <w:t xml:space="preserve">        </w:t>
+      </w:r>
+      <w:proofErr w:type="spellStart"/>
+      <w:r>
+        <w:rPr>
+          <w:rFonts w:ascii="Courier New" w:eastAsia="Times New Roman" w:hAnsi="Courier New" w:cs="Courier New"/>
+          <w:color w:val="BCBEC4"/>
+          <w:sz w:val="23"/>
+          <w:szCs w:val="23"/>
+          <w:lang w:eastAsia="en-IN"/>
+        </w:rPr>
+        <w:t>report.setSystemInfo</w:t>
+      </w:r>
+      <w:proofErr w:type="spellEnd"/>
+      <w:r>
+        <w:rPr>
+          <w:rFonts w:ascii="Courier New" w:eastAsia="Times New Roman" w:hAnsi="Courier New" w:cs="Courier New"/>
+          <w:color w:val="BCBEC4"/>
+          <w:sz w:val="23"/>
+          <w:szCs w:val="23"/>
+          <w:lang w:eastAsia="en-IN"/>
+        </w:rPr>
+        <w:t>(</w:t>
+      </w:r>
+      <w:r>
+        <w:rPr>
+          <w:rFonts w:ascii="Courier New" w:eastAsia="Times New Roman" w:hAnsi="Courier New" w:cs="Courier New"/>
+          <w:color w:val="6AAB73"/>
+          <w:sz w:val="23"/>
+          <w:szCs w:val="23"/>
+          <w:lang w:eastAsia="en-IN"/>
+        </w:rPr>
+        <w:t>"Browser"</w:t>
+      </w:r>
+      <w:r>
+        <w:rPr>
+          <w:rFonts w:ascii="Courier New" w:eastAsia="Times New Roman" w:hAnsi="Courier New" w:cs="Courier New"/>
+          <w:color w:val="BCBEC4"/>
+          <w:sz w:val="23"/>
+          <w:szCs w:val="23"/>
+          <w:lang w:eastAsia="en-IN"/>
+        </w:rPr>
+        <w:t xml:space="preserve">, </w:t>
+      </w:r>
+      <w:r>
+        <w:rPr>
+          <w:rFonts w:ascii="Courier New" w:eastAsia="Times New Roman" w:hAnsi="Courier New" w:cs="Courier New"/>
+          <w:color w:val="6AAB73"/>
+          <w:sz w:val="23"/>
+          <w:szCs w:val="23"/>
+          <w:lang w:eastAsia="en-IN"/>
+        </w:rPr>
+        <w:t>"Chrome"</w:t>
+      </w:r>
+      <w:r>
+        <w:rPr>
+          <w:rFonts w:ascii="Courier New" w:eastAsia="Times New Roman" w:hAnsi="Courier New" w:cs="Courier New"/>
+          <w:color w:val="BCBEC4"/>
+          <w:sz w:val="23"/>
+          <w:szCs w:val="23"/>
+          <w:lang w:eastAsia="en-IN"/>
+        </w:rPr>
+        <w:t>);</w:t>
+      </w:r>
+      <w:r>
+        <w:rPr>
+          <w:rFonts w:ascii="Courier New" w:eastAsia="Times New Roman" w:hAnsi="Courier New" w:cs="Courier New"/>
+          <w:color w:val="BCBEC4"/>
+          <w:sz w:val="23"/>
+          <w:szCs w:val="23"/>
+          <w:lang w:eastAsia="en-IN"/>
+        </w:rPr>
+        <w:br/>
+        <w:t xml:space="preserve">        </w:t>
+      </w:r>
+      <w:proofErr w:type="spellStart"/>
+      <w:r>
+        <w:rPr>
+          <w:rFonts w:ascii="Courier New" w:eastAsia="Times New Roman" w:hAnsi="Courier New" w:cs="Courier New"/>
+          <w:color w:val="BCBEC4"/>
+          <w:sz w:val="23"/>
+          <w:szCs w:val="23"/>
+          <w:lang w:eastAsia="en-IN"/>
+        </w:rPr>
+        <w:t>report.setSystemInfo</w:t>
+      </w:r>
+      <w:proofErr w:type="spellEnd"/>
+      <w:r>
+        <w:rPr>
+          <w:rFonts w:ascii="Courier New" w:eastAsia="Times New Roman" w:hAnsi="Courier New" w:cs="Courier New"/>
+          <w:color w:val="BCBEC4"/>
+          <w:sz w:val="23"/>
+          <w:szCs w:val="23"/>
+          <w:lang w:eastAsia="en-IN"/>
+        </w:rPr>
+        <w:t>(</w:t>
+      </w:r>
+      <w:r>
+        <w:rPr>
+          <w:rFonts w:ascii="Courier New" w:eastAsia="Times New Roman" w:hAnsi="Courier New" w:cs="Courier New"/>
+          <w:color w:val="6AAB73"/>
+          <w:sz w:val="23"/>
+          <w:szCs w:val="23"/>
+          <w:lang w:eastAsia="en-IN"/>
+        </w:rPr>
+        <w:t>"Processor"</w:t>
+      </w:r>
+      <w:r>
+        <w:rPr>
+          <w:rFonts w:ascii="Courier New" w:eastAsia="Times New Roman" w:hAnsi="Courier New" w:cs="Courier New"/>
+          <w:color w:val="BCBEC4"/>
+          <w:sz w:val="23"/>
+          <w:szCs w:val="23"/>
+          <w:lang w:eastAsia="en-IN"/>
+        </w:rPr>
+        <w:t xml:space="preserve">, </w:t>
+      </w:r>
+      <w:r>
+        <w:rPr>
+          <w:rFonts w:ascii="Courier New" w:eastAsia="Times New Roman" w:hAnsi="Courier New" w:cs="Courier New"/>
+          <w:color w:val="6AAB73"/>
+          <w:sz w:val="23"/>
+          <w:szCs w:val="23"/>
+          <w:lang w:eastAsia="en-IN"/>
+        </w:rPr>
+        <w:t>"I5"</w:t>
+      </w:r>
+      <w:r>
+        <w:rPr>
+          <w:rFonts w:ascii="Courier New" w:eastAsia="Times New Roman" w:hAnsi="Courier New" w:cs="Courier New"/>
+          <w:color w:val="BCBEC4"/>
+          <w:sz w:val="23"/>
+          <w:szCs w:val="23"/>
+          <w:lang w:eastAsia="en-IN"/>
+        </w:rPr>
+        <w:t>);</w:t>
+      </w:r>
+      <w:r>
+        <w:rPr>
+          <w:rFonts w:ascii="Courier New" w:eastAsia="Times New Roman" w:hAnsi="Courier New" w:cs="Courier New"/>
+          <w:color w:val="BCBEC4"/>
+          <w:sz w:val="23"/>
+          <w:szCs w:val="23"/>
+          <w:lang w:eastAsia="en-IN"/>
+        </w:rPr>
+        <w:br/>
+      </w:r>
+      <w:r>
+        <w:rPr>
+          <w:rFonts w:ascii="Courier New" w:eastAsia="Times New Roman" w:hAnsi="Courier New" w:cs="Courier New"/>
+          <w:color w:val="BCBEC4"/>
+          <w:sz w:val="23"/>
+          <w:szCs w:val="23"/>
+          <w:lang w:eastAsia="en-IN"/>
+        </w:rPr>
+        <w:br/>
+        <w:t xml:space="preserve">        </w:t>
+      </w:r>
+      <w:r>
+        <w:rPr>
+          <w:rFonts w:ascii="Courier New" w:eastAsia="Times New Roman" w:hAnsi="Courier New" w:cs="Courier New"/>
+          <w:color w:val="7A7E85"/>
+          <w:sz w:val="23"/>
+          <w:szCs w:val="23"/>
+          <w:lang w:eastAsia="en-IN"/>
+        </w:rPr>
+        <w:t>//Configuration of look and feel of the report</w:t>
+      </w:r>
+      <w:r>
+        <w:rPr>
+          <w:rFonts w:ascii="Courier New" w:eastAsia="Times New Roman" w:hAnsi="Courier New" w:cs="Courier New"/>
+          <w:color w:val="7A7E85"/>
+          <w:sz w:val="23"/>
+          <w:szCs w:val="23"/>
+          <w:lang w:eastAsia="en-IN"/>
+        </w:rPr>
+        <w:br/>
+        <w:t xml:space="preserve">        </w:t>
+      </w:r>
+      <w:proofErr w:type="spellStart"/>
+      <w:r>
+        <w:rPr>
+          <w:rFonts w:ascii="Courier New" w:eastAsia="Times New Roman" w:hAnsi="Courier New" w:cs="Courier New"/>
+          <w:color w:val="BCBEC4"/>
+          <w:sz w:val="23"/>
+          <w:szCs w:val="23"/>
+          <w:lang w:eastAsia="en-IN"/>
+        </w:rPr>
+        <w:t>htmlReport.config</w:t>
+      </w:r>
+      <w:proofErr w:type="spellEnd"/>
+      <w:r>
+        <w:rPr>
+          <w:rFonts w:ascii="Courier New" w:eastAsia="Times New Roman" w:hAnsi="Courier New" w:cs="Courier New"/>
+          <w:color w:val="BCBEC4"/>
+          <w:sz w:val="23"/>
+          <w:szCs w:val="23"/>
+          <w:lang w:eastAsia="en-IN"/>
+        </w:rPr>
+        <w:t>().</w:t>
+      </w:r>
+      <w:proofErr w:type="spellStart"/>
+      <w:r>
+        <w:rPr>
+          <w:rFonts w:ascii="Courier New" w:eastAsia="Times New Roman" w:hAnsi="Courier New" w:cs="Courier New"/>
+          <w:color w:val="BCBEC4"/>
+          <w:sz w:val="23"/>
+          <w:szCs w:val="23"/>
+          <w:lang w:eastAsia="en-IN"/>
+        </w:rPr>
+        <w:t>setDocumentTitle</w:t>
+      </w:r>
+      <w:proofErr w:type="spellEnd"/>
+      <w:r>
+        <w:rPr>
+          <w:rFonts w:ascii="Courier New" w:eastAsia="Times New Roman" w:hAnsi="Courier New" w:cs="Courier New"/>
+          <w:color w:val="BCBEC4"/>
+          <w:sz w:val="23"/>
+          <w:szCs w:val="23"/>
+          <w:lang w:eastAsia="en-IN"/>
+        </w:rPr>
+        <w:t>(</w:t>
+      </w:r>
+      <w:r>
+        <w:rPr>
+          <w:rFonts w:ascii="Courier New" w:eastAsia="Times New Roman" w:hAnsi="Courier New" w:cs="Courier New"/>
+          <w:color w:val="6AAB73"/>
+          <w:sz w:val="23"/>
+          <w:szCs w:val="23"/>
+          <w:lang w:eastAsia="en-IN"/>
+        </w:rPr>
+        <w:t>"My First Extent Report"</w:t>
+      </w:r>
+      <w:r>
+        <w:rPr>
+          <w:rFonts w:ascii="Courier New" w:eastAsia="Times New Roman" w:hAnsi="Courier New" w:cs="Courier New"/>
+          <w:color w:val="BCBEC4"/>
+          <w:sz w:val="23"/>
+          <w:szCs w:val="23"/>
+          <w:lang w:eastAsia="en-IN"/>
+        </w:rPr>
+        <w:t>);</w:t>
+      </w:r>
+      <w:r>
+        <w:rPr>
+          <w:rFonts w:ascii="Courier New" w:eastAsia="Times New Roman" w:hAnsi="Courier New" w:cs="Courier New"/>
+          <w:color w:val="BCBEC4"/>
+          <w:sz w:val="23"/>
+          <w:szCs w:val="23"/>
+          <w:lang w:eastAsia="en-IN"/>
+        </w:rPr>
+        <w:br/>
+        <w:t xml:space="preserve">        </w:t>
+      </w:r>
+      <w:proofErr w:type="spellStart"/>
+      <w:r>
+        <w:rPr>
+          <w:rFonts w:ascii="Courier New" w:eastAsia="Times New Roman" w:hAnsi="Courier New" w:cs="Courier New"/>
+          <w:color w:val="BCBEC4"/>
+          <w:sz w:val="23"/>
+          <w:szCs w:val="23"/>
+          <w:lang w:eastAsia="en-IN"/>
+        </w:rPr>
+        <w:t>htmlReport.config</w:t>
+      </w:r>
+      <w:proofErr w:type="spellEnd"/>
+      <w:r>
+        <w:rPr>
+          <w:rFonts w:ascii="Courier New" w:eastAsia="Times New Roman" w:hAnsi="Courier New" w:cs="Courier New"/>
+          <w:color w:val="BCBEC4"/>
+          <w:sz w:val="23"/>
+          <w:szCs w:val="23"/>
+          <w:lang w:eastAsia="en-IN"/>
+        </w:rPr>
+        <w:t>().</w:t>
+      </w:r>
+      <w:proofErr w:type="spellStart"/>
+      <w:r>
+        <w:rPr>
+          <w:rFonts w:ascii="Courier New" w:eastAsia="Times New Roman" w:hAnsi="Courier New" w:cs="Courier New"/>
+          <w:color w:val="BCBEC4"/>
+          <w:sz w:val="23"/>
+          <w:szCs w:val="23"/>
+          <w:lang w:eastAsia="en-IN"/>
+        </w:rPr>
+        <w:t>setReportName</w:t>
+      </w:r>
+      <w:proofErr w:type="spellEnd"/>
+      <w:r>
+        <w:rPr>
+          <w:rFonts w:ascii="Courier New" w:eastAsia="Times New Roman" w:hAnsi="Courier New" w:cs="Courier New"/>
+          <w:color w:val="BCBEC4"/>
+          <w:sz w:val="23"/>
+          <w:szCs w:val="23"/>
+          <w:lang w:eastAsia="en-IN"/>
+        </w:rPr>
+        <w:t>(</w:t>
+      </w:r>
+      <w:r>
+        <w:rPr>
+          <w:rFonts w:ascii="Courier New" w:eastAsia="Times New Roman" w:hAnsi="Courier New" w:cs="Courier New"/>
+          <w:color w:val="6AAB73"/>
+          <w:sz w:val="23"/>
+          <w:szCs w:val="23"/>
+          <w:lang w:eastAsia="en-IN"/>
+        </w:rPr>
+        <w:t>"Google Report"</w:t>
+      </w:r>
+      <w:r>
+        <w:rPr>
+          <w:rFonts w:ascii="Courier New" w:eastAsia="Times New Roman" w:hAnsi="Courier New" w:cs="Courier New"/>
+          <w:color w:val="BCBEC4"/>
+          <w:sz w:val="23"/>
+          <w:szCs w:val="23"/>
+          <w:lang w:eastAsia="en-IN"/>
+        </w:rPr>
+        <w:t>);</w:t>
+      </w:r>
+      <w:r>
+        <w:rPr>
+          <w:rFonts w:ascii="Courier New" w:eastAsia="Times New Roman" w:hAnsi="Courier New" w:cs="Courier New"/>
+          <w:color w:val="BCBEC4"/>
+          <w:sz w:val="23"/>
+          <w:szCs w:val="23"/>
+          <w:lang w:eastAsia="en-IN"/>
+        </w:rPr>
+        <w:br/>
+        <w:t xml:space="preserve">        </w:t>
+      </w:r>
+      <w:proofErr w:type="spellStart"/>
+      <w:r>
+        <w:rPr>
+          <w:rFonts w:ascii="Courier New" w:eastAsia="Times New Roman" w:hAnsi="Courier New" w:cs="Courier New"/>
+          <w:color w:val="BCBEC4"/>
+          <w:sz w:val="23"/>
+          <w:szCs w:val="23"/>
+          <w:lang w:eastAsia="en-IN"/>
+        </w:rPr>
+        <w:t>htmlReport.config</w:t>
+      </w:r>
+      <w:proofErr w:type="spellEnd"/>
+      <w:r>
+        <w:rPr>
+          <w:rFonts w:ascii="Courier New" w:eastAsia="Times New Roman" w:hAnsi="Courier New" w:cs="Courier New"/>
+          <w:color w:val="BCBEC4"/>
+          <w:sz w:val="23"/>
+          <w:szCs w:val="23"/>
+          <w:lang w:eastAsia="en-IN"/>
+        </w:rPr>
+        <w:t>().</w:t>
+      </w:r>
+      <w:proofErr w:type="spellStart"/>
+      <w:r>
+        <w:rPr>
+          <w:rFonts w:ascii="Courier New" w:eastAsia="Times New Roman" w:hAnsi="Courier New" w:cs="Courier New"/>
+          <w:color w:val="BCBEC4"/>
+          <w:sz w:val="23"/>
+          <w:szCs w:val="23"/>
+          <w:lang w:eastAsia="en-IN"/>
+        </w:rPr>
+        <w:t>setTheme</w:t>
+      </w:r>
+      <w:proofErr w:type="spellEnd"/>
+      <w:r>
+        <w:rPr>
+          <w:rFonts w:ascii="Courier New" w:eastAsia="Times New Roman" w:hAnsi="Courier New" w:cs="Courier New"/>
+          <w:color w:val="BCBEC4"/>
+          <w:sz w:val="23"/>
+          <w:szCs w:val="23"/>
+          <w:lang w:eastAsia="en-IN"/>
+        </w:rPr>
+        <w:t>(</w:t>
+      </w:r>
+      <w:proofErr w:type="spellStart"/>
+      <w:r>
+        <w:rPr>
+          <w:rFonts w:ascii="Courier New" w:eastAsia="Times New Roman" w:hAnsi="Courier New" w:cs="Courier New"/>
+          <w:color w:val="BCBEC4"/>
+          <w:sz w:val="23"/>
+          <w:szCs w:val="23"/>
+          <w:lang w:eastAsia="en-IN"/>
+        </w:rPr>
+        <w:t>Theme.</w:t>
+      </w:r>
+      <w:r>
+        <w:rPr>
+          <w:rFonts w:ascii="Courier New" w:eastAsia="Times New Roman" w:hAnsi="Courier New" w:cs="Courier New"/>
+          <w:i/>
+          <w:iCs/>
+          <w:color w:val="C77DBB"/>
+          <w:sz w:val="23"/>
+          <w:szCs w:val="23"/>
+          <w:lang w:eastAsia="en-IN"/>
+        </w:rPr>
+        <w:t>STANDARD</w:t>
+      </w:r>
+      <w:proofErr w:type="spellEnd"/>
+      <w:r>
+        <w:rPr>
+          <w:rFonts w:ascii="Courier New" w:eastAsia="Times New Roman" w:hAnsi="Courier New" w:cs="Courier New"/>
+          <w:color w:val="BCBEC4"/>
+          <w:sz w:val="23"/>
+          <w:szCs w:val="23"/>
+          <w:lang w:eastAsia="en-IN"/>
+        </w:rPr>
+        <w:t>);</w:t>
+      </w:r>
+      <w:r>
+        <w:rPr>
+          <w:rFonts w:ascii="Courier New" w:eastAsia="Times New Roman" w:hAnsi="Courier New" w:cs="Courier New"/>
+          <w:color w:val="BCBEC4"/>
+          <w:sz w:val="23"/>
+          <w:szCs w:val="23"/>
+          <w:lang w:eastAsia="en-IN"/>
+        </w:rPr>
+        <w:br/>
+        <w:t xml:space="preserve">        </w:t>
+      </w:r>
+      <w:proofErr w:type="spellStart"/>
+      <w:r>
+        <w:rPr>
+          <w:rFonts w:ascii="Courier New" w:eastAsia="Times New Roman" w:hAnsi="Courier New" w:cs="Courier New"/>
+          <w:color w:val="BCBEC4"/>
+          <w:sz w:val="23"/>
+          <w:szCs w:val="23"/>
+          <w:lang w:eastAsia="en-IN"/>
+        </w:rPr>
+        <w:t>htmlReport.config</w:t>
+      </w:r>
+      <w:proofErr w:type="spellEnd"/>
+      <w:r>
+        <w:rPr>
+          <w:rFonts w:ascii="Courier New" w:eastAsia="Times New Roman" w:hAnsi="Courier New" w:cs="Courier New"/>
+          <w:color w:val="BCBEC4"/>
+          <w:sz w:val="23"/>
+          <w:szCs w:val="23"/>
+          <w:lang w:eastAsia="en-IN"/>
+        </w:rPr>
+        <w:t>().</w:t>
+      </w:r>
+      <w:proofErr w:type="spellStart"/>
+      <w:r>
+        <w:rPr>
+          <w:rFonts w:ascii="Courier New" w:eastAsia="Times New Roman" w:hAnsi="Courier New" w:cs="Courier New"/>
+          <w:color w:val="BCBEC4"/>
+          <w:sz w:val="23"/>
+          <w:szCs w:val="23"/>
+          <w:lang w:eastAsia="en-IN"/>
+        </w:rPr>
+        <w:t>setTimeStampFormat</w:t>
+      </w:r>
+      <w:proofErr w:type="spellEnd"/>
+      <w:r>
+        <w:rPr>
+          <w:rFonts w:ascii="Courier New" w:eastAsia="Times New Roman" w:hAnsi="Courier New" w:cs="Courier New"/>
+          <w:color w:val="BCBEC4"/>
+          <w:sz w:val="23"/>
+          <w:szCs w:val="23"/>
+          <w:lang w:eastAsia="en-IN"/>
+        </w:rPr>
+        <w:t>(</w:t>
+      </w:r>
+      <w:r>
+        <w:rPr>
+          <w:rFonts w:ascii="Courier New" w:eastAsia="Times New Roman" w:hAnsi="Courier New" w:cs="Courier New"/>
+          <w:color w:val="6AAB73"/>
+          <w:sz w:val="23"/>
+          <w:szCs w:val="23"/>
+          <w:lang w:eastAsia="en-IN"/>
+        </w:rPr>
+        <w:t>"</w:t>
+      </w:r>
+      <w:proofErr w:type="spellStart"/>
+      <w:r>
+        <w:rPr>
+          <w:rFonts w:ascii="Courier New" w:eastAsia="Times New Roman" w:hAnsi="Courier New" w:cs="Courier New"/>
+          <w:color w:val="6AAB73"/>
+          <w:sz w:val="23"/>
+          <w:szCs w:val="23"/>
+          <w:lang w:eastAsia="en-IN"/>
+        </w:rPr>
+        <w:t>dd</w:t>
+      </w:r>
+      <w:proofErr w:type="spellEnd"/>
+      <w:r>
+        <w:rPr>
+          <w:rFonts w:ascii="Courier New" w:eastAsia="Times New Roman" w:hAnsi="Courier New" w:cs="Courier New"/>
+          <w:color w:val="6AAB73"/>
+          <w:sz w:val="23"/>
+          <w:szCs w:val="23"/>
+          <w:lang w:eastAsia="en-IN"/>
+        </w:rPr>
+        <w:t>-MMM-</w:t>
+      </w:r>
+      <w:proofErr w:type="spellStart"/>
+      <w:r>
+        <w:rPr>
+          <w:rFonts w:ascii="Courier New" w:eastAsia="Times New Roman" w:hAnsi="Courier New" w:cs="Courier New"/>
+          <w:color w:val="6AAB73"/>
+          <w:sz w:val="23"/>
+          <w:szCs w:val="23"/>
+          <w:lang w:eastAsia="en-IN"/>
+        </w:rPr>
+        <w:t>yyyy</w:t>
+      </w:r>
+      <w:proofErr w:type="spellEnd"/>
+      <w:r>
+        <w:rPr>
+          <w:rFonts w:ascii="Courier New" w:eastAsia="Times New Roman" w:hAnsi="Courier New" w:cs="Courier New"/>
+          <w:color w:val="6AAB73"/>
+          <w:sz w:val="23"/>
+          <w:szCs w:val="23"/>
+          <w:lang w:eastAsia="en-IN"/>
+        </w:rPr>
+        <w:t>"</w:t>
+      </w:r>
+      <w:r>
+        <w:rPr>
+          <w:rFonts w:ascii="Courier New" w:eastAsia="Times New Roman" w:hAnsi="Courier New" w:cs="Courier New"/>
+          <w:color w:val="BCBEC4"/>
+          <w:sz w:val="23"/>
+          <w:szCs w:val="23"/>
+          <w:lang w:eastAsia="en-IN"/>
+        </w:rPr>
+        <w:t>);</w:t>
+      </w:r>
+      <w:r>
+        <w:rPr>
+          <w:rFonts w:ascii="Courier New" w:eastAsia="Times New Roman" w:hAnsi="Courier New" w:cs="Courier New"/>
+          <w:color w:val="BCBEC4"/>
+          <w:sz w:val="23"/>
+          <w:szCs w:val="23"/>
+          <w:lang w:eastAsia="en-IN"/>
+        </w:rPr>
+        <w:br/>
+      </w:r>
+      <w:r>
+        <w:rPr>
+          <w:rFonts w:ascii="Courier New" w:eastAsia="Times New Roman" w:hAnsi="Courier New" w:cs="Courier New"/>
+          <w:color w:val="BCBEC4"/>
+          <w:sz w:val="23"/>
+          <w:szCs w:val="23"/>
+          <w:lang w:eastAsia="en-IN"/>
+        </w:rPr>
+        <w:br/>
+        <w:t xml:space="preserve">        test = </w:t>
+      </w:r>
+      <w:proofErr w:type="spellStart"/>
+      <w:r>
+        <w:rPr>
+          <w:rFonts w:ascii="Courier New" w:eastAsia="Times New Roman" w:hAnsi="Courier New" w:cs="Courier New"/>
+          <w:color w:val="BCBEC4"/>
+          <w:sz w:val="23"/>
+          <w:szCs w:val="23"/>
+          <w:lang w:eastAsia="en-IN"/>
+        </w:rPr>
+        <w:t>report.createTest</w:t>
+      </w:r>
+      <w:proofErr w:type="spellEnd"/>
+      <w:r>
+        <w:rPr>
+          <w:rFonts w:ascii="Courier New" w:eastAsia="Times New Roman" w:hAnsi="Courier New" w:cs="Courier New"/>
+          <w:color w:val="BCBEC4"/>
+          <w:sz w:val="23"/>
+          <w:szCs w:val="23"/>
+          <w:lang w:eastAsia="en-IN"/>
+        </w:rPr>
+        <w:t>(</w:t>
+      </w:r>
+      <w:r>
+        <w:rPr>
+          <w:rFonts w:ascii="Courier New" w:eastAsia="Times New Roman" w:hAnsi="Courier New" w:cs="Courier New"/>
+          <w:color w:val="6AAB73"/>
+          <w:sz w:val="23"/>
+          <w:szCs w:val="23"/>
+          <w:lang w:eastAsia="en-IN"/>
+        </w:rPr>
+        <w:t>"Google Title Test"</w:t>
+      </w:r>
+      <w:r>
+        <w:rPr>
+          <w:rFonts w:ascii="Courier New" w:eastAsia="Times New Roman" w:hAnsi="Courier New" w:cs="Courier New"/>
+          <w:color w:val="BCBEC4"/>
+          <w:sz w:val="23"/>
+          <w:szCs w:val="23"/>
+          <w:lang w:eastAsia="en-IN"/>
+        </w:rPr>
+        <w:t>);</w:t>
+      </w:r>
+      <w:r>
+        <w:rPr>
+          <w:rFonts w:ascii="Courier New" w:eastAsia="Times New Roman" w:hAnsi="Courier New" w:cs="Courier New"/>
+          <w:color w:val="BCBEC4"/>
+          <w:sz w:val="23"/>
+          <w:szCs w:val="23"/>
+          <w:lang w:eastAsia="en-IN"/>
+        </w:rPr>
+        <w:br/>
+      </w:r>
+      <w:r>
+        <w:rPr>
+          <w:rFonts w:ascii="Courier New" w:eastAsia="Times New Roman" w:hAnsi="Courier New" w:cs="Courier New"/>
+          <w:color w:val="BCBEC4"/>
+          <w:sz w:val="23"/>
+          <w:szCs w:val="23"/>
+          <w:lang w:eastAsia="en-IN"/>
+        </w:rPr>
+        <w:br/>
+        <w:t xml:space="preserve">        driver = </w:t>
+      </w:r>
+      <w:r>
+        <w:rPr>
+          <w:rFonts w:ascii="Courier New" w:eastAsia="Times New Roman" w:hAnsi="Courier New" w:cs="Courier New"/>
+          <w:color w:val="CF8E6D"/>
+          <w:sz w:val="23"/>
+          <w:szCs w:val="23"/>
+          <w:lang w:eastAsia="en-IN"/>
+        </w:rPr>
+        <w:t xml:space="preserve">new </w:t>
+      </w:r>
+      <w:r>
+        <w:rPr>
+          <w:rFonts w:ascii="Courier New" w:eastAsia="Times New Roman" w:hAnsi="Courier New" w:cs="Courier New"/>
+          <w:color w:val="BCBEC4"/>
+          <w:sz w:val="23"/>
+          <w:szCs w:val="23"/>
+          <w:lang w:eastAsia="en-IN"/>
+        </w:rPr>
+        <w:t>ChromeDriver();</w:t>
+      </w:r>
+      <w:r>
+        <w:rPr>
+          <w:rFonts w:ascii="Courier New" w:eastAsia="Times New Roman" w:hAnsi="Courier New" w:cs="Courier New"/>
+          <w:color w:val="BCBEC4"/>
+          <w:sz w:val="23"/>
+          <w:szCs w:val="23"/>
+          <w:lang w:eastAsia="en-IN"/>
+        </w:rPr>
+        <w:br/>
+      </w:r>
+      <w:r>
+        <w:rPr>
+          <w:rFonts w:ascii="Courier New" w:eastAsia="Times New Roman" w:hAnsi="Courier New" w:cs="Courier New"/>
+          <w:color w:val="BCBEC4"/>
+          <w:sz w:val="23"/>
+          <w:szCs w:val="23"/>
+          <w:lang w:eastAsia="en-IN"/>
+        </w:rPr>
+        <w:lastRenderedPageBreak/>
+        <w:t xml:space="preserve">        </w:t>
+      </w:r>
+      <w:proofErr w:type="spellStart"/>
+      <w:r>
+        <w:rPr>
+          <w:rFonts w:ascii="Courier New" w:eastAsia="Times New Roman" w:hAnsi="Courier New" w:cs="Courier New"/>
+          <w:color w:val="BCBEC4"/>
+          <w:sz w:val="23"/>
+          <w:szCs w:val="23"/>
+          <w:lang w:eastAsia="en-IN"/>
+        </w:rPr>
+        <w:t>driver.manage</w:t>
+      </w:r>
+      <w:proofErr w:type="spellEnd"/>
+      <w:r>
+        <w:rPr>
+          <w:rFonts w:ascii="Courier New" w:eastAsia="Times New Roman" w:hAnsi="Courier New" w:cs="Courier New"/>
+          <w:color w:val="BCBEC4"/>
+          <w:sz w:val="23"/>
+          <w:szCs w:val="23"/>
+          <w:lang w:eastAsia="en-IN"/>
+        </w:rPr>
+        <w:t>().window().maximize();</w:t>
+      </w:r>
+      <w:r>
+        <w:rPr>
+          <w:rFonts w:ascii="Courier New" w:eastAsia="Times New Roman" w:hAnsi="Courier New" w:cs="Courier New"/>
+          <w:color w:val="BCBEC4"/>
+          <w:sz w:val="23"/>
+          <w:szCs w:val="23"/>
+          <w:lang w:eastAsia="en-IN"/>
+        </w:rPr>
+        <w:br/>
+        <w:t xml:space="preserve">        driver.manage().timeouts().implicitlyWait(Duration.</w:t>
+      </w:r>
+      <w:r>
+        <w:rPr>
+          <w:rFonts w:ascii="Courier New" w:eastAsia="Times New Roman" w:hAnsi="Courier New" w:cs="Courier New"/>
+          <w:i/>
+          <w:iCs/>
+          <w:color w:val="BCBEC4"/>
+          <w:sz w:val="23"/>
+          <w:szCs w:val="23"/>
+          <w:lang w:eastAsia="en-IN"/>
+        </w:rPr>
+        <w:t>ofSeconds</w:t>
+      </w:r>
+      <w:r>
+        <w:rPr>
+          <w:rFonts w:ascii="Courier New" w:eastAsia="Times New Roman" w:hAnsi="Courier New" w:cs="Courier New"/>
+          <w:color w:val="BCBEC4"/>
+          <w:sz w:val="23"/>
+          <w:szCs w:val="23"/>
+          <w:lang w:eastAsia="en-IN"/>
+        </w:rPr>
+        <w:t>(</w:t>
+      </w:r>
+      <w:r>
+        <w:rPr>
+          <w:rFonts w:ascii="Courier New" w:eastAsia="Times New Roman" w:hAnsi="Courier New" w:cs="Courier New"/>
+          <w:color w:val="2AACB8"/>
+          <w:sz w:val="23"/>
+          <w:szCs w:val="23"/>
+          <w:lang w:eastAsia="en-IN"/>
+        </w:rPr>
+        <w:t>10</w:t>
+      </w:r>
+      <w:r>
+        <w:rPr>
+          <w:rFonts w:ascii="Courier New" w:eastAsia="Times New Roman" w:hAnsi="Courier New" w:cs="Courier New"/>
+          <w:color w:val="BCBEC4"/>
+          <w:sz w:val="23"/>
+          <w:szCs w:val="23"/>
+          <w:lang w:eastAsia="en-IN"/>
+        </w:rPr>
+        <w:t>));</w:t>
+      </w:r>
+      <w:r>
+        <w:rPr>
+          <w:rFonts w:ascii="Courier New" w:eastAsia="Times New Roman" w:hAnsi="Courier New" w:cs="Courier New"/>
+          <w:color w:val="BCBEC4"/>
+          <w:sz w:val="23"/>
+          <w:szCs w:val="23"/>
+          <w:lang w:eastAsia="en-IN"/>
+        </w:rPr>
+        <w:br/>
+      </w:r>
+      <w:r>
+        <w:rPr>
+          <w:rFonts w:ascii="Courier New" w:eastAsia="Times New Roman" w:hAnsi="Courier New" w:cs="Courier New"/>
+          <w:color w:val="BCBEC4"/>
+          <w:sz w:val="23"/>
+          <w:szCs w:val="23"/>
+          <w:lang w:eastAsia="en-IN"/>
+        </w:rPr>
+        <w:br/>
+        <w:t xml:space="preserve">        </w:t>
+      </w:r>
+      <w:proofErr w:type="spellStart"/>
+      <w:r>
+        <w:rPr>
+          <w:rFonts w:ascii="Courier New" w:eastAsia="Times New Roman" w:hAnsi="Courier New" w:cs="Courier New"/>
+          <w:color w:val="BCBEC4"/>
+          <w:sz w:val="23"/>
+          <w:szCs w:val="23"/>
+          <w:lang w:eastAsia="en-IN"/>
+        </w:rPr>
+        <w:t>driver.get</w:t>
+      </w:r>
+      <w:proofErr w:type="spellEnd"/>
+      <w:r>
+        <w:rPr>
+          <w:rFonts w:ascii="Courier New" w:eastAsia="Times New Roman" w:hAnsi="Courier New" w:cs="Courier New"/>
+          <w:color w:val="BCBEC4"/>
+          <w:sz w:val="23"/>
+          <w:szCs w:val="23"/>
+          <w:lang w:eastAsia="en-IN"/>
+        </w:rPr>
+        <w:t>(</w:t>
+      </w:r>
+      <w:r>
+        <w:rPr>
+          <w:rFonts w:ascii="Courier New" w:eastAsia="Times New Roman" w:hAnsi="Courier New" w:cs="Courier New"/>
+          <w:color w:val="6AAB73"/>
+          <w:sz w:val="23"/>
+          <w:szCs w:val="23"/>
+          <w:lang w:eastAsia="en-IN"/>
+        </w:rPr>
+        <w:t>"https://www.google.com"</w:t>
+      </w:r>
+      <w:r>
+        <w:rPr>
+          <w:rFonts w:ascii="Courier New" w:eastAsia="Times New Roman" w:hAnsi="Courier New" w:cs="Courier New"/>
+          <w:color w:val="BCBEC4"/>
+          <w:sz w:val="23"/>
+          <w:szCs w:val="23"/>
+          <w:lang w:eastAsia="en-IN"/>
+        </w:rPr>
+        <w:t>);</w:t>
+      </w:r>
+      <w:r>
+        <w:rPr>
+          <w:rFonts w:ascii="Courier New" w:eastAsia="Times New Roman" w:hAnsi="Courier New" w:cs="Courier New"/>
+          <w:color w:val="BCBEC4"/>
+          <w:sz w:val="23"/>
+          <w:szCs w:val="23"/>
+          <w:lang w:eastAsia="en-IN"/>
+        </w:rPr>
+        <w:br/>
+        <w:t xml:space="preserve">        </w:t>
+      </w:r>
+      <w:proofErr w:type="spellStart"/>
+      <w:r>
+        <w:rPr>
+          <w:rFonts w:ascii="Courier New" w:eastAsia="Times New Roman" w:hAnsi="Courier New" w:cs="Courier New"/>
+          <w:color w:val="BCBEC4"/>
+          <w:sz w:val="23"/>
+          <w:szCs w:val="23"/>
+          <w:lang w:eastAsia="en-IN"/>
+        </w:rPr>
+        <w:t>System.</w:t>
+      </w:r>
+      <w:r>
+        <w:rPr>
+          <w:rFonts w:ascii="Courier New" w:eastAsia="Times New Roman" w:hAnsi="Courier New" w:cs="Courier New"/>
+          <w:i/>
+          <w:iCs/>
+          <w:color w:val="C77DBB"/>
+          <w:sz w:val="23"/>
+          <w:szCs w:val="23"/>
+          <w:lang w:eastAsia="en-IN"/>
+        </w:rPr>
+        <w:t>out</w:t>
+      </w:r>
+      <w:r>
+        <w:rPr>
+          <w:rFonts w:ascii="Courier New" w:eastAsia="Times New Roman" w:hAnsi="Courier New" w:cs="Courier New"/>
+          <w:color w:val="BCBEC4"/>
+          <w:sz w:val="23"/>
+          <w:szCs w:val="23"/>
+          <w:lang w:eastAsia="en-IN"/>
+        </w:rPr>
+        <w:t>.println</w:t>
+      </w:r>
+      <w:proofErr w:type="spellEnd"/>
+      <w:r>
+        <w:rPr>
+          <w:rFonts w:ascii="Courier New" w:eastAsia="Times New Roman" w:hAnsi="Courier New" w:cs="Courier New"/>
+          <w:color w:val="BCBEC4"/>
+          <w:sz w:val="23"/>
+          <w:szCs w:val="23"/>
+          <w:lang w:eastAsia="en-IN"/>
+        </w:rPr>
+        <w:t>(</w:t>
+      </w:r>
+      <w:r>
+        <w:rPr>
+          <w:rFonts w:ascii="Courier New" w:eastAsia="Times New Roman" w:hAnsi="Courier New" w:cs="Courier New"/>
+          <w:color w:val="6AAB73"/>
+          <w:sz w:val="23"/>
+          <w:szCs w:val="23"/>
+          <w:lang w:eastAsia="en-IN"/>
+        </w:rPr>
+        <w:t xml:space="preserve">"Title: " </w:t>
+      </w:r>
+      <w:r>
+        <w:rPr>
+          <w:rFonts w:ascii="Courier New" w:eastAsia="Times New Roman" w:hAnsi="Courier New" w:cs="Courier New"/>
+          <w:color w:val="BCBEC4"/>
+          <w:sz w:val="23"/>
+          <w:szCs w:val="23"/>
+          <w:lang w:eastAsia="en-IN"/>
+        </w:rPr>
+        <w:t xml:space="preserve">+ </w:t>
+      </w:r>
+      <w:proofErr w:type="spellStart"/>
+      <w:r>
+        <w:rPr>
+          <w:rFonts w:ascii="Courier New" w:eastAsia="Times New Roman" w:hAnsi="Courier New" w:cs="Courier New"/>
+          <w:color w:val="BCBEC4"/>
+          <w:sz w:val="23"/>
+          <w:szCs w:val="23"/>
+          <w:lang w:eastAsia="en-IN"/>
+        </w:rPr>
+        <w:t>driver.getTitle</w:t>
+      </w:r>
+      <w:proofErr w:type="spellEnd"/>
+      <w:r>
+        <w:rPr>
+          <w:rFonts w:ascii="Courier New" w:eastAsia="Times New Roman" w:hAnsi="Courier New" w:cs="Courier New"/>
+          <w:color w:val="BCBEC4"/>
+          <w:sz w:val="23"/>
+          <w:szCs w:val="23"/>
+          <w:lang w:eastAsia="en-IN"/>
+        </w:rPr>
+        <w:t>());</w:t>
+      </w:r>
+      <w:r>
+        <w:rPr>
+          <w:rFonts w:ascii="Courier New" w:eastAsia="Times New Roman" w:hAnsi="Courier New" w:cs="Courier New"/>
+          <w:color w:val="BCBEC4"/>
+          <w:sz w:val="23"/>
+          <w:szCs w:val="23"/>
+          <w:lang w:eastAsia="en-IN"/>
+        </w:rPr>
+        <w:br/>
+      </w:r>
+      <w:r>
+        <w:rPr>
+          <w:rFonts w:ascii="Courier New" w:eastAsia="Times New Roman" w:hAnsi="Courier New" w:cs="Courier New"/>
+          <w:color w:val="BCBEC4"/>
+          <w:sz w:val="23"/>
+          <w:szCs w:val="23"/>
+          <w:lang w:eastAsia="en-IN"/>
+        </w:rPr>
+        <w:br/>
+        <w:t xml:space="preserve">        </w:t>
+      </w:r>
+      <w:proofErr w:type="spellStart"/>
+      <w:r>
+        <w:rPr>
+          <w:rFonts w:ascii="Courier New" w:eastAsia="Times New Roman" w:hAnsi="Courier New" w:cs="Courier New"/>
+          <w:color w:val="BCBEC4"/>
+          <w:sz w:val="23"/>
+          <w:szCs w:val="23"/>
+          <w:lang w:eastAsia="en-IN"/>
+        </w:rPr>
+        <w:t>driver.close</w:t>
+      </w:r>
+      <w:proofErr w:type="spellEnd"/>
+      <w:r>
+        <w:rPr>
+          <w:rFonts w:ascii="Courier New" w:eastAsia="Times New Roman" w:hAnsi="Courier New" w:cs="Courier New"/>
+          <w:color w:val="BCBEC4"/>
+          <w:sz w:val="23"/>
+          <w:szCs w:val="23"/>
+          <w:lang w:eastAsia="en-IN"/>
+        </w:rPr>
+        <w:t>();</w:t>
+      </w:r>
+      <w:r>
+        <w:rPr>
+          <w:rFonts w:ascii="Courier New" w:eastAsia="Times New Roman" w:hAnsi="Courier New" w:cs="Courier New"/>
+          <w:color w:val="BCBEC4"/>
+          <w:sz w:val="23"/>
+          <w:szCs w:val="23"/>
+          <w:lang w:eastAsia="en-IN"/>
+        </w:rPr>
+        <w:br/>
+      </w:r>
+      <w:r>
+        <w:rPr>
+          <w:rFonts w:ascii="Courier New" w:eastAsia="Times New Roman" w:hAnsi="Courier New" w:cs="Courier New"/>
+          <w:color w:val="BCBEC4"/>
+          <w:sz w:val="23"/>
+          <w:szCs w:val="23"/>
+          <w:lang w:eastAsia="en-IN"/>
+        </w:rPr>
+        <w:br/>
+        <w:t xml:space="preserve">        test.log(</w:t>
+      </w:r>
+      <w:proofErr w:type="spellStart"/>
+      <w:r>
+        <w:rPr>
+          <w:rFonts w:ascii="Courier New" w:eastAsia="Times New Roman" w:hAnsi="Courier New" w:cs="Courier New"/>
+          <w:color w:val="BCBEC4"/>
+          <w:sz w:val="23"/>
+          <w:szCs w:val="23"/>
+          <w:lang w:eastAsia="en-IN"/>
+        </w:rPr>
+        <w:t>Status.</w:t>
+      </w:r>
+      <w:r>
+        <w:rPr>
+          <w:rFonts w:ascii="Courier New" w:eastAsia="Times New Roman" w:hAnsi="Courier New" w:cs="Courier New"/>
+          <w:i/>
+          <w:iCs/>
+          <w:color w:val="C77DBB"/>
+          <w:sz w:val="23"/>
+          <w:szCs w:val="23"/>
+          <w:lang w:eastAsia="en-IN"/>
+        </w:rPr>
+        <w:t>PASS</w:t>
+      </w:r>
+      <w:proofErr w:type="spellEnd"/>
+      <w:r>
+        <w:rPr>
+          <w:rFonts w:ascii="Courier New" w:eastAsia="Times New Roman" w:hAnsi="Courier New" w:cs="Courier New"/>
+          <w:color w:val="BCBEC4"/>
+          <w:sz w:val="23"/>
+          <w:szCs w:val="23"/>
+          <w:lang w:eastAsia="en-IN"/>
+        </w:rPr>
+        <w:t xml:space="preserve">, </w:t>
+      </w:r>
+      <w:proofErr w:type="spellStart"/>
+      <w:r>
+        <w:rPr>
+          <w:rFonts w:ascii="Courier New" w:eastAsia="Times New Roman" w:hAnsi="Courier New" w:cs="Courier New"/>
+          <w:color w:val="BCBEC4"/>
+          <w:sz w:val="23"/>
+          <w:szCs w:val="23"/>
+          <w:lang w:eastAsia="en-IN"/>
+        </w:rPr>
+        <w:t>MarkupHelper.</w:t>
+      </w:r>
+      <w:r>
+        <w:rPr>
+          <w:rFonts w:ascii="Courier New" w:eastAsia="Times New Roman" w:hAnsi="Courier New" w:cs="Courier New"/>
+          <w:i/>
+          <w:iCs/>
+          <w:color w:val="BCBEC4"/>
+          <w:sz w:val="23"/>
+          <w:szCs w:val="23"/>
+          <w:lang w:eastAsia="en-IN"/>
+        </w:rPr>
+        <w:t>createLabel</w:t>
+      </w:r>
+      <w:proofErr w:type="spellEnd"/>
+      <w:r>
+        <w:rPr>
+          <w:rFonts w:ascii="Courier New" w:eastAsia="Times New Roman" w:hAnsi="Courier New" w:cs="Courier New"/>
+          <w:color w:val="BCBEC4"/>
+          <w:sz w:val="23"/>
+          <w:szCs w:val="23"/>
+          <w:lang w:eastAsia="en-IN"/>
+        </w:rPr>
+        <w:t>(</w:t>
+      </w:r>
+      <w:r>
+        <w:rPr>
+          <w:rFonts w:ascii="Courier New" w:eastAsia="Times New Roman" w:hAnsi="Courier New" w:cs="Courier New"/>
+          <w:color w:val="6AAB73"/>
+          <w:sz w:val="23"/>
+          <w:szCs w:val="23"/>
+          <w:lang w:eastAsia="en-IN"/>
+        </w:rPr>
+        <w:t>"Title Test"</w:t>
+      </w:r>
+      <w:r>
+        <w:rPr>
+          <w:rFonts w:ascii="Courier New" w:eastAsia="Times New Roman" w:hAnsi="Courier New" w:cs="Courier New"/>
+          <w:color w:val="BCBEC4"/>
+          <w:sz w:val="23"/>
+          <w:szCs w:val="23"/>
+          <w:lang w:eastAsia="en-IN"/>
+        </w:rPr>
+        <w:t xml:space="preserve">, </w:t>
+      </w:r>
+      <w:proofErr w:type="spellStart"/>
+      <w:r>
+        <w:rPr>
+          <w:rFonts w:ascii="Courier New" w:eastAsia="Times New Roman" w:hAnsi="Courier New" w:cs="Courier New"/>
+          <w:color w:val="BCBEC4"/>
+          <w:sz w:val="23"/>
+          <w:szCs w:val="23"/>
+          <w:lang w:eastAsia="en-IN"/>
+        </w:rPr>
+        <w:t>ExtentColor.</w:t>
+      </w:r>
+      <w:r>
+        <w:rPr>
+          <w:rFonts w:ascii="Courier New" w:eastAsia="Times New Roman" w:hAnsi="Courier New" w:cs="Courier New"/>
+          <w:i/>
+          <w:iCs/>
+          <w:color w:val="C77DBB"/>
+          <w:sz w:val="23"/>
+          <w:szCs w:val="23"/>
+          <w:lang w:eastAsia="en-IN"/>
+        </w:rPr>
+        <w:t>GREEN</w:t>
+      </w:r>
+      <w:proofErr w:type="spellEnd"/>
+      <w:r>
+        <w:rPr>
+          <w:rFonts w:ascii="Courier New" w:eastAsia="Times New Roman" w:hAnsi="Courier New" w:cs="Courier New"/>
+          <w:color w:val="BCBEC4"/>
+          <w:sz w:val="23"/>
+          <w:szCs w:val="23"/>
+          <w:lang w:eastAsia="en-IN"/>
+        </w:rPr>
+        <w:t>));</w:t>
+      </w:r>
+      <w:r>
+        <w:rPr>
+          <w:rFonts w:ascii="Courier New" w:eastAsia="Times New Roman" w:hAnsi="Courier New" w:cs="Courier New"/>
+          <w:color w:val="BCBEC4"/>
+          <w:sz w:val="23"/>
+          <w:szCs w:val="23"/>
+          <w:lang w:eastAsia="en-IN"/>
+        </w:rPr>
+        <w:br/>
+      </w:r>
+      <w:r>
+        <w:rPr>
+          <w:rFonts w:ascii="Courier New" w:eastAsia="Times New Roman" w:hAnsi="Courier New" w:cs="Courier New"/>
+          <w:color w:val="BCBEC4"/>
+          <w:sz w:val="23"/>
+          <w:szCs w:val="23"/>
+          <w:lang w:eastAsia="en-IN"/>
+        </w:rPr>
+        <w:br/>
+        <w:t xml:space="preserve">        </w:t>
+      </w:r>
+      <w:r>
+        <w:rPr>
+          <w:rFonts w:ascii="Courier New" w:eastAsia="Times New Roman" w:hAnsi="Courier New" w:cs="Courier New"/>
+          <w:color w:val="7A7E85"/>
+          <w:sz w:val="23"/>
+          <w:szCs w:val="23"/>
+          <w:lang w:eastAsia="en-IN"/>
+        </w:rPr>
+        <w:t>//Create another test</w:t>
+      </w:r>
+      <w:r>
+        <w:rPr>
+          <w:rFonts w:ascii="Courier New" w:eastAsia="Times New Roman" w:hAnsi="Courier New" w:cs="Courier New"/>
+          <w:color w:val="7A7E85"/>
+          <w:sz w:val="23"/>
+          <w:szCs w:val="23"/>
+          <w:lang w:eastAsia="en-IN"/>
+        </w:rPr>
+        <w:br/>
+        <w:t xml:space="preserve">        </w:t>
+      </w:r>
+      <w:proofErr w:type="spellStart"/>
+      <w:r>
+        <w:rPr>
+          <w:rFonts w:ascii="Courier New" w:eastAsia="Times New Roman" w:hAnsi="Courier New" w:cs="Courier New"/>
+          <w:color w:val="BCBEC4"/>
+          <w:sz w:val="23"/>
+          <w:szCs w:val="23"/>
+          <w:lang w:eastAsia="en-IN"/>
+        </w:rPr>
+        <w:t>test</w:t>
+      </w:r>
+      <w:proofErr w:type="spellEnd"/>
+      <w:r>
+        <w:rPr>
+          <w:rFonts w:ascii="Courier New" w:eastAsia="Times New Roman" w:hAnsi="Courier New" w:cs="Courier New"/>
+          <w:color w:val="BCBEC4"/>
+          <w:sz w:val="23"/>
+          <w:szCs w:val="23"/>
+          <w:lang w:eastAsia="en-IN"/>
+        </w:rPr>
+        <w:t xml:space="preserve"> = </w:t>
+      </w:r>
+      <w:proofErr w:type="spellStart"/>
+      <w:r>
+        <w:rPr>
+          <w:rFonts w:ascii="Courier New" w:eastAsia="Times New Roman" w:hAnsi="Courier New" w:cs="Courier New"/>
+          <w:color w:val="BCBEC4"/>
+          <w:sz w:val="23"/>
+          <w:szCs w:val="23"/>
+          <w:lang w:eastAsia="en-IN"/>
+        </w:rPr>
+        <w:t>report.createTest</w:t>
+      </w:r>
+      <w:proofErr w:type="spellEnd"/>
+      <w:r>
+        <w:rPr>
+          <w:rFonts w:ascii="Courier New" w:eastAsia="Times New Roman" w:hAnsi="Courier New" w:cs="Courier New"/>
+          <w:color w:val="BCBEC4"/>
+          <w:sz w:val="23"/>
+          <w:szCs w:val="23"/>
+          <w:lang w:eastAsia="en-IN"/>
+        </w:rPr>
+        <w:t>(</w:t>
+      </w:r>
+      <w:r>
+        <w:rPr>
+          <w:rFonts w:ascii="Courier New" w:eastAsia="Times New Roman" w:hAnsi="Courier New" w:cs="Courier New"/>
+          <w:color w:val="6AAB73"/>
+          <w:sz w:val="23"/>
+          <w:szCs w:val="23"/>
+          <w:lang w:eastAsia="en-IN"/>
+        </w:rPr>
+        <w:t>"Google Search Test"</w:t>
+      </w:r>
+      <w:r>
+        <w:rPr>
+          <w:rFonts w:ascii="Courier New" w:eastAsia="Times New Roman" w:hAnsi="Courier New" w:cs="Courier New"/>
+          <w:color w:val="BCBEC4"/>
+          <w:sz w:val="23"/>
+          <w:szCs w:val="23"/>
+          <w:lang w:eastAsia="en-IN"/>
+        </w:rPr>
+        <w:t>);</w:t>
+      </w:r>
+      <w:r>
+        <w:rPr>
+          <w:rFonts w:ascii="Courier New" w:eastAsia="Times New Roman" w:hAnsi="Courier New" w:cs="Courier New"/>
+          <w:color w:val="BCBEC4"/>
+          <w:sz w:val="23"/>
+          <w:szCs w:val="23"/>
+          <w:lang w:eastAsia="en-IN"/>
+        </w:rPr>
+        <w:br/>
+      </w:r>
+      <w:r>
+        <w:rPr>
+          <w:rFonts w:ascii="Courier New" w:eastAsia="Times New Roman" w:hAnsi="Courier New" w:cs="Courier New"/>
+          <w:color w:val="BCBEC4"/>
+          <w:sz w:val="23"/>
+          <w:szCs w:val="23"/>
+          <w:lang w:eastAsia="en-IN"/>
+        </w:rPr>
+        <w:br/>
+        <w:t xml:space="preserve">        driver = </w:t>
+      </w:r>
+      <w:r>
+        <w:rPr>
+          <w:rFonts w:ascii="Courier New" w:eastAsia="Times New Roman" w:hAnsi="Courier New" w:cs="Courier New"/>
+          <w:color w:val="CF8E6D"/>
+          <w:sz w:val="23"/>
+          <w:szCs w:val="23"/>
+          <w:lang w:eastAsia="en-IN"/>
+        </w:rPr>
+        <w:t xml:space="preserve">new </w:t>
+      </w:r>
+      <w:r>
+        <w:rPr>
+          <w:rFonts w:ascii="Courier New" w:eastAsia="Times New Roman" w:hAnsi="Courier New" w:cs="Courier New"/>
+          <w:color w:val="BCBEC4"/>
+          <w:sz w:val="23"/>
+          <w:szCs w:val="23"/>
+          <w:lang w:eastAsia="en-IN"/>
+        </w:rPr>
+        <w:t>ChromeDriver();</w:t>
+      </w:r>
+      <w:r>
+        <w:rPr>
+          <w:rFonts w:ascii="Courier New" w:eastAsia="Times New Roman" w:hAnsi="Courier New" w:cs="Courier New"/>
+          <w:color w:val="BCBEC4"/>
+          <w:sz w:val="23"/>
+          <w:szCs w:val="23"/>
+          <w:lang w:eastAsia="en-IN"/>
+        </w:rPr>
+        <w:br/>
+        <w:t xml:space="preserve">        </w:t>
+      </w:r>
+      <w:proofErr w:type="spellStart"/>
+      <w:r>
+        <w:rPr>
+          <w:rFonts w:ascii="Courier New" w:eastAsia="Times New Roman" w:hAnsi="Courier New" w:cs="Courier New"/>
+          <w:color w:val="BCBEC4"/>
+          <w:sz w:val="23"/>
+          <w:szCs w:val="23"/>
+          <w:lang w:eastAsia="en-IN"/>
+        </w:rPr>
+        <w:t>driver.manage</w:t>
+      </w:r>
+      <w:proofErr w:type="spellEnd"/>
+      <w:r>
+        <w:rPr>
+          <w:rFonts w:ascii="Courier New" w:eastAsia="Times New Roman" w:hAnsi="Courier New" w:cs="Courier New"/>
+          <w:color w:val="BCBEC4"/>
+          <w:sz w:val="23"/>
+          <w:szCs w:val="23"/>
+          <w:lang w:eastAsia="en-IN"/>
+        </w:rPr>
+        <w:t>().window().maximize();</w:t>
+      </w:r>
+      <w:r>
+        <w:rPr>
+          <w:rFonts w:ascii="Courier New" w:eastAsia="Times New Roman" w:hAnsi="Courier New" w:cs="Courier New"/>
+          <w:color w:val="BCBEC4"/>
+          <w:sz w:val="23"/>
+          <w:szCs w:val="23"/>
+          <w:lang w:eastAsia="en-IN"/>
+        </w:rPr>
+        <w:br/>
+        <w:t xml:space="preserve">        driver.manage().timeouts().implicitlyWait(Duration.</w:t>
+      </w:r>
+      <w:r>
+        <w:rPr>
+          <w:rFonts w:ascii="Courier New" w:eastAsia="Times New Roman" w:hAnsi="Courier New" w:cs="Courier New"/>
+          <w:i/>
+          <w:iCs/>
+          <w:color w:val="BCBEC4"/>
+          <w:sz w:val="23"/>
+          <w:szCs w:val="23"/>
+          <w:lang w:eastAsia="en-IN"/>
+        </w:rPr>
+        <w:t>ofSeconds</w:t>
+      </w:r>
+      <w:r>
+        <w:rPr>
+          <w:rFonts w:ascii="Courier New" w:eastAsia="Times New Roman" w:hAnsi="Courier New" w:cs="Courier New"/>
+          <w:color w:val="BCBEC4"/>
+          <w:sz w:val="23"/>
+          <w:szCs w:val="23"/>
+          <w:lang w:eastAsia="en-IN"/>
+        </w:rPr>
+        <w:t>(</w:t>
+      </w:r>
+      <w:r>
+        <w:rPr>
+          <w:rFonts w:ascii="Courier New" w:eastAsia="Times New Roman" w:hAnsi="Courier New" w:cs="Courier New"/>
+          <w:color w:val="2AACB8"/>
+          <w:sz w:val="23"/>
+          <w:szCs w:val="23"/>
+          <w:lang w:eastAsia="en-IN"/>
+        </w:rPr>
+        <w:t>10</w:t>
+      </w:r>
+      <w:r>
+        <w:rPr>
+          <w:rFonts w:ascii="Courier New" w:eastAsia="Times New Roman" w:hAnsi="Courier New" w:cs="Courier New"/>
+          <w:color w:val="BCBEC4"/>
+          <w:sz w:val="23"/>
+          <w:szCs w:val="23"/>
+          <w:lang w:eastAsia="en-IN"/>
+        </w:rPr>
+        <w:t>));</w:t>
+      </w:r>
+      <w:r>
+        <w:rPr>
+          <w:rFonts w:ascii="Courier New" w:eastAsia="Times New Roman" w:hAnsi="Courier New" w:cs="Courier New"/>
+          <w:color w:val="BCBEC4"/>
+          <w:sz w:val="23"/>
+          <w:szCs w:val="23"/>
+          <w:lang w:eastAsia="en-IN"/>
+        </w:rPr>
+        <w:br/>
+      </w:r>
+      <w:r>
+        <w:rPr>
+          <w:rFonts w:ascii="Courier New" w:eastAsia="Times New Roman" w:hAnsi="Courier New" w:cs="Courier New"/>
+          <w:color w:val="BCBEC4"/>
+          <w:sz w:val="23"/>
+          <w:szCs w:val="23"/>
+          <w:lang w:eastAsia="en-IN"/>
+        </w:rPr>
+        <w:br/>
+        <w:t xml:space="preserve">        </w:t>
+      </w:r>
+      <w:proofErr w:type="spellStart"/>
+      <w:r>
+        <w:rPr>
+          <w:rFonts w:ascii="Courier New" w:eastAsia="Times New Roman" w:hAnsi="Courier New" w:cs="Courier New"/>
+          <w:color w:val="BCBEC4"/>
+          <w:sz w:val="23"/>
+          <w:szCs w:val="23"/>
+          <w:lang w:eastAsia="en-IN"/>
+        </w:rPr>
+        <w:t>driver.get</w:t>
+      </w:r>
+      <w:proofErr w:type="spellEnd"/>
+      <w:r>
+        <w:rPr>
+          <w:rFonts w:ascii="Courier New" w:eastAsia="Times New Roman" w:hAnsi="Courier New" w:cs="Courier New"/>
+          <w:color w:val="BCBEC4"/>
+          <w:sz w:val="23"/>
+          <w:szCs w:val="23"/>
+          <w:lang w:eastAsia="en-IN"/>
+        </w:rPr>
+        <w:t>(</w:t>
+      </w:r>
+      <w:r>
+        <w:rPr>
+          <w:rFonts w:ascii="Courier New" w:eastAsia="Times New Roman" w:hAnsi="Courier New" w:cs="Courier New"/>
+          <w:color w:val="6AAB73"/>
+          <w:sz w:val="23"/>
+          <w:szCs w:val="23"/>
+          <w:lang w:eastAsia="en-IN"/>
+        </w:rPr>
+        <w:t>"https://www.google.com"</w:t>
+      </w:r>
+      <w:r>
+        <w:rPr>
+          <w:rFonts w:ascii="Courier New" w:eastAsia="Times New Roman" w:hAnsi="Courier New" w:cs="Courier New"/>
+          <w:color w:val="BCBEC4"/>
+          <w:sz w:val="23"/>
+          <w:szCs w:val="23"/>
+          <w:lang w:eastAsia="en-IN"/>
+        </w:rPr>
+        <w:t>);</w:t>
+      </w:r>
+      <w:r>
+        <w:rPr>
+          <w:rFonts w:ascii="Courier New" w:eastAsia="Times New Roman" w:hAnsi="Courier New" w:cs="Courier New"/>
+          <w:color w:val="BCBEC4"/>
+          <w:sz w:val="23"/>
+          <w:szCs w:val="23"/>
+          <w:lang w:eastAsia="en-IN"/>
+        </w:rPr>
+        <w:br/>
+      </w:r>
+      <w:r>
+        <w:rPr>
+          <w:rFonts w:ascii="Courier New" w:eastAsia="Times New Roman" w:hAnsi="Courier New" w:cs="Courier New"/>
+          <w:color w:val="BCBEC4"/>
+          <w:sz w:val="23"/>
+          <w:szCs w:val="23"/>
+          <w:lang w:eastAsia="en-IN"/>
+        </w:rPr>
+        <w:br/>
+        <w:t xml:space="preserve">        </w:t>
+      </w:r>
+      <w:proofErr w:type="spellStart"/>
+      <w:r>
+        <w:rPr>
+          <w:rFonts w:ascii="Courier New" w:eastAsia="Times New Roman" w:hAnsi="Courier New" w:cs="Courier New"/>
+          <w:color w:val="BCBEC4"/>
+          <w:sz w:val="23"/>
+          <w:szCs w:val="23"/>
+          <w:lang w:eastAsia="en-IN"/>
+        </w:rPr>
+        <w:t>driver.findElement</w:t>
+      </w:r>
+      <w:proofErr w:type="spellEnd"/>
+      <w:r>
+        <w:rPr>
+          <w:rFonts w:ascii="Courier New" w:eastAsia="Times New Roman" w:hAnsi="Courier New" w:cs="Courier New"/>
+          <w:color w:val="BCBEC4"/>
+          <w:sz w:val="23"/>
+          <w:szCs w:val="23"/>
+          <w:lang w:eastAsia="en-IN"/>
+        </w:rPr>
+        <w:t>(By.</w:t>
+      </w:r>
+      <w:r>
+        <w:rPr>
+          <w:rFonts w:ascii="Courier New" w:eastAsia="Times New Roman" w:hAnsi="Courier New" w:cs="Courier New"/>
+          <w:i/>
+          <w:iCs/>
+          <w:color w:val="BCBEC4"/>
+          <w:sz w:val="23"/>
+          <w:szCs w:val="23"/>
+          <w:lang w:eastAsia="en-IN"/>
+        </w:rPr>
+        <w:t>name</w:t>
+      </w:r>
+      <w:r>
+        <w:rPr>
+          <w:rFonts w:ascii="Courier New" w:eastAsia="Times New Roman" w:hAnsi="Courier New" w:cs="Courier New"/>
+          <w:color w:val="BCBEC4"/>
+          <w:sz w:val="23"/>
+          <w:szCs w:val="23"/>
+          <w:lang w:eastAsia="en-IN"/>
+        </w:rPr>
+        <w:t>(</w:t>
+      </w:r>
+      <w:r>
+        <w:rPr>
+          <w:rFonts w:ascii="Courier New" w:eastAsia="Times New Roman" w:hAnsi="Courier New" w:cs="Courier New"/>
+          <w:color w:val="6AAB73"/>
+          <w:sz w:val="23"/>
+          <w:szCs w:val="23"/>
+          <w:lang w:eastAsia="en-IN"/>
+        </w:rPr>
+        <w:t>"q"</w:t>
+      </w:r>
+      <w:r>
+        <w:rPr>
+          <w:rFonts w:ascii="Courier New" w:eastAsia="Times New Roman" w:hAnsi="Courier New" w:cs="Courier New"/>
+          <w:color w:val="BCBEC4"/>
+          <w:sz w:val="23"/>
+          <w:szCs w:val="23"/>
+          <w:lang w:eastAsia="en-IN"/>
+        </w:rPr>
+        <w:t>)).sendKeys(</w:t>
+      </w:r>
+      <w:r>
+        <w:rPr>
+          <w:rFonts w:ascii="Courier New" w:eastAsia="Times New Roman" w:hAnsi="Courier New" w:cs="Courier New"/>
+          <w:color w:val="6AAB73"/>
+          <w:sz w:val="23"/>
+          <w:szCs w:val="23"/>
+          <w:lang w:eastAsia="en-IN"/>
+        </w:rPr>
+        <w:t>"Maven"</w:t>
+      </w:r>
+      <w:r>
+        <w:rPr>
+          <w:rFonts w:ascii="Courier New" w:eastAsia="Times New Roman" w:hAnsi="Courier New" w:cs="Courier New"/>
+          <w:color w:val="BCBEC4"/>
+          <w:sz w:val="23"/>
+          <w:szCs w:val="23"/>
+          <w:lang w:eastAsia="en-IN"/>
+        </w:rPr>
+        <w:t xml:space="preserve">, </w:t>
+      </w:r>
+      <w:proofErr w:type="spellStart"/>
+      <w:r>
+        <w:rPr>
+          <w:rFonts w:ascii="Courier New" w:eastAsia="Times New Roman" w:hAnsi="Courier New" w:cs="Courier New"/>
+          <w:color w:val="BCBEC4"/>
+          <w:sz w:val="23"/>
+          <w:szCs w:val="23"/>
+          <w:lang w:eastAsia="en-IN"/>
+        </w:rPr>
+        <w:t>Keys.</w:t>
+      </w:r>
+      <w:r>
+        <w:rPr>
+          <w:rFonts w:ascii="Courier New" w:eastAsia="Times New Roman" w:hAnsi="Courier New" w:cs="Courier New"/>
+          <w:i/>
+          <w:iCs/>
+          <w:color w:val="C77DBB"/>
+          <w:sz w:val="23"/>
+          <w:szCs w:val="23"/>
+          <w:lang w:eastAsia="en-IN"/>
+        </w:rPr>
+        <w:t>ENTER</w:t>
+      </w:r>
+      <w:proofErr w:type="spellEnd"/>
+      <w:r>
+        <w:rPr>
+          <w:rFonts w:ascii="Courier New" w:eastAsia="Times New Roman" w:hAnsi="Courier New" w:cs="Courier New"/>
+          <w:color w:val="BCBEC4"/>
+          <w:sz w:val="23"/>
+          <w:szCs w:val="23"/>
+          <w:lang w:eastAsia="en-IN"/>
+        </w:rPr>
+        <w:t>);</w:t>
+      </w:r>
+      <w:r>
+        <w:rPr>
+          <w:rFonts w:ascii="Courier New" w:eastAsia="Times New Roman" w:hAnsi="Courier New" w:cs="Courier New"/>
+          <w:color w:val="BCBEC4"/>
+          <w:sz w:val="23"/>
+          <w:szCs w:val="23"/>
+          <w:lang w:eastAsia="en-IN"/>
+        </w:rPr>
+        <w:br/>
+      </w:r>
+      <w:r>
+        <w:rPr>
+          <w:rFonts w:ascii="Courier New" w:eastAsia="Times New Roman" w:hAnsi="Courier New" w:cs="Courier New"/>
+          <w:color w:val="BCBEC4"/>
+          <w:sz w:val="23"/>
+          <w:szCs w:val="23"/>
+          <w:lang w:eastAsia="en-IN"/>
+        </w:rPr>
+        <w:br/>
+        <w:t xml:space="preserve">        </w:t>
+      </w:r>
+      <w:r>
+        <w:rPr>
+          <w:rFonts w:ascii="Courier New" w:eastAsia="Times New Roman" w:hAnsi="Courier New" w:cs="Courier New"/>
+          <w:color w:val="7A7E85"/>
+          <w:sz w:val="23"/>
+          <w:szCs w:val="23"/>
+          <w:lang w:eastAsia="en-IN"/>
+        </w:rPr>
+        <w:t>//Taking screenshot</w:t>
+      </w:r>
+      <w:r>
+        <w:rPr>
+          <w:rFonts w:ascii="Courier New" w:eastAsia="Times New Roman" w:hAnsi="Courier New" w:cs="Courier New"/>
+          <w:color w:val="7A7E85"/>
+          <w:sz w:val="23"/>
+          <w:szCs w:val="23"/>
+          <w:lang w:eastAsia="en-IN"/>
+        </w:rPr>
+        <w:br/>
+        <w:t xml:space="preserve">        </w:t>
+      </w:r>
+      <w:r>
+        <w:rPr>
+          <w:rFonts w:ascii="Courier New" w:eastAsia="Times New Roman" w:hAnsi="Courier New" w:cs="Courier New"/>
+          <w:color w:val="BCBEC4"/>
+          <w:sz w:val="23"/>
+          <w:szCs w:val="23"/>
+          <w:lang w:eastAsia="en-IN"/>
+        </w:rPr>
+        <w:t xml:space="preserve">File </w:t>
+      </w:r>
+      <w:proofErr w:type="spellStart"/>
+      <w:r>
+        <w:rPr>
+          <w:rFonts w:ascii="Courier New" w:eastAsia="Times New Roman" w:hAnsi="Courier New" w:cs="Courier New"/>
+          <w:color w:val="BCBEC4"/>
+          <w:sz w:val="23"/>
+          <w:szCs w:val="23"/>
+          <w:lang w:eastAsia="en-IN"/>
+        </w:rPr>
+        <w:t>ss</w:t>
+      </w:r>
+      <w:proofErr w:type="spellEnd"/>
+      <w:r>
+        <w:rPr>
+          <w:rFonts w:ascii="Courier New" w:eastAsia="Times New Roman" w:hAnsi="Courier New" w:cs="Courier New"/>
+          <w:color w:val="BCBEC4"/>
+          <w:sz w:val="23"/>
+          <w:szCs w:val="23"/>
+          <w:lang w:eastAsia="en-IN"/>
+        </w:rPr>
+        <w:t xml:space="preserve"> = ((</w:t>
+      </w:r>
+      <w:proofErr w:type="spellStart"/>
+      <w:r>
+        <w:rPr>
+          <w:rFonts w:ascii="Courier New" w:eastAsia="Times New Roman" w:hAnsi="Courier New" w:cs="Courier New"/>
+          <w:color w:val="BCBEC4"/>
+          <w:sz w:val="23"/>
+          <w:szCs w:val="23"/>
+          <w:lang w:eastAsia="en-IN"/>
+        </w:rPr>
+        <w:t>TakesScreenshot</w:t>
+      </w:r>
+      <w:proofErr w:type="spellEnd"/>
+      <w:r>
+        <w:rPr>
+          <w:rFonts w:ascii="Courier New" w:eastAsia="Times New Roman" w:hAnsi="Courier New" w:cs="Courier New"/>
+          <w:color w:val="BCBEC4"/>
+          <w:sz w:val="23"/>
+          <w:szCs w:val="23"/>
+          <w:lang w:eastAsia="en-IN"/>
+        </w:rPr>
+        <w:t>)driver).</w:t>
+      </w:r>
+      <w:proofErr w:type="spellStart"/>
+      <w:r>
+        <w:rPr>
+          <w:rFonts w:ascii="Courier New" w:eastAsia="Times New Roman" w:hAnsi="Courier New" w:cs="Courier New"/>
+          <w:color w:val="BCBEC4"/>
+          <w:sz w:val="23"/>
+          <w:szCs w:val="23"/>
+          <w:lang w:eastAsia="en-IN"/>
+        </w:rPr>
+        <w:t>getScreenshotAs</w:t>
+      </w:r>
+      <w:proofErr w:type="spellEnd"/>
+      <w:r>
+        <w:rPr>
+          <w:rFonts w:ascii="Courier New" w:eastAsia="Times New Roman" w:hAnsi="Courier New" w:cs="Courier New"/>
+          <w:color w:val="BCBEC4"/>
+          <w:sz w:val="23"/>
+          <w:szCs w:val="23"/>
+          <w:lang w:eastAsia="en-IN"/>
+        </w:rPr>
+        <w:t>(</w:t>
+      </w:r>
+      <w:proofErr w:type="spellStart"/>
+      <w:r>
+        <w:rPr>
+          <w:rFonts w:ascii="Courier New" w:eastAsia="Times New Roman" w:hAnsi="Courier New" w:cs="Courier New"/>
+          <w:color w:val="BCBEC4"/>
+          <w:sz w:val="23"/>
+          <w:szCs w:val="23"/>
+          <w:lang w:eastAsia="en-IN"/>
+        </w:rPr>
+        <w:t>OutputType.</w:t>
+      </w:r>
+      <w:r>
+        <w:rPr>
+          <w:rFonts w:ascii="Courier New" w:eastAsia="Times New Roman" w:hAnsi="Courier New" w:cs="Courier New"/>
+          <w:i/>
+          <w:iCs/>
+          <w:color w:val="C77DBB"/>
+          <w:sz w:val="23"/>
+          <w:szCs w:val="23"/>
+          <w:lang w:eastAsia="en-IN"/>
+        </w:rPr>
+        <w:t>FILE</w:t>
+      </w:r>
+      <w:proofErr w:type="spellEnd"/>
+      <w:r>
+        <w:rPr>
+          <w:rFonts w:ascii="Courier New" w:eastAsia="Times New Roman" w:hAnsi="Courier New" w:cs="Courier New"/>
+          <w:color w:val="BCBEC4"/>
+          <w:sz w:val="23"/>
+          <w:szCs w:val="23"/>
+          <w:lang w:eastAsia="en-IN"/>
+        </w:rPr>
+        <w:t>);</w:t>
+      </w:r>
+      <w:r>
+        <w:rPr>
+          <w:rFonts w:ascii="Courier New" w:eastAsia="Times New Roman" w:hAnsi="Courier New" w:cs="Courier New"/>
+          <w:color w:val="BCBEC4"/>
+          <w:sz w:val="23"/>
+          <w:szCs w:val="23"/>
+          <w:lang w:eastAsia="en-IN"/>
+        </w:rPr>
+        <w:br/>
+        <w:t xml:space="preserve">        </w:t>
+      </w:r>
+      <w:proofErr w:type="spellStart"/>
+      <w:r>
+        <w:rPr>
+          <w:rFonts w:ascii="Courier New" w:eastAsia="Times New Roman" w:hAnsi="Courier New" w:cs="Courier New"/>
+          <w:color w:val="BCBEC4"/>
+          <w:sz w:val="23"/>
+          <w:szCs w:val="23"/>
+          <w:lang w:eastAsia="en-IN"/>
+        </w:rPr>
+        <w:t>FileHandler.</w:t>
+      </w:r>
+      <w:r>
+        <w:rPr>
+          <w:rFonts w:ascii="Courier New" w:eastAsia="Times New Roman" w:hAnsi="Courier New" w:cs="Courier New"/>
+          <w:i/>
+          <w:iCs/>
+          <w:color w:val="BCBEC4"/>
+          <w:sz w:val="23"/>
+          <w:szCs w:val="23"/>
+          <w:lang w:eastAsia="en-IN"/>
+        </w:rPr>
+        <w:t>copy</w:t>
+      </w:r>
+      <w:proofErr w:type="spellEnd"/>
+      <w:r>
+        <w:rPr>
+          <w:rFonts w:ascii="Courier New" w:eastAsia="Times New Roman" w:hAnsi="Courier New" w:cs="Courier New"/>
+          <w:color w:val="BCBEC4"/>
+          <w:sz w:val="23"/>
+          <w:szCs w:val="23"/>
+          <w:lang w:eastAsia="en-IN"/>
+        </w:rPr>
+        <w:t>(</w:t>
+      </w:r>
+      <w:proofErr w:type="spellStart"/>
+      <w:r>
+        <w:rPr>
+          <w:rFonts w:ascii="Courier New" w:eastAsia="Times New Roman" w:hAnsi="Courier New" w:cs="Courier New"/>
+          <w:color w:val="BCBEC4"/>
+          <w:sz w:val="23"/>
+          <w:szCs w:val="23"/>
+          <w:lang w:eastAsia="en-IN"/>
+        </w:rPr>
+        <w:t>ss</w:t>
+      </w:r>
+      <w:proofErr w:type="spellEnd"/>
+      <w:r>
+        <w:rPr>
+          <w:rFonts w:ascii="Courier New" w:eastAsia="Times New Roman" w:hAnsi="Courier New" w:cs="Courier New"/>
+          <w:color w:val="BCBEC4"/>
+          <w:sz w:val="23"/>
+          <w:szCs w:val="23"/>
+          <w:lang w:eastAsia="en-IN"/>
+        </w:rPr>
+        <w:t xml:space="preserve">, </w:t>
+      </w:r>
+      <w:r>
+        <w:rPr>
+          <w:rFonts w:ascii="Courier New" w:eastAsia="Times New Roman" w:hAnsi="Courier New" w:cs="Courier New"/>
+          <w:color w:val="CF8E6D"/>
+          <w:sz w:val="23"/>
+          <w:szCs w:val="23"/>
+          <w:lang w:eastAsia="en-IN"/>
+        </w:rPr>
+        <w:t xml:space="preserve">new </w:t>
+      </w:r>
+      <w:r>
+        <w:rPr>
+          <w:rFonts w:ascii="Courier New" w:eastAsia="Times New Roman" w:hAnsi="Courier New" w:cs="Courier New"/>
+          <w:color w:val="BCBEC4"/>
+          <w:sz w:val="23"/>
+          <w:szCs w:val="23"/>
+          <w:lang w:eastAsia="en-IN"/>
+        </w:rPr>
+        <w:t>File(</w:t>
+      </w:r>
+      <w:r>
+        <w:rPr>
+          <w:rFonts w:ascii="Courier New" w:eastAsia="Times New Roman" w:hAnsi="Courier New" w:cs="Courier New"/>
+          <w:color w:val="6AAB73"/>
+          <w:sz w:val="23"/>
+          <w:szCs w:val="23"/>
+          <w:lang w:eastAsia="en-IN"/>
+        </w:rPr>
+        <w:t>"Trial.jpeg"</w:t>
+      </w:r>
+      <w:r>
+        <w:rPr>
+          <w:rFonts w:ascii="Courier New" w:eastAsia="Times New Roman" w:hAnsi="Courier New" w:cs="Courier New"/>
+          <w:color w:val="BCBEC4"/>
+          <w:sz w:val="23"/>
+          <w:szCs w:val="23"/>
+          <w:lang w:eastAsia="en-IN"/>
+        </w:rPr>
+        <w:t>));</w:t>
+      </w:r>
+      <w:r>
+        <w:rPr>
+          <w:rFonts w:ascii="Courier New" w:eastAsia="Times New Roman" w:hAnsi="Courier New" w:cs="Courier New"/>
+          <w:color w:val="BCBEC4"/>
+          <w:sz w:val="23"/>
+          <w:szCs w:val="23"/>
+          <w:lang w:eastAsia="en-IN"/>
+        </w:rPr>
+        <w:br/>
+        <w:t xml:space="preserve">        </w:t>
+      </w:r>
+      <w:r>
+        <w:rPr>
+          <w:rFonts w:ascii="Courier New" w:eastAsia="Times New Roman" w:hAnsi="Courier New" w:cs="Courier New"/>
+          <w:color w:val="BCBEC4"/>
+          <w:sz w:val="23"/>
+          <w:szCs w:val="23"/>
+          <w:lang w:eastAsia="en-IN"/>
+        </w:rPr>
+        <w:br/>
+        <w:t xml:space="preserve">        </w:t>
+      </w:r>
+      <w:proofErr w:type="spellStart"/>
+      <w:r>
+        <w:rPr>
+          <w:rFonts w:ascii="Courier New" w:eastAsia="Times New Roman" w:hAnsi="Courier New" w:cs="Courier New"/>
+          <w:color w:val="BCBEC4"/>
+          <w:sz w:val="23"/>
+          <w:szCs w:val="23"/>
+          <w:lang w:eastAsia="en-IN"/>
+        </w:rPr>
+        <w:t>driver.close</w:t>
+      </w:r>
+      <w:proofErr w:type="spellEnd"/>
+      <w:r>
+        <w:rPr>
+          <w:rFonts w:ascii="Courier New" w:eastAsia="Times New Roman" w:hAnsi="Courier New" w:cs="Courier New"/>
+          <w:color w:val="BCBEC4"/>
+          <w:sz w:val="23"/>
+          <w:szCs w:val="23"/>
+          <w:lang w:eastAsia="en-IN"/>
+        </w:rPr>
+        <w:t>();</w:t>
+      </w:r>
+      <w:r>
+        <w:rPr>
+          <w:rFonts w:ascii="Courier New" w:eastAsia="Times New Roman" w:hAnsi="Courier New" w:cs="Courier New"/>
+          <w:color w:val="BCBEC4"/>
+          <w:sz w:val="23"/>
+          <w:szCs w:val="23"/>
+          <w:lang w:eastAsia="en-IN"/>
+        </w:rPr>
+        <w:br/>
+      </w:r>
+      <w:r>
+        <w:rPr>
+          <w:rFonts w:ascii="Courier New" w:eastAsia="Times New Roman" w:hAnsi="Courier New" w:cs="Courier New"/>
+          <w:color w:val="BCBEC4"/>
+          <w:sz w:val="23"/>
+          <w:szCs w:val="23"/>
+          <w:lang w:eastAsia="en-IN"/>
+        </w:rPr>
+        <w:br/>
+        <w:t xml:space="preserve">        </w:t>
+      </w:r>
+      <w:r>
+        <w:rPr>
+          <w:rFonts w:ascii="Courier New" w:eastAsia="Times New Roman" w:hAnsi="Courier New" w:cs="Courier New"/>
+          <w:color w:val="7A7E85"/>
+          <w:sz w:val="23"/>
+          <w:szCs w:val="23"/>
+          <w:lang w:eastAsia="en-IN"/>
+        </w:rPr>
+        <w:t>//Adding the screenshot in Report</w:t>
+      </w:r>
+      <w:r>
+        <w:rPr>
+          <w:rFonts w:ascii="Courier New" w:eastAsia="Times New Roman" w:hAnsi="Courier New" w:cs="Courier New"/>
+          <w:color w:val="7A7E85"/>
+          <w:sz w:val="23"/>
+          <w:szCs w:val="23"/>
+          <w:lang w:eastAsia="en-IN"/>
+        </w:rPr>
+        <w:br/>
+        <w:t xml:space="preserve">        </w:t>
+      </w:r>
+      <w:r>
+        <w:rPr>
+          <w:rFonts w:ascii="Courier New" w:eastAsia="Times New Roman" w:hAnsi="Courier New" w:cs="Courier New"/>
+          <w:color w:val="BCBEC4"/>
+          <w:sz w:val="23"/>
+          <w:szCs w:val="23"/>
+          <w:lang w:eastAsia="en-IN"/>
+        </w:rPr>
+        <w:t>test.log(</w:t>
+      </w:r>
+      <w:proofErr w:type="spellStart"/>
+      <w:r>
+        <w:rPr>
+          <w:rFonts w:ascii="Courier New" w:eastAsia="Times New Roman" w:hAnsi="Courier New" w:cs="Courier New"/>
+          <w:color w:val="BCBEC4"/>
+          <w:sz w:val="23"/>
+          <w:szCs w:val="23"/>
+          <w:lang w:eastAsia="en-IN"/>
+        </w:rPr>
+        <w:t>Status.</w:t>
+      </w:r>
+      <w:r>
+        <w:rPr>
+          <w:rFonts w:ascii="Courier New" w:eastAsia="Times New Roman" w:hAnsi="Courier New" w:cs="Courier New"/>
+          <w:i/>
+          <w:iCs/>
+          <w:color w:val="C77DBB"/>
+          <w:sz w:val="23"/>
+          <w:szCs w:val="23"/>
+          <w:lang w:eastAsia="en-IN"/>
+        </w:rPr>
+        <w:t>FAIL</w:t>
+      </w:r>
+      <w:proofErr w:type="spellEnd"/>
+      <w:r>
+        <w:rPr>
+          <w:rFonts w:ascii="Courier New" w:eastAsia="Times New Roman" w:hAnsi="Courier New" w:cs="Courier New"/>
+          <w:color w:val="BCBEC4"/>
+          <w:sz w:val="23"/>
+          <w:szCs w:val="23"/>
+          <w:lang w:eastAsia="en-IN"/>
+        </w:rPr>
+        <w:t xml:space="preserve">, </w:t>
+      </w:r>
+      <w:proofErr w:type="spellStart"/>
+      <w:r>
+        <w:rPr>
+          <w:rFonts w:ascii="Courier New" w:eastAsia="Times New Roman" w:hAnsi="Courier New" w:cs="Courier New"/>
+          <w:color w:val="BCBEC4"/>
+          <w:sz w:val="23"/>
+          <w:szCs w:val="23"/>
+          <w:lang w:eastAsia="en-IN"/>
+        </w:rPr>
+        <w:t>MarkupHelper.</w:t>
+      </w:r>
+      <w:r>
+        <w:rPr>
+          <w:rFonts w:ascii="Courier New" w:eastAsia="Times New Roman" w:hAnsi="Courier New" w:cs="Courier New"/>
+          <w:i/>
+          <w:iCs/>
+          <w:color w:val="BCBEC4"/>
+          <w:sz w:val="23"/>
+          <w:szCs w:val="23"/>
+          <w:lang w:eastAsia="en-IN"/>
+        </w:rPr>
+        <w:t>createLabel</w:t>
+      </w:r>
+      <w:proofErr w:type="spellEnd"/>
+      <w:r>
+        <w:rPr>
+          <w:rFonts w:ascii="Courier New" w:eastAsia="Times New Roman" w:hAnsi="Courier New" w:cs="Courier New"/>
+          <w:color w:val="BCBEC4"/>
+          <w:sz w:val="23"/>
+          <w:szCs w:val="23"/>
+          <w:lang w:eastAsia="en-IN"/>
+        </w:rPr>
+        <w:t>(</w:t>
+      </w:r>
+      <w:r>
+        <w:rPr>
+          <w:rFonts w:ascii="Courier New" w:eastAsia="Times New Roman" w:hAnsi="Courier New" w:cs="Courier New"/>
+          <w:color w:val="6AAB73"/>
+          <w:sz w:val="23"/>
+          <w:szCs w:val="23"/>
+          <w:lang w:eastAsia="en-IN"/>
+        </w:rPr>
+        <w:t>"Search Test"</w:t>
+      </w:r>
+      <w:r>
+        <w:rPr>
+          <w:rFonts w:ascii="Courier New" w:eastAsia="Times New Roman" w:hAnsi="Courier New" w:cs="Courier New"/>
+          <w:color w:val="BCBEC4"/>
+          <w:sz w:val="23"/>
+          <w:szCs w:val="23"/>
+          <w:lang w:eastAsia="en-IN"/>
+        </w:rPr>
+        <w:t xml:space="preserve">, </w:t>
+      </w:r>
+      <w:proofErr w:type="spellStart"/>
+      <w:r>
+        <w:rPr>
+          <w:rFonts w:ascii="Courier New" w:eastAsia="Times New Roman" w:hAnsi="Courier New" w:cs="Courier New"/>
+          <w:color w:val="BCBEC4"/>
+          <w:sz w:val="23"/>
+          <w:szCs w:val="23"/>
+          <w:lang w:eastAsia="en-IN"/>
+        </w:rPr>
+        <w:t>ExtentColor.</w:t>
+      </w:r>
+      <w:r>
+        <w:rPr>
+          <w:rFonts w:ascii="Courier New" w:eastAsia="Times New Roman" w:hAnsi="Courier New" w:cs="Courier New"/>
+          <w:i/>
+          <w:iCs/>
+          <w:color w:val="C77DBB"/>
+          <w:sz w:val="23"/>
+          <w:szCs w:val="23"/>
+          <w:lang w:eastAsia="en-IN"/>
+        </w:rPr>
+        <w:t>RED</w:t>
+      </w:r>
+      <w:proofErr w:type="spellEnd"/>
+      <w:r>
+        <w:rPr>
+          <w:rFonts w:ascii="Courier New" w:eastAsia="Times New Roman" w:hAnsi="Courier New" w:cs="Courier New"/>
+          <w:color w:val="BCBEC4"/>
+          <w:sz w:val="23"/>
+          <w:szCs w:val="23"/>
+          <w:lang w:eastAsia="en-IN"/>
+        </w:rPr>
+        <w:t>));</w:t>
+      </w:r>
+      <w:r>
+        <w:rPr>
+          <w:rFonts w:ascii="Courier New" w:eastAsia="Times New Roman" w:hAnsi="Courier New" w:cs="Courier New"/>
+          <w:color w:val="BCBEC4"/>
+          <w:sz w:val="23"/>
+          <w:szCs w:val="23"/>
+          <w:lang w:eastAsia="en-IN"/>
+        </w:rPr>
+        <w:br/>
+        <w:t xml:space="preserve">        </w:t>
+      </w:r>
+      <w:proofErr w:type="spellStart"/>
+      <w:r>
+        <w:rPr>
+          <w:rFonts w:ascii="Courier New" w:eastAsia="Times New Roman" w:hAnsi="Courier New" w:cs="Courier New"/>
+          <w:color w:val="BCBEC4"/>
+          <w:sz w:val="23"/>
+          <w:szCs w:val="23"/>
+          <w:lang w:eastAsia="en-IN"/>
+        </w:rPr>
+        <w:t>test.fail</w:t>
+      </w:r>
+      <w:proofErr w:type="spellEnd"/>
+      <w:r>
+        <w:rPr>
+          <w:rFonts w:ascii="Courier New" w:eastAsia="Times New Roman" w:hAnsi="Courier New" w:cs="Courier New"/>
+          <w:color w:val="BCBEC4"/>
+          <w:sz w:val="23"/>
+          <w:szCs w:val="23"/>
+          <w:lang w:eastAsia="en-IN"/>
+        </w:rPr>
+        <w:t>(</w:t>
+      </w:r>
+      <w:r>
+        <w:rPr>
+          <w:rFonts w:ascii="Courier New" w:eastAsia="Times New Roman" w:hAnsi="Courier New" w:cs="Courier New"/>
+          <w:color w:val="6AAB73"/>
+          <w:sz w:val="23"/>
+          <w:szCs w:val="23"/>
+          <w:lang w:eastAsia="en-IN"/>
+        </w:rPr>
+        <w:t>"Test Failed"</w:t>
+      </w:r>
+      <w:r>
+        <w:rPr>
+          <w:rFonts w:ascii="Courier New" w:eastAsia="Times New Roman" w:hAnsi="Courier New" w:cs="Courier New"/>
+          <w:color w:val="BCBEC4"/>
+          <w:sz w:val="23"/>
+          <w:szCs w:val="23"/>
+          <w:lang w:eastAsia="en-IN"/>
+        </w:rPr>
+        <w:t>, MediaEntityBuilder.</w:t>
+      </w:r>
+      <w:r>
+        <w:rPr>
+          <w:rFonts w:ascii="Courier New" w:eastAsia="Times New Roman" w:hAnsi="Courier New" w:cs="Courier New"/>
+          <w:i/>
+          <w:iCs/>
+          <w:color w:val="BCBEC4"/>
+          <w:sz w:val="23"/>
+          <w:szCs w:val="23"/>
+          <w:lang w:eastAsia="en-IN"/>
+        </w:rPr>
+        <w:t>createScreenCaptureFromPath</w:t>
+      </w:r>
+      <w:r>
+        <w:rPr>
+          <w:rFonts w:ascii="Courier New" w:eastAsia="Times New Roman" w:hAnsi="Courier New" w:cs="Courier New"/>
+          <w:color w:val="BCBEC4"/>
+          <w:sz w:val="23"/>
+          <w:szCs w:val="23"/>
+          <w:lang w:eastAsia="en-IN"/>
+        </w:rPr>
+        <w:t>(</w:t>
+      </w:r>
+      <w:r>
+        <w:rPr>
+          <w:rFonts w:ascii="Courier New" w:eastAsia="Times New Roman" w:hAnsi="Courier New" w:cs="Courier New"/>
+          <w:color w:val="6AAB73"/>
+          <w:sz w:val="23"/>
+          <w:szCs w:val="23"/>
+          <w:lang w:eastAsia="en-IN"/>
+        </w:rPr>
+        <w:t>"Trial.jpeg"</w:t>
+      </w:r>
+      <w:r>
+        <w:rPr>
+          <w:rFonts w:ascii="Courier New" w:eastAsia="Times New Roman" w:hAnsi="Courier New" w:cs="Courier New"/>
+          <w:color w:val="BCBEC4"/>
+          <w:sz w:val="23"/>
+          <w:szCs w:val="23"/>
+          <w:lang w:eastAsia="en-IN"/>
+        </w:rPr>
+        <w:t>).build());</w:t>
+      </w:r>
+      <w:r>
+        <w:rPr>
+          <w:rFonts w:ascii="Courier New" w:eastAsia="Times New Roman" w:hAnsi="Courier New" w:cs="Courier New"/>
+          <w:color w:val="BCBEC4"/>
+          <w:sz w:val="23"/>
+          <w:szCs w:val="23"/>
+          <w:lang w:eastAsia="en-IN"/>
+        </w:rPr>
+        <w:br/>
+      </w:r>
+      <w:r>
+        <w:rPr>
+          <w:rFonts w:ascii="Courier New" w:eastAsia="Times New Roman" w:hAnsi="Courier New" w:cs="Courier New"/>
+          <w:color w:val="BCBEC4"/>
+          <w:sz w:val="23"/>
+          <w:szCs w:val="23"/>
+          <w:lang w:eastAsia="en-IN"/>
+        </w:rPr>
+        <w:br/>
+      </w:r>
+      <w:r>
+        <w:rPr>
+          <w:rFonts w:ascii="Courier New" w:eastAsia="Times New Roman" w:hAnsi="Courier New" w:cs="Courier New"/>
+          <w:color w:val="BCBEC4"/>
+          <w:sz w:val="23"/>
+          <w:szCs w:val="23"/>
+          <w:lang w:eastAsia="en-IN"/>
+        </w:rPr>
+        <w:br/>
+        <w:t xml:space="preserve">        </w:t>
+      </w:r>
+      <w:proofErr w:type="spellStart"/>
+      <w:r>
+        <w:rPr>
+          <w:rFonts w:ascii="Courier New" w:eastAsia="Times New Roman" w:hAnsi="Courier New" w:cs="Courier New"/>
+          <w:color w:val="BCBEC4"/>
+          <w:sz w:val="23"/>
+          <w:szCs w:val="23"/>
+          <w:lang w:eastAsia="en-IN"/>
+        </w:rPr>
+        <w:t>report.flush</w:t>
+      </w:r>
+      <w:proofErr w:type="spellEnd"/>
+      <w:r>
+        <w:rPr>
+          <w:rFonts w:ascii="Courier New" w:eastAsia="Times New Roman" w:hAnsi="Courier New" w:cs="Courier New"/>
+          <w:color w:val="BCBEC4"/>
+          <w:sz w:val="23"/>
+          <w:szCs w:val="23"/>
+          <w:lang w:eastAsia="en-IN"/>
+        </w:rPr>
+        <w:t>();</w:t>
+      </w:r>
+      <w:r>
+        <w:rPr>
+          <w:rFonts w:ascii="Courier New" w:eastAsia="Times New Roman" w:hAnsi="Courier New" w:cs="Courier New"/>
+          <w:color w:val="BCBEC4"/>
+          <w:sz w:val="23"/>
+          <w:szCs w:val="23"/>
+          <w:lang w:eastAsia="en-IN"/>
+        </w:rPr>
+        <w:br/>
+        <w:t xml:space="preserve">        </w:t>
+      </w:r>
+      <w:r>
+        <w:rPr>
+          <w:rFonts w:ascii="Courier New" w:eastAsia="Times New Roman" w:hAnsi="Courier New" w:cs="Courier New"/>
+          <w:color w:val="7A7E85"/>
+          <w:sz w:val="23"/>
+          <w:szCs w:val="23"/>
+          <w:lang w:eastAsia="en-IN"/>
+        </w:rPr>
+        <w:t>//This will create the report file</w:t>
+      </w:r>
+      <w:r>
+        <w:rPr>
+          <w:rFonts w:ascii="Courier New" w:eastAsia="Times New Roman" w:hAnsi="Courier New" w:cs="Courier New"/>
+          <w:color w:val="7A7E85"/>
+          <w:sz w:val="23"/>
+          <w:szCs w:val="23"/>
+          <w:lang w:eastAsia="en-IN"/>
+        </w:rPr>
+        <w:br/>
+        <w:t xml:space="preserve">    </w:t>
+      </w:r>
+      <w:r>
+        <w:rPr>
+          <w:rFonts w:ascii="Courier New" w:eastAsia="Times New Roman" w:hAnsi="Courier New" w:cs="Courier New"/>
+          <w:color w:val="BCBEC4"/>
+          <w:sz w:val="23"/>
+          <w:szCs w:val="23"/>
+          <w:lang w:eastAsia="en-IN"/>
+        </w:rPr>
+        <w:t>}</w:t>
+      </w:r>
+      <w:r>
+        <w:rPr>
+          <w:rFonts w:ascii="Courier New" w:eastAsia="Times New Roman" w:hAnsi="Courier New" w:cs="Courier New"/>
+          <w:color w:val="BCBEC4"/>
+          <w:sz w:val="23"/>
+          <w:szCs w:val="23"/>
+          <w:lang w:eastAsia="en-IN"/>
+        </w:rPr>
+        <w:br/>
+        <w:t>}</w:t>
+      </w:r>
+    </w:p>
+    <w:p>
+      <w:pPr>
+        <w:rPr>
+          <w:sz w:val="24"/>
+          <w:szCs w:val="22"/>
+          <w:lang w:val="en-US"/>
+        </w:rPr>
+      </w:pPr>
+      <w:bookmarkStart w:id="0" w:name="_GoBack"/>
+      <w:bookmarkEnd w:id="0"/>
     </w:p>
     <w:sectPr>
       <w:pgSz w:w="11906" w:h="16838"/>
@@ -8952,6 +12987,54 @@
     <w:basedOn w:val="DefaultParagraphFont"/>
     <w:rsid w:val="00CD47FC"/>
   </w:style>
+  <w:style w:type="paragraph" w:styleId="HTMLPreformatted">
+    <w:name w:val="HTML Preformatted"/>
+    <w:basedOn w:val="Normal"/>
+    <w:link w:val="HTMLPreformattedChar"/>
+    <w:uiPriority w:val="99"/>
+    <w:semiHidden/>
+    <w:unhideWhenUsed/>
+    <w:rsid w:val="00325CCE"/>
+    <w:pPr>
+      <w:tabs>
+        <w:tab w:val="left" w:pos="916"/>
+        <w:tab w:val="left" w:pos="1832"/>
+        <w:tab w:val="left" w:pos="2748"/>
+        <w:tab w:val="left" w:pos="3664"/>
+        <w:tab w:val="left" w:pos="4580"/>
+        <w:tab w:val="left" w:pos="5496"/>
+        <w:tab w:val="left" w:pos="6412"/>
+        <w:tab w:val="left" w:pos="7328"/>
+        <w:tab w:val="left" w:pos="8244"/>
+        <w:tab w:val="left" w:pos="9160"/>
+        <w:tab w:val="left" w:pos="10076"/>
+        <w:tab w:val="left" w:pos="10992"/>
+        <w:tab w:val="left" w:pos="11908"/>
+        <w:tab w:val="left" w:pos="12824"/>
+        <w:tab w:val="left" w:pos="13740"/>
+        <w:tab w:val="left" w:pos="14656"/>
+      </w:tabs>
+      <w:spacing w:after="0" w:line="240" w:lineRule="auto"/>
+    </w:pPr>
+    <w:rPr>
+      <w:rFonts w:ascii="Courier New" w:eastAsia="Times New Roman" w:hAnsi="Courier New" w:cs="Courier New"/>
+      <w:sz w:val="20"/>
+      <w:lang w:eastAsia="en-IN"/>
+    </w:rPr>
+  </w:style>
+  <w:style w:type="character" w:customStyle="1" w:styleId="HTMLPreformattedChar">
+    <w:name w:val="HTML Preformatted Char"/>
+    <w:basedOn w:val="DefaultParagraphFont"/>
+    <w:link w:val="HTMLPreformatted"/>
+    <w:uiPriority w:val="99"/>
+    <w:semiHidden/>
+    <w:rsid w:val="00325CCE"/>
+    <w:rPr>
+      <w:rFonts w:ascii="Courier New" w:eastAsia="Times New Roman" w:hAnsi="Courier New" w:cs="Courier New"/>
+      <w:sz w:val="20"/>
+      <w:lang w:eastAsia="en-IN"/>
+    </w:rPr>
+  </w:style>
 </w:styles>
 </file>
 

</xml_diff>

<commit_message>
Date: 13 Mar 2026
</commit_message>
<xml_diff>
--- a/Selenium_Notes.docx
+++ b/Selenium_Notes.docx
@@ -1610,7 +1610,6 @@
           <w:lang w:val="en-US"/>
         </w:rPr>
       </w:pPr>
-      <w:proofErr w:type="spellStart"/>
       <w:r>
         <w:rPr>
           <w:sz w:val="24"/>
@@ -1619,7 +1618,6 @@
         </w:rPr>
         <w:t>JMeeter</w:t>
       </w:r>
-      <w:proofErr w:type="spellEnd"/>
     </w:p>
     <w:p>
       <w:pPr>
@@ -2090,18 +2088,8 @@
           <w:szCs w:val="22"/>
           <w:lang w:val="en-US"/>
         </w:rPr>
-        <w:t xml:space="preserve">Idea </w:t>
-      </w:r>
-      <w:proofErr w:type="spellStart"/>
-      <w:r>
-        <w:rPr>
-          <w:sz w:val="24"/>
-          <w:szCs w:val="22"/>
-          <w:lang w:val="en-US"/>
-        </w:rPr>
-        <w:t>Itellij</w:t>
-      </w:r>
-      <w:proofErr w:type="spellEnd"/>
+        <w:t>Idea Itellij</w:t>
+      </w:r>
     </w:p>
     <w:p>
       <w:pPr>
@@ -2230,7 +2218,6 @@
           <w:lang w:val="en-US"/>
         </w:rPr>
       </w:pPr>
-      <w:proofErr w:type="spellStart"/>
       <w:r>
         <w:rPr>
           <w:sz w:val="24"/>
@@ -2239,7 +2226,6 @@
         </w:rPr>
         <w:t>YourName_SeleniumDemos</w:t>
       </w:r>
-      <w:proofErr w:type="spellEnd"/>
     </w:p>
     <w:p>
       <w:pPr>
@@ -2283,25 +2269,7 @@
           <w:szCs w:val="22"/>
           <w:lang w:val="en-US"/>
         </w:rPr>
-        <w:t xml:space="preserve">Open </w:t>
-      </w:r>
-      <w:proofErr w:type="spellStart"/>
-      <w:r>
-        <w:rPr>
-          <w:sz w:val="24"/>
-          <w:szCs w:val="22"/>
-          <w:lang w:val="en-US"/>
-        </w:rPr>
-        <w:t>selenium.dev</w:t>
-      </w:r>
-      <w:proofErr w:type="spellEnd"/>
-      <w:r>
-        <w:rPr>
-          <w:sz w:val="24"/>
-          <w:szCs w:val="22"/>
-          <w:lang w:val="en-US"/>
-        </w:rPr>
-        <w:t xml:space="preserve"> site</w:t>
+        <w:t>Open selenium.dev site</w:t>
       </w:r>
     </w:p>
     <w:p>
@@ -2520,25 +2488,7 @@
           <w:szCs w:val="22"/>
           <w:lang w:val="en-US"/>
         </w:rPr>
-        <w:t>Create a Package inside this project (</w:t>
-      </w:r>
-      <w:proofErr w:type="spellStart"/>
-      <w:r>
-        <w:rPr>
-          <w:sz w:val="24"/>
-          <w:szCs w:val="22"/>
-          <w:lang w:val="en-US"/>
-        </w:rPr>
-        <w:t>com.WebDriverDemos</w:t>
-      </w:r>
-      <w:proofErr w:type="spellEnd"/>
-      <w:r>
-        <w:rPr>
-          <w:sz w:val="24"/>
-          <w:szCs w:val="22"/>
-          <w:lang w:val="en-US"/>
-        </w:rPr>
-        <w:t>)</w:t>
+        <w:t>Create a Package inside this project (com.WebDriverDemos)</w:t>
       </w:r>
     </w:p>
     <w:p>
@@ -2755,23 +2705,13 @@
           <w:lang w:val="en-US"/>
         </w:rPr>
       </w:pPr>
-      <w:proofErr w:type="gramStart"/>
-      <w:r>
-        <w:rPr>
-          <w:sz w:val="24"/>
-          <w:szCs w:val="22"/>
-          <w:lang w:val="en-US"/>
-        </w:rPr>
-        <w:t>get(</w:t>
-      </w:r>
-      <w:proofErr w:type="gramEnd"/>
-      <w:r>
-        <w:rPr>
-          <w:sz w:val="24"/>
-          <w:szCs w:val="22"/>
-          <w:lang w:val="en-US"/>
-        </w:rPr>
-        <w:t xml:space="preserve">) </w:t>
+      <w:r>
+        <w:rPr>
+          <w:sz w:val="24"/>
+          <w:szCs w:val="22"/>
+          <w:lang w:val="en-US"/>
+        </w:rPr>
+        <w:t xml:space="preserve">get() </w:t>
       </w:r>
       <w:r>
         <w:rPr>
@@ -2803,33 +2743,13 @@
           <w:lang w:val="en-US"/>
         </w:rPr>
       </w:pPr>
-      <w:proofErr w:type="spellStart"/>
-      <w:proofErr w:type="gramStart"/>
-      <w:r>
-        <w:rPr>
-          <w:sz w:val="24"/>
-          <w:szCs w:val="22"/>
-          <w:lang w:val="en-US"/>
-        </w:rPr>
-        <w:t>driver.manage</w:t>
-      </w:r>
-      <w:proofErr w:type="spellEnd"/>
-      <w:r>
-        <w:rPr>
-          <w:sz w:val="24"/>
-          <w:szCs w:val="22"/>
-          <w:lang w:val="en-US"/>
-        </w:rPr>
-        <w:t>(</w:t>
-      </w:r>
-      <w:proofErr w:type="gramEnd"/>
-      <w:r>
-        <w:rPr>
-          <w:sz w:val="24"/>
-          <w:szCs w:val="22"/>
-          <w:lang w:val="en-US"/>
-        </w:rPr>
-        <w:t xml:space="preserve">).window().maximize() </w:t>
+      <w:r>
+        <w:rPr>
+          <w:sz w:val="24"/>
+          <w:szCs w:val="22"/>
+          <w:lang w:val="en-US"/>
+        </w:rPr>
+        <w:t xml:space="preserve">driver.manage().window().maximize() </w:t>
       </w:r>
       <w:r>
         <w:rPr>
@@ -2861,23 +2781,13 @@
           <w:lang w:val="en-US"/>
         </w:rPr>
       </w:pPr>
-      <w:proofErr w:type="gramStart"/>
-      <w:r>
-        <w:rPr>
-          <w:sz w:val="24"/>
-          <w:szCs w:val="22"/>
-          <w:lang w:val="en-US"/>
-        </w:rPr>
-        <w:t>close(</w:t>
-      </w:r>
-      <w:proofErr w:type="gramEnd"/>
-      <w:r>
-        <w:rPr>
-          <w:sz w:val="24"/>
-          <w:szCs w:val="22"/>
-          <w:lang w:val="en-US"/>
-        </w:rPr>
-        <w:t xml:space="preserve">) </w:t>
+      <w:r>
+        <w:rPr>
+          <w:sz w:val="24"/>
+          <w:szCs w:val="22"/>
+          <w:lang w:val="en-US"/>
+        </w:rPr>
+        <w:t xml:space="preserve">close() </w:t>
       </w:r>
       <w:r>
         <w:rPr>
@@ -2935,23 +2845,13 @@
           <w:lang w:val="en-US"/>
         </w:rPr>
       </w:pPr>
-      <w:proofErr w:type="gramStart"/>
-      <w:r>
-        <w:rPr>
-          <w:sz w:val="24"/>
-          <w:szCs w:val="22"/>
-          <w:lang w:val="en-US"/>
-        </w:rPr>
-        <w:t>getTitle(</w:t>
-      </w:r>
-      <w:proofErr w:type="gramEnd"/>
-      <w:r>
-        <w:rPr>
-          <w:sz w:val="24"/>
-          <w:szCs w:val="22"/>
-          <w:lang w:val="en-US"/>
-        </w:rPr>
-        <w:t xml:space="preserve">) </w:t>
+      <w:r>
+        <w:rPr>
+          <w:sz w:val="24"/>
+          <w:szCs w:val="22"/>
+          <w:lang w:val="en-US"/>
+        </w:rPr>
+        <w:t xml:space="preserve">getTitle() </w:t>
       </w:r>
       <w:r>
         <w:rPr>
@@ -3021,23 +2921,13 @@
           <w:lang w:val="en-US"/>
         </w:rPr>
       </w:pPr>
-      <w:proofErr w:type="gramStart"/>
-      <w:r>
-        <w:rPr>
-          <w:sz w:val="24"/>
-          <w:szCs w:val="22"/>
-          <w:lang w:val="en-US"/>
-        </w:rPr>
-        <w:t>getPageSource(</w:t>
-      </w:r>
-      <w:proofErr w:type="gramEnd"/>
-      <w:r>
-        <w:rPr>
-          <w:sz w:val="24"/>
-          <w:szCs w:val="22"/>
-          <w:lang w:val="en-US"/>
-        </w:rPr>
-        <w:t xml:space="preserve">) </w:t>
+      <w:r>
+        <w:rPr>
+          <w:sz w:val="24"/>
+          <w:szCs w:val="22"/>
+          <w:lang w:val="en-US"/>
+        </w:rPr>
+        <w:t xml:space="preserve">getPageSource() </w:t>
       </w:r>
       <w:r>
         <w:rPr>
@@ -3069,23 +2959,13 @@
           <w:lang w:val="en-US"/>
         </w:rPr>
       </w:pPr>
-      <w:proofErr w:type="gramStart"/>
-      <w:r>
-        <w:rPr>
-          <w:sz w:val="24"/>
-          <w:szCs w:val="22"/>
-          <w:lang w:val="en-US"/>
-        </w:rPr>
-        <w:t>findElement(</w:t>
-      </w:r>
-      <w:proofErr w:type="gramEnd"/>
-      <w:r>
-        <w:rPr>
-          <w:sz w:val="24"/>
-          <w:szCs w:val="22"/>
-          <w:lang w:val="en-US"/>
-        </w:rPr>
-        <w:t xml:space="preserve">) </w:t>
+      <w:r>
+        <w:rPr>
+          <w:sz w:val="24"/>
+          <w:szCs w:val="22"/>
+          <w:lang w:val="en-US"/>
+        </w:rPr>
+        <w:t xml:space="preserve">findElement() </w:t>
       </w:r>
       <w:r>
         <w:rPr>
@@ -3465,35 +3345,7 @@
           <w:szCs w:val="22"/>
           <w:lang w:val="en-US"/>
         </w:rPr>
-        <w:t xml:space="preserve"> If the specific page (URL) is not getting loaded within 30 seconds while calling </w:t>
-      </w:r>
-      <w:proofErr w:type="spellStart"/>
-      <w:proofErr w:type="gramStart"/>
-      <w:r>
-        <w:rPr>
-          <w:sz w:val="24"/>
-          <w:szCs w:val="22"/>
-          <w:lang w:val="en-US"/>
-        </w:rPr>
-        <w:t>driver.get</w:t>
-      </w:r>
-      <w:proofErr w:type="spellEnd"/>
-      <w:r>
-        <w:rPr>
-          <w:sz w:val="24"/>
-          <w:szCs w:val="22"/>
-          <w:lang w:val="en-US"/>
-        </w:rPr>
-        <w:t>(</w:t>
-      </w:r>
-      <w:proofErr w:type="gramEnd"/>
-      <w:r>
-        <w:rPr>
-          <w:sz w:val="24"/>
-          <w:szCs w:val="22"/>
-          <w:lang w:val="en-US"/>
-        </w:rPr>
-        <w:t>).</w:t>
+        <w:t xml:space="preserve"> If the specific page (URL) is not getting loaded within 30 seconds while calling driver.get().</w:t>
       </w:r>
     </w:p>
     <w:p>
@@ -3627,23 +3479,13 @@
           <w:lang w:val="en-US"/>
         </w:rPr>
       </w:pPr>
-      <w:proofErr w:type="gramStart"/>
-      <w:r>
-        <w:rPr>
-          <w:sz w:val="24"/>
-          <w:szCs w:val="22"/>
-          <w:lang w:val="en-US"/>
-        </w:rPr>
-        <w:t>sendKeys(</w:t>
-      </w:r>
-      <w:proofErr w:type="gramEnd"/>
-      <w:r>
-        <w:rPr>
-          <w:sz w:val="24"/>
-          <w:szCs w:val="22"/>
-          <w:lang w:val="en-US"/>
-        </w:rPr>
-        <w:t xml:space="preserve">) </w:t>
+      <w:r>
+        <w:rPr>
+          <w:sz w:val="24"/>
+          <w:szCs w:val="22"/>
+          <w:lang w:val="en-US"/>
+        </w:rPr>
+        <w:t xml:space="preserve">sendKeys() </w:t>
       </w:r>
       <w:r>
         <w:rPr>
@@ -3683,23 +3525,13 @@
           <w:lang w:val="en-US"/>
         </w:rPr>
       </w:pPr>
-      <w:proofErr w:type="gramStart"/>
-      <w:r>
-        <w:rPr>
-          <w:sz w:val="24"/>
-          <w:szCs w:val="22"/>
-          <w:lang w:val="en-US"/>
-        </w:rPr>
-        <w:t>click(</w:t>
-      </w:r>
-      <w:proofErr w:type="gramEnd"/>
-      <w:r>
-        <w:rPr>
-          <w:sz w:val="24"/>
-          <w:szCs w:val="22"/>
-          <w:lang w:val="en-US"/>
-        </w:rPr>
-        <w:t xml:space="preserve">) </w:t>
+      <w:r>
+        <w:rPr>
+          <w:sz w:val="24"/>
+          <w:szCs w:val="22"/>
+          <w:lang w:val="en-US"/>
+        </w:rPr>
+        <w:t xml:space="preserve">click() </w:t>
       </w:r>
       <w:r>
         <w:rPr>
@@ -3731,23 +3563,13 @@
           <w:lang w:val="en-US"/>
         </w:rPr>
       </w:pPr>
-      <w:proofErr w:type="gramStart"/>
-      <w:r>
-        <w:rPr>
-          <w:sz w:val="24"/>
-          <w:szCs w:val="22"/>
-          <w:lang w:val="en-US"/>
-        </w:rPr>
-        <w:t>getText(</w:t>
-      </w:r>
-      <w:proofErr w:type="gramEnd"/>
-      <w:r>
-        <w:rPr>
-          <w:sz w:val="24"/>
-          <w:szCs w:val="22"/>
-          <w:lang w:val="en-US"/>
-        </w:rPr>
-        <w:t xml:space="preserve">) </w:t>
+      <w:r>
+        <w:rPr>
+          <w:sz w:val="24"/>
+          <w:szCs w:val="22"/>
+          <w:lang w:val="en-US"/>
+        </w:rPr>
+        <w:t xml:space="preserve">getText() </w:t>
       </w:r>
       <w:r>
         <w:rPr>
@@ -3779,23 +3601,13 @@
           <w:lang w:val="en-US"/>
         </w:rPr>
       </w:pPr>
-      <w:proofErr w:type="gramStart"/>
-      <w:r>
-        <w:rPr>
-          <w:sz w:val="24"/>
-          <w:szCs w:val="22"/>
-          <w:lang w:val="en-US"/>
-        </w:rPr>
-        <w:t>getAttribute(</w:t>
-      </w:r>
-      <w:proofErr w:type="gramEnd"/>
-      <w:r>
-        <w:rPr>
-          <w:sz w:val="24"/>
-          <w:szCs w:val="22"/>
-          <w:lang w:val="en-US"/>
-        </w:rPr>
-        <w:t xml:space="preserve">) / getDomAttribute() </w:t>
+      <w:r>
+        <w:rPr>
+          <w:sz w:val="24"/>
+          <w:szCs w:val="22"/>
+          <w:lang w:val="en-US"/>
+        </w:rPr>
+        <w:t xml:space="preserve">getAttribute() / getDomAttribute() </w:t>
       </w:r>
       <w:r>
         <w:rPr>
@@ -4456,25 +4268,7 @@
           <w:szCs w:val="22"/>
           <w:lang w:val="en-US"/>
         </w:rPr>
-        <w:t>data-</w:t>
-      </w:r>
-      <w:proofErr w:type="spellStart"/>
-      <w:r>
-        <w:rPr>
-          <w:sz w:val="24"/>
-          <w:szCs w:val="22"/>
-          <w:lang w:val="en-US"/>
-        </w:rPr>
-        <w:t>testid</w:t>
-      </w:r>
-      <w:proofErr w:type="spellEnd"/>
-      <w:r>
-        <w:rPr>
-          <w:sz w:val="24"/>
-          <w:szCs w:val="22"/>
-          <w:lang w:val="en-US"/>
-        </w:rPr>
-        <w:t>="royal-email"]</w:t>
+        <w:t>data-testid="royal-email"]</w:t>
       </w:r>
     </w:p>
     <w:p>
@@ -5078,25 +4872,7 @@
           <w:szCs w:val="22"/>
           <w:lang w:val="en-US"/>
         </w:rPr>
-        <w:t xml:space="preserve">Selenium has a special class to handle such a drop down list </w:t>
-      </w:r>
-      <w:proofErr w:type="spellStart"/>
-      <w:r>
-        <w:rPr>
-          <w:sz w:val="24"/>
-          <w:szCs w:val="22"/>
-          <w:lang w:val="en-US"/>
-        </w:rPr>
-        <w:t>ie</w:t>
-      </w:r>
-      <w:proofErr w:type="spellEnd"/>
-      <w:r>
-        <w:rPr>
-          <w:sz w:val="24"/>
-          <w:szCs w:val="22"/>
-          <w:lang w:val="en-US"/>
-        </w:rPr>
-        <w:t xml:space="preserve">. </w:t>
+        <w:t xml:space="preserve">Selenium has a special class to handle such a drop down list ie. </w:t>
       </w:r>
       <w:r>
         <w:rPr>
@@ -5184,23 +4960,13 @@
           <w:lang w:val="en-US"/>
         </w:rPr>
       </w:pPr>
-      <w:proofErr w:type="gramStart"/>
-      <w:r>
-        <w:rPr>
-          <w:sz w:val="24"/>
-          <w:szCs w:val="22"/>
-          <w:lang w:val="en-US"/>
-        </w:rPr>
-        <w:t>getOptions(</w:t>
-      </w:r>
-      <w:proofErr w:type="gramEnd"/>
-      <w:r>
-        <w:rPr>
-          <w:sz w:val="24"/>
-          <w:szCs w:val="22"/>
-          <w:lang w:val="en-US"/>
-        </w:rPr>
-        <w:t xml:space="preserve">) </w:t>
+      <w:r>
+        <w:rPr>
+          <w:sz w:val="24"/>
+          <w:szCs w:val="22"/>
+          <w:lang w:val="en-US"/>
+        </w:rPr>
+        <w:t xml:space="preserve">getOptions() </w:t>
       </w:r>
       <w:r>
         <w:rPr>
@@ -5309,23 +5075,13 @@
           <w:lang w:val="en-US"/>
         </w:rPr>
       </w:pPr>
-      <w:proofErr w:type="gramStart"/>
-      <w:r>
-        <w:rPr>
-          <w:sz w:val="24"/>
-          <w:szCs w:val="22"/>
-          <w:lang w:val="en-US"/>
-        </w:rPr>
-        <w:t>selectByValue(</w:t>
-      </w:r>
-      <w:proofErr w:type="gramEnd"/>
-      <w:r>
-        <w:rPr>
-          <w:sz w:val="24"/>
-          <w:szCs w:val="22"/>
-          <w:lang w:val="en-US"/>
-        </w:rPr>
-        <w:t xml:space="preserve">) </w:t>
+      <w:r>
+        <w:rPr>
+          <w:sz w:val="24"/>
+          <w:szCs w:val="22"/>
+          <w:lang w:val="en-US"/>
+        </w:rPr>
+        <w:t xml:space="preserve">selectByValue() </w:t>
       </w:r>
       <w:r>
         <w:rPr>
@@ -5395,23 +5151,13 @@
           <w:lang w:val="en-US"/>
         </w:rPr>
       </w:pPr>
-      <w:proofErr w:type="gramStart"/>
-      <w:r>
-        <w:rPr>
-          <w:sz w:val="24"/>
-          <w:szCs w:val="22"/>
-          <w:lang w:val="en-US"/>
-        </w:rPr>
-        <w:t>isMultiple(</w:t>
-      </w:r>
-      <w:proofErr w:type="gramEnd"/>
-      <w:r>
-        <w:rPr>
-          <w:sz w:val="24"/>
-          <w:szCs w:val="22"/>
-          <w:lang w:val="en-US"/>
-        </w:rPr>
-        <w:t xml:space="preserve">) </w:t>
+      <w:r>
+        <w:rPr>
+          <w:sz w:val="24"/>
+          <w:szCs w:val="22"/>
+          <w:lang w:val="en-US"/>
+        </w:rPr>
+        <w:t xml:space="preserve">isMultiple() </w:t>
       </w:r>
       <w:r>
         <w:rPr>
@@ -5615,23 +5361,13 @@
           <w:lang w:val="en-US"/>
         </w:rPr>
       </w:pPr>
-      <w:proofErr w:type="spellStart"/>
-      <w:r>
-        <w:rPr>
-          <w:sz w:val="24"/>
-          <w:szCs w:val="22"/>
-          <w:lang w:val="en-US"/>
-        </w:rPr>
-        <w:t>Thread.sleep</w:t>
-      </w:r>
-      <w:proofErr w:type="spellEnd"/>
-      <w:r>
-        <w:rPr>
-          <w:sz w:val="24"/>
-          <w:szCs w:val="22"/>
-          <w:lang w:val="en-US"/>
-        </w:rPr>
-        <w:t>()</w:t>
+      <w:r>
+        <w:rPr>
+          <w:sz w:val="24"/>
+          <w:szCs w:val="22"/>
+          <w:lang w:val="en-US"/>
+        </w:rPr>
+        <w:t>Thread.sleep()</w:t>
       </w:r>
       <w:r>
         <w:rPr>
@@ -5859,25 +5595,7 @@
           <w:szCs w:val="22"/>
           <w:lang w:val="en-US"/>
         </w:rPr>
-        <w:t xml:space="preserve"> It is combination of </w:t>
-      </w:r>
-      <w:proofErr w:type="spellStart"/>
-      <w:r>
-        <w:rPr>
-          <w:sz w:val="24"/>
-          <w:szCs w:val="22"/>
-          <w:lang w:val="en-US"/>
-        </w:rPr>
-        <w:t>Thread.sleep</w:t>
-      </w:r>
-      <w:proofErr w:type="spellEnd"/>
-      <w:r>
-        <w:rPr>
-          <w:sz w:val="24"/>
-          <w:szCs w:val="22"/>
-          <w:lang w:val="en-US"/>
-        </w:rPr>
-        <w:t xml:space="preserve"> &amp; Implicit Wait</w:t>
+        <w:t xml:space="preserve"> It is combination of Thread.sleep &amp; Implicit Wait</w:t>
       </w:r>
     </w:p>
     <w:p>
@@ -5943,43 +5661,7 @@
           <w:szCs w:val="22"/>
           <w:lang w:val="en-US"/>
         </w:rPr>
-        <w:t xml:space="preserve">We can handle some specific condition for wait (ElementToBeClickable, </w:t>
-      </w:r>
-      <w:proofErr w:type="spellStart"/>
-      <w:r>
-        <w:rPr>
-          <w:sz w:val="24"/>
-          <w:szCs w:val="22"/>
-          <w:lang w:val="en-US"/>
-        </w:rPr>
-        <w:t>AlertToPresent</w:t>
-      </w:r>
-      <w:proofErr w:type="spellEnd"/>
-      <w:r>
-        <w:rPr>
-          <w:sz w:val="24"/>
-          <w:szCs w:val="22"/>
-          <w:lang w:val="en-US"/>
-        </w:rPr>
-        <w:t xml:space="preserve">, </w:t>
-      </w:r>
-      <w:proofErr w:type="spellStart"/>
-      <w:r>
-        <w:rPr>
-          <w:sz w:val="24"/>
-          <w:szCs w:val="22"/>
-          <w:lang w:val="en-US"/>
-        </w:rPr>
-        <w:t>VisibilityOfElementLocateBy</w:t>
-      </w:r>
-      <w:proofErr w:type="spellEnd"/>
-      <w:r>
-        <w:rPr>
-          <w:sz w:val="24"/>
-          <w:szCs w:val="22"/>
-          <w:lang w:val="en-US"/>
-        </w:rPr>
-        <w:t>)</w:t>
+        <w:t>We can handle some specific condition for wait (ElementToBeClickable, AlertToPresent, VisibilityOfElementLocateBy)</w:t>
       </w:r>
     </w:p>
     <w:p>
@@ -6091,43 +5773,7 @@
           <w:szCs w:val="22"/>
           <w:lang w:val="en-US"/>
         </w:rPr>
-        <w:t xml:space="preserve">We can handle some specific condition for wait (ElementToBeClickable, </w:t>
-      </w:r>
-      <w:proofErr w:type="spellStart"/>
-      <w:r>
-        <w:rPr>
-          <w:sz w:val="24"/>
-          <w:szCs w:val="22"/>
-          <w:lang w:val="en-US"/>
-        </w:rPr>
-        <w:t>AlertToPresent</w:t>
-      </w:r>
-      <w:proofErr w:type="spellEnd"/>
-      <w:r>
-        <w:rPr>
-          <w:sz w:val="24"/>
-          <w:szCs w:val="22"/>
-          <w:lang w:val="en-US"/>
-        </w:rPr>
-        <w:t xml:space="preserve">, </w:t>
-      </w:r>
-      <w:proofErr w:type="spellStart"/>
-      <w:r>
-        <w:rPr>
-          <w:sz w:val="24"/>
-          <w:szCs w:val="22"/>
-          <w:lang w:val="en-US"/>
-        </w:rPr>
-        <w:t>VisibilityOfElementLocateBy</w:t>
-      </w:r>
-      <w:proofErr w:type="spellEnd"/>
-      <w:r>
-        <w:rPr>
-          <w:sz w:val="24"/>
-          <w:szCs w:val="22"/>
-          <w:lang w:val="en-US"/>
-        </w:rPr>
-        <w:t>)</w:t>
+        <w:t>We can handle some specific condition for wait (ElementToBeClickable, AlertToPresent, VisibilityOfElementLocateBy)</w:t>
       </w:r>
     </w:p>
     <w:p>
@@ -6209,23 +5855,13 @@
           <w:lang w:val="en-US"/>
         </w:rPr>
       </w:pPr>
-      <w:proofErr w:type="spellStart"/>
-      <w:r>
-        <w:rPr>
-          <w:sz w:val="24"/>
-          <w:szCs w:val="22"/>
-          <w:lang w:val="en-US"/>
-        </w:rPr>
-        <w:t>i</w:t>
-      </w:r>
-      <w:proofErr w:type="spellEnd"/>
-      <w:r>
-        <w:rPr>
-          <w:sz w:val="24"/>
-          <w:szCs w:val="22"/>
-          <w:lang w:val="en-US"/>
-        </w:rPr>
-        <w:t xml:space="preserve"> - ignoring</w:t>
+      <w:r>
+        <w:rPr>
+          <w:sz w:val="24"/>
+          <w:szCs w:val="22"/>
+          <w:lang w:val="en-US"/>
+        </w:rPr>
+        <w:t>i - ignoring</w:t>
       </w:r>
     </w:p>
     <w:p>
@@ -6307,23 +5943,13 @@
           <w:lang w:val="en-US"/>
         </w:rPr>
       </w:pPr>
-      <w:proofErr w:type="spellStart"/>
-      <w:r>
-        <w:rPr>
-          <w:sz w:val="24"/>
-          <w:szCs w:val="22"/>
-          <w:lang w:val="en-US"/>
-        </w:rPr>
-        <w:t>driver.get</w:t>
-      </w:r>
-      <w:proofErr w:type="spellEnd"/>
-      <w:r>
-        <w:rPr>
-          <w:sz w:val="24"/>
-          <w:szCs w:val="22"/>
-          <w:lang w:val="en-US"/>
-        </w:rPr>
-        <w:t>() is having implicit wait for 30 seconds</w:t>
+      <w:r>
+        <w:rPr>
+          <w:sz w:val="24"/>
+          <w:szCs w:val="22"/>
+          <w:lang w:val="en-US"/>
+        </w:rPr>
+        <w:t>driver.get() is having implicit wait for 30 seconds</w:t>
       </w:r>
     </w:p>
     <w:p>
@@ -6474,27 +6100,15 @@
         </w:rPr>
         <w:t xml:space="preserve">package </w:t>
       </w:r>
-      <w:proofErr w:type="spellStart"/>
-      <w:r>
-        <w:rPr>
-          <w:rFonts w:ascii="Courier New" w:eastAsia="Times New Roman" w:hAnsi="Courier New" w:cs="Courier New"/>
-          <w:color w:val="BCBEC4"/>
-          <w:sz w:val="23"/>
-          <w:szCs w:val="23"/>
-          <w:lang w:eastAsia="en-IN"/>
-        </w:rPr>
-        <w:t>com.WebTests</w:t>
-      </w:r>
-      <w:proofErr w:type="spellEnd"/>
-      <w:r>
-        <w:rPr>
-          <w:rFonts w:ascii="Courier New" w:eastAsia="Times New Roman" w:hAnsi="Courier New" w:cs="Courier New"/>
-          <w:color w:val="BCBEC4"/>
-          <w:sz w:val="23"/>
-          <w:szCs w:val="23"/>
-          <w:lang w:eastAsia="en-IN"/>
-        </w:rPr>
-        <w:t>;</w:t>
+      <w:r>
+        <w:rPr>
+          <w:rFonts w:ascii="Courier New" w:eastAsia="Times New Roman" w:hAnsi="Courier New" w:cs="Courier New"/>
+          <w:color w:val="BCBEC4"/>
+          <w:sz w:val="23"/>
+          <w:szCs w:val="23"/>
+          <w:lang w:eastAsia="en-IN"/>
+        </w:rPr>
+        <w:t>com.WebTests;</w:t>
       </w:r>
       <w:r>
         <w:rPr>
@@ -6526,27 +6140,15 @@
         </w:rPr>
         <w:t xml:space="preserve">import </w:t>
       </w:r>
-      <w:proofErr w:type="spellStart"/>
-      <w:r>
-        <w:rPr>
-          <w:rFonts w:ascii="Courier New" w:eastAsia="Times New Roman" w:hAnsi="Courier New" w:cs="Courier New"/>
-          <w:color w:val="BCBEC4"/>
-          <w:sz w:val="23"/>
-          <w:szCs w:val="23"/>
-          <w:lang w:eastAsia="en-IN"/>
-        </w:rPr>
-        <w:t>com.aventstack.extentreports.ExtentReports</w:t>
-      </w:r>
-      <w:proofErr w:type="spellEnd"/>
-      <w:r>
-        <w:rPr>
-          <w:rFonts w:ascii="Courier New" w:eastAsia="Times New Roman" w:hAnsi="Courier New" w:cs="Courier New"/>
-          <w:color w:val="BCBEC4"/>
-          <w:sz w:val="23"/>
-          <w:szCs w:val="23"/>
-          <w:lang w:eastAsia="en-IN"/>
-        </w:rPr>
-        <w:t>;</w:t>
+      <w:r>
+        <w:rPr>
+          <w:rFonts w:ascii="Courier New" w:eastAsia="Times New Roman" w:hAnsi="Courier New" w:cs="Courier New"/>
+          <w:color w:val="BCBEC4"/>
+          <w:sz w:val="23"/>
+          <w:szCs w:val="23"/>
+          <w:lang w:eastAsia="en-IN"/>
+        </w:rPr>
+        <w:t>com.aventstack.extentreports.ExtentReports;</w:t>
       </w:r>
       <w:r>
         <w:rPr>
@@ -6568,27 +6170,15 @@
         </w:rPr>
         <w:t xml:space="preserve">import </w:t>
       </w:r>
-      <w:proofErr w:type="spellStart"/>
-      <w:r>
-        <w:rPr>
-          <w:rFonts w:ascii="Courier New" w:eastAsia="Times New Roman" w:hAnsi="Courier New" w:cs="Courier New"/>
-          <w:color w:val="BCBEC4"/>
-          <w:sz w:val="23"/>
-          <w:szCs w:val="23"/>
-          <w:lang w:eastAsia="en-IN"/>
-        </w:rPr>
-        <w:t>com.aventstack.extentreports.ExtentTest</w:t>
-      </w:r>
-      <w:proofErr w:type="spellEnd"/>
-      <w:r>
-        <w:rPr>
-          <w:rFonts w:ascii="Courier New" w:eastAsia="Times New Roman" w:hAnsi="Courier New" w:cs="Courier New"/>
-          <w:color w:val="BCBEC4"/>
-          <w:sz w:val="23"/>
-          <w:szCs w:val="23"/>
-          <w:lang w:eastAsia="en-IN"/>
-        </w:rPr>
-        <w:t>;</w:t>
+      <w:r>
+        <w:rPr>
+          <w:rFonts w:ascii="Courier New" w:eastAsia="Times New Roman" w:hAnsi="Courier New" w:cs="Courier New"/>
+          <w:color w:val="BCBEC4"/>
+          <w:sz w:val="23"/>
+          <w:szCs w:val="23"/>
+          <w:lang w:eastAsia="en-IN"/>
+        </w:rPr>
+        <w:t>com.aventstack.extentreports.ExtentTest;</w:t>
       </w:r>
       <w:r>
         <w:rPr>
@@ -6610,27 +6200,15 @@
         </w:rPr>
         <w:t xml:space="preserve">import </w:t>
       </w:r>
-      <w:proofErr w:type="spellStart"/>
-      <w:r>
-        <w:rPr>
-          <w:rFonts w:ascii="Courier New" w:eastAsia="Times New Roman" w:hAnsi="Courier New" w:cs="Courier New"/>
-          <w:color w:val="BCBEC4"/>
-          <w:sz w:val="23"/>
-          <w:szCs w:val="23"/>
-          <w:lang w:eastAsia="en-IN"/>
-        </w:rPr>
-        <w:t>com.aventstack.extentreports.MediaEntityBuilder</w:t>
-      </w:r>
-      <w:proofErr w:type="spellEnd"/>
-      <w:r>
-        <w:rPr>
-          <w:rFonts w:ascii="Courier New" w:eastAsia="Times New Roman" w:hAnsi="Courier New" w:cs="Courier New"/>
-          <w:color w:val="BCBEC4"/>
-          <w:sz w:val="23"/>
-          <w:szCs w:val="23"/>
-          <w:lang w:eastAsia="en-IN"/>
-        </w:rPr>
-        <w:t>;</w:t>
+      <w:r>
+        <w:rPr>
+          <w:rFonts w:ascii="Courier New" w:eastAsia="Times New Roman" w:hAnsi="Courier New" w:cs="Courier New"/>
+          <w:color w:val="BCBEC4"/>
+          <w:sz w:val="23"/>
+          <w:szCs w:val="23"/>
+          <w:lang w:eastAsia="en-IN"/>
+        </w:rPr>
+        <w:t>com.aventstack.extentreports.MediaEntityBuilder;</w:t>
       </w:r>
       <w:r>
         <w:rPr>
@@ -6652,27 +6230,15 @@
         </w:rPr>
         <w:t xml:space="preserve">import </w:t>
       </w:r>
-      <w:proofErr w:type="spellStart"/>
-      <w:r>
-        <w:rPr>
-          <w:rFonts w:ascii="Courier New" w:eastAsia="Times New Roman" w:hAnsi="Courier New" w:cs="Courier New"/>
-          <w:color w:val="BCBEC4"/>
-          <w:sz w:val="23"/>
-          <w:szCs w:val="23"/>
-          <w:lang w:eastAsia="en-IN"/>
-        </w:rPr>
-        <w:t>com.aventstack.extentreports.Status</w:t>
-      </w:r>
-      <w:proofErr w:type="spellEnd"/>
-      <w:r>
-        <w:rPr>
-          <w:rFonts w:ascii="Courier New" w:eastAsia="Times New Roman" w:hAnsi="Courier New" w:cs="Courier New"/>
-          <w:color w:val="BCBEC4"/>
-          <w:sz w:val="23"/>
-          <w:szCs w:val="23"/>
-          <w:lang w:eastAsia="en-IN"/>
-        </w:rPr>
-        <w:t>;</w:t>
+      <w:r>
+        <w:rPr>
+          <w:rFonts w:ascii="Courier New" w:eastAsia="Times New Roman" w:hAnsi="Courier New" w:cs="Courier New"/>
+          <w:color w:val="BCBEC4"/>
+          <w:sz w:val="23"/>
+          <w:szCs w:val="23"/>
+          <w:lang w:eastAsia="en-IN"/>
+        </w:rPr>
+        <w:t>com.aventstack.extentreports.Status;</w:t>
       </w:r>
       <w:r>
         <w:rPr>
@@ -6694,27 +6260,15 @@
         </w:rPr>
         <w:t xml:space="preserve">import </w:t>
       </w:r>
-      <w:proofErr w:type="spellStart"/>
-      <w:r>
-        <w:rPr>
-          <w:rFonts w:ascii="Courier New" w:eastAsia="Times New Roman" w:hAnsi="Courier New" w:cs="Courier New"/>
-          <w:color w:val="BCBEC4"/>
-          <w:sz w:val="23"/>
-          <w:szCs w:val="23"/>
-          <w:lang w:eastAsia="en-IN"/>
-        </w:rPr>
-        <w:t>com.aventstack.extentreports.markuputils.ExtentColor</w:t>
-      </w:r>
-      <w:proofErr w:type="spellEnd"/>
-      <w:r>
-        <w:rPr>
-          <w:rFonts w:ascii="Courier New" w:eastAsia="Times New Roman" w:hAnsi="Courier New" w:cs="Courier New"/>
-          <w:color w:val="BCBEC4"/>
-          <w:sz w:val="23"/>
-          <w:szCs w:val="23"/>
-          <w:lang w:eastAsia="en-IN"/>
-        </w:rPr>
-        <w:t>;</w:t>
+      <w:r>
+        <w:rPr>
+          <w:rFonts w:ascii="Courier New" w:eastAsia="Times New Roman" w:hAnsi="Courier New" w:cs="Courier New"/>
+          <w:color w:val="BCBEC4"/>
+          <w:sz w:val="23"/>
+          <w:szCs w:val="23"/>
+          <w:lang w:eastAsia="en-IN"/>
+        </w:rPr>
+        <w:t>com.aventstack.extentreports.markuputils.ExtentColor;</w:t>
       </w:r>
       <w:r>
         <w:rPr>
@@ -6736,27 +6290,15 @@
         </w:rPr>
         <w:t xml:space="preserve">import </w:t>
       </w:r>
-      <w:proofErr w:type="spellStart"/>
-      <w:r>
-        <w:rPr>
-          <w:rFonts w:ascii="Courier New" w:eastAsia="Times New Roman" w:hAnsi="Courier New" w:cs="Courier New"/>
-          <w:color w:val="BCBEC4"/>
-          <w:sz w:val="23"/>
-          <w:szCs w:val="23"/>
-          <w:lang w:eastAsia="en-IN"/>
-        </w:rPr>
-        <w:t>com.aventstack.extentreports.markuputils.MarkupHelper</w:t>
-      </w:r>
-      <w:proofErr w:type="spellEnd"/>
-      <w:r>
-        <w:rPr>
-          <w:rFonts w:ascii="Courier New" w:eastAsia="Times New Roman" w:hAnsi="Courier New" w:cs="Courier New"/>
-          <w:color w:val="BCBEC4"/>
-          <w:sz w:val="23"/>
-          <w:szCs w:val="23"/>
-          <w:lang w:eastAsia="en-IN"/>
-        </w:rPr>
-        <w:t>;</w:t>
+      <w:r>
+        <w:rPr>
+          <w:rFonts w:ascii="Courier New" w:eastAsia="Times New Roman" w:hAnsi="Courier New" w:cs="Courier New"/>
+          <w:color w:val="BCBEC4"/>
+          <w:sz w:val="23"/>
+          <w:szCs w:val="23"/>
+          <w:lang w:eastAsia="en-IN"/>
+        </w:rPr>
+        <w:t>com.aventstack.extentreports.markuputils.MarkupHelper;</w:t>
       </w:r>
       <w:r>
         <w:rPr>
@@ -6778,27 +6320,15 @@
         </w:rPr>
         <w:t xml:space="preserve">import </w:t>
       </w:r>
-      <w:proofErr w:type="spellStart"/>
-      <w:r>
-        <w:rPr>
-          <w:rFonts w:ascii="Courier New" w:eastAsia="Times New Roman" w:hAnsi="Courier New" w:cs="Courier New"/>
-          <w:color w:val="BCBEC4"/>
-          <w:sz w:val="23"/>
-          <w:szCs w:val="23"/>
-          <w:lang w:eastAsia="en-IN"/>
-        </w:rPr>
-        <w:t>com.aventstack.extentreports.reporter.ExtentSparkReporter</w:t>
-      </w:r>
-      <w:proofErr w:type="spellEnd"/>
-      <w:r>
-        <w:rPr>
-          <w:rFonts w:ascii="Courier New" w:eastAsia="Times New Roman" w:hAnsi="Courier New" w:cs="Courier New"/>
-          <w:color w:val="BCBEC4"/>
-          <w:sz w:val="23"/>
-          <w:szCs w:val="23"/>
-          <w:lang w:eastAsia="en-IN"/>
-        </w:rPr>
-        <w:t>;</w:t>
+      <w:r>
+        <w:rPr>
+          <w:rFonts w:ascii="Courier New" w:eastAsia="Times New Roman" w:hAnsi="Courier New" w:cs="Courier New"/>
+          <w:color w:val="BCBEC4"/>
+          <w:sz w:val="23"/>
+          <w:szCs w:val="23"/>
+          <w:lang w:eastAsia="en-IN"/>
+        </w:rPr>
+        <w:t>com.aventstack.extentreports.reporter.ExtentSparkReporter;</w:t>
       </w:r>
       <w:r>
         <w:rPr>
@@ -6820,27 +6350,15 @@
         </w:rPr>
         <w:t xml:space="preserve">import </w:t>
       </w:r>
-      <w:proofErr w:type="spellStart"/>
-      <w:r>
-        <w:rPr>
-          <w:rFonts w:ascii="Courier New" w:eastAsia="Times New Roman" w:hAnsi="Courier New" w:cs="Courier New"/>
-          <w:color w:val="BCBEC4"/>
-          <w:sz w:val="23"/>
-          <w:szCs w:val="23"/>
-          <w:lang w:eastAsia="en-IN"/>
-        </w:rPr>
-        <w:t>com.aventstack.extentreports.reporter.configuration.Theme</w:t>
-      </w:r>
-      <w:proofErr w:type="spellEnd"/>
-      <w:r>
-        <w:rPr>
-          <w:rFonts w:ascii="Courier New" w:eastAsia="Times New Roman" w:hAnsi="Courier New" w:cs="Courier New"/>
-          <w:color w:val="BCBEC4"/>
-          <w:sz w:val="23"/>
-          <w:szCs w:val="23"/>
-          <w:lang w:eastAsia="en-IN"/>
-        </w:rPr>
-        <w:t>;</w:t>
+      <w:r>
+        <w:rPr>
+          <w:rFonts w:ascii="Courier New" w:eastAsia="Times New Roman" w:hAnsi="Courier New" w:cs="Courier New"/>
+          <w:color w:val="BCBEC4"/>
+          <w:sz w:val="23"/>
+          <w:szCs w:val="23"/>
+          <w:lang w:eastAsia="en-IN"/>
+        </w:rPr>
+        <w:t>com.aventstack.extentreports.reporter.configuration.Theme;</w:t>
       </w:r>
       <w:r>
         <w:rPr>
@@ -6862,27 +6380,15 @@
         </w:rPr>
         <w:t xml:space="preserve">import </w:t>
       </w:r>
-      <w:proofErr w:type="spellStart"/>
-      <w:r>
-        <w:rPr>
-          <w:rFonts w:ascii="Courier New" w:eastAsia="Times New Roman" w:hAnsi="Courier New" w:cs="Courier New"/>
-          <w:color w:val="BCBEC4"/>
-          <w:sz w:val="23"/>
-          <w:szCs w:val="23"/>
-          <w:lang w:eastAsia="en-IN"/>
-        </w:rPr>
-        <w:t>org.openqa.selenium</w:t>
-      </w:r>
-      <w:proofErr w:type="spellEnd"/>
-      <w:r>
-        <w:rPr>
-          <w:rFonts w:ascii="Courier New" w:eastAsia="Times New Roman" w:hAnsi="Courier New" w:cs="Courier New"/>
-          <w:color w:val="BCBEC4"/>
-          <w:sz w:val="23"/>
-          <w:szCs w:val="23"/>
-          <w:lang w:eastAsia="en-IN"/>
-        </w:rPr>
-        <w:t>.*;</w:t>
+      <w:r>
+        <w:rPr>
+          <w:rFonts w:ascii="Courier New" w:eastAsia="Times New Roman" w:hAnsi="Courier New" w:cs="Courier New"/>
+          <w:color w:val="BCBEC4"/>
+          <w:sz w:val="23"/>
+          <w:szCs w:val="23"/>
+          <w:lang w:eastAsia="en-IN"/>
+        </w:rPr>
+        <w:t>org.openqa.selenium.*;</w:t>
       </w:r>
       <w:r>
         <w:rPr>
@@ -6904,27 +6410,15 @@
         </w:rPr>
         <w:t xml:space="preserve">import </w:t>
       </w:r>
-      <w:proofErr w:type="spellStart"/>
-      <w:r>
-        <w:rPr>
-          <w:rFonts w:ascii="Courier New" w:eastAsia="Times New Roman" w:hAnsi="Courier New" w:cs="Courier New"/>
-          <w:color w:val="BCBEC4"/>
-          <w:sz w:val="23"/>
-          <w:szCs w:val="23"/>
-          <w:lang w:eastAsia="en-IN"/>
-        </w:rPr>
-        <w:t>org.openqa.selenium.chrome.ChromeDriver</w:t>
-      </w:r>
-      <w:proofErr w:type="spellEnd"/>
-      <w:r>
-        <w:rPr>
-          <w:rFonts w:ascii="Courier New" w:eastAsia="Times New Roman" w:hAnsi="Courier New" w:cs="Courier New"/>
-          <w:color w:val="BCBEC4"/>
-          <w:sz w:val="23"/>
-          <w:szCs w:val="23"/>
-          <w:lang w:eastAsia="en-IN"/>
-        </w:rPr>
-        <w:t>;</w:t>
+      <w:r>
+        <w:rPr>
+          <w:rFonts w:ascii="Courier New" w:eastAsia="Times New Roman" w:hAnsi="Courier New" w:cs="Courier New"/>
+          <w:color w:val="BCBEC4"/>
+          <w:sz w:val="23"/>
+          <w:szCs w:val="23"/>
+          <w:lang w:eastAsia="en-IN"/>
+        </w:rPr>
+        <w:t>org.openqa.selenium.chrome.ChromeDriver;</w:t>
       </w:r>
       <w:r>
         <w:rPr>
@@ -6946,27 +6440,15 @@
         </w:rPr>
         <w:t xml:space="preserve">import </w:t>
       </w:r>
-      <w:proofErr w:type="spellStart"/>
-      <w:r>
-        <w:rPr>
-          <w:rFonts w:ascii="Courier New" w:eastAsia="Times New Roman" w:hAnsi="Courier New" w:cs="Courier New"/>
-          <w:color w:val="BCBEC4"/>
-          <w:sz w:val="23"/>
-          <w:szCs w:val="23"/>
-          <w:lang w:eastAsia="en-IN"/>
-        </w:rPr>
-        <w:t>org.openqa.selenium.io.FileHandler</w:t>
-      </w:r>
-      <w:proofErr w:type="spellEnd"/>
-      <w:r>
-        <w:rPr>
-          <w:rFonts w:ascii="Courier New" w:eastAsia="Times New Roman" w:hAnsi="Courier New" w:cs="Courier New"/>
-          <w:color w:val="BCBEC4"/>
-          <w:sz w:val="23"/>
-          <w:szCs w:val="23"/>
-          <w:lang w:eastAsia="en-IN"/>
-        </w:rPr>
-        <w:t>;</w:t>
+      <w:r>
+        <w:rPr>
+          <w:rFonts w:ascii="Courier New" w:eastAsia="Times New Roman" w:hAnsi="Courier New" w:cs="Courier New"/>
+          <w:color w:val="BCBEC4"/>
+          <w:sz w:val="23"/>
+          <w:szCs w:val="23"/>
+          <w:lang w:eastAsia="en-IN"/>
+        </w:rPr>
+        <w:t>org.openqa.selenium.io.FileHandler;</w:t>
       </w:r>
       <w:r>
         <w:rPr>
@@ -6998,27 +6480,15 @@
         </w:rPr>
         <w:t xml:space="preserve">import </w:t>
       </w:r>
-      <w:proofErr w:type="spellStart"/>
-      <w:r>
-        <w:rPr>
-          <w:rFonts w:ascii="Courier New" w:eastAsia="Times New Roman" w:hAnsi="Courier New" w:cs="Courier New"/>
-          <w:color w:val="BCBEC4"/>
-          <w:sz w:val="23"/>
-          <w:szCs w:val="23"/>
-          <w:lang w:eastAsia="en-IN"/>
-        </w:rPr>
-        <w:t>java.io.File</w:t>
-      </w:r>
-      <w:proofErr w:type="spellEnd"/>
-      <w:r>
-        <w:rPr>
-          <w:rFonts w:ascii="Courier New" w:eastAsia="Times New Roman" w:hAnsi="Courier New" w:cs="Courier New"/>
-          <w:color w:val="BCBEC4"/>
-          <w:sz w:val="23"/>
-          <w:szCs w:val="23"/>
-          <w:lang w:eastAsia="en-IN"/>
-        </w:rPr>
-        <w:t>;</w:t>
+      <w:r>
+        <w:rPr>
+          <w:rFonts w:ascii="Courier New" w:eastAsia="Times New Roman" w:hAnsi="Courier New" w:cs="Courier New"/>
+          <w:color w:val="BCBEC4"/>
+          <w:sz w:val="23"/>
+          <w:szCs w:val="23"/>
+          <w:lang w:eastAsia="en-IN"/>
+        </w:rPr>
+        <w:t>java.io.File;</w:t>
       </w:r>
       <w:r>
         <w:rPr>
@@ -7040,27 +6510,15 @@
         </w:rPr>
         <w:t xml:space="preserve">import </w:t>
       </w:r>
-      <w:proofErr w:type="spellStart"/>
-      <w:r>
-        <w:rPr>
-          <w:rFonts w:ascii="Courier New" w:eastAsia="Times New Roman" w:hAnsi="Courier New" w:cs="Courier New"/>
-          <w:color w:val="BCBEC4"/>
-          <w:sz w:val="23"/>
-          <w:szCs w:val="23"/>
-          <w:lang w:eastAsia="en-IN"/>
-        </w:rPr>
-        <w:t>java.io.IOException</w:t>
-      </w:r>
-      <w:proofErr w:type="spellEnd"/>
-      <w:r>
-        <w:rPr>
-          <w:rFonts w:ascii="Courier New" w:eastAsia="Times New Roman" w:hAnsi="Courier New" w:cs="Courier New"/>
-          <w:color w:val="BCBEC4"/>
-          <w:sz w:val="23"/>
-          <w:szCs w:val="23"/>
-          <w:lang w:eastAsia="en-IN"/>
-        </w:rPr>
-        <w:t>;</w:t>
+      <w:r>
+        <w:rPr>
+          <w:rFonts w:ascii="Courier New" w:eastAsia="Times New Roman" w:hAnsi="Courier New" w:cs="Courier New"/>
+          <w:color w:val="BCBEC4"/>
+          <w:sz w:val="23"/>
+          <w:szCs w:val="23"/>
+          <w:lang w:eastAsia="en-IN"/>
+        </w:rPr>
+        <w:t>java.io.IOException;</w:t>
       </w:r>
       <w:r>
         <w:rPr>
@@ -7082,27 +6540,15 @@
         </w:rPr>
         <w:t xml:space="preserve">import </w:t>
       </w:r>
-      <w:proofErr w:type="spellStart"/>
-      <w:r>
-        <w:rPr>
-          <w:rFonts w:ascii="Courier New" w:eastAsia="Times New Roman" w:hAnsi="Courier New" w:cs="Courier New"/>
-          <w:color w:val="BCBEC4"/>
-          <w:sz w:val="23"/>
-          <w:szCs w:val="23"/>
-          <w:lang w:eastAsia="en-IN"/>
-        </w:rPr>
-        <w:t>java.time.Duration</w:t>
-      </w:r>
-      <w:proofErr w:type="spellEnd"/>
-      <w:r>
-        <w:rPr>
-          <w:rFonts w:ascii="Courier New" w:eastAsia="Times New Roman" w:hAnsi="Courier New" w:cs="Courier New"/>
-          <w:color w:val="BCBEC4"/>
-          <w:sz w:val="23"/>
-          <w:szCs w:val="23"/>
-          <w:lang w:eastAsia="en-IN"/>
-        </w:rPr>
-        <w:t>;</w:t>
+      <w:r>
+        <w:rPr>
+          <w:rFonts w:ascii="Courier New" w:eastAsia="Times New Roman" w:hAnsi="Courier New" w:cs="Courier New"/>
+          <w:color w:val="BCBEC4"/>
+          <w:sz w:val="23"/>
+          <w:szCs w:val="23"/>
+          <w:lang w:eastAsia="en-IN"/>
+        </w:rPr>
+        <w:t>java.time.Duration;</w:t>
       </w:r>
       <w:r>
         <w:rPr>
@@ -7183,29 +6629,7 @@
           <w:szCs w:val="23"/>
           <w:lang w:eastAsia="en-IN"/>
         </w:rPr>
-        <w:t xml:space="preserve">(String[] </w:t>
-      </w:r>
-      <w:proofErr w:type="spellStart"/>
-      <w:r>
-        <w:rPr>
-          <w:rFonts w:ascii="Courier New" w:eastAsia="Times New Roman" w:hAnsi="Courier New" w:cs="Courier New"/>
-          <w:color w:val="BCBEC4"/>
-          <w:sz w:val="23"/>
-          <w:szCs w:val="23"/>
-          <w:lang w:eastAsia="en-IN"/>
-        </w:rPr>
-        <w:t>args</w:t>
-      </w:r>
-      <w:proofErr w:type="spellEnd"/>
-      <w:r>
-        <w:rPr>
-          <w:rFonts w:ascii="Courier New" w:eastAsia="Times New Roman" w:hAnsi="Courier New" w:cs="Courier New"/>
-          <w:color w:val="BCBEC4"/>
-          <w:sz w:val="23"/>
-          <w:szCs w:val="23"/>
-          <w:lang w:eastAsia="en-IN"/>
-        </w:rPr>
-        <w:t xml:space="preserve">) </w:t>
+        <w:t xml:space="preserve">(String[] args) </w:t>
       </w:r>
       <w:r>
         <w:rPr>
@@ -7247,51 +6671,7 @@
           <w:lang w:eastAsia="en-IN"/>
         </w:rPr>
         <w:br/>
-        <w:t xml:space="preserve">        </w:t>
-      </w:r>
-      <w:proofErr w:type="spellStart"/>
-      <w:r>
-        <w:rPr>
-          <w:rFonts w:ascii="Courier New" w:eastAsia="Times New Roman" w:hAnsi="Courier New" w:cs="Courier New"/>
-          <w:color w:val="BCBEC4"/>
-          <w:sz w:val="23"/>
-          <w:szCs w:val="23"/>
-          <w:lang w:eastAsia="en-IN"/>
-        </w:rPr>
-        <w:t>ExtentSparkReporter</w:t>
-      </w:r>
-      <w:proofErr w:type="spellEnd"/>
-      <w:r>
-        <w:rPr>
-          <w:rFonts w:ascii="Courier New" w:eastAsia="Times New Roman" w:hAnsi="Courier New" w:cs="Courier New"/>
-          <w:color w:val="BCBEC4"/>
-          <w:sz w:val="23"/>
-          <w:szCs w:val="23"/>
-          <w:lang w:eastAsia="en-IN"/>
-        </w:rPr>
-        <w:t xml:space="preserve"> </w:t>
-      </w:r>
-      <w:proofErr w:type="spellStart"/>
-      <w:r>
-        <w:rPr>
-          <w:rFonts w:ascii="Courier New" w:eastAsia="Times New Roman" w:hAnsi="Courier New" w:cs="Courier New"/>
-          <w:color w:val="BCBEC4"/>
-          <w:sz w:val="23"/>
-          <w:szCs w:val="23"/>
-          <w:lang w:eastAsia="en-IN"/>
-        </w:rPr>
-        <w:t>htmlReport</w:t>
-      </w:r>
-      <w:proofErr w:type="spellEnd"/>
-      <w:r>
-        <w:rPr>
-          <w:rFonts w:ascii="Courier New" w:eastAsia="Times New Roman" w:hAnsi="Courier New" w:cs="Courier New"/>
-          <w:color w:val="BCBEC4"/>
-          <w:sz w:val="23"/>
-          <w:szCs w:val="23"/>
-          <w:lang w:eastAsia="en-IN"/>
-        </w:rPr>
-        <w:t xml:space="preserve"> = </w:t>
+        <w:t xml:space="preserve">        ExtentSparkReporter htmlReport = </w:t>
       </w:r>
       <w:r>
         <w:rPr>
@@ -7303,27 +6683,15 @@
         </w:rPr>
         <w:t xml:space="preserve">new </w:t>
       </w:r>
-      <w:proofErr w:type="spellStart"/>
-      <w:r>
-        <w:rPr>
-          <w:rFonts w:ascii="Courier New" w:eastAsia="Times New Roman" w:hAnsi="Courier New" w:cs="Courier New"/>
-          <w:color w:val="BCBEC4"/>
-          <w:sz w:val="23"/>
-          <w:szCs w:val="23"/>
-          <w:lang w:eastAsia="en-IN"/>
-        </w:rPr>
-        <w:t>ExtentSparkReporter</w:t>
-      </w:r>
-      <w:proofErr w:type="spellEnd"/>
-      <w:r>
-        <w:rPr>
-          <w:rFonts w:ascii="Courier New" w:eastAsia="Times New Roman" w:hAnsi="Courier New" w:cs="Courier New"/>
-          <w:color w:val="BCBEC4"/>
-          <w:sz w:val="23"/>
-          <w:szCs w:val="23"/>
-          <w:lang w:eastAsia="en-IN"/>
-        </w:rPr>
-        <w:t>(</w:t>
+      <w:r>
+        <w:rPr>
+          <w:rFonts w:ascii="Courier New" w:eastAsia="Times New Roman" w:hAnsi="Courier New" w:cs="Courier New"/>
+          <w:color w:val="BCBEC4"/>
+          <w:sz w:val="23"/>
+          <w:szCs w:val="23"/>
+          <w:lang w:eastAsia="en-IN"/>
+        </w:rPr>
+        <w:t>ExtentSparkReporter(</w:t>
       </w:r>
       <w:r>
         <w:rPr>
@@ -7377,27 +6745,15 @@
         <w:br/>
         <w:t xml:space="preserve">        </w:t>
       </w:r>
-      <w:proofErr w:type="spellStart"/>
-      <w:r>
-        <w:rPr>
-          <w:rFonts w:ascii="Courier New" w:eastAsia="Times New Roman" w:hAnsi="Courier New" w:cs="Courier New"/>
-          <w:color w:val="BCBEC4"/>
-          <w:sz w:val="23"/>
-          <w:szCs w:val="23"/>
-          <w:lang w:eastAsia="en-IN"/>
-        </w:rPr>
-        <w:t>ExtentReports</w:t>
-      </w:r>
-      <w:proofErr w:type="spellEnd"/>
-      <w:r>
-        <w:rPr>
-          <w:rFonts w:ascii="Courier New" w:eastAsia="Times New Roman" w:hAnsi="Courier New" w:cs="Courier New"/>
-          <w:color w:val="BCBEC4"/>
-          <w:sz w:val="23"/>
-          <w:szCs w:val="23"/>
-          <w:lang w:eastAsia="en-IN"/>
-        </w:rPr>
-        <w:t xml:space="preserve"> report = </w:t>
+      <w:r>
+        <w:rPr>
+          <w:rFonts w:ascii="Courier New" w:eastAsia="Times New Roman" w:hAnsi="Courier New" w:cs="Courier New"/>
+          <w:color w:val="BCBEC4"/>
+          <w:sz w:val="23"/>
+          <w:szCs w:val="23"/>
+          <w:lang w:eastAsia="en-IN"/>
+        </w:rPr>
+        <w:t xml:space="preserve">ExtentReports report = </w:t>
       </w:r>
       <w:r>
         <w:rPr>
@@ -7409,27 +6765,15 @@
         </w:rPr>
         <w:t xml:space="preserve">new </w:t>
       </w:r>
-      <w:proofErr w:type="spellStart"/>
-      <w:r>
-        <w:rPr>
-          <w:rFonts w:ascii="Courier New" w:eastAsia="Times New Roman" w:hAnsi="Courier New" w:cs="Courier New"/>
-          <w:color w:val="BCBEC4"/>
-          <w:sz w:val="23"/>
-          <w:szCs w:val="23"/>
-          <w:lang w:eastAsia="en-IN"/>
-        </w:rPr>
-        <w:t>ExtentReports</w:t>
-      </w:r>
-      <w:proofErr w:type="spellEnd"/>
-      <w:r>
-        <w:rPr>
-          <w:rFonts w:ascii="Courier New" w:eastAsia="Times New Roman" w:hAnsi="Courier New" w:cs="Courier New"/>
-          <w:color w:val="BCBEC4"/>
-          <w:sz w:val="23"/>
-          <w:szCs w:val="23"/>
-          <w:lang w:eastAsia="en-IN"/>
-        </w:rPr>
-        <w:t>();</w:t>
+      <w:r>
+        <w:rPr>
+          <w:rFonts w:ascii="Courier New" w:eastAsia="Times New Roman" w:hAnsi="Courier New" w:cs="Courier New"/>
+          <w:color w:val="BCBEC4"/>
+          <w:sz w:val="23"/>
+          <w:szCs w:val="23"/>
+          <w:lang w:eastAsia="en-IN"/>
+        </w:rPr>
+        <w:t>ExtentReports();</w:t>
       </w:r>
       <w:r>
         <w:rPr>
@@ -7463,27 +6807,15 @@
         <w:br/>
         <w:t xml:space="preserve">        </w:t>
       </w:r>
-      <w:proofErr w:type="spellStart"/>
-      <w:r>
-        <w:rPr>
-          <w:rFonts w:ascii="Courier New" w:eastAsia="Times New Roman" w:hAnsi="Courier New" w:cs="Courier New"/>
-          <w:color w:val="BCBEC4"/>
-          <w:sz w:val="23"/>
-          <w:szCs w:val="23"/>
-          <w:lang w:eastAsia="en-IN"/>
-        </w:rPr>
-        <w:t>ExtentTest</w:t>
-      </w:r>
-      <w:proofErr w:type="spellEnd"/>
-      <w:r>
-        <w:rPr>
-          <w:rFonts w:ascii="Courier New" w:eastAsia="Times New Roman" w:hAnsi="Courier New" w:cs="Courier New"/>
-          <w:color w:val="BCBEC4"/>
-          <w:sz w:val="23"/>
-          <w:szCs w:val="23"/>
-          <w:lang w:eastAsia="en-IN"/>
-        </w:rPr>
-        <w:t xml:space="preserve"> test;</w:t>
+      <w:r>
+        <w:rPr>
+          <w:rFonts w:ascii="Courier New" w:eastAsia="Times New Roman" w:hAnsi="Courier New" w:cs="Courier New"/>
+          <w:color w:val="BCBEC4"/>
+          <w:sz w:val="23"/>
+          <w:szCs w:val="23"/>
+          <w:lang w:eastAsia="en-IN"/>
+        </w:rPr>
+        <w:t>ExtentTest test;</w:t>
       </w:r>
       <w:r>
         <w:rPr>
@@ -7527,49 +6859,15 @@
         <w:br/>
         <w:t xml:space="preserve">        </w:t>
       </w:r>
-      <w:proofErr w:type="spellStart"/>
-      <w:r>
-        <w:rPr>
-          <w:rFonts w:ascii="Courier New" w:eastAsia="Times New Roman" w:hAnsi="Courier New" w:cs="Courier New"/>
-          <w:color w:val="BCBEC4"/>
-          <w:sz w:val="23"/>
-          <w:szCs w:val="23"/>
-          <w:lang w:eastAsia="en-IN"/>
-        </w:rPr>
-        <w:t>report.attachReporter</w:t>
-      </w:r>
-      <w:proofErr w:type="spellEnd"/>
-      <w:r>
-        <w:rPr>
-          <w:rFonts w:ascii="Courier New" w:eastAsia="Times New Roman" w:hAnsi="Courier New" w:cs="Courier New"/>
-          <w:color w:val="BCBEC4"/>
-          <w:sz w:val="23"/>
-          <w:szCs w:val="23"/>
-          <w:lang w:eastAsia="en-IN"/>
-        </w:rPr>
-        <w:t>(</w:t>
-      </w:r>
-      <w:proofErr w:type="spellStart"/>
-      <w:r>
-        <w:rPr>
-          <w:rFonts w:ascii="Courier New" w:eastAsia="Times New Roman" w:hAnsi="Courier New" w:cs="Courier New"/>
-          <w:color w:val="BCBEC4"/>
-          <w:sz w:val="23"/>
-          <w:szCs w:val="23"/>
-          <w:lang w:eastAsia="en-IN"/>
-        </w:rPr>
-        <w:t>htmlReport</w:t>
-      </w:r>
-      <w:proofErr w:type="spellEnd"/>
-      <w:r>
-        <w:rPr>
-          <w:rFonts w:ascii="Courier New" w:eastAsia="Times New Roman" w:hAnsi="Courier New" w:cs="Courier New"/>
-          <w:color w:val="BCBEC4"/>
-          <w:sz w:val="23"/>
-          <w:szCs w:val="23"/>
-          <w:lang w:eastAsia="en-IN"/>
-        </w:rPr>
-        <w:t>);</w:t>
+      <w:r>
+        <w:rPr>
+          <w:rFonts w:ascii="Courier New" w:eastAsia="Times New Roman" w:hAnsi="Courier New" w:cs="Courier New"/>
+          <w:color w:val="BCBEC4"/>
+          <w:sz w:val="23"/>
+          <w:szCs w:val="23"/>
+          <w:lang w:eastAsia="en-IN"/>
+        </w:rPr>
+        <w:t>report.attachReporter(htmlReport);</w:t>
       </w:r>
       <w:r>
         <w:rPr>
@@ -7624,27 +6922,15 @@
         <w:br/>
         <w:t xml:space="preserve">        </w:t>
       </w:r>
-      <w:proofErr w:type="spellStart"/>
-      <w:r>
-        <w:rPr>
-          <w:rFonts w:ascii="Courier New" w:eastAsia="Times New Roman" w:hAnsi="Courier New" w:cs="Courier New"/>
-          <w:color w:val="BCBEC4"/>
-          <w:sz w:val="23"/>
-          <w:szCs w:val="23"/>
-          <w:lang w:eastAsia="en-IN"/>
-        </w:rPr>
-        <w:t>report.setSystemInfo</w:t>
-      </w:r>
-      <w:proofErr w:type="spellEnd"/>
-      <w:r>
-        <w:rPr>
-          <w:rFonts w:ascii="Courier New" w:eastAsia="Times New Roman" w:hAnsi="Courier New" w:cs="Courier New"/>
-          <w:color w:val="BCBEC4"/>
-          <w:sz w:val="23"/>
-          <w:szCs w:val="23"/>
-          <w:lang w:eastAsia="en-IN"/>
-        </w:rPr>
-        <w:t>(</w:t>
+      <w:r>
+        <w:rPr>
+          <w:rFonts w:ascii="Courier New" w:eastAsia="Times New Roman" w:hAnsi="Courier New" w:cs="Courier New"/>
+          <w:color w:val="BCBEC4"/>
+          <w:sz w:val="23"/>
+          <w:szCs w:val="23"/>
+          <w:lang w:eastAsia="en-IN"/>
+        </w:rPr>
+        <w:t>report.setSystemInfo(</w:t>
       </w:r>
       <w:r>
         <w:rPr>
@@ -7685,6 +6971,220 @@
           <w:lang w:eastAsia="en-IN"/>
         </w:rPr>
         <w:t>);</w:t>
+      </w:r>
+      <w:r>
+        <w:rPr>
+          <w:rFonts w:ascii="Courier New" w:eastAsia="Times New Roman" w:hAnsi="Courier New" w:cs="Courier New"/>
+          <w:color w:val="BCBEC4"/>
+          <w:sz w:val="23"/>
+          <w:szCs w:val="23"/>
+          <w:lang w:eastAsia="en-IN"/>
+        </w:rPr>
+        <w:br/>
+        <w:t xml:space="preserve">        report.setSystemInfo(</w:t>
+      </w:r>
+      <w:r>
+        <w:rPr>
+          <w:rFonts w:ascii="Courier New" w:eastAsia="Times New Roman" w:hAnsi="Courier New" w:cs="Courier New"/>
+          <w:color w:val="6AAB73"/>
+          <w:sz w:val="23"/>
+          <w:szCs w:val="23"/>
+          <w:lang w:eastAsia="en-IN"/>
+        </w:rPr>
+        <w:t>"Operating System"</w:t>
+      </w:r>
+      <w:r>
+        <w:rPr>
+          <w:rFonts w:ascii="Courier New" w:eastAsia="Times New Roman" w:hAnsi="Courier New" w:cs="Courier New"/>
+          <w:color w:val="BCBEC4"/>
+          <w:sz w:val="23"/>
+          <w:szCs w:val="23"/>
+          <w:lang w:eastAsia="en-IN"/>
+        </w:rPr>
+        <w:t xml:space="preserve">, </w:t>
+      </w:r>
+      <w:r>
+        <w:rPr>
+          <w:rFonts w:ascii="Courier New" w:eastAsia="Times New Roman" w:hAnsi="Courier New" w:cs="Courier New"/>
+          <w:color w:val="6AAB73"/>
+          <w:sz w:val="23"/>
+          <w:szCs w:val="23"/>
+          <w:lang w:eastAsia="en-IN"/>
+        </w:rPr>
+        <w:t>"Windows 10"</w:t>
+      </w:r>
+      <w:r>
+        <w:rPr>
+          <w:rFonts w:ascii="Courier New" w:eastAsia="Times New Roman" w:hAnsi="Courier New" w:cs="Courier New"/>
+          <w:color w:val="BCBEC4"/>
+          <w:sz w:val="23"/>
+          <w:szCs w:val="23"/>
+          <w:lang w:eastAsia="en-IN"/>
+        </w:rPr>
+        <w:t>);</w:t>
+      </w:r>
+      <w:r>
+        <w:rPr>
+          <w:rFonts w:ascii="Courier New" w:eastAsia="Times New Roman" w:hAnsi="Courier New" w:cs="Courier New"/>
+          <w:color w:val="BCBEC4"/>
+          <w:sz w:val="23"/>
+          <w:szCs w:val="23"/>
+          <w:lang w:eastAsia="en-IN"/>
+        </w:rPr>
+        <w:br/>
+        <w:t xml:space="preserve">        report.setSystemInfo(</w:t>
+      </w:r>
+      <w:r>
+        <w:rPr>
+          <w:rFonts w:ascii="Courier New" w:eastAsia="Times New Roman" w:hAnsi="Courier New" w:cs="Courier New"/>
+          <w:color w:val="6AAB73"/>
+          <w:sz w:val="23"/>
+          <w:szCs w:val="23"/>
+          <w:lang w:eastAsia="en-IN"/>
+        </w:rPr>
+        <w:t>"User Name"</w:t>
+      </w:r>
+      <w:r>
+        <w:rPr>
+          <w:rFonts w:ascii="Courier New" w:eastAsia="Times New Roman" w:hAnsi="Courier New" w:cs="Courier New"/>
+          <w:color w:val="BCBEC4"/>
+          <w:sz w:val="23"/>
+          <w:szCs w:val="23"/>
+          <w:lang w:eastAsia="en-IN"/>
+        </w:rPr>
+        <w:t xml:space="preserve">, </w:t>
+      </w:r>
+      <w:r>
+        <w:rPr>
+          <w:rFonts w:ascii="Courier New" w:eastAsia="Times New Roman" w:hAnsi="Courier New" w:cs="Courier New"/>
+          <w:color w:val="6AAB73"/>
+          <w:sz w:val="23"/>
+          <w:szCs w:val="23"/>
+          <w:lang w:eastAsia="en-IN"/>
+        </w:rPr>
+        <w:t>"Ila V"</w:t>
+      </w:r>
+      <w:r>
+        <w:rPr>
+          <w:rFonts w:ascii="Courier New" w:eastAsia="Times New Roman" w:hAnsi="Courier New" w:cs="Courier New"/>
+          <w:color w:val="BCBEC4"/>
+          <w:sz w:val="23"/>
+          <w:szCs w:val="23"/>
+          <w:lang w:eastAsia="en-IN"/>
+        </w:rPr>
+        <w:t>);</w:t>
+      </w:r>
+      <w:r>
+        <w:rPr>
+          <w:rFonts w:ascii="Courier New" w:eastAsia="Times New Roman" w:hAnsi="Courier New" w:cs="Courier New"/>
+          <w:color w:val="BCBEC4"/>
+          <w:sz w:val="23"/>
+          <w:szCs w:val="23"/>
+          <w:lang w:eastAsia="en-IN"/>
+        </w:rPr>
+        <w:br/>
+        <w:t xml:space="preserve">        report.setSystemInfo(</w:t>
+      </w:r>
+      <w:r>
+        <w:rPr>
+          <w:rFonts w:ascii="Courier New" w:eastAsia="Times New Roman" w:hAnsi="Courier New" w:cs="Courier New"/>
+          <w:color w:val="6AAB73"/>
+          <w:sz w:val="23"/>
+          <w:szCs w:val="23"/>
+          <w:lang w:eastAsia="en-IN"/>
+        </w:rPr>
+        <w:t>"Browser"</w:t>
+      </w:r>
+      <w:r>
+        <w:rPr>
+          <w:rFonts w:ascii="Courier New" w:eastAsia="Times New Roman" w:hAnsi="Courier New" w:cs="Courier New"/>
+          <w:color w:val="BCBEC4"/>
+          <w:sz w:val="23"/>
+          <w:szCs w:val="23"/>
+          <w:lang w:eastAsia="en-IN"/>
+        </w:rPr>
+        <w:t xml:space="preserve">, </w:t>
+      </w:r>
+      <w:r>
+        <w:rPr>
+          <w:rFonts w:ascii="Courier New" w:eastAsia="Times New Roman" w:hAnsi="Courier New" w:cs="Courier New"/>
+          <w:color w:val="6AAB73"/>
+          <w:sz w:val="23"/>
+          <w:szCs w:val="23"/>
+          <w:lang w:eastAsia="en-IN"/>
+        </w:rPr>
+        <w:t>"Chrome"</w:t>
+      </w:r>
+      <w:r>
+        <w:rPr>
+          <w:rFonts w:ascii="Courier New" w:eastAsia="Times New Roman" w:hAnsi="Courier New" w:cs="Courier New"/>
+          <w:color w:val="BCBEC4"/>
+          <w:sz w:val="23"/>
+          <w:szCs w:val="23"/>
+          <w:lang w:eastAsia="en-IN"/>
+        </w:rPr>
+        <w:t>);</w:t>
+      </w:r>
+      <w:r>
+        <w:rPr>
+          <w:rFonts w:ascii="Courier New" w:eastAsia="Times New Roman" w:hAnsi="Courier New" w:cs="Courier New"/>
+          <w:color w:val="BCBEC4"/>
+          <w:sz w:val="23"/>
+          <w:szCs w:val="23"/>
+          <w:lang w:eastAsia="en-IN"/>
+        </w:rPr>
+        <w:br/>
+        <w:t xml:space="preserve">        report.setSystemInfo(</w:t>
+      </w:r>
+      <w:r>
+        <w:rPr>
+          <w:rFonts w:ascii="Courier New" w:eastAsia="Times New Roman" w:hAnsi="Courier New" w:cs="Courier New"/>
+          <w:color w:val="6AAB73"/>
+          <w:sz w:val="23"/>
+          <w:szCs w:val="23"/>
+          <w:lang w:eastAsia="en-IN"/>
+        </w:rPr>
+        <w:t>"Processor"</w:t>
+      </w:r>
+      <w:r>
+        <w:rPr>
+          <w:rFonts w:ascii="Courier New" w:eastAsia="Times New Roman" w:hAnsi="Courier New" w:cs="Courier New"/>
+          <w:color w:val="BCBEC4"/>
+          <w:sz w:val="23"/>
+          <w:szCs w:val="23"/>
+          <w:lang w:eastAsia="en-IN"/>
+        </w:rPr>
+        <w:t xml:space="preserve">, </w:t>
+      </w:r>
+      <w:r>
+        <w:rPr>
+          <w:rFonts w:ascii="Courier New" w:eastAsia="Times New Roman" w:hAnsi="Courier New" w:cs="Courier New"/>
+          <w:color w:val="6AAB73"/>
+          <w:sz w:val="23"/>
+          <w:szCs w:val="23"/>
+          <w:lang w:eastAsia="en-IN"/>
+        </w:rPr>
+        <w:t>"I5"</w:t>
+      </w:r>
+      <w:r>
+        <w:rPr>
+          <w:rFonts w:ascii="Courier New" w:eastAsia="Times New Roman" w:hAnsi="Courier New" w:cs="Courier New"/>
+          <w:color w:val="BCBEC4"/>
+          <w:sz w:val="23"/>
+          <w:szCs w:val="23"/>
+          <w:lang w:eastAsia="en-IN"/>
+        </w:rPr>
+        <w:t>);</w:t>
+      </w:r>
+      <w:r>
+        <w:rPr>
+          <w:rFonts w:ascii="Courier New" w:eastAsia="Times New Roman" w:hAnsi="Courier New" w:cs="Courier New"/>
+          <w:color w:val="BCBEC4"/>
+          <w:sz w:val="23"/>
+          <w:szCs w:val="23"/>
+          <w:lang w:eastAsia="en-IN"/>
+        </w:rPr>
+        <w:br/>
       </w:r>
       <w:r>
         <w:rPr>
@@ -7697,72 +7197,20 @@
         <w:br/>
         <w:t xml:space="preserve">        </w:t>
       </w:r>
-      <w:proofErr w:type="spellStart"/>
-      <w:r>
-        <w:rPr>
-          <w:rFonts w:ascii="Courier New" w:eastAsia="Times New Roman" w:hAnsi="Courier New" w:cs="Courier New"/>
-          <w:color w:val="BCBEC4"/>
-          <w:sz w:val="23"/>
-          <w:szCs w:val="23"/>
-          <w:lang w:eastAsia="en-IN"/>
-        </w:rPr>
-        <w:t>report.setSystemInfo</w:t>
-      </w:r>
-      <w:proofErr w:type="spellEnd"/>
-      <w:r>
-        <w:rPr>
-          <w:rFonts w:ascii="Courier New" w:eastAsia="Times New Roman" w:hAnsi="Courier New" w:cs="Courier New"/>
-          <w:color w:val="BCBEC4"/>
-          <w:sz w:val="23"/>
-          <w:szCs w:val="23"/>
-          <w:lang w:eastAsia="en-IN"/>
-        </w:rPr>
-        <w:t>(</w:t>
-      </w:r>
-      <w:r>
-        <w:rPr>
-          <w:rFonts w:ascii="Courier New" w:eastAsia="Times New Roman" w:hAnsi="Courier New" w:cs="Courier New"/>
-          <w:color w:val="6AAB73"/>
-          <w:sz w:val="23"/>
-          <w:szCs w:val="23"/>
-          <w:lang w:eastAsia="en-IN"/>
-        </w:rPr>
-        <w:t>"Operating System"</w:t>
-      </w:r>
-      <w:r>
-        <w:rPr>
-          <w:rFonts w:ascii="Courier New" w:eastAsia="Times New Roman" w:hAnsi="Courier New" w:cs="Courier New"/>
-          <w:color w:val="BCBEC4"/>
-          <w:sz w:val="23"/>
-          <w:szCs w:val="23"/>
-          <w:lang w:eastAsia="en-IN"/>
-        </w:rPr>
-        <w:t xml:space="preserve">, </w:t>
-      </w:r>
-      <w:r>
-        <w:rPr>
-          <w:rFonts w:ascii="Courier New" w:eastAsia="Times New Roman" w:hAnsi="Courier New" w:cs="Courier New"/>
-          <w:color w:val="6AAB73"/>
-          <w:sz w:val="23"/>
-          <w:szCs w:val="23"/>
-          <w:lang w:eastAsia="en-IN"/>
-        </w:rPr>
-        <w:t>"Windows 10"</w:t>
-      </w:r>
-      <w:r>
-        <w:rPr>
-          <w:rFonts w:ascii="Courier New" w:eastAsia="Times New Roman" w:hAnsi="Courier New" w:cs="Courier New"/>
-          <w:color w:val="BCBEC4"/>
-          <w:sz w:val="23"/>
-          <w:szCs w:val="23"/>
-          <w:lang w:eastAsia="en-IN"/>
-        </w:rPr>
-        <w:t>);</w:t>
-      </w:r>
-      <w:r>
-        <w:rPr>
-          <w:rFonts w:ascii="Courier New" w:eastAsia="Times New Roman" w:hAnsi="Courier New" w:cs="Courier New"/>
-          <w:color w:val="BCBEC4"/>
+      <w:r>
+        <w:rPr>
+          <w:rFonts w:ascii="Courier New" w:eastAsia="Times New Roman" w:hAnsi="Courier New" w:cs="Courier New"/>
+          <w:color w:val="7A7E85"/>
+          <w:sz w:val="23"/>
+          <w:szCs w:val="23"/>
+          <w:lang w:eastAsia="en-IN"/>
+        </w:rPr>
+        <w:t>//Configuration of look and feel of the report</w:t>
+      </w:r>
+      <w:r>
+        <w:rPr>
+          <w:rFonts w:ascii="Courier New" w:eastAsia="Times New Roman" w:hAnsi="Courier New" w:cs="Courier New"/>
+          <w:color w:val="7A7E85"/>
           <w:sz w:val="23"/>
           <w:szCs w:val="23"/>
           <w:lang w:eastAsia="en-IN"/>
@@ -7770,27 +7218,15 @@
         <w:br/>
         <w:t xml:space="preserve">        </w:t>
       </w:r>
-      <w:proofErr w:type="spellStart"/>
-      <w:r>
-        <w:rPr>
-          <w:rFonts w:ascii="Courier New" w:eastAsia="Times New Roman" w:hAnsi="Courier New" w:cs="Courier New"/>
-          <w:color w:val="BCBEC4"/>
-          <w:sz w:val="23"/>
-          <w:szCs w:val="23"/>
-          <w:lang w:eastAsia="en-IN"/>
-        </w:rPr>
-        <w:t>report.setSystemInfo</w:t>
-      </w:r>
-      <w:proofErr w:type="spellEnd"/>
-      <w:r>
-        <w:rPr>
-          <w:rFonts w:ascii="Courier New" w:eastAsia="Times New Roman" w:hAnsi="Courier New" w:cs="Courier New"/>
-          <w:color w:val="BCBEC4"/>
-          <w:sz w:val="23"/>
-          <w:szCs w:val="23"/>
-          <w:lang w:eastAsia="en-IN"/>
-        </w:rPr>
-        <w:t>(</w:t>
+      <w:r>
+        <w:rPr>
+          <w:rFonts w:ascii="Courier New" w:eastAsia="Times New Roman" w:hAnsi="Courier New" w:cs="Courier New"/>
+          <w:color w:val="BCBEC4"/>
+          <w:sz w:val="23"/>
+          <w:szCs w:val="23"/>
+          <w:lang w:eastAsia="en-IN"/>
+        </w:rPr>
+        <w:t>htmlReport.config().setDocumentTitle(</w:t>
       </w:r>
       <w:r>
         <w:rPr>
@@ -7800,17 +7236,28 @@
           <w:szCs w:val="23"/>
           <w:lang w:eastAsia="en-IN"/>
         </w:rPr>
-        <w:t>"User Name"</w:t>
-      </w:r>
-      <w:r>
-        <w:rPr>
-          <w:rFonts w:ascii="Courier New" w:eastAsia="Times New Roman" w:hAnsi="Courier New" w:cs="Courier New"/>
-          <w:color w:val="BCBEC4"/>
-          <w:sz w:val="23"/>
-          <w:szCs w:val="23"/>
-          <w:lang w:eastAsia="en-IN"/>
-        </w:rPr>
-        <w:t xml:space="preserve">, </w:t>
+        <w:t>"My First Extent Report"</w:t>
+      </w:r>
+      <w:r>
+        <w:rPr>
+          <w:rFonts w:ascii="Courier New" w:eastAsia="Times New Roman" w:hAnsi="Courier New" w:cs="Courier New"/>
+          <w:color w:val="BCBEC4"/>
+          <w:sz w:val="23"/>
+          <w:szCs w:val="23"/>
+          <w:lang w:eastAsia="en-IN"/>
+        </w:rPr>
+        <w:t>);</w:t>
+      </w:r>
+      <w:r>
+        <w:rPr>
+          <w:rFonts w:ascii="Courier New" w:eastAsia="Times New Roman" w:hAnsi="Courier New" w:cs="Courier New"/>
+          <w:color w:val="BCBEC4"/>
+          <w:sz w:val="23"/>
+          <w:szCs w:val="23"/>
+          <w:lang w:eastAsia="en-IN"/>
+        </w:rPr>
+        <w:br/>
+        <w:t xml:space="preserve">        htmlReport.config().setReportName(</w:t>
       </w:r>
       <w:r>
         <w:rPr>
@@ -7820,29 +7267,7 @@
           <w:szCs w:val="23"/>
           <w:lang w:eastAsia="en-IN"/>
         </w:rPr>
-        <w:t>"</w:t>
-      </w:r>
-      <w:proofErr w:type="spellStart"/>
-      <w:r>
-        <w:rPr>
-          <w:rFonts w:ascii="Courier New" w:eastAsia="Times New Roman" w:hAnsi="Courier New" w:cs="Courier New"/>
-          <w:color w:val="6AAB73"/>
-          <w:sz w:val="23"/>
-          <w:szCs w:val="23"/>
-          <w:lang w:eastAsia="en-IN"/>
-        </w:rPr>
-        <w:t>Ila</w:t>
-      </w:r>
-      <w:proofErr w:type="spellEnd"/>
-      <w:r>
-        <w:rPr>
-          <w:rFonts w:ascii="Courier New" w:eastAsia="Times New Roman" w:hAnsi="Courier New" w:cs="Courier New"/>
-          <w:color w:val="6AAB73"/>
-          <w:sz w:val="23"/>
-          <w:szCs w:val="23"/>
-          <w:lang w:eastAsia="en-IN"/>
-        </w:rPr>
-        <w:t xml:space="preserve"> V"</w:t>
+        <w:t>"Google Report"</w:t>
       </w:r>
       <w:r>
         <w:rPr>
@@ -7863,389 +7288,7 @@
           <w:lang w:eastAsia="en-IN"/>
         </w:rPr>
         <w:br/>
-        <w:t xml:space="preserve">        </w:t>
-      </w:r>
-      <w:proofErr w:type="spellStart"/>
-      <w:r>
-        <w:rPr>
-          <w:rFonts w:ascii="Courier New" w:eastAsia="Times New Roman" w:hAnsi="Courier New" w:cs="Courier New"/>
-          <w:color w:val="BCBEC4"/>
-          <w:sz w:val="23"/>
-          <w:szCs w:val="23"/>
-          <w:lang w:eastAsia="en-IN"/>
-        </w:rPr>
-        <w:t>report.setSystemInfo</w:t>
-      </w:r>
-      <w:proofErr w:type="spellEnd"/>
-      <w:r>
-        <w:rPr>
-          <w:rFonts w:ascii="Courier New" w:eastAsia="Times New Roman" w:hAnsi="Courier New" w:cs="Courier New"/>
-          <w:color w:val="BCBEC4"/>
-          <w:sz w:val="23"/>
-          <w:szCs w:val="23"/>
-          <w:lang w:eastAsia="en-IN"/>
-        </w:rPr>
-        <w:t>(</w:t>
-      </w:r>
-      <w:r>
-        <w:rPr>
-          <w:rFonts w:ascii="Courier New" w:eastAsia="Times New Roman" w:hAnsi="Courier New" w:cs="Courier New"/>
-          <w:color w:val="6AAB73"/>
-          <w:sz w:val="23"/>
-          <w:szCs w:val="23"/>
-          <w:lang w:eastAsia="en-IN"/>
-        </w:rPr>
-        <w:t>"Browser"</w:t>
-      </w:r>
-      <w:r>
-        <w:rPr>
-          <w:rFonts w:ascii="Courier New" w:eastAsia="Times New Roman" w:hAnsi="Courier New" w:cs="Courier New"/>
-          <w:color w:val="BCBEC4"/>
-          <w:sz w:val="23"/>
-          <w:szCs w:val="23"/>
-          <w:lang w:eastAsia="en-IN"/>
-        </w:rPr>
-        <w:t xml:space="preserve">, </w:t>
-      </w:r>
-      <w:r>
-        <w:rPr>
-          <w:rFonts w:ascii="Courier New" w:eastAsia="Times New Roman" w:hAnsi="Courier New" w:cs="Courier New"/>
-          <w:color w:val="6AAB73"/>
-          <w:sz w:val="23"/>
-          <w:szCs w:val="23"/>
-          <w:lang w:eastAsia="en-IN"/>
-        </w:rPr>
-        <w:t>"Chrome"</w:t>
-      </w:r>
-      <w:r>
-        <w:rPr>
-          <w:rFonts w:ascii="Courier New" w:eastAsia="Times New Roman" w:hAnsi="Courier New" w:cs="Courier New"/>
-          <w:color w:val="BCBEC4"/>
-          <w:sz w:val="23"/>
-          <w:szCs w:val="23"/>
-          <w:lang w:eastAsia="en-IN"/>
-        </w:rPr>
-        <w:t>);</w:t>
-      </w:r>
-      <w:r>
-        <w:rPr>
-          <w:rFonts w:ascii="Courier New" w:eastAsia="Times New Roman" w:hAnsi="Courier New" w:cs="Courier New"/>
-          <w:color w:val="BCBEC4"/>
-          <w:sz w:val="23"/>
-          <w:szCs w:val="23"/>
-          <w:lang w:eastAsia="en-IN"/>
-        </w:rPr>
-        <w:br/>
-        <w:t xml:space="preserve">        </w:t>
-      </w:r>
-      <w:proofErr w:type="spellStart"/>
-      <w:r>
-        <w:rPr>
-          <w:rFonts w:ascii="Courier New" w:eastAsia="Times New Roman" w:hAnsi="Courier New" w:cs="Courier New"/>
-          <w:color w:val="BCBEC4"/>
-          <w:sz w:val="23"/>
-          <w:szCs w:val="23"/>
-          <w:lang w:eastAsia="en-IN"/>
-        </w:rPr>
-        <w:t>report.setSystemInfo</w:t>
-      </w:r>
-      <w:proofErr w:type="spellEnd"/>
-      <w:r>
-        <w:rPr>
-          <w:rFonts w:ascii="Courier New" w:eastAsia="Times New Roman" w:hAnsi="Courier New" w:cs="Courier New"/>
-          <w:color w:val="BCBEC4"/>
-          <w:sz w:val="23"/>
-          <w:szCs w:val="23"/>
-          <w:lang w:eastAsia="en-IN"/>
-        </w:rPr>
-        <w:t>(</w:t>
-      </w:r>
-      <w:r>
-        <w:rPr>
-          <w:rFonts w:ascii="Courier New" w:eastAsia="Times New Roman" w:hAnsi="Courier New" w:cs="Courier New"/>
-          <w:color w:val="6AAB73"/>
-          <w:sz w:val="23"/>
-          <w:szCs w:val="23"/>
-          <w:lang w:eastAsia="en-IN"/>
-        </w:rPr>
-        <w:t>"Processor"</w:t>
-      </w:r>
-      <w:r>
-        <w:rPr>
-          <w:rFonts w:ascii="Courier New" w:eastAsia="Times New Roman" w:hAnsi="Courier New" w:cs="Courier New"/>
-          <w:color w:val="BCBEC4"/>
-          <w:sz w:val="23"/>
-          <w:szCs w:val="23"/>
-          <w:lang w:eastAsia="en-IN"/>
-        </w:rPr>
-        <w:t xml:space="preserve">, </w:t>
-      </w:r>
-      <w:r>
-        <w:rPr>
-          <w:rFonts w:ascii="Courier New" w:eastAsia="Times New Roman" w:hAnsi="Courier New" w:cs="Courier New"/>
-          <w:color w:val="6AAB73"/>
-          <w:sz w:val="23"/>
-          <w:szCs w:val="23"/>
-          <w:lang w:eastAsia="en-IN"/>
-        </w:rPr>
-        <w:t>"I5"</w:t>
-      </w:r>
-      <w:r>
-        <w:rPr>
-          <w:rFonts w:ascii="Courier New" w:eastAsia="Times New Roman" w:hAnsi="Courier New" w:cs="Courier New"/>
-          <w:color w:val="BCBEC4"/>
-          <w:sz w:val="23"/>
-          <w:szCs w:val="23"/>
-          <w:lang w:eastAsia="en-IN"/>
-        </w:rPr>
-        <w:t>);</w:t>
-      </w:r>
-      <w:r>
-        <w:rPr>
-          <w:rFonts w:ascii="Courier New" w:eastAsia="Times New Roman" w:hAnsi="Courier New" w:cs="Courier New"/>
-          <w:color w:val="BCBEC4"/>
-          <w:sz w:val="23"/>
-          <w:szCs w:val="23"/>
-          <w:lang w:eastAsia="en-IN"/>
-        </w:rPr>
-        <w:br/>
-      </w:r>
-      <w:r>
-        <w:rPr>
-          <w:rFonts w:ascii="Courier New" w:eastAsia="Times New Roman" w:hAnsi="Courier New" w:cs="Courier New"/>
-          <w:color w:val="BCBEC4"/>
-          <w:sz w:val="23"/>
-          <w:szCs w:val="23"/>
-          <w:lang w:eastAsia="en-IN"/>
-        </w:rPr>
-        <w:br/>
-        <w:t xml:space="preserve">        </w:t>
-      </w:r>
-      <w:r>
-        <w:rPr>
-          <w:rFonts w:ascii="Courier New" w:eastAsia="Times New Roman" w:hAnsi="Courier New" w:cs="Courier New"/>
-          <w:color w:val="7A7E85"/>
-          <w:sz w:val="23"/>
-          <w:szCs w:val="23"/>
-          <w:lang w:eastAsia="en-IN"/>
-        </w:rPr>
-        <w:t>//Configuration of look and feel of the report</w:t>
-      </w:r>
-      <w:r>
-        <w:rPr>
-          <w:rFonts w:ascii="Courier New" w:eastAsia="Times New Roman" w:hAnsi="Courier New" w:cs="Courier New"/>
-          <w:color w:val="7A7E85"/>
-          <w:sz w:val="23"/>
-          <w:szCs w:val="23"/>
-          <w:lang w:eastAsia="en-IN"/>
-        </w:rPr>
-        <w:br/>
-        <w:t xml:space="preserve">        </w:t>
-      </w:r>
-      <w:proofErr w:type="spellStart"/>
-      <w:r>
-        <w:rPr>
-          <w:rFonts w:ascii="Courier New" w:eastAsia="Times New Roman" w:hAnsi="Courier New" w:cs="Courier New"/>
-          <w:color w:val="BCBEC4"/>
-          <w:sz w:val="23"/>
-          <w:szCs w:val="23"/>
-          <w:lang w:eastAsia="en-IN"/>
-        </w:rPr>
-        <w:t>htmlReport.config</w:t>
-      </w:r>
-      <w:proofErr w:type="spellEnd"/>
-      <w:r>
-        <w:rPr>
-          <w:rFonts w:ascii="Courier New" w:eastAsia="Times New Roman" w:hAnsi="Courier New" w:cs="Courier New"/>
-          <w:color w:val="BCBEC4"/>
-          <w:sz w:val="23"/>
-          <w:szCs w:val="23"/>
-          <w:lang w:eastAsia="en-IN"/>
-        </w:rPr>
-        <w:t>().</w:t>
-      </w:r>
-      <w:proofErr w:type="spellStart"/>
-      <w:r>
-        <w:rPr>
-          <w:rFonts w:ascii="Courier New" w:eastAsia="Times New Roman" w:hAnsi="Courier New" w:cs="Courier New"/>
-          <w:color w:val="BCBEC4"/>
-          <w:sz w:val="23"/>
-          <w:szCs w:val="23"/>
-          <w:lang w:eastAsia="en-IN"/>
-        </w:rPr>
-        <w:t>setDocumentTitle</w:t>
-      </w:r>
-      <w:proofErr w:type="spellEnd"/>
-      <w:r>
-        <w:rPr>
-          <w:rFonts w:ascii="Courier New" w:eastAsia="Times New Roman" w:hAnsi="Courier New" w:cs="Courier New"/>
-          <w:color w:val="BCBEC4"/>
-          <w:sz w:val="23"/>
-          <w:szCs w:val="23"/>
-          <w:lang w:eastAsia="en-IN"/>
-        </w:rPr>
-        <w:t>(</w:t>
-      </w:r>
-      <w:r>
-        <w:rPr>
-          <w:rFonts w:ascii="Courier New" w:eastAsia="Times New Roman" w:hAnsi="Courier New" w:cs="Courier New"/>
-          <w:color w:val="6AAB73"/>
-          <w:sz w:val="23"/>
-          <w:szCs w:val="23"/>
-          <w:lang w:eastAsia="en-IN"/>
-        </w:rPr>
-        <w:t>"My First Extent Report"</w:t>
-      </w:r>
-      <w:r>
-        <w:rPr>
-          <w:rFonts w:ascii="Courier New" w:eastAsia="Times New Roman" w:hAnsi="Courier New" w:cs="Courier New"/>
-          <w:color w:val="BCBEC4"/>
-          <w:sz w:val="23"/>
-          <w:szCs w:val="23"/>
-          <w:lang w:eastAsia="en-IN"/>
-        </w:rPr>
-        <w:t>);</w:t>
-      </w:r>
-      <w:r>
-        <w:rPr>
-          <w:rFonts w:ascii="Courier New" w:eastAsia="Times New Roman" w:hAnsi="Courier New" w:cs="Courier New"/>
-          <w:color w:val="BCBEC4"/>
-          <w:sz w:val="23"/>
-          <w:szCs w:val="23"/>
-          <w:lang w:eastAsia="en-IN"/>
-        </w:rPr>
-        <w:br/>
-        <w:t xml:space="preserve">        </w:t>
-      </w:r>
-      <w:proofErr w:type="spellStart"/>
-      <w:r>
-        <w:rPr>
-          <w:rFonts w:ascii="Courier New" w:eastAsia="Times New Roman" w:hAnsi="Courier New" w:cs="Courier New"/>
-          <w:color w:val="BCBEC4"/>
-          <w:sz w:val="23"/>
-          <w:szCs w:val="23"/>
-          <w:lang w:eastAsia="en-IN"/>
-        </w:rPr>
-        <w:t>htmlReport.config</w:t>
-      </w:r>
-      <w:proofErr w:type="spellEnd"/>
-      <w:r>
-        <w:rPr>
-          <w:rFonts w:ascii="Courier New" w:eastAsia="Times New Roman" w:hAnsi="Courier New" w:cs="Courier New"/>
-          <w:color w:val="BCBEC4"/>
-          <w:sz w:val="23"/>
-          <w:szCs w:val="23"/>
-          <w:lang w:eastAsia="en-IN"/>
-        </w:rPr>
-        <w:t>().</w:t>
-      </w:r>
-      <w:proofErr w:type="spellStart"/>
-      <w:r>
-        <w:rPr>
-          <w:rFonts w:ascii="Courier New" w:eastAsia="Times New Roman" w:hAnsi="Courier New" w:cs="Courier New"/>
-          <w:color w:val="BCBEC4"/>
-          <w:sz w:val="23"/>
-          <w:szCs w:val="23"/>
-          <w:lang w:eastAsia="en-IN"/>
-        </w:rPr>
-        <w:t>setReportName</w:t>
-      </w:r>
-      <w:proofErr w:type="spellEnd"/>
-      <w:r>
-        <w:rPr>
-          <w:rFonts w:ascii="Courier New" w:eastAsia="Times New Roman" w:hAnsi="Courier New" w:cs="Courier New"/>
-          <w:color w:val="BCBEC4"/>
-          <w:sz w:val="23"/>
-          <w:szCs w:val="23"/>
-          <w:lang w:eastAsia="en-IN"/>
-        </w:rPr>
-        <w:t>(</w:t>
-      </w:r>
-      <w:r>
-        <w:rPr>
-          <w:rFonts w:ascii="Courier New" w:eastAsia="Times New Roman" w:hAnsi="Courier New" w:cs="Courier New"/>
-          <w:color w:val="6AAB73"/>
-          <w:sz w:val="23"/>
-          <w:szCs w:val="23"/>
-          <w:lang w:eastAsia="en-IN"/>
-        </w:rPr>
-        <w:t>"Google Report"</w:t>
-      </w:r>
-      <w:r>
-        <w:rPr>
-          <w:rFonts w:ascii="Courier New" w:eastAsia="Times New Roman" w:hAnsi="Courier New" w:cs="Courier New"/>
-          <w:color w:val="BCBEC4"/>
-          <w:sz w:val="23"/>
-          <w:szCs w:val="23"/>
-          <w:lang w:eastAsia="en-IN"/>
-        </w:rPr>
-        <w:t>);</w:t>
-      </w:r>
-      <w:r>
-        <w:rPr>
-          <w:rFonts w:ascii="Courier New" w:eastAsia="Times New Roman" w:hAnsi="Courier New" w:cs="Courier New"/>
-          <w:color w:val="BCBEC4"/>
-          <w:sz w:val="23"/>
-          <w:szCs w:val="23"/>
-          <w:lang w:eastAsia="en-IN"/>
-        </w:rPr>
-        <w:br/>
-        <w:t xml:space="preserve">        </w:t>
-      </w:r>
-      <w:proofErr w:type="spellStart"/>
-      <w:r>
-        <w:rPr>
-          <w:rFonts w:ascii="Courier New" w:eastAsia="Times New Roman" w:hAnsi="Courier New" w:cs="Courier New"/>
-          <w:color w:val="BCBEC4"/>
-          <w:sz w:val="23"/>
-          <w:szCs w:val="23"/>
-          <w:lang w:eastAsia="en-IN"/>
-        </w:rPr>
-        <w:t>htmlReport.config</w:t>
-      </w:r>
-      <w:proofErr w:type="spellEnd"/>
-      <w:r>
-        <w:rPr>
-          <w:rFonts w:ascii="Courier New" w:eastAsia="Times New Roman" w:hAnsi="Courier New" w:cs="Courier New"/>
-          <w:color w:val="BCBEC4"/>
-          <w:sz w:val="23"/>
-          <w:szCs w:val="23"/>
-          <w:lang w:eastAsia="en-IN"/>
-        </w:rPr>
-        <w:t>().</w:t>
-      </w:r>
-      <w:proofErr w:type="spellStart"/>
-      <w:r>
-        <w:rPr>
-          <w:rFonts w:ascii="Courier New" w:eastAsia="Times New Roman" w:hAnsi="Courier New" w:cs="Courier New"/>
-          <w:color w:val="BCBEC4"/>
-          <w:sz w:val="23"/>
-          <w:szCs w:val="23"/>
-          <w:lang w:eastAsia="en-IN"/>
-        </w:rPr>
-        <w:t>setTheme</w:t>
-      </w:r>
-      <w:proofErr w:type="spellEnd"/>
-      <w:r>
-        <w:rPr>
-          <w:rFonts w:ascii="Courier New" w:eastAsia="Times New Roman" w:hAnsi="Courier New" w:cs="Courier New"/>
-          <w:color w:val="BCBEC4"/>
-          <w:sz w:val="23"/>
-          <w:szCs w:val="23"/>
-          <w:lang w:eastAsia="en-IN"/>
-        </w:rPr>
-        <w:t>(</w:t>
-      </w:r>
-      <w:proofErr w:type="spellStart"/>
-      <w:r>
-        <w:rPr>
-          <w:rFonts w:ascii="Courier New" w:eastAsia="Times New Roman" w:hAnsi="Courier New" w:cs="Courier New"/>
-          <w:color w:val="BCBEC4"/>
-          <w:sz w:val="23"/>
-          <w:szCs w:val="23"/>
-          <w:lang w:eastAsia="en-IN"/>
-        </w:rPr>
-        <w:t>Theme.</w:t>
+        <w:t xml:space="preserve">        htmlReport.config().setTheme(Theme.</w:t>
       </w:r>
       <w:r>
         <w:rPr>
@@ -8259,7 +7302,6 @@
         </w:rPr>
         <w:t>STANDARD</w:t>
       </w:r>
-      <w:proofErr w:type="spellEnd"/>
       <w:r>
         <w:rPr>
           <w:rFonts w:ascii="Courier New" w:eastAsia="Times New Roman" w:hAnsi="Courier New" w:cs="Courier New"/>
@@ -8279,51 +7321,7 @@
           <w:lang w:eastAsia="en-IN"/>
         </w:rPr>
         <w:br/>
-        <w:t xml:space="preserve">        </w:t>
-      </w:r>
-      <w:proofErr w:type="spellStart"/>
-      <w:r>
-        <w:rPr>
-          <w:rFonts w:ascii="Courier New" w:eastAsia="Times New Roman" w:hAnsi="Courier New" w:cs="Courier New"/>
-          <w:color w:val="BCBEC4"/>
-          <w:sz w:val="23"/>
-          <w:szCs w:val="23"/>
-          <w:lang w:eastAsia="en-IN"/>
-        </w:rPr>
-        <w:t>htmlReport.config</w:t>
-      </w:r>
-      <w:proofErr w:type="spellEnd"/>
-      <w:r>
-        <w:rPr>
-          <w:rFonts w:ascii="Courier New" w:eastAsia="Times New Roman" w:hAnsi="Courier New" w:cs="Courier New"/>
-          <w:color w:val="BCBEC4"/>
-          <w:sz w:val="23"/>
-          <w:szCs w:val="23"/>
-          <w:lang w:eastAsia="en-IN"/>
-        </w:rPr>
-        <w:t>().</w:t>
-      </w:r>
-      <w:proofErr w:type="spellStart"/>
-      <w:r>
-        <w:rPr>
-          <w:rFonts w:ascii="Courier New" w:eastAsia="Times New Roman" w:hAnsi="Courier New" w:cs="Courier New"/>
-          <w:color w:val="BCBEC4"/>
-          <w:sz w:val="23"/>
-          <w:szCs w:val="23"/>
-          <w:lang w:eastAsia="en-IN"/>
-        </w:rPr>
-        <w:t>setTimeStampFormat</w:t>
-      </w:r>
-      <w:proofErr w:type="spellEnd"/>
-      <w:r>
-        <w:rPr>
-          <w:rFonts w:ascii="Courier New" w:eastAsia="Times New Roman" w:hAnsi="Courier New" w:cs="Courier New"/>
-          <w:color w:val="BCBEC4"/>
-          <w:sz w:val="23"/>
-          <w:szCs w:val="23"/>
-          <w:lang w:eastAsia="en-IN"/>
-        </w:rPr>
-        <w:t>(</w:t>
+        <w:t xml:space="preserve">        htmlReport.config().setTimeStampFormat(</w:t>
       </w:r>
       <w:r>
         <w:rPr>
@@ -8333,51 +7331,7 @@
           <w:szCs w:val="23"/>
           <w:lang w:eastAsia="en-IN"/>
         </w:rPr>
-        <w:t>"</w:t>
-      </w:r>
-      <w:proofErr w:type="spellStart"/>
-      <w:r>
-        <w:rPr>
-          <w:rFonts w:ascii="Courier New" w:eastAsia="Times New Roman" w:hAnsi="Courier New" w:cs="Courier New"/>
-          <w:color w:val="6AAB73"/>
-          <w:sz w:val="23"/>
-          <w:szCs w:val="23"/>
-          <w:lang w:eastAsia="en-IN"/>
-        </w:rPr>
-        <w:t>dd</w:t>
-      </w:r>
-      <w:proofErr w:type="spellEnd"/>
-      <w:r>
-        <w:rPr>
-          <w:rFonts w:ascii="Courier New" w:eastAsia="Times New Roman" w:hAnsi="Courier New" w:cs="Courier New"/>
-          <w:color w:val="6AAB73"/>
-          <w:sz w:val="23"/>
-          <w:szCs w:val="23"/>
-          <w:lang w:eastAsia="en-IN"/>
-        </w:rPr>
-        <w:t>-MMM-</w:t>
-      </w:r>
-      <w:proofErr w:type="spellStart"/>
-      <w:r>
-        <w:rPr>
-          <w:rFonts w:ascii="Courier New" w:eastAsia="Times New Roman" w:hAnsi="Courier New" w:cs="Courier New"/>
-          <w:color w:val="6AAB73"/>
-          <w:sz w:val="23"/>
-          <w:szCs w:val="23"/>
-          <w:lang w:eastAsia="en-IN"/>
-        </w:rPr>
-        <w:t>yyyy</w:t>
-      </w:r>
-      <w:proofErr w:type="spellEnd"/>
-      <w:r>
-        <w:rPr>
-          <w:rFonts w:ascii="Courier New" w:eastAsia="Times New Roman" w:hAnsi="Courier New" w:cs="Courier New"/>
-          <w:color w:val="6AAB73"/>
-          <w:sz w:val="23"/>
-          <w:szCs w:val="23"/>
-          <w:lang w:eastAsia="en-IN"/>
-        </w:rPr>
-        <w:t>"</w:t>
+        <w:t>"dd-MMM-yyyy"</w:t>
       </w:r>
       <w:r>
         <w:rPr>
@@ -8408,29 +7362,7 @@
           <w:lang w:eastAsia="en-IN"/>
         </w:rPr>
         <w:br/>
-        <w:t xml:space="preserve">        test = </w:t>
-      </w:r>
-      <w:proofErr w:type="spellStart"/>
-      <w:r>
-        <w:rPr>
-          <w:rFonts w:ascii="Courier New" w:eastAsia="Times New Roman" w:hAnsi="Courier New" w:cs="Courier New"/>
-          <w:color w:val="BCBEC4"/>
-          <w:sz w:val="23"/>
-          <w:szCs w:val="23"/>
-          <w:lang w:eastAsia="en-IN"/>
-        </w:rPr>
-        <w:t>report.createTest</w:t>
-      </w:r>
-      <w:proofErr w:type="spellEnd"/>
-      <w:r>
-        <w:rPr>
-          <w:rFonts w:ascii="Courier New" w:eastAsia="Times New Roman" w:hAnsi="Courier New" w:cs="Courier New"/>
-          <w:color w:val="BCBEC4"/>
-          <w:sz w:val="23"/>
-          <w:szCs w:val="23"/>
-          <w:lang w:eastAsia="en-IN"/>
-        </w:rPr>
-        <w:t>(</w:t>
+        <w:t xml:space="preserve">        test = report.createTest(</w:t>
       </w:r>
       <w:r>
         <w:rPr>
@@ -8512,29 +7444,7 @@
           <w:lang w:eastAsia="en-IN"/>
         </w:rPr>
         <w:lastRenderedPageBreak/>
-        <w:t xml:space="preserve">        </w:t>
-      </w:r>
-      <w:proofErr w:type="spellStart"/>
-      <w:r>
-        <w:rPr>
-          <w:rFonts w:ascii="Courier New" w:eastAsia="Times New Roman" w:hAnsi="Courier New" w:cs="Courier New"/>
-          <w:color w:val="BCBEC4"/>
-          <w:sz w:val="23"/>
-          <w:szCs w:val="23"/>
-          <w:lang w:eastAsia="en-IN"/>
-        </w:rPr>
-        <w:t>driver.manage</w:t>
-      </w:r>
-      <w:proofErr w:type="spellEnd"/>
-      <w:r>
-        <w:rPr>
-          <w:rFonts w:ascii="Courier New" w:eastAsia="Times New Roman" w:hAnsi="Courier New" w:cs="Courier New"/>
-          <w:color w:val="BCBEC4"/>
-          <w:sz w:val="23"/>
-          <w:szCs w:val="23"/>
-          <w:lang w:eastAsia="en-IN"/>
-        </w:rPr>
-        <w:t>().window().maximize();</w:t>
+        <w:t xml:space="preserve">        driver.manage().window().maximize();</w:t>
       </w:r>
       <w:r>
         <w:rPr>
@@ -8608,29 +7518,7 @@
           <w:lang w:eastAsia="en-IN"/>
         </w:rPr>
         <w:br/>
-        <w:t xml:space="preserve">        </w:t>
-      </w:r>
-      <w:proofErr w:type="spellStart"/>
-      <w:r>
-        <w:rPr>
-          <w:rFonts w:ascii="Courier New" w:eastAsia="Times New Roman" w:hAnsi="Courier New" w:cs="Courier New"/>
-          <w:color w:val="BCBEC4"/>
-          <w:sz w:val="23"/>
-          <w:szCs w:val="23"/>
-          <w:lang w:eastAsia="en-IN"/>
-        </w:rPr>
-        <w:t>driver.get</w:t>
-      </w:r>
-      <w:proofErr w:type="spellEnd"/>
-      <w:r>
-        <w:rPr>
-          <w:rFonts w:ascii="Courier New" w:eastAsia="Times New Roman" w:hAnsi="Courier New" w:cs="Courier New"/>
-          <w:color w:val="BCBEC4"/>
-          <w:sz w:val="23"/>
-          <w:szCs w:val="23"/>
-          <w:lang w:eastAsia="en-IN"/>
-        </w:rPr>
-        <w:t>(</w:t>
+        <w:t xml:space="preserve">        driver.get(</w:t>
       </w:r>
       <w:r>
         <w:rPr>
@@ -8661,18 +7549,7 @@
           <w:lang w:eastAsia="en-IN"/>
         </w:rPr>
         <w:br/>
-        <w:t xml:space="preserve">        </w:t>
-      </w:r>
-      <w:proofErr w:type="spellStart"/>
-      <w:r>
-        <w:rPr>
-          <w:rFonts w:ascii="Courier New" w:eastAsia="Times New Roman" w:hAnsi="Courier New" w:cs="Courier New"/>
-          <w:color w:val="BCBEC4"/>
-          <w:sz w:val="23"/>
-          <w:szCs w:val="23"/>
-          <w:lang w:eastAsia="en-IN"/>
-        </w:rPr>
-        <w:t>System.</w:t>
+        <w:t xml:space="preserve">        System.</w:t>
       </w:r>
       <w:r>
         <w:rPr>
@@ -8694,18 +7571,7 @@
           <w:szCs w:val="23"/>
           <w:lang w:eastAsia="en-IN"/>
         </w:rPr>
-        <w:t>.println</w:t>
-      </w:r>
-      <w:proofErr w:type="spellEnd"/>
-      <w:r>
-        <w:rPr>
-          <w:rFonts w:ascii="Courier New" w:eastAsia="Times New Roman" w:hAnsi="Courier New" w:cs="Courier New"/>
-          <w:color w:val="BCBEC4"/>
-          <w:sz w:val="23"/>
-          <w:szCs w:val="23"/>
-          <w:lang w:eastAsia="en-IN"/>
-        </w:rPr>
-        <w:t>(</w:t>
+        <w:t>.println(</w:t>
       </w:r>
       <w:r>
         <w:rPr>
@@ -8725,29 +7591,7 @@
           <w:szCs w:val="23"/>
           <w:lang w:eastAsia="en-IN"/>
         </w:rPr>
-        <w:t xml:space="preserve">+ </w:t>
-      </w:r>
-      <w:proofErr w:type="spellStart"/>
-      <w:r>
-        <w:rPr>
-          <w:rFonts w:ascii="Courier New" w:eastAsia="Times New Roman" w:hAnsi="Courier New" w:cs="Courier New"/>
-          <w:color w:val="BCBEC4"/>
-          <w:sz w:val="23"/>
-          <w:szCs w:val="23"/>
-          <w:lang w:eastAsia="en-IN"/>
-        </w:rPr>
-        <w:t>driver.getTitle</w:t>
-      </w:r>
-      <w:proofErr w:type="spellEnd"/>
-      <w:r>
-        <w:rPr>
-          <w:rFonts w:ascii="Courier New" w:eastAsia="Times New Roman" w:hAnsi="Courier New" w:cs="Courier New"/>
-          <w:color w:val="BCBEC4"/>
-          <w:sz w:val="23"/>
-          <w:szCs w:val="23"/>
-          <w:lang w:eastAsia="en-IN"/>
-        </w:rPr>
-        <w:t>());</w:t>
+        <w:t>+ driver.getTitle());</w:t>
       </w:r>
       <w:r>
         <w:rPr>
@@ -8768,29 +7612,7 @@
           <w:lang w:eastAsia="en-IN"/>
         </w:rPr>
         <w:br/>
-        <w:t xml:space="preserve">        </w:t>
-      </w:r>
-      <w:proofErr w:type="spellStart"/>
-      <w:r>
-        <w:rPr>
-          <w:rFonts w:ascii="Courier New" w:eastAsia="Times New Roman" w:hAnsi="Courier New" w:cs="Courier New"/>
-          <w:color w:val="BCBEC4"/>
-          <w:sz w:val="23"/>
-          <w:szCs w:val="23"/>
-          <w:lang w:eastAsia="en-IN"/>
-        </w:rPr>
-        <w:t>driver.close</w:t>
-      </w:r>
-      <w:proofErr w:type="spellEnd"/>
-      <w:r>
-        <w:rPr>
-          <w:rFonts w:ascii="Courier New" w:eastAsia="Times New Roman" w:hAnsi="Courier New" w:cs="Courier New"/>
-          <w:color w:val="BCBEC4"/>
-          <w:sz w:val="23"/>
-          <w:szCs w:val="23"/>
-          <w:lang w:eastAsia="en-IN"/>
-        </w:rPr>
-        <w:t>();</w:t>
+        <w:t xml:space="preserve">        driver.close();</w:t>
       </w:r>
       <w:r>
         <w:rPr>
@@ -8811,18 +7633,7 @@
           <w:lang w:eastAsia="en-IN"/>
         </w:rPr>
         <w:br/>
-        <w:t xml:space="preserve">        test.log(</w:t>
-      </w:r>
-      <w:proofErr w:type="spellStart"/>
-      <w:r>
-        <w:rPr>
-          <w:rFonts w:ascii="Courier New" w:eastAsia="Times New Roman" w:hAnsi="Courier New" w:cs="Courier New"/>
-          <w:color w:val="BCBEC4"/>
-          <w:sz w:val="23"/>
-          <w:szCs w:val="23"/>
-          <w:lang w:eastAsia="en-IN"/>
-        </w:rPr>
-        <w:t>Status.</w:t>
+        <w:t xml:space="preserve">        test.log(Status.</w:t>
       </w:r>
       <w:r>
         <w:rPr>
@@ -8836,27 +7647,15 @@
         </w:rPr>
         <w:t>PASS</w:t>
       </w:r>
-      <w:proofErr w:type="spellEnd"/>
-      <w:r>
-        <w:rPr>
-          <w:rFonts w:ascii="Courier New" w:eastAsia="Times New Roman" w:hAnsi="Courier New" w:cs="Courier New"/>
-          <w:color w:val="BCBEC4"/>
-          <w:sz w:val="23"/>
-          <w:szCs w:val="23"/>
-          <w:lang w:eastAsia="en-IN"/>
-        </w:rPr>
-        <w:t xml:space="preserve">, </w:t>
-      </w:r>
-      <w:proofErr w:type="spellStart"/>
-      <w:r>
-        <w:rPr>
-          <w:rFonts w:ascii="Courier New" w:eastAsia="Times New Roman" w:hAnsi="Courier New" w:cs="Courier New"/>
-          <w:color w:val="BCBEC4"/>
-          <w:sz w:val="23"/>
-          <w:szCs w:val="23"/>
-          <w:lang w:eastAsia="en-IN"/>
-        </w:rPr>
-        <w:t>MarkupHelper.</w:t>
+      <w:r>
+        <w:rPr>
+          <w:rFonts w:ascii="Courier New" w:eastAsia="Times New Roman" w:hAnsi="Courier New" w:cs="Courier New"/>
+          <w:color w:val="BCBEC4"/>
+          <w:sz w:val="23"/>
+          <w:szCs w:val="23"/>
+          <w:lang w:eastAsia="en-IN"/>
+        </w:rPr>
+        <w:t>, MarkupHelper.</w:t>
       </w:r>
       <w:r>
         <w:rPr>
@@ -8870,7 +7669,6 @@
         </w:rPr>
         <w:t>createLabel</w:t>
       </w:r>
-      <w:proofErr w:type="spellEnd"/>
       <w:r>
         <w:rPr>
           <w:rFonts w:ascii="Courier New" w:eastAsia="Times New Roman" w:hAnsi="Courier New" w:cs="Courier New"/>
@@ -8899,18 +7697,7 @@
           <w:szCs w:val="23"/>
           <w:lang w:eastAsia="en-IN"/>
         </w:rPr>
-        <w:t xml:space="preserve">, </w:t>
-      </w:r>
-      <w:proofErr w:type="spellStart"/>
-      <w:r>
-        <w:rPr>
-          <w:rFonts w:ascii="Courier New" w:eastAsia="Times New Roman" w:hAnsi="Courier New" w:cs="Courier New"/>
-          <w:color w:val="BCBEC4"/>
-          <w:sz w:val="23"/>
-          <w:szCs w:val="23"/>
-          <w:lang w:eastAsia="en-IN"/>
-        </w:rPr>
-        <w:t>ExtentColor.</w:t>
+        <w:t>, ExtentColor.</w:t>
       </w:r>
       <w:r>
         <w:rPr>
@@ -8924,7 +7711,6 @@
         </w:rPr>
         <w:t>GREEN</w:t>
       </w:r>
-      <w:proofErr w:type="spellEnd"/>
       <w:r>
         <w:rPr>
           <w:rFonts w:ascii="Courier New" w:eastAsia="Times New Roman" w:hAnsi="Courier New" w:cs="Courier New"/>
@@ -8977,49 +7763,15 @@
         <w:br/>
         <w:t xml:space="preserve">        </w:t>
       </w:r>
-      <w:proofErr w:type="spellStart"/>
-      <w:r>
-        <w:rPr>
-          <w:rFonts w:ascii="Courier New" w:eastAsia="Times New Roman" w:hAnsi="Courier New" w:cs="Courier New"/>
-          <w:color w:val="BCBEC4"/>
-          <w:sz w:val="23"/>
-          <w:szCs w:val="23"/>
-          <w:lang w:eastAsia="en-IN"/>
-        </w:rPr>
-        <w:t>test</w:t>
-      </w:r>
-      <w:proofErr w:type="spellEnd"/>
-      <w:r>
-        <w:rPr>
-          <w:rFonts w:ascii="Courier New" w:eastAsia="Times New Roman" w:hAnsi="Courier New" w:cs="Courier New"/>
-          <w:color w:val="BCBEC4"/>
-          <w:sz w:val="23"/>
-          <w:szCs w:val="23"/>
-          <w:lang w:eastAsia="en-IN"/>
-        </w:rPr>
-        <w:t xml:space="preserve"> = </w:t>
-      </w:r>
-      <w:proofErr w:type="spellStart"/>
-      <w:r>
-        <w:rPr>
-          <w:rFonts w:ascii="Courier New" w:eastAsia="Times New Roman" w:hAnsi="Courier New" w:cs="Courier New"/>
-          <w:color w:val="BCBEC4"/>
-          <w:sz w:val="23"/>
-          <w:szCs w:val="23"/>
-          <w:lang w:eastAsia="en-IN"/>
-        </w:rPr>
-        <w:t>report.createTest</w:t>
-      </w:r>
-      <w:proofErr w:type="spellEnd"/>
-      <w:r>
-        <w:rPr>
-          <w:rFonts w:ascii="Courier New" w:eastAsia="Times New Roman" w:hAnsi="Courier New" w:cs="Courier New"/>
-          <w:color w:val="BCBEC4"/>
-          <w:sz w:val="23"/>
-          <w:szCs w:val="23"/>
-          <w:lang w:eastAsia="en-IN"/>
-        </w:rPr>
-        <w:t>(</w:t>
+      <w:r>
+        <w:rPr>
+          <w:rFonts w:ascii="Courier New" w:eastAsia="Times New Roman" w:hAnsi="Courier New" w:cs="Courier New"/>
+          <w:color w:val="BCBEC4"/>
+          <w:sz w:val="23"/>
+          <w:szCs w:val="23"/>
+          <w:lang w:eastAsia="en-IN"/>
+        </w:rPr>
+        <w:t>test = report.createTest(</w:t>
       </w:r>
       <w:r>
         <w:rPr>
@@ -9091,29 +7843,7 @@
           <w:lang w:eastAsia="en-IN"/>
         </w:rPr>
         <w:br/>
-        <w:t xml:space="preserve">        </w:t>
-      </w:r>
-      <w:proofErr w:type="spellStart"/>
-      <w:r>
-        <w:rPr>
-          <w:rFonts w:ascii="Courier New" w:eastAsia="Times New Roman" w:hAnsi="Courier New" w:cs="Courier New"/>
-          <w:color w:val="BCBEC4"/>
-          <w:sz w:val="23"/>
-          <w:szCs w:val="23"/>
-          <w:lang w:eastAsia="en-IN"/>
-        </w:rPr>
-        <w:t>driver.manage</w:t>
-      </w:r>
-      <w:proofErr w:type="spellEnd"/>
-      <w:r>
-        <w:rPr>
-          <w:rFonts w:ascii="Courier New" w:eastAsia="Times New Roman" w:hAnsi="Courier New" w:cs="Courier New"/>
-          <w:color w:val="BCBEC4"/>
-          <w:sz w:val="23"/>
-          <w:szCs w:val="23"/>
-          <w:lang w:eastAsia="en-IN"/>
-        </w:rPr>
-        <w:t>().window().maximize();</w:t>
+        <w:t xml:space="preserve">        driver.manage().window().maximize();</w:t>
       </w:r>
       <w:r>
         <w:rPr>
@@ -9187,29 +7917,7 @@
           <w:lang w:eastAsia="en-IN"/>
         </w:rPr>
         <w:br/>
-        <w:t xml:space="preserve">        </w:t>
-      </w:r>
-      <w:proofErr w:type="spellStart"/>
-      <w:r>
-        <w:rPr>
-          <w:rFonts w:ascii="Courier New" w:eastAsia="Times New Roman" w:hAnsi="Courier New" w:cs="Courier New"/>
-          <w:color w:val="BCBEC4"/>
-          <w:sz w:val="23"/>
-          <w:szCs w:val="23"/>
-          <w:lang w:eastAsia="en-IN"/>
-        </w:rPr>
-        <w:t>driver.get</w:t>
-      </w:r>
-      <w:proofErr w:type="spellEnd"/>
-      <w:r>
-        <w:rPr>
-          <w:rFonts w:ascii="Courier New" w:eastAsia="Times New Roman" w:hAnsi="Courier New" w:cs="Courier New"/>
-          <w:color w:val="BCBEC4"/>
-          <w:sz w:val="23"/>
-          <w:szCs w:val="23"/>
-          <w:lang w:eastAsia="en-IN"/>
-        </w:rPr>
-        <w:t>(</w:t>
+        <w:t xml:space="preserve">        driver.get(</w:t>
       </w:r>
       <w:r>
         <w:rPr>
@@ -9250,29 +7958,7 @@
           <w:lang w:eastAsia="en-IN"/>
         </w:rPr>
         <w:br/>
-        <w:t xml:space="preserve">        </w:t>
-      </w:r>
-      <w:proofErr w:type="spellStart"/>
-      <w:r>
-        <w:rPr>
-          <w:rFonts w:ascii="Courier New" w:eastAsia="Times New Roman" w:hAnsi="Courier New" w:cs="Courier New"/>
-          <w:color w:val="BCBEC4"/>
-          <w:sz w:val="23"/>
-          <w:szCs w:val="23"/>
-          <w:lang w:eastAsia="en-IN"/>
-        </w:rPr>
-        <w:t>driver.findElement</w:t>
-      </w:r>
-      <w:proofErr w:type="spellEnd"/>
-      <w:r>
-        <w:rPr>
-          <w:rFonts w:ascii="Courier New" w:eastAsia="Times New Roman" w:hAnsi="Courier New" w:cs="Courier New"/>
-          <w:color w:val="BCBEC4"/>
-          <w:sz w:val="23"/>
-          <w:szCs w:val="23"/>
-          <w:lang w:eastAsia="en-IN"/>
-        </w:rPr>
-        <w:t>(By.</w:t>
+        <w:t xml:space="preserve">        driver.findElement(By.</w:t>
       </w:r>
       <w:r>
         <w:rPr>
@@ -9334,18 +8020,7 @@
           <w:szCs w:val="23"/>
           <w:lang w:eastAsia="en-IN"/>
         </w:rPr>
-        <w:t xml:space="preserve">, </w:t>
-      </w:r>
-      <w:proofErr w:type="spellStart"/>
-      <w:r>
-        <w:rPr>
-          <w:rFonts w:ascii="Courier New" w:eastAsia="Times New Roman" w:hAnsi="Courier New" w:cs="Courier New"/>
-          <w:color w:val="BCBEC4"/>
-          <w:sz w:val="23"/>
-          <w:szCs w:val="23"/>
-          <w:lang w:eastAsia="en-IN"/>
-        </w:rPr>
-        <w:t>Keys.</w:t>
+        <w:t>, Keys.</w:t>
       </w:r>
       <w:r>
         <w:rPr>
@@ -9359,7 +8034,6 @@
         </w:rPr>
         <w:t>ENTER</w:t>
       </w:r>
-      <w:proofErr w:type="spellEnd"/>
       <w:r>
         <w:rPr>
           <w:rFonts w:ascii="Courier New" w:eastAsia="Times New Roman" w:hAnsi="Courier New" w:cs="Courier New"/>
@@ -9420,84 +8094,7 @@
           <w:szCs w:val="23"/>
           <w:lang w:eastAsia="en-IN"/>
         </w:rPr>
-        <w:t xml:space="preserve">File </w:t>
-      </w:r>
-      <w:proofErr w:type="spellStart"/>
-      <w:r>
-        <w:rPr>
-          <w:rFonts w:ascii="Courier New" w:eastAsia="Times New Roman" w:hAnsi="Courier New" w:cs="Courier New"/>
-          <w:color w:val="BCBEC4"/>
-          <w:sz w:val="23"/>
-          <w:szCs w:val="23"/>
-          <w:lang w:eastAsia="en-IN"/>
-        </w:rPr>
-        <w:t>ss</w:t>
-      </w:r>
-      <w:proofErr w:type="spellEnd"/>
-      <w:r>
-        <w:rPr>
-          <w:rFonts w:ascii="Courier New" w:eastAsia="Times New Roman" w:hAnsi="Courier New" w:cs="Courier New"/>
-          <w:color w:val="BCBEC4"/>
-          <w:sz w:val="23"/>
-          <w:szCs w:val="23"/>
-          <w:lang w:eastAsia="en-IN"/>
-        </w:rPr>
-        <w:t xml:space="preserve"> = ((</w:t>
-      </w:r>
-      <w:proofErr w:type="spellStart"/>
-      <w:r>
-        <w:rPr>
-          <w:rFonts w:ascii="Courier New" w:eastAsia="Times New Roman" w:hAnsi="Courier New" w:cs="Courier New"/>
-          <w:color w:val="BCBEC4"/>
-          <w:sz w:val="23"/>
-          <w:szCs w:val="23"/>
-          <w:lang w:eastAsia="en-IN"/>
-        </w:rPr>
-        <w:t>TakesScreenshot</w:t>
-      </w:r>
-      <w:proofErr w:type="spellEnd"/>
-      <w:r>
-        <w:rPr>
-          <w:rFonts w:ascii="Courier New" w:eastAsia="Times New Roman" w:hAnsi="Courier New" w:cs="Courier New"/>
-          <w:color w:val="BCBEC4"/>
-          <w:sz w:val="23"/>
-          <w:szCs w:val="23"/>
-          <w:lang w:eastAsia="en-IN"/>
-        </w:rPr>
-        <w:t>)driver).</w:t>
-      </w:r>
-      <w:proofErr w:type="spellStart"/>
-      <w:r>
-        <w:rPr>
-          <w:rFonts w:ascii="Courier New" w:eastAsia="Times New Roman" w:hAnsi="Courier New" w:cs="Courier New"/>
-          <w:color w:val="BCBEC4"/>
-          <w:sz w:val="23"/>
-          <w:szCs w:val="23"/>
-          <w:lang w:eastAsia="en-IN"/>
-        </w:rPr>
-        <w:t>getScreenshotAs</w:t>
-      </w:r>
-      <w:proofErr w:type="spellEnd"/>
-      <w:r>
-        <w:rPr>
-          <w:rFonts w:ascii="Courier New" w:eastAsia="Times New Roman" w:hAnsi="Courier New" w:cs="Courier New"/>
-          <w:color w:val="BCBEC4"/>
-          <w:sz w:val="23"/>
-          <w:szCs w:val="23"/>
-          <w:lang w:eastAsia="en-IN"/>
-        </w:rPr>
-        <w:t>(</w:t>
-      </w:r>
-      <w:proofErr w:type="spellStart"/>
-      <w:r>
-        <w:rPr>
-          <w:rFonts w:ascii="Courier New" w:eastAsia="Times New Roman" w:hAnsi="Courier New" w:cs="Courier New"/>
-          <w:color w:val="BCBEC4"/>
-          <w:sz w:val="23"/>
-          <w:szCs w:val="23"/>
-          <w:lang w:eastAsia="en-IN"/>
-        </w:rPr>
-        <w:t>OutputType.</w:t>
+        <w:t>File ss = ((TakesScreenshot)driver).getScreenshotAs(OutputType.</w:t>
       </w:r>
       <w:r>
         <w:rPr>
@@ -9511,7 +8108,6 @@
         </w:rPr>
         <w:t>FILE</w:t>
       </w:r>
-      <w:proofErr w:type="spellEnd"/>
       <w:r>
         <w:rPr>
           <w:rFonts w:ascii="Courier New" w:eastAsia="Times New Roman" w:hAnsi="Courier New" w:cs="Courier New"/>
@@ -9521,6 +8117,79 @@
           <w:lang w:eastAsia="en-IN"/>
         </w:rPr>
         <w:t>);</w:t>
+      </w:r>
+      <w:r>
+        <w:rPr>
+          <w:rFonts w:ascii="Courier New" w:eastAsia="Times New Roman" w:hAnsi="Courier New" w:cs="Courier New"/>
+          <w:color w:val="BCBEC4"/>
+          <w:sz w:val="23"/>
+          <w:szCs w:val="23"/>
+          <w:lang w:eastAsia="en-IN"/>
+        </w:rPr>
+        <w:br/>
+        <w:t xml:space="preserve">        FileHandler.</w:t>
+      </w:r>
+      <w:r>
+        <w:rPr>
+          <w:rFonts w:ascii="Courier New" w:eastAsia="Times New Roman" w:hAnsi="Courier New" w:cs="Courier New"/>
+          <w:i/>
+          <w:iCs/>
+          <w:color w:val="BCBEC4"/>
+          <w:sz w:val="23"/>
+          <w:szCs w:val="23"/>
+          <w:lang w:eastAsia="en-IN"/>
+        </w:rPr>
+        <w:t>copy</w:t>
+      </w:r>
+      <w:r>
+        <w:rPr>
+          <w:rFonts w:ascii="Courier New" w:eastAsia="Times New Roman" w:hAnsi="Courier New" w:cs="Courier New"/>
+          <w:color w:val="BCBEC4"/>
+          <w:sz w:val="23"/>
+          <w:szCs w:val="23"/>
+          <w:lang w:eastAsia="en-IN"/>
+        </w:rPr>
+        <w:t xml:space="preserve">(ss, </w:t>
+      </w:r>
+      <w:r>
+        <w:rPr>
+          <w:rFonts w:ascii="Courier New" w:eastAsia="Times New Roman" w:hAnsi="Courier New" w:cs="Courier New"/>
+          <w:color w:val="CF8E6D"/>
+          <w:sz w:val="23"/>
+          <w:szCs w:val="23"/>
+          <w:lang w:eastAsia="en-IN"/>
+        </w:rPr>
+        <w:t xml:space="preserve">new </w:t>
+      </w:r>
+      <w:r>
+        <w:rPr>
+          <w:rFonts w:ascii="Courier New" w:eastAsia="Times New Roman" w:hAnsi="Courier New" w:cs="Courier New"/>
+          <w:color w:val="BCBEC4"/>
+          <w:sz w:val="23"/>
+          <w:szCs w:val="23"/>
+          <w:lang w:eastAsia="en-IN"/>
+        </w:rPr>
+        <w:t>File(</w:t>
+      </w:r>
+      <w:r>
+        <w:rPr>
+          <w:rFonts w:ascii="Courier New" w:eastAsia="Times New Roman" w:hAnsi="Courier New" w:cs="Courier New"/>
+          <w:color w:val="6AAB73"/>
+          <w:sz w:val="23"/>
+          <w:szCs w:val="23"/>
+          <w:lang w:eastAsia="en-IN"/>
+        </w:rPr>
+        <w:t>"Trial.jpeg"</w:t>
+      </w:r>
+      <w:r>
+        <w:rPr>
+          <w:rFonts w:ascii="Courier New" w:eastAsia="Times New Roman" w:hAnsi="Courier New" w:cs="Courier New"/>
+          <w:color w:val="BCBEC4"/>
+          <w:sz w:val="23"/>
+          <w:szCs w:val="23"/>
+          <w:lang w:eastAsia="en-IN"/>
+        </w:rPr>
+        <w:t>));</w:t>
       </w:r>
       <w:r>
         <w:rPr>
@@ -9533,101 +8202,26 @@
         <w:br/>
         <w:t xml:space="preserve">        </w:t>
       </w:r>
-      <w:proofErr w:type="spellStart"/>
-      <w:r>
-        <w:rPr>
-          <w:rFonts w:ascii="Courier New" w:eastAsia="Times New Roman" w:hAnsi="Courier New" w:cs="Courier New"/>
-          <w:color w:val="BCBEC4"/>
-          <w:sz w:val="23"/>
-          <w:szCs w:val="23"/>
-          <w:lang w:eastAsia="en-IN"/>
-        </w:rPr>
-        <w:t>FileHandler.</w:t>
-      </w:r>
-      <w:r>
-        <w:rPr>
-          <w:rFonts w:ascii="Courier New" w:eastAsia="Times New Roman" w:hAnsi="Courier New" w:cs="Courier New"/>
-          <w:i/>
-          <w:iCs/>
-          <w:color w:val="BCBEC4"/>
-          <w:sz w:val="23"/>
-          <w:szCs w:val="23"/>
-          <w:lang w:eastAsia="en-IN"/>
-        </w:rPr>
-        <w:t>copy</w:t>
-      </w:r>
-      <w:proofErr w:type="spellEnd"/>
-      <w:r>
-        <w:rPr>
-          <w:rFonts w:ascii="Courier New" w:eastAsia="Times New Roman" w:hAnsi="Courier New" w:cs="Courier New"/>
-          <w:color w:val="BCBEC4"/>
-          <w:sz w:val="23"/>
-          <w:szCs w:val="23"/>
-          <w:lang w:eastAsia="en-IN"/>
-        </w:rPr>
-        <w:t>(</w:t>
-      </w:r>
-      <w:proofErr w:type="spellStart"/>
-      <w:r>
-        <w:rPr>
-          <w:rFonts w:ascii="Courier New" w:eastAsia="Times New Roman" w:hAnsi="Courier New" w:cs="Courier New"/>
-          <w:color w:val="BCBEC4"/>
-          <w:sz w:val="23"/>
-          <w:szCs w:val="23"/>
-          <w:lang w:eastAsia="en-IN"/>
-        </w:rPr>
-        <w:t>ss</w:t>
-      </w:r>
-      <w:proofErr w:type="spellEnd"/>
-      <w:r>
-        <w:rPr>
-          <w:rFonts w:ascii="Courier New" w:eastAsia="Times New Roman" w:hAnsi="Courier New" w:cs="Courier New"/>
-          <w:color w:val="BCBEC4"/>
-          <w:sz w:val="23"/>
-          <w:szCs w:val="23"/>
-          <w:lang w:eastAsia="en-IN"/>
-        </w:rPr>
-        <w:t xml:space="preserve">, </w:t>
-      </w:r>
-      <w:r>
-        <w:rPr>
-          <w:rFonts w:ascii="Courier New" w:eastAsia="Times New Roman" w:hAnsi="Courier New" w:cs="Courier New"/>
-          <w:color w:val="CF8E6D"/>
-          <w:sz w:val="23"/>
-          <w:szCs w:val="23"/>
-          <w:lang w:eastAsia="en-IN"/>
-        </w:rPr>
-        <w:t xml:space="preserve">new </w:t>
-      </w:r>
-      <w:r>
-        <w:rPr>
-          <w:rFonts w:ascii="Courier New" w:eastAsia="Times New Roman" w:hAnsi="Courier New" w:cs="Courier New"/>
-          <w:color w:val="BCBEC4"/>
-          <w:sz w:val="23"/>
-          <w:szCs w:val="23"/>
-          <w:lang w:eastAsia="en-IN"/>
-        </w:rPr>
-        <w:t>File(</w:t>
-      </w:r>
-      <w:r>
-        <w:rPr>
-          <w:rFonts w:ascii="Courier New" w:eastAsia="Times New Roman" w:hAnsi="Courier New" w:cs="Courier New"/>
-          <w:color w:val="6AAB73"/>
-          <w:sz w:val="23"/>
-          <w:szCs w:val="23"/>
-          <w:lang w:eastAsia="en-IN"/>
-        </w:rPr>
-        <w:t>"Trial.jpeg"</w:t>
-      </w:r>
-      <w:r>
-        <w:rPr>
-          <w:rFonts w:ascii="Courier New" w:eastAsia="Times New Roman" w:hAnsi="Courier New" w:cs="Courier New"/>
-          <w:color w:val="BCBEC4"/>
-          <w:sz w:val="23"/>
-          <w:szCs w:val="23"/>
-          <w:lang w:eastAsia="en-IN"/>
-        </w:rPr>
-        <w:t>));</w:t>
+      <w:r>
+        <w:rPr>
+          <w:rFonts w:ascii="Courier New" w:eastAsia="Times New Roman" w:hAnsi="Courier New" w:cs="Courier New"/>
+          <w:color w:val="BCBEC4"/>
+          <w:sz w:val="23"/>
+          <w:szCs w:val="23"/>
+          <w:lang w:eastAsia="en-IN"/>
+        </w:rPr>
+        <w:br/>
+        <w:t xml:space="preserve">        driver.close();</w:t>
+      </w:r>
+      <w:r>
+        <w:rPr>
+          <w:rFonts w:ascii="Courier New" w:eastAsia="Times New Roman" w:hAnsi="Courier New" w:cs="Courier New"/>
+          <w:color w:val="BCBEC4"/>
+          <w:sz w:val="23"/>
+          <w:szCs w:val="23"/>
+          <w:lang w:eastAsia="en-IN"/>
+        </w:rPr>
+        <w:br/>
       </w:r>
       <w:r>
         <w:rPr>
@@ -9643,7 +8237,17 @@
       <w:r>
         <w:rPr>
           <w:rFonts w:ascii="Courier New" w:eastAsia="Times New Roman" w:hAnsi="Courier New" w:cs="Courier New"/>
-          <w:color w:val="BCBEC4"/>
+          <w:color w:val="7A7E85"/>
+          <w:sz w:val="23"/>
+          <w:szCs w:val="23"/>
+          <w:lang w:eastAsia="en-IN"/>
+        </w:rPr>
+        <w:t>//Adding the screenshot in Report</w:t>
+      </w:r>
+      <w:r>
+        <w:rPr>
+          <w:rFonts w:ascii="Courier New" w:eastAsia="Times New Roman" w:hAnsi="Courier New" w:cs="Courier New"/>
+          <w:color w:val="7A7E85"/>
           <w:sz w:val="23"/>
           <w:szCs w:val="23"/>
           <w:lang w:eastAsia="en-IN"/>
@@ -9651,90 +8255,15 @@
         <w:br/>
         <w:t xml:space="preserve">        </w:t>
       </w:r>
-      <w:proofErr w:type="spellStart"/>
-      <w:r>
-        <w:rPr>
-          <w:rFonts w:ascii="Courier New" w:eastAsia="Times New Roman" w:hAnsi="Courier New" w:cs="Courier New"/>
-          <w:color w:val="BCBEC4"/>
-          <w:sz w:val="23"/>
-          <w:szCs w:val="23"/>
-          <w:lang w:eastAsia="en-IN"/>
-        </w:rPr>
-        <w:t>driver.close</w:t>
-      </w:r>
-      <w:proofErr w:type="spellEnd"/>
-      <w:r>
-        <w:rPr>
-          <w:rFonts w:ascii="Courier New" w:eastAsia="Times New Roman" w:hAnsi="Courier New" w:cs="Courier New"/>
-          <w:color w:val="BCBEC4"/>
-          <w:sz w:val="23"/>
-          <w:szCs w:val="23"/>
-          <w:lang w:eastAsia="en-IN"/>
-        </w:rPr>
-        <w:t>();</w:t>
-      </w:r>
-      <w:r>
-        <w:rPr>
-          <w:rFonts w:ascii="Courier New" w:eastAsia="Times New Roman" w:hAnsi="Courier New" w:cs="Courier New"/>
-          <w:color w:val="BCBEC4"/>
-          <w:sz w:val="23"/>
-          <w:szCs w:val="23"/>
-          <w:lang w:eastAsia="en-IN"/>
-        </w:rPr>
-        <w:br/>
-      </w:r>
-      <w:r>
-        <w:rPr>
-          <w:rFonts w:ascii="Courier New" w:eastAsia="Times New Roman" w:hAnsi="Courier New" w:cs="Courier New"/>
-          <w:color w:val="BCBEC4"/>
-          <w:sz w:val="23"/>
-          <w:szCs w:val="23"/>
-          <w:lang w:eastAsia="en-IN"/>
-        </w:rPr>
-        <w:br/>
-        <w:t xml:space="preserve">        </w:t>
-      </w:r>
-      <w:r>
-        <w:rPr>
-          <w:rFonts w:ascii="Courier New" w:eastAsia="Times New Roman" w:hAnsi="Courier New" w:cs="Courier New"/>
-          <w:color w:val="7A7E85"/>
-          <w:sz w:val="23"/>
-          <w:szCs w:val="23"/>
-          <w:lang w:eastAsia="en-IN"/>
-        </w:rPr>
-        <w:t>//Adding the screenshot in Report</w:t>
-      </w:r>
-      <w:r>
-        <w:rPr>
-          <w:rFonts w:ascii="Courier New" w:eastAsia="Times New Roman" w:hAnsi="Courier New" w:cs="Courier New"/>
-          <w:color w:val="7A7E85"/>
-          <w:sz w:val="23"/>
-          <w:szCs w:val="23"/>
-          <w:lang w:eastAsia="en-IN"/>
-        </w:rPr>
-        <w:br/>
-        <w:t xml:space="preserve">        </w:t>
-      </w:r>
-      <w:r>
-        <w:rPr>
-          <w:rFonts w:ascii="Courier New" w:eastAsia="Times New Roman" w:hAnsi="Courier New" w:cs="Courier New"/>
-          <w:color w:val="BCBEC4"/>
-          <w:sz w:val="23"/>
-          <w:szCs w:val="23"/>
-          <w:lang w:eastAsia="en-IN"/>
-        </w:rPr>
-        <w:t>test.log(</w:t>
-      </w:r>
-      <w:proofErr w:type="spellStart"/>
-      <w:r>
-        <w:rPr>
-          <w:rFonts w:ascii="Courier New" w:eastAsia="Times New Roman" w:hAnsi="Courier New" w:cs="Courier New"/>
-          <w:color w:val="BCBEC4"/>
-          <w:sz w:val="23"/>
-          <w:szCs w:val="23"/>
-          <w:lang w:eastAsia="en-IN"/>
-        </w:rPr>
-        <w:t>Status.</w:t>
+      <w:r>
+        <w:rPr>
+          <w:rFonts w:ascii="Courier New" w:eastAsia="Times New Roman" w:hAnsi="Courier New" w:cs="Courier New"/>
+          <w:color w:val="BCBEC4"/>
+          <w:sz w:val="23"/>
+          <w:szCs w:val="23"/>
+          <w:lang w:eastAsia="en-IN"/>
+        </w:rPr>
+        <w:t>test.log(Status.</w:t>
       </w:r>
       <w:r>
         <w:rPr>
@@ -9748,27 +8277,15 @@
         </w:rPr>
         <w:t>FAIL</w:t>
       </w:r>
-      <w:proofErr w:type="spellEnd"/>
-      <w:r>
-        <w:rPr>
-          <w:rFonts w:ascii="Courier New" w:eastAsia="Times New Roman" w:hAnsi="Courier New" w:cs="Courier New"/>
-          <w:color w:val="BCBEC4"/>
-          <w:sz w:val="23"/>
-          <w:szCs w:val="23"/>
-          <w:lang w:eastAsia="en-IN"/>
-        </w:rPr>
-        <w:t xml:space="preserve">, </w:t>
-      </w:r>
-      <w:proofErr w:type="spellStart"/>
-      <w:r>
-        <w:rPr>
-          <w:rFonts w:ascii="Courier New" w:eastAsia="Times New Roman" w:hAnsi="Courier New" w:cs="Courier New"/>
-          <w:color w:val="BCBEC4"/>
-          <w:sz w:val="23"/>
-          <w:szCs w:val="23"/>
-          <w:lang w:eastAsia="en-IN"/>
-        </w:rPr>
-        <w:t>MarkupHelper.</w:t>
+      <w:r>
+        <w:rPr>
+          <w:rFonts w:ascii="Courier New" w:eastAsia="Times New Roman" w:hAnsi="Courier New" w:cs="Courier New"/>
+          <w:color w:val="BCBEC4"/>
+          <w:sz w:val="23"/>
+          <w:szCs w:val="23"/>
+          <w:lang w:eastAsia="en-IN"/>
+        </w:rPr>
+        <w:t>, MarkupHelper.</w:t>
       </w:r>
       <w:r>
         <w:rPr>
@@ -9782,7 +8299,6 @@
         </w:rPr>
         <w:t>createLabel</w:t>
       </w:r>
-      <w:proofErr w:type="spellEnd"/>
       <w:r>
         <w:rPr>
           <w:rFonts w:ascii="Courier New" w:eastAsia="Times New Roman" w:hAnsi="Courier New" w:cs="Courier New"/>
@@ -9811,18 +8327,7 @@
           <w:szCs w:val="23"/>
           <w:lang w:eastAsia="en-IN"/>
         </w:rPr>
-        <w:t xml:space="preserve">, </w:t>
-      </w:r>
-      <w:proofErr w:type="spellStart"/>
-      <w:r>
-        <w:rPr>
-          <w:rFonts w:ascii="Courier New" w:eastAsia="Times New Roman" w:hAnsi="Courier New" w:cs="Courier New"/>
-          <w:color w:val="BCBEC4"/>
-          <w:sz w:val="23"/>
-          <w:szCs w:val="23"/>
-          <w:lang w:eastAsia="en-IN"/>
-        </w:rPr>
-        <w:t>ExtentColor.</w:t>
+        <w:t>, ExtentColor.</w:t>
       </w:r>
       <w:r>
         <w:rPr>
@@ -9836,7 +8341,6 @@
         </w:rPr>
         <w:t>RED</w:t>
       </w:r>
-      <w:proofErr w:type="spellEnd"/>
       <w:r>
         <w:rPr>
           <w:rFonts w:ascii="Courier New" w:eastAsia="Times New Roman" w:hAnsi="Courier New" w:cs="Courier New"/>
@@ -9846,6 +8350,110 @@
           <w:lang w:eastAsia="en-IN"/>
         </w:rPr>
         <w:t>));</w:t>
+      </w:r>
+      <w:r>
+        <w:rPr>
+          <w:rFonts w:ascii="Courier New" w:eastAsia="Times New Roman" w:hAnsi="Courier New" w:cs="Courier New"/>
+          <w:color w:val="BCBEC4"/>
+          <w:sz w:val="23"/>
+          <w:szCs w:val="23"/>
+          <w:lang w:eastAsia="en-IN"/>
+        </w:rPr>
+        <w:br/>
+        <w:t xml:space="preserve">        test.fail(</w:t>
+      </w:r>
+      <w:r>
+        <w:rPr>
+          <w:rFonts w:ascii="Courier New" w:eastAsia="Times New Roman" w:hAnsi="Courier New" w:cs="Courier New"/>
+          <w:color w:val="6AAB73"/>
+          <w:sz w:val="23"/>
+          <w:szCs w:val="23"/>
+          <w:lang w:eastAsia="en-IN"/>
+        </w:rPr>
+        <w:t>"Test Failed"</w:t>
+      </w:r>
+      <w:r>
+        <w:rPr>
+          <w:rFonts w:ascii="Courier New" w:eastAsia="Times New Roman" w:hAnsi="Courier New" w:cs="Courier New"/>
+          <w:color w:val="BCBEC4"/>
+          <w:sz w:val="23"/>
+          <w:szCs w:val="23"/>
+          <w:lang w:eastAsia="en-IN"/>
+        </w:rPr>
+        <w:t>, MediaEntityBuilder.</w:t>
+      </w:r>
+      <w:r>
+        <w:rPr>
+          <w:rFonts w:ascii="Courier New" w:eastAsia="Times New Roman" w:hAnsi="Courier New" w:cs="Courier New"/>
+          <w:i/>
+          <w:iCs/>
+          <w:color w:val="BCBEC4"/>
+          <w:sz w:val="23"/>
+          <w:szCs w:val="23"/>
+          <w:lang w:eastAsia="en-IN"/>
+        </w:rPr>
+        <w:t>createScreenCaptureFromPath</w:t>
+      </w:r>
+      <w:r>
+        <w:rPr>
+          <w:rFonts w:ascii="Courier New" w:eastAsia="Times New Roman" w:hAnsi="Courier New" w:cs="Courier New"/>
+          <w:color w:val="BCBEC4"/>
+          <w:sz w:val="23"/>
+          <w:szCs w:val="23"/>
+          <w:lang w:eastAsia="en-IN"/>
+        </w:rPr>
+        <w:t>(</w:t>
+      </w:r>
+      <w:r>
+        <w:rPr>
+          <w:rFonts w:ascii="Courier New" w:eastAsia="Times New Roman" w:hAnsi="Courier New" w:cs="Courier New"/>
+          <w:color w:val="6AAB73"/>
+          <w:sz w:val="23"/>
+          <w:szCs w:val="23"/>
+          <w:lang w:eastAsia="en-IN"/>
+        </w:rPr>
+        <w:t>"Trial.jpeg"</w:t>
+      </w:r>
+      <w:r>
+        <w:rPr>
+          <w:rFonts w:ascii="Courier New" w:eastAsia="Times New Roman" w:hAnsi="Courier New" w:cs="Courier New"/>
+          <w:color w:val="BCBEC4"/>
+          <w:sz w:val="23"/>
+          <w:szCs w:val="23"/>
+          <w:lang w:eastAsia="en-IN"/>
+        </w:rPr>
+        <w:t>).build());</w:t>
+      </w:r>
+      <w:r>
+        <w:rPr>
+          <w:rFonts w:ascii="Courier New" w:eastAsia="Times New Roman" w:hAnsi="Courier New" w:cs="Courier New"/>
+          <w:color w:val="BCBEC4"/>
+          <w:sz w:val="23"/>
+          <w:szCs w:val="23"/>
+          <w:lang w:eastAsia="en-IN"/>
+        </w:rPr>
+        <w:br/>
+      </w:r>
+      <w:r>
+        <w:rPr>
+          <w:rFonts w:ascii="Courier New" w:eastAsia="Times New Roman" w:hAnsi="Courier New" w:cs="Courier New"/>
+          <w:color w:val="BCBEC4"/>
+          <w:sz w:val="23"/>
+          <w:szCs w:val="23"/>
+          <w:lang w:eastAsia="en-IN"/>
+        </w:rPr>
+        <w:br/>
+      </w:r>
+      <w:r>
+        <w:rPr>
+          <w:rFonts w:ascii="Courier New" w:eastAsia="Times New Roman" w:hAnsi="Courier New" w:cs="Courier New"/>
+          <w:color w:val="BCBEC4"/>
+          <w:sz w:val="23"/>
+          <w:szCs w:val="23"/>
+          <w:lang w:eastAsia="en-IN"/>
+        </w:rPr>
+        <w:br/>
+        <w:t xml:space="preserve">        report.flush();</w:t>
       </w:r>
       <w:r>
         <w:rPr>
@@ -9858,154 +8466,6 @@
         <w:br/>
         <w:t xml:space="preserve">        </w:t>
       </w:r>
-      <w:proofErr w:type="spellStart"/>
-      <w:r>
-        <w:rPr>
-          <w:rFonts w:ascii="Courier New" w:eastAsia="Times New Roman" w:hAnsi="Courier New" w:cs="Courier New"/>
-          <w:color w:val="BCBEC4"/>
-          <w:sz w:val="23"/>
-          <w:szCs w:val="23"/>
-          <w:lang w:eastAsia="en-IN"/>
-        </w:rPr>
-        <w:t>test.fail</w:t>
-      </w:r>
-      <w:proofErr w:type="spellEnd"/>
-      <w:r>
-        <w:rPr>
-          <w:rFonts w:ascii="Courier New" w:eastAsia="Times New Roman" w:hAnsi="Courier New" w:cs="Courier New"/>
-          <w:color w:val="BCBEC4"/>
-          <w:sz w:val="23"/>
-          <w:szCs w:val="23"/>
-          <w:lang w:eastAsia="en-IN"/>
-        </w:rPr>
-        <w:t>(</w:t>
-      </w:r>
-      <w:r>
-        <w:rPr>
-          <w:rFonts w:ascii="Courier New" w:eastAsia="Times New Roman" w:hAnsi="Courier New" w:cs="Courier New"/>
-          <w:color w:val="6AAB73"/>
-          <w:sz w:val="23"/>
-          <w:szCs w:val="23"/>
-          <w:lang w:eastAsia="en-IN"/>
-        </w:rPr>
-        <w:t>"Test Failed"</w:t>
-      </w:r>
-      <w:r>
-        <w:rPr>
-          <w:rFonts w:ascii="Courier New" w:eastAsia="Times New Roman" w:hAnsi="Courier New" w:cs="Courier New"/>
-          <w:color w:val="BCBEC4"/>
-          <w:sz w:val="23"/>
-          <w:szCs w:val="23"/>
-          <w:lang w:eastAsia="en-IN"/>
-        </w:rPr>
-        <w:t>, MediaEntityBuilder.</w:t>
-      </w:r>
-      <w:r>
-        <w:rPr>
-          <w:rFonts w:ascii="Courier New" w:eastAsia="Times New Roman" w:hAnsi="Courier New" w:cs="Courier New"/>
-          <w:i/>
-          <w:iCs/>
-          <w:color w:val="BCBEC4"/>
-          <w:sz w:val="23"/>
-          <w:szCs w:val="23"/>
-          <w:lang w:eastAsia="en-IN"/>
-        </w:rPr>
-        <w:t>createScreenCaptureFromPath</w:t>
-      </w:r>
-      <w:r>
-        <w:rPr>
-          <w:rFonts w:ascii="Courier New" w:eastAsia="Times New Roman" w:hAnsi="Courier New" w:cs="Courier New"/>
-          <w:color w:val="BCBEC4"/>
-          <w:sz w:val="23"/>
-          <w:szCs w:val="23"/>
-          <w:lang w:eastAsia="en-IN"/>
-        </w:rPr>
-        <w:t>(</w:t>
-      </w:r>
-      <w:r>
-        <w:rPr>
-          <w:rFonts w:ascii="Courier New" w:eastAsia="Times New Roman" w:hAnsi="Courier New" w:cs="Courier New"/>
-          <w:color w:val="6AAB73"/>
-          <w:sz w:val="23"/>
-          <w:szCs w:val="23"/>
-          <w:lang w:eastAsia="en-IN"/>
-        </w:rPr>
-        <w:t>"Trial.jpeg"</w:t>
-      </w:r>
-      <w:r>
-        <w:rPr>
-          <w:rFonts w:ascii="Courier New" w:eastAsia="Times New Roman" w:hAnsi="Courier New" w:cs="Courier New"/>
-          <w:color w:val="BCBEC4"/>
-          <w:sz w:val="23"/>
-          <w:szCs w:val="23"/>
-          <w:lang w:eastAsia="en-IN"/>
-        </w:rPr>
-        <w:t>).build());</w:t>
-      </w:r>
-      <w:r>
-        <w:rPr>
-          <w:rFonts w:ascii="Courier New" w:eastAsia="Times New Roman" w:hAnsi="Courier New" w:cs="Courier New"/>
-          <w:color w:val="BCBEC4"/>
-          <w:sz w:val="23"/>
-          <w:szCs w:val="23"/>
-          <w:lang w:eastAsia="en-IN"/>
-        </w:rPr>
-        <w:br/>
-      </w:r>
-      <w:r>
-        <w:rPr>
-          <w:rFonts w:ascii="Courier New" w:eastAsia="Times New Roman" w:hAnsi="Courier New" w:cs="Courier New"/>
-          <w:color w:val="BCBEC4"/>
-          <w:sz w:val="23"/>
-          <w:szCs w:val="23"/>
-          <w:lang w:eastAsia="en-IN"/>
-        </w:rPr>
-        <w:br/>
-      </w:r>
-      <w:r>
-        <w:rPr>
-          <w:rFonts w:ascii="Courier New" w:eastAsia="Times New Roman" w:hAnsi="Courier New" w:cs="Courier New"/>
-          <w:color w:val="BCBEC4"/>
-          <w:sz w:val="23"/>
-          <w:szCs w:val="23"/>
-          <w:lang w:eastAsia="en-IN"/>
-        </w:rPr>
-        <w:br/>
-        <w:t xml:space="preserve">        </w:t>
-      </w:r>
-      <w:proofErr w:type="spellStart"/>
-      <w:r>
-        <w:rPr>
-          <w:rFonts w:ascii="Courier New" w:eastAsia="Times New Roman" w:hAnsi="Courier New" w:cs="Courier New"/>
-          <w:color w:val="BCBEC4"/>
-          <w:sz w:val="23"/>
-          <w:szCs w:val="23"/>
-          <w:lang w:eastAsia="en-IN"/>
-        </w:rPr>
-        <w:t>report.flush</w:t>
-      </w:r>
-      <w:proofErr w:type="spellEnd"/>
-      <w:r>
-        <w:rPr>
-          <w:rFonts w:ascii="Courier New" w:eastAsia="Times New Roman" w:hAnsi="Courier New" w:cs="Courier New"/>
-          <w:color w:val="BCBEC4"/>
-          <w:sz w:val="23"/>
-          <w:szCs w:val="23"/>
-          <w:lang w:eastAsia="en-IN"/>
-        </w:rPr>
-        <w:t>();</w:t>
-      </w:r>
-      <w:r>
-        <w:rPr>
-          <w:rFonts w:ascii="Courier New" w:eastAsia="Times New Roman" w:hAnsi="Courier New" w:cs="Courier New"/>
-          <w:color w:val="BCBEC4"/>
-          <w:sz w:val="23"/>
-          <w:szCs w:val="23"/>
-          <w:lang w:eastAsia="en-IN"/>
-        </w:rPr>
-        <w:br/>
-        <w:t xml:space="preserve">        </w:t>
-      </w:r>
       <w:r>
         <w:rPr>
           <w:rFonts w:ascii="Courier New" w:eastAsia="Times New Roman" w:hAnsi="Courier New" w:cs="Courier New"/>
@@ -10048,6 +8508,247 @@
         <w:br/>
         <w:t>}</w:t>
       </w:r>
+    </w:p>
+    <w:p>
+      <w:pPr>
+        <w:rPr>
+          <w:sz w:val="24"/>
+          <w:szCs w:val="22"/>
+          <w:lang w:val="en-US"/>
+        </w:rPr>
+      </w:pPr>
+    </w:p>
+    <w:p>
+      <w:pPr>
+        <w:rPr>
+          <w:sz w:val="24"/>
+          <w:szCs w:val="22"/>
+          <w:lang w:val="en-US"/>
+        </w:rPr>
+      </w:pPr>
+    </w:p>
+    <w:p>
+      <w:pPr>
+        <w:rPr>
+          <w:sz w:val="24"/>
+          <w:szCs w:val="22"/>
+          <w:lang w:val="en-US"/>
+        </w:rPr>
+      </w:pPr>
+    </w:p>
+    <w:p>
+      <w:pPr>
+        <w:rPr>
+          <w:sz w:val="24"/>
+          <w:szCs w:val="22"/>
+          <w:lang w:val="en-US"/>
+        </w:rPr>
+      </w:pPr>
+      <w:r>
+        <w:rPr>
+          <w:sz w:val="24"/>
+          <w:szCs w:val="22"/>
+          <w:lang w:val="en-US"/>
+        </w:rPr>
+        <w:t>dd - day 13</w:t>
+      </w:r>
+    </w:p>
+    <w:p>
+      <w:pPr>
+        <w:rPr>
+          <w:sz w:val="24"/>
+          <w:szCs w:val="22"/>
+          <w:lang w:val="en-US"/>
+        </w:rPr>
+      </w:pPr>
+      <w:r>
+        <w:rPr>
+          <w:sz w:val="24"/>
+          <w:szCs w:val="22"/>
+          <w:lang w:val="en-US"/>
+        </w:rPr>
+        <w:lastRenderedPageBreak/>
+        <w:t>mm - minutes</w:t>
+      </w:r>
+    </w:p>
+    <w:p>
+      <w:pPr>
+        <w:rPr>
+          <w:sz w:val="24"/>
+          <w:szCs w:val="22"/>
+          <w:lang w:val="en-US"/>
+        </w:rPr>
+      </w:pPr>
+      <w:r>
+        <w:rPr>
+          <w:sz w:val="24"/>
+          <w:szCs w:val="22"/>
+          <w:lang w:val="en-US"/>
+        </w:rPr>
+        <w:t>MM - month - 03</w:t>
+      </w:r>
+    </w:p>
+    <w:p>
+      <w:pPr>
+        <w:rPr>
+          <w:sz w:val="24"/>
+          <w:szCs w:val="22"/>
+          <w:lang w:val="en-US"/>
+        </w:rPr>
+      </w:pPr>
+      <w:r>
+        <w:rPr>
+          <w:sz w:val="24"/>
+          <w:szCs w:val="22"/>
+          <w:lang w:val="en-US"/>
+        </w:rPr>
+        <w:t>MMM - Month - Mar</w:t>
+      </w:r>
+    </w:p>
+    <w:p>
+      <w:pPr>
+        <w:rPr>
+          <w:sz w:val="24"/>
+          <w:szCs w:val="22"/>
+          <w:lang w:val="en-US"/>
+        </w:rPr>
+      </w:pPr>
+      <w:r>
+        <w:rPr>
+          <w:sz w:val="24"/>
+          <w:szCs w:val="22"/>
+          <w:lang w:val="en-US"/>
+        </w:rPr>
+        <w:t>MMMM - month - March</w:t>
+      </w:r>
+    </w:p>
+    <w:p>
+      <w:pPr>
+        <w:rPr>
+          <w:sz w:val="24"/>
+          <w:szCs w:val="22"/>
+          <w:lang w:val="en-US"/>
+        </w:rPr>
+      </w:pPr>
+      <w:r>
+        <w:rPr>
+          <w:sz w:val="24"/>
+          <w:szCs w:val="22"/>
+          <w:lang w:val="en-US"/>
+        </w:rPr>
+        <w:t>yy - year 26</w:t>
+      </w:r>
+    </w:p>
+    <w:p>
+      <w:pPr>
+        <w:rPr>
+          <w:sz w:val="24"/>
+          <w:szCs w:val="22"/>
+          <w:lang w:val="en-US"/>
+        </w:rPr>
+      </w:pPr>
+      <w:r>
+        <w:rPr>
+          <w:sz w:val="24"/>
+          <w:szCs w:val="22"/>
+          <w:lang w:val="en-US"/>
+        </w:rPr>
+        <w:t>yyy/ yyyy - year - 2026</w:t>
+      </w:r>
+    </w:p>
+    <w:p>
+      <w:pPr>
+        <w:rPr>
+          <w:sz w:val="24"/>
+          <w:szCs w:val="22"/>
+          <w:lang w:val="en-US"/>
+        </w:rPr>
+      </w:pPr>
+      <w:r>
+        <w:rPr>
+          <w:sz w:val="24"/>
+          <w:szCs w:val="22"/>
+          <w:lang w:val="en-US"/>
+        </w:rPr>
+        <w:t>EEE - DOW - Fri</w:t>
+      </w:r>
+    </w:p>
+    <w:p>
+      <w:pPr>
+        <w:rPr>
+          <w:sz w:val="24"/>
+          <w:szCs w:val="22"/>
+          <w:lang w:val="en-US"/>
+        </w:rPr>
+      </w:pPr>
+      <w:r>
+        <w:rPr>
+          <w:sz w:val="24"/>
+          <w:szCs w:val="22"/>
+          <w:lang w:val="en-US"/>
+        </w:rPr>
+        <w:t>EEEE - DOW - Friday</w:t>
+      </w:r>
+    </w:p>
+    <w:p>
+      <w:pPr>
+        <w:rPr>
+          <w:sz w:val="24"/>
+          <w:szCs w:val="22"/>
+          <w:lang w:val="en-US"/>
+        </w:rPr>
+      </w:pPr>
+      <w:r>
+        <w:rPr>
+          <w:sz w:val="24"/>
+          <w:szCs w:val="22"/>
+          <w:lang w:val="en-US"/>
+        </w:rPr>
+        <w:t>hh - hours</w:t>
+      </w:r>
+    </w:p>
+    <w:p>
+      <w:pPr>
+        <w:rPr>
+          <w:sz w:val="24"/>
+          <w:szCs w:val="22"/>
+          <w:lang w:val="en-US"/>
+        </w:rPr>
+      </w:pPr>
+      <w:r>
+        <w:rPr>
+          <w:sz w:val="24"/>
+          <w:szCs w:val="22"/>
+          <w:lang w:val="en-US"/>
+        </w:rPr>
+        <w:t>a - AM / PM</w:t>
+      </w:r>
+    </w:p>
+    <w:p>
+      <w:pPr>
+        <w:rPr>
+          <w:sz w:val="24"/>
+          <w:szCs w:val="22"/>
+          <w:lang w:val="en-US"/>
+        </w:rPr>
+      </w:pPr>
+      <w:r>
+        <w:rPr>
+          <w:sz w:val="24"/>
+          <w:szCs w:val="22"/>
+          <w:lang w:val="en-US"/>
+        </w:rPr>
+        <w:t>zzz - Time zone (IST)</w:t>
+      </w:r>
+    </w:p>
+    <w:p>
+      <w:pPr>
+        <w:rPr>
+          <w:sz w:val="24"/>
+          <w:szCs w:val="22"/>
+          <w:lang w:val="en-US"/>
+        </w:rPr>
+      </w:pPr>
     </w:p>
     <w:p>
       <w:pPr>

</xml_diff>

<commit_message>
Date: 14 Mar 2026
</commit_message>
<xml_diff>
--- a/Selenium_Notes.docx
+++ b/Selenium_Notes.docx
@@ -3032,6 +3032,120 @@
     </w:p>
     <w:p>
       <w:pPr>
+        <w:pStyle w:val="ListParagraph"/>
+        <w:numPr>
+          <w:ilvl w:val="0"/>
+          <w:numId w:val="13"/>
+        </w:numPr>
+        <w:rPr>
+          <w:sz w:val="24"/>
+          <w:szCs w:val="22"/>
+          <w:lang w:val="en-US"/>
+        </w:rPr>
+      </w:pPr>
+      <w:r>
+        <w:rPr>
+          <w:sz w:val="24"/>
+          <w:szCs w:val="22"/>
+          <w:lang w:val="en-US"/>
+        </w:rPr>
+        <w:t xml:space="preserve">findElements() </w:t>
+      </w:r>
+      <w:r>
+        <w:rPr>
+          <w:sz w:val="24"/>
+          <w:szCs w:val="22"/>
+          <w:lang w:val="en-US"/>
+        </w:rPr>
+        <w:sym w:font="Wingdings" w:char="F0E0"/>
+      </w:r>
+      <w:r>
+        <w:rPr>
+          <w:sz w:val="24"/>
+          <w:szCs w:val="22"/>
+          <w:lang w:val="en-US"/>
+        </w:rPr>
+        <w:t xml:space="preserve"> Will search and return multiple controls (List&lt;WebElement&gt;)</w:t>
+      </w:r>
+    </w:p>
+    <w:p>
+      <w:pPr>
+        <w:pStyle w:val="ListParagraph"/>
+        <w:numPr>
+          <w:ilvl w:val="0"/>
+          <w:numId w:val="13"/>
+        </w:numPr>
+        <w:rPr>
+          <w:sz w:val="24"/>
+          <w:szCs w:val="22"/>
+          <w:lang w:val="en-US"/>
+        </w:rPr>
+      </w:pPr>
+      <w:r>
+        <w:rPr>
+          <w:sz w:val="24"/>
+          <w:szCs w:val="22"/>
+          <w:lang w:val="en-US"/>
+        </w:rPr>
+        <w:t xml:space="preserve">getWindowHandles() </w:t>
+      </w:r>
+      <w:r>
+        <w:rPr>
+          <w:sz w:val="24"/>
+          <w:szCs w:val="22"/>
+          <w:lang w:val="en-US"/>
+        </w:rPr>
+        <w:sym w:font="Wingdings" w:char="F0E0"/>
+      </w:r>
+      <w:r>
+        <w:rPr>
+          <w:sz w:val="24"/>
+          <w:szCs w:val="22"/>
+          <w:lang w:val="en-US"/>
+        </w:rPr>
+        <w:t xml:space="preserve"> Will return the ids of all the windows those are opened by WebDriver. (Set&lt;String&gt;)</w:t>
+      </w:r>
+    </w:p>
+    <w:p>
+      <w:pPr>
+        <w:pStyle w:val="ListParagraph"/>
+        <w:numPr>
+          <w:ilvl w:val="0"/>
+          <w:numId w:val="13"/>
+        </w:numPr>
+        <w:rPr>
+          <w:sz w:val="24"/>
+          <w:szCs w:val="22"/>
+          <w:lang w:val="en-US"/>
+        </w:rPr>
+      </w:pPr>
+      <w:r>
+        <w:rPr>
+          <w:sz w:val="24"/>
+          <w:szCs w:val="22"/>
+          <w:lang w:val="en-US"/>
+        </w:rPr>
+        <w:t xml:space="preserve">quit() </w:t>
+      </w:r>
+      <w:r>
+        <w:rPr>
+          <w:sz w:val="24"/>
+          <w:szCs w:val="22"/>
+          <w:lang w:val="en-US"/>
+        </w:rPr>
+        <w:sym w:font="Wingdings" w:char="F0E0"/>
+      </w:r>
+      <w:r>
+        <w:rPr>
+          <w:sz w:val="24"/>
+          <w:szCs w:val="22"/>
+          <w:lang w:val="en-US"/>
+        </w:rPr>
+        <w:t xml:space="preserve"> will close all the browser windows those are opened by current WebDriver object.</w:t>
+      </w:r>
+    </w:p>
+    <w:p>
+      <w:pPr>
         <w:rPr>
           <w:sz w:val="24"/>
           <w:szCs w:val="22"/>
@@ -3350,6 +3464,52 @@
     </w:p>
     <w:p>
       <w:pPr>
+        <w:pStyle w:val="ListParagraph"/>
+        <w:numPr>
+          <w:ilvl w:val="0"/>
+          <w:numId w:val="15"/>
+        </w:numPr>
+        <w:rPr>
+          <w:sz w:val="24"/>
+          <w:szCs w:val="22"/>
+          <w:lang w:val="en-US"/>
+        </w:rPr>
+      </w:pPr>
+      <w:r>
+        <w:rPr>
+          <w:sz w:val="24"/>
+          <w:szCs w:val="22"/>
+          <w:lang w:val="en-US"/>
+        </w:rPr>
+        <w:t>NoAlertPresentException</w:t>
+      </w:r>
+      <w:r>
+        <w:rPr>
+          <w:sz w:val="24"/>
+          <w:szCs w:val="22"/>
+          <w:lang w:val="en-US"/>
+        </w:rPr>
+        <w:t xml:space="preserve"> </w:t>
+      </w:r>
+      <w:r>
+        <w:rPr>
+          <w:sz w:val="24"/>
+          <w:szCs w:val="22"/>
+          <w:lang w:val="en-US"/>
+        </w:rPr>
+        <w:sym w:font="Wingdings" w:char="F0E0"/>
+      </w:r>
+      <w:r>
+        <w:rPr>
+          <w:sz w:val="24"/>
+          <w:szCs w:val="22"/>
+          <w:lang w:val="en-US"/>
+        </w:rPr>
+        <w:t xml:space="preserve"> You are trying to handle an alert but there is no alert present on the page.</w:t>
+      </w:r>
+    </w:p>
+    <w:p>
+      <w:pPr>
         <w:rPr>
           <w:sz w:val="24"/>
           <w:szCs w:val="22"/>
@@ -3485,6 +3645,7 @@
           <w:szCs w:val="22"/>
           <w:lang w:val="en-US"/>
         </w:rPr>
+        <w:lastRenderedPageBreak/>
         <w:t xml:space="preserve">sendKeys() </w:t>
       </w:r>
       <w:r>
@@ -3691,7 +3852,6 @@
           <w:szCs w:val="22"/>
           <w:lang w:val="en-US"/>
         </w:rPr>
-        <w:lastRenderedPageBreak/>
         <w:t xml:space="preserve">isEnabled() </w:t>
       </w:r>
       <w:r>
@@ -3747,6 +3907,62 @@
           <w:lang w:val="en-US"/>
         </w:rPr>
         <w:t xml:space="preserve"> Will check that whether the control is visible or not (boolean)</w:t>
+      </w:r>
+    </w:p>
+    <w:p>
+      <w:pPr>
+        <w:pStyle w:val="ListParagraph"/>
+        <w:numPr>
+          <w:ilvl w:val="1"/>
+          <w:numId w:val="16"/>
+        </w:numPr>
+        <w:rPr>
+          <w:sz w:val="24"/>
+          <w:szCs w:val="22"/>
+          <w:lang w:val="en-US"/>
+        </w:rPr>
+      </w:pPr>
+      <w:r>
+        <w:rPr>
+          <w:sz w:val="24"/>
+          <w:szCs w:val="22"/>
+          <w:lang w:val="en-US"/>
+        </w:rPr>
+        <w:t xml:space="preserve">clear() </w:t>
+      </w:r>
+      <w:r>
+        <w:rPr>
+          <w:sz w:val="24"/>
+          <w:szCs w:val="22"/>
+          <w:lang w:val="en-US"/>
+        </w:rPr>
+        <w:sym w:font="Wingdings" w:char="F0E0"/>
+      </w:r>
+      <w:r>
+        <w:rPr>
+          <w:sz w:val="24"/>
+          <w:szCs w:val="22"/>
+          <w:lang w:val="en-US"/>
+        </w:rPr>
+        <w:t xml:space="preserve"> Will clear the</w:t>
+      </w:r>
+      <w:r>
+        <w:rPr>
+          <w:sz w:val="24"/>
+          <w:szCs w:val="22"/>
+          <w:lang w:val="en-US"/>
+        </w:rPr>
+        <w:t xml:space="preserve"> existing</w:t>
+      </w:r>
+      <w:bookmarkStart w:id="0" w:name="_GoBack"/>
+      <w:bookmarkEnd w:id="0"/>
+      <w:r>
+        <w:rPr>
+          <w:sz w:val="24"/>
+          <w:szCs w:val="22"/>
+          <w:lang w:val="en-US"/>
+        </w:rPr>
+        <w:t xml:space="preserve"> text form text box</w:t>
       </w:r>
     </w:p>
     <w:p>
@@ -4044,6 +4260,7 @@
           <w:szCs w:val="22"/>
           <w:lang w:val="en-US"/>
         </w:rPr>
+        <w:lastRenderedPageBreak/>
         <w:t>TagName</w:t>
       </w:r>
     </w:p>
@@ -4166,7 +4383,6 @@
           <w:szCs w:val="22"/>
           <w:lang w:val="en-US"/>
         </w:rPr>
-        <w:lastRenderedPageBreak/>
         <w:t>Locator: CssSelector</w:t>
       </w:r>
     </w:p>
@@ -4850,6 +5066,7 @@
           <w:szCs w:val="22"/>
           <w:lang w:val="en-US"/>
         </w:rPr>
+        <w:lastRenderedPageBreak/>
         <w:t xml:space="preserve">If any control is having &lt;select&gt; tag, then such a control is treated as Dropdown list / list box by selenium. </w:t>
       </w:r>
     </w:p>
@@ -5042,7 +5259,6 @@
           <w:szCs w:val="22"/>
           <w:lang w:val="en-US"/>
         </w:rPr>
-        <w:lastRenderedPageBreak/>
         <w:t xml:space="preserve">selectByContainsVisibleText() </w:t>
       </w:r>
       <w:r>
@@ -5773,6 +5989,7 @@
           <w:szCs w:val="22"/>
           <w:lang w:val="en-US"/>
         </w:rPr>
+        <w:lastRenderedPageBreak/>
         <w:t>We can handle some specific condition for wait (ElementToBeClickable, AlertToPresent, VisibilityOfElementLocateBy)</w:t>
       </w:r>
     </w:p>
@@ -5971,7 +6188,6 @@
           <w:szCs w:val="22"/>
           <w:lang w:val="en-US"/>
         </w:rPr>
-        <w:lastRenderedPageBreak/>
         <w:t xml:space="preserve">if the page is not getting loaded within 30 seconds, Selenium will throw </w:t>
       </w:r>
       <w:r>
@@ -6019,31 +6235,541 @@
     <w:p>
       <w:pPr>
         <w:rPr>
-          <w:sz w:val="24"/>
-          <w:szCs w:val="22"/>
-          <w:lang w:val="en-US"/>
-        </w:rPr>
-      </w:pPr>
-    </w:p>
-    <w:p>
-      <w:pPr>
-        <w:rPr>
-          <w:sz w:val="24"/>
-          <w:szCs w:val="22"/>
-          <w:lang w:val="en-US"/>
-        </w:rPr>
-      </w:pPr>
-      <w:r>
-        <w:rPr>
-          <w:sz w:val="24"/>
-          <w:szCs w:val="22"/>
-          <w:lang w:val="en-US"/>
-        </w:rPr>
-        <w:br w:type="page"/>
-      </w:r>
-    </w:p>
-    <w:p>
-      <w:pPr>
+          <w:b/>
+          <w:bCs/>
+          <w:sz w:val="24"/>
+          <w:szCs w:val="22"/>
+          <w:lang w:val="en-US"/>
+        </w:rPr>
+      </w:pPr>
+      <w:r>
+        <w:rPr>
+          <w:b/>
+          <w:bCs/>
+          <w:sz w:val="24"/>
+          <w:szCs w:val="22"/>
+          <w:lang w:val="en-US"/>
+        </w:rPr>
+        <w:t>Handling Alerts</w:t>
+      </w:r>
+    </w:p>
+    <w:p>
+      <w:pPr>
+        <w:rPr>
+          <w:sz w:val="24"/>
+          <w:szCs w:val="22"/>
+          <w:lang w:val="en-US"/>
+        </w:rPr>
+      </w:pPr>
+      <w:r>
+        <w:rPr>
+          <w:sz w:val="24"/>
+          <w:szCs w:val="22"/>
+          <w:lang w:val="en-US"/>
+        </w:rPr>
+        <w:t xml:space="preserve">Alert is </w:t>
+      </w:r>
+      <w:r>
+        <w:rPr>
+          <w:sz w:val="24"/>
+          <w:szCs w:val="22"/>
+          <w:lang w:val="en-US"/>
+        </w:rPr>
+        <w:t>kind of pop up that is</w:t>
+      </w:r>
+    </w:p>
+    <w:p>
+      <w:pPr>
+        <w:pStyle w:val="ListParagraph"/>
+        <w:numPr>
+          <w:ilvl w:val="0"/>
+          <w:numId w:val="23"/>
+        </w:numPr>
+        <w:rPr>
+          <w:sz w:val="24"/>
+          <w:szCs w:val="22"/>
+          <w:lang w:val="en-US"/>
+        </w:rPr>
+      </w:pPr>
+      <w:r>
+        <w:rPr>
+          <w:sz w:val="24"/>
+          <w:szCs w:val="22"/>
+          <w:lang w:val="en-US"/>
+        </w:rPr>
+        <w:t>Normally displayed on top center of browser</w:t>
+      </w:r>
+    </w:p>
+    <w:p>
+      <w:pPr>
+        <w:pStyle w:val="ListParagraph"/>
+        <w:numPr>
+          <w:ilvl w:val="0"/>
+          <w:numId w:val="23"/>
+        </w:numPr>
+        <w:rPr>
+          <w:sz w:val="24"/>
+          <w:szCs w:val="22"/>
+          <w:lang w:val="en-US"/>
+        </w:rPr>
+      </w:pPr>
+      <w:r>
+        <w:rPr>
+          <w:sz w:val="24"/>
+          <w:szCs w:val="22"/>
+          <w:lang w:val="en-US"/>
+        </w:rPr>
+        <w:t>Don’t have (x) close button</w:t>
+      </w:r>
+    </w:p>
+    <w:p>
+      <w:pPr>
+        <w:pStyle w:val="ListParagraph"/>
+        <w:numPr>
+          <w:ilvl w:val="0"/>
+          <w:numId w:val="23"/>
+        </w:numPr>
+        <w:rPr>
+          <w:sz w:val="24"/>
+          <w:szCs w:val="22"/>
+          <w:lang w:val="en-US"/>
+        </w:rPr>
+      </w:pPr>
+      <w:r>
+        <w:rPr>
+          <w:sz w:val="24"/>
+          <w:szCs w:val="22"/>
+          <w:lang w:val="en-US"/>
+        </w:rPr>
+        <w:t>You cannot inspect anything on this</w:t>
+      </w:r>
+    </w:p>
+    <w:p>
+      <w:pPr>
+        <w:pStyle w:val="ListParagraph"/>
+        <w:numPr>
+          <w:ilvl w:val="0"/>
+          <w:numId w:val="23"/>
+        </w:numPr>
+        <w:rPr>
+          <w:sz w:val="24"/>
+          <w:szCs w:val="22"/>
+          <w:lang w:val="en-US"/>
+        </w:rPr>
+      </w:pPr>
+      <w:r>
+        <w:rPr>
+          <w:sz w:val="24"/>
+          <w:szCs w:val="22"/>
+          <w:lang w:val="en-US"/>
+        </w:rPr>
+        <w:t>If alert is present, you cannot perform any action on the page</w:t>
+      </w:r>
+    </w:p>
+    <w:p>
+      <w:pPr>
+        <w:rPr>
+          <w:sz w:val="24"/>
+          <w:szCs w:val="22"/>
+          <w:lang w:val="en-US"/>
+        </w:rPr>
+      </w:pPr>
+      <w:r>
+        <w:rPr>
+          <w:sz w:val="24"/>
+          <w:szCs w:val="22"/>
+          <w:lang w:val="en-US"/>
+        </w:rPr>
+        <w:t>Types of alert</w:t>
+      </w:r>
+    </w:p>
+    <w:p>
+      <w:pPr>
+        <w:pStyle w:val="ListParagraph"/>
+        <w:numPr>
+          <w:ilvl w:val="0"/>
+          <w:numId w:val="24"/>
+        </w:numPr>
+        <w:rPr>
+          <w:sz w:val="24"/>
+          <w:szCs w:val="22"/>
+          <w:lang w:val="en-US"/>
+        </w:rPr>
+      </w:pPr>
+      <w:r>
+        <w:rPr>
+          <w:sz w:val="24"/>
+          <w:szCs w:val="22"/>
+          <w:lang w:val="en-US"/>
+        </w:rPr>
+        <w:t>Normal alert (Only having Ok button)</w:t>
+      </w:r>
+    </w:p>
+    <w:p>
+      <w:pPr>
+        <w:pStyle w:val="ListParagraph"/>
+        <w:numPr>
+          <w:ilvl w:val="0"/>
+          <w:numId w:val="24"/>
+        </w:numPr>
+        <w:rPr>
+          <w:sz w:val="24"/>
+          <w:szCs w:val="22"/>
+          <w:lang w:val="en-US"/>
+        </w:rPr>
+      </w:pPr>
+      <w:r>
+        <w:rPr>
+          <w:sz w:val="24"/>
+          <w:szCs w:val="22"/>
+          <w:lang w:val="en-US"/>
+        </w:rPr>
+        <w:t>Confirmation alert (Having Ok and Cancel button)</w:t>
+      </w:r>
+    </w:p>
+    <w:p>
+      <w:pPr>
+        <w:pStyle w:val="ListParagraph"/>
+        <w:numPr>
+          <w:ilvl w:val="0"/>
+          <w:numId w:val="24"/>
+        </w:numPr>
+        <w:rPr>
+          <w:sz w:val="24"/>
+          <w:szCs w:val="22"/>
+          <w:lang w:val="en-US"/>
+        </w:rPr>
+      </w:pPr>
+      <w:r>
+        <w:rPr>
+          <w:sz w:val="24"/>
+          <w:szCs w:val="22"/>
+          <w:lang w:val="en-US"/>
+        </w:rPr>
+        <w:t>Prompt box (Allows to enter some text on alert)</w:t>
+      </w:r>
+    </w:p>
+    <w:p>
+      <w:pPr>
+        <w:rPr>
+          <w:b/>
+          <w:bCs/>
+          <w:sz w:val="24"/>
+          <w:szCs w:val="22"/>
+          <w:lang w:val="en-US"/>
+        </w:rPr>
+      </w:pPr>
+      <w:r>
+        <w:rPr>
+          <w:sz w:val="24"/>
+          <w:szCs w:val="22"/>
+          <w:lang w:val="en-US"/>
+        </w:rPr>
+        <w:t xml:space="preserve">Selenium has provided a special interface to handle such alert ie. </w:t>
+      </w:r>
+      <w:r>
+        <w:rPr>
+          <w:b/>
+          <w:bCs/>
+          <w:sz w:val="24"/>
+          <w:szCs w:val="22"/>
+          <w:lang w:val="en-US"/>
+        </w:rPr>
+        <w:t>Alert</w:t>
+      </w:r>
+    </w:p>
+    <w:p>
+      <w:pPr>
+        <w:rPr>
+          <w:b/>
+          <w:bCs/>
+          <w:sz w:val="24"/>
+          <w:szCs w:val="22"/>
+          <w:lang w:val="en-US"/>
+        </w:rPr>
+      </w:pPr>
+      <w:r>
+        <w:rPr>
+          <w:b/>
+          <w:bCs/>
+          <w:sz w:val="24"/>
+          <w:szCs w:val="22"/>
+          <w:lang w:val="en-US"/>
+        </w:rPr>
+        <w:t>Methods of Alert interface</w:t>
+      </w:r>
+    </w:p>
+    <w:p>
+      <w:pPr>
+        <w:pStyle w:val="ListParagraph"/>
+        <w:numPr>
+          <w:ilvl w:val="0"/>
+          <w:numId w:val="25"/>
+        </w:numPr>
+        <w:rPr>
+          <w:sz w:val="24"/>
+          <w:szCs w:val="22"/>
+          <w:lang w:val="en-US"/>
+        </w:rPr>
+      </w:pPr>
+      <w:r>
+        <w:rPr>
+          <w:sz w:val="24"/>
+          <w:szCs w:val="22"/>
+          <w:lang w:val="en-US"/>
+        </w:rPr>
+        <w:t xml:space="preserve">driver.switchTo().alert() </w:t>
+      </w:r>
+      <w:r>
+        <w:rPr>
+          <w:sz w:val="24"/>
+          <w:szCs w:val="22"/>
+          <w:lang w:val="en-US"/>
+        </w:rPr>
+        <w:sym w:font="Wingdings" w:char="F0E0"/>
+      </w:r>
+      <w:r>
+        <w:rPr>
+          <w:sz w:val="24"/>
+          <w:szCs w:val="22"/>
+          <w:lang w:val="en-US"/>
+        </w:rPr>
+        <w:t xml:space="preserve"> Will switch to the alert</w:t>
+      </w:r>
+    </w:p>
+    <w:p>
+      <w:pPr>
+        <w:pStyle w:val="ListParagraph"/>
+        <w:numPr>
+          <w:ilvl w:val="0"/>
+          <w:numId w:val="25"/>
+        </w:numPr>
+        <w:rPr>
+          <w:sz w:val="24"/>
+          <w:szCs w:val="22"/>
+          <w:lang w:val="en-US"/>
+        </w:rPr>
+      </w:pPr>
+      <w:r>
+        <w:rPr>
+          <w:sz w:val="24"/>
+          <w:szCs w:val="22"/>
+          <w:lang w:val="en-US"/>
+        </w:rPr>
+        <w:t xml:space="preserve">getText() </w:t>
+      </w:r>
+      <w:r>
+        <w:rPr>
+          <w:sz w:val="24"/>
+          <w:szCs w:val="22"/>
+          <w:lang w:val="en-US"/>
+        </w:rPr>
+        <w:sym w:font="Wingdings" w:char="F0E0"/>
+      </w:r>
+      <w:r>
+        <w:rPr>
+          <w:sz w:val="24"/>
+          <w:szCs w:val="22"/>
+          <w:lang w:val="en-US"/>
+        </w:rPr>
+        <w:t xml:space="preserve"> Will return the text on alert. (String)</w:t>
+      </w:r>
+    </w:p>
+    <w:p>
+      <w:pPr>
+        <w:pStyle w:val="ListParagraph"/>
+        <w:numPr>
+          <w:ilvl w:val="0"/>
+          <w:numId w:val="25"/>
+        </w:numPr>
+        <w:rPr>
+          <w:sz w:val="24"/>
+          <w:szCs w:val="22"/>
+          <w:lang w:val="en-US"/>
+        </w:rPr>
+      </w:pPr>
+      <w:r>
+        <w:rPr>
+          <w:sz w:val="24"/>
+          <w:szCs w:val="22"/>
+          <w:lang w:val="en-US"/>
+        </w:rPr>
+        <w:t xml:space="preserve">accept() </w:t>
+      </w:r>
+      <w:r>
+        <w:rPr>
+          <w:sz w:val="24"/>
+          <w:szCs w:val="22"/>
+          <w:lang w:val="en-US"/>
+        </w:rPr>
+        <w:sym w:font="Wingdings" w:char="F0E0"/>
+      </w:r>
+      <w:r>
+        <w:rPr>
+          <w:sz w:val="24"/>
+          <w:szCs w:val="22"/>
+          <w:lang w:val="en-US"/>
+        </w:rPr>
+        <w:t xml:space="preserve"> Will click on Ok button</w:t>
+      </w:r>
+    </w:p>
+    <w:p>
+      <w:pPr>
+        <w:pStyle w:val="ListParagraph"/>
+        <w:numPr>
+          <w:ilvl w:val="0"/>
+          <w:numId w:val="25"/>
+        </w:numPr>
+        <w:rPr>
+          <w:sz w:val="24"/>
+          <w:szCs w:val="22"/>
+          <w:lang w:val="en-US"/>
+        </w:rPr>
+      </w:pPr>
+      <w:r>
+        <w:rPr>
+          <w:sz w:val="24"/>
+          <w:szCs w:val="22"/>
+          <w:lang w:val="en-US"/>
+        </w:rPr>
+        <w:t xml:space="preserve">dismiss() </w:t>
+      </w:r>
+      <w:r>
+        <w:rPr>
+          <w:sz w:val="24"/>
+          <w:szCs w:val="22"/>
+          <w:lang w:val="en-US"/>
+        </w:rPr>
+        <w:sym w:font="Wingdings" w:char="F0E0"/>
+      </w:r>
+      <w:r>
+        <w:rPr>
+          <w:sz w:val="24"/>
+          <w:szCs w:val="22"/>
+          <w:lang w:val="en-US"/>
+        </w:rPr>
+        <w:t xml:space="preserve"> Will click on Cancel button</w:t>
+      </w:r>
+    </w:p>
+    <w:p>
+      <w:pPr>
+        <w:pStyle w:val="ListParagraph"/>
+        <w:numPr>
+          <w:ilvl w:val="0"/>
+          <w:numId w:val="25"/>
+        </w:numPr>
+        <w:rPr>
+          <w:sz w:val="24"/>
+          <w:szCs w:val="22"/>
+          <w:lang w:val="en-US"/>
+        </w:rPr>
+      </w:pPr>
+      <w:r>
+        <w:rPr>
+          <w:sz w:val="24"/>
+          <w:szCs w:val="22"/>
+          <w:lang w:val="en-US"/>
+        </w:rPr>
+        <w:t xml:space="preserve">sendKeys() </w:t>
+      </w:r>
+      <w:r>
+        <w:rPr>
+          <w:sz w:val="24"/>
+          <w:szCs w:val="22"/>
+          <w:lang w:val="en-US"/>
+        </w:rPr>
+        <w:sym w:font="Wingdings" w:char="F0E0"/>
+      </w:r>
+      <w:r>
+        <w:rPr>
+          <w:sz w:val="24"/>
+          <w:szCs w:val="22"/>
+          <w:lang w:val="en-US"/>
+        </w:rPr>
+        <w:t xml:space="preserve"> Will enter some text on the prompt box</w:t>
+      </w:r>
+    </w:p>
+    <w:p>
+      <w:pPr>
+        <w:rPr>
+          <w:sz w:val="24"/>
+          <w:szCs w:val="22"/>
+          <w:lang w:val="en-US"/>
+        </w:rPr>
+      </w:pPr>
+    </w:p>
+    <w:p>
+      <w:pPr>
+        <w:rPr>
+          <w:b/>
+          <w:bCs/>
+          <w:sz w:val="24"/>
+          <w:szCs w:val="22"/>
+          <w:lang w:val="en-US"/>
+        </w:rPr>
+      </w:pPr>
+      <w:r>
+        <w:rPr>
+          <w:b/>
+          <w:bCs/>
+          <w:sz w:val="24"/>
+          <w:szCs w:val="22"/>
+          <w:lang w:val="en-US"/>
+        </w:rPr>
+        <w:t>Handling File upload</w:t>
+      </w:r>
+    </w:p>
+    <w:p>
+      <w:pPr>
+        <w:pStyle w:val="ListParagraph"/>
+        <w:numPr>
+          <w:ilvl w:val="0"/>
+          <w:numId w:val="26"/>
+        </w:numPr>
+        <w:rPr>
+          <w:sz w:val="24"/>
+          <w:szCs w:val="22"/>
+          <w:lang w:val="en-US"/>
+        </w:rPr>
+      </w:pPr>
+      <w:r>
+        <w:rPr>
+          <w:sz w:val="24"/>
+          <w:szCs w:val="22"/>
+          <w:lang w:val="en-US"/>
+        </w:rPr>
+        <w:t>If any control is having &lt;type=”file”&gt; attribute, then such control is treaded as File Upload in Selenium.</w:t>
+      </w:r>
+    </w:p>
+    <w:p>
+      <w:pPr>
+        <w:pStyle w:val="ListParagraph"/>
+        <w:numPr>
+          <w:ilvl w:val="0"/>
+          <w:numId w:val="26"/>
+        </w:numPr>
+        <w:rPr>
+          <w:sz w:val="24"/>
+          <w:szCs w:val="22"/>
+          <w:lang w:val="en-US"/>
+        </w:rPr>
+      </w:pPr>
+      <w:r>
+        <w:rPr>
+          <w:sz w:val="24"/>
+          <w:szCs w:val="22"/>
+          <w:lang w:val="en-US"/>
+        </w:rPr>
+        <w:t>WebElement’s sendKeys() is used to upload any file to such control.</w:t>
+      </w:r>
+    </w:p>
+    <w:p>
+      <w:pPr>
+        <w:pStyle w:val="ListParagraph"/>
+        <w:numPr>
+          <w:ilvl w:val="0"/>
+          <w:numId w:val="26"/>
+        </w:numPr>
         <w:rPr>
           <w:sz w:val="24"/>
           <w:szCs w:val="22"/>
@@ -6057,2709 +6783,8 @@
           <w:lang w:val="en-US"/>
         </w:rPr>
         <w:lastRenderedPageBreak/>
-        <w:t>Extent Report</w:t>
-      </w:r>
-    </w:p>
-    <w:p>
-      <w:pPr>
-        <w:shd w:val="clear" w:color="auto" w:fill="1E1F22"/>
-        <w:tabs>
-          <w:tab w:val="left" w:pos="916"/>
-          <w:tab w:val="left" w:pos="1832"/>
-          <w:tab w:val="left" w:pos="2748"/>
-          <w:tab w:val="left" w:pos="3664"/>
-          <w:tab w:val="left" w:pos="4580"/>
-          <w:tab w:val="left" w:pos="5496"/>
-          <w:tab w:val="left" w:pos="6412"/>
-          <w:tab w:val="left" w:pos="7328"/>
-          <w:tab w:val="left" w:pos="8244"/>
-          <w:tab w:val="left" w:pos="9160"/>
-          <w:tab w:val="left" w:pos="10076"/>
-          <w:tab w:val="left" w:pos="10992"/>
-          <w:tab w:val="left" w:pos="11908"/>
-          <w:tab w:val="left" w:pos="12824"/>
-          <w:tab w:val="left" w:pos="13740"/>
-          <w:tab w:val="left" w:pos="14656"/>
-        </w:tabs>
-        <w:spacing w:after="0" w:line="240" w:lineRule="auto"/>
-        <w:rPr>
-          <w:rFonts w:ascii="Courier New" w:eastAsia="Times New Roman" w:hAnsi="Courier New" w:cs="Courier New"/>
-          <w:color w:val="BCBEC4"/>
-          <w:sz w:val="23"/>
-          <w:szCs w:val="23"/>
-          <w:lang w:eastAsia="en-IN"/>
-        </w:rPr>
-      </w:pPr>
-      <w:r>
-        <w:rPr>
-          <w:rFonts w:ascii="Courier New" w:eastAsia="Times New Roman" w:hAnsi="Courier New" w:cs="Courier New"/>
-          <w:color w:val="CF8E6D"/>
-          <w:sz w:val="23"/>
-          <w:szCs w:val="23"/>
-          <w:lang w:eastAsia="en-IN"/>
-        </w:rPr>
-        <w:t xml:space="preserve">package </w:t>
-      </w:r>
-      <w:r>
-        <w:rPr>
-          <w:rFonts w:ascii="Courier New" w:eastAsia="Times New Roman" w:hAnsi="Courier New" w:cs="Courier New"/>
-          <w:color w:val="BCBEC4"/>
-          <w:sz w:val="23"/>
-          <w:szCs w:val="23"/>
-          <w:lang w:eastAsia="en-IN"/>
-        </w:rPr>
-        <w:t>com.WebTests;</w:t>
-      </w:r>
-      <w:r>
-        <w:rPr>
-          <w:rFonts w:ascii="Courier New" w:eastAsia="Times New Roman" w:hAnsi="Courier New" w:cs="Courier New"/>
-          <w:color w:val="BCBEC4"/>
-          <w:sz w:val="23"/>
-          <w:szCs w:val="23"/>
-          <w:lang w:eastAsia="en-IN"/>
-        </w:rPr>
-        <w:br/>
-      </w:r>
-      <w:r>
-        <w:rPr>
-          <w:rFonts w:ascii="Courier New" w:eastAsia="Times New Roman" w:hAnsi="Courier New" w:cs="Courier New"/>
-          <w:color w:val="BCBEC4"/>
-          <w:sz w:val="23"/>
-          <w:szCs w:val="23"/>
-          <w:lang w:eastAsia="en-IN"/>
-        </w:rPr>
-        <w:br/>
-      </w:r>
-      <w:r>
-        <w:rPr>
-          <w:rFonts w:ascii="Courier New" w:eastAsia="Times New Roman" w:hAnsi="Courier New" w:cs="Courier New"/>
-          <w:color w:val="CF8E6D"/>
-          <w:sz w:val="23"/>
-          <w:szCs w:val="23"/>
-          <w:lang w:eastAsia="en-IN"/>
-        </w:rPr>
-        <w:t xml:space="preserve">import </w:t>
-      </w:r>
-      <w:r>
-        <w:rPr>
-          <w:rFonts w:ascii="Courier New" w:eastAsia="Times New Roman" w:hAnsi="Courier New" w:cs="Courier New"/>
-          <w:color w:val="BCBEC4"/>
-          <w:sz w:val="23"/>
-          <w:szCs w:val="23"/>
-          <w:lang w:eastAsia="en-IN"/>
-        </w:rPr>
-        <w:t>com.aventstack.extentreports.ExtentReports;</w:t>
-      </w:r>
-      <w:r>
-        <w:rPr>
-          <w:rFonts w:ascii="Courier New" w:eastAsia="Times New Roman" w:hAnsi="Courier New" w:cs="Courier New"/>
-          <w:color w:val="BCBEC4"/>
-          <w:sz w:val="23"/>
-          <w:szCs w:val="23"/>
-          <w:lang w:eastAsia="en-IN"/>
-        </w:rPr>
-        <w:br/>
-      </w:r>
-      <w:r>
-        <w:rPr>
-          <w:rFonts w:ascii="Courier New" w:eastAsia="Times New Roman" w:hAnsi="Courier New" w:cs="Courier New"/>
-          <w:color w:val="CF8E6D"/>
-          <w:sz w:val="23"/>
-          <w:szCs w:val="23"/>
-          <w:lang w:eastAsia="en-IN"/>
-        </w:rPr>
-        <w:t xml:space="preserve">import </w:t>
-      </w:r>
-      <w:r>
-        <w:rPr>
-          <w:rFonts w:ascii="Courier New" w:eastAsia="Times New Roman" w:hAnsi="Courier New" w:cs="Courier New"/>
-          <w:color w:val="BCBEC4"/>
-          <w:sz w:val="23"/>
-          <w:szCs w:val="23"/>
-          <w:lang w:eastAsia="en-IN"/>
-        </w:rPr>
-        <w:t>com.aventstack.extentreports.ExtentTest;</w:t>
-      </w:r>
-      <w:r>
-        <w:rPr>
-          <w:rFonts w:ascii="Courier New" w:eastAsia="Times New Roman" w:hAnsi="Courier New" w:cs="Courier New"/>
-          <w:color w:val="BCBEC4"/>
-          <w:sz w:val="23"/>
-          <w:szCs w:val="23"/>
-          <w:lang w:eastAsia="en-IN"/>
-        </w:rPr>
-        <w:br/>
-      </w:r>
-      <w:r>
-        <w:rPr>
-          <w:rFonts w:ascii="Courier New" w:eastAsia="Times New Roman" w:hAnsi="Courier New" w:cs="Courier New"/>
-          <w:color w:val="CF8E6D"/>
-          <w:sz w:val="23"/>
-          <w:szCs w:val="23"/>
-          <w:lang w:eastAsia="en-IN"/>
-        </w:rPr>
-        <w:t xml:space="preserve">import </w:t>
-      </w:r>
-      <w:r>
-        <w:rPr>
-          <w:rFonts w:ascii="Courier New" w:eastAsia="Times New Roman" w:hAnsi="Courier New" w:cs="Courier New"/>
-          <w:color w:val="BCBEC4"/>
-          <w:sz w:val="23"/>
-          <w:szCs w:val="23"/>
-          <w:lang w:eastAsia="en-IN"/>
-        </w:rPr>
-        <w:t>com.aventstack.extentreports.MediaEntityBuilder;</w:t>
-      </w:r>
-      <w:r>
-        <w:rPr>
-          <w:rFonts w:ascii="Courier New" w:eastAsia="Times New Roman" w:hAnsi="Courier New" w:cs="Courier New"/>
-          <w:color w:val="BCBEC4"/>
-          <w:sz w:val="23"/>
-          <w:szCs w:val="23"/>
-          <w:lang w:eastAsia="en-IN"/>
-        </w:rPr>
-        <w:br/>
-      </w:r>
-      <w:r>
-        <w:rPr>
-          <w:rFonts w:ascii="Courier New" w:eastAsia="Times New Roman" w:hAnsi="Courier New" w:cs="Courier New"/>
-          <w:color w:val="CF8E6D"/>
-          <w:sz w:val="23"/>
-          <w:szCs w:val="23"/>
-          <w:lang w:eastAsia="en-IN"/>
-        </w:rPr>
-        <w:t xml:space="preserve">import </w:t>
-      </w:r>
-      <w:r>
-        <w:rPr>
-          <w:rFonts w:ascii="Courier New" w:eastAsia="Times New Roman" w:hAnsi="Courier New" w:cs="Courier New"/>
-          <w:color w:val="BCBEC4"/>
-          <w:sz w:val="23"/>
-          <w:szCs w:val="23"/>
-          <w:lang w:eastAsia="en-IN"/>
-        </w:rPr>
-        <w:t>com.aventstack.extentreports.Status;</w:t>
-      </w:r>
-      <w:r>
-        <w:rPr>
-          <w:rFonts w:ascii="Courier New" w:eastAsia="Times New Roman" w:hAnsi="Courier New" w:cs="Courier New"/>
-          <w:color w:val="BCBEC4"/>
-          <w:sz w:val="23"/>
-          <w:szCs w:val="23"/>
-          <w:lang w:eastAsia="en-IN"/>
-        </w:rPr>
-        <w:br/>
-      </w:r>
-      <w:r>
-        <w:rPr>
-          <w:rFonts w:ascii="Courier New" w:eastAsia="Times New Roman" w:hAnsi="Courier New" w:cs="Courier New"/>
-          <w:color w:val="CF8E6D"/>
-          <w:sz w:val="23"/>
-          <w:szCs w:val="23"/>
-          <w:lang w:eastAsia="en-IN"/>
-        </w:rPr>
-        <w:t xml:space="preserve">import </w:t>
-      </w:r>
-      <w:r>
-        <w:rPr>
-          <w:rFonts w:ascii="Courier New" w:eastAsia="Times New Roman" w:hAnsi="Courier New" w:cs="Courier New"/>
-          <w:color w:val="BCBEC4"/>
-          <w:sz w:val="23"/>
-          <w:szCs w:val="23"/>
-          <w:lang w:eastAsia="en-IN"/>
-        </w:rPr>
-        <w:t>com.aventstack.extentreports.markuputils.ExtentColor;</w:t>
-      </w:r>
-      <w:r>
-        <w:rPr>
-          <w:rFonts w:ascii="Courier New" w:eastAsia="Times New Roman" w:hAnsi="Courier New" w:cs="Courier New"/>
-          <w:color w:val="BCBEC4"/>
-          <w:sz w:val="23"/>
-          <w:szCs w:val="23"/>
-          <w:lang w:eastAsia="en-IN"/>
-        </w:rPr>
-        <w:br/>
-      </w:r>
-      <w:r>
-        <w:rPr>
-          <w:rFonts w:ascii="Courier New" w:eastAsia="Times New Roman" w:hAnsi="Courier New" w:cs="Courier New"/>
-          <w:color w:val="CF8E6D"/>
-          <w:sz w:val="23"/>
-          <w:szCs w:val="23"/>
-          <w:lang w:eastAsia="en-IN"/>
-        </w:rPr>
-        <w:t xml:space="preserve">import </w:t>
-      </w:r>
-      <w:r>
-        <w:rPr>
-          <w:rFonts w:ascii="Courier New" w:eastAsia="Times New Roman" w:hAnsi="Courier New" w:cs="Courier New"/>
-          <w:color w:val="BCBEC4"/>
-          <w:sz w:val="23"/>
-          <w:szCs w:val="23"/>
-          <w:lang w:eastAsia="en-IN"/>
-        </w:rPr>
-        <w:t>com.aventstack.extentreports.markuputils.MarkupHelper;</w:t>
-      </w:r>
-      <w:r>
-        <w:rPr>
-          <w:rFonts w:ascii="Courier New" w:eastAsia="Times New Roman" w:hAnsi="Courier New" w:cs="Courier New"/>
-          <w:color w:val="BCBEC4"/>
-          <w:sz w:val="23"/>
-          <w:szCs w:val="23"/>
-          <w:lang w:eastAsia="en-IN"/>
-        </w:rPr>
-        <w:br/>
-      </w:r>
-      <w:r>
-        <w:rPr>
-          <w:rFonts w:ascii="Courier New" w:eastAsia="Times New Roman" w:hAnsi="Courier New" w:cs="Courier New"/>
-          <w:color w:val="CF8E6D"/>
-          <w:sz w:val="23"/>
-          <w:szCs w:val="23"/>
-          <w:lang w:eastAsia="en-IN"/>
-        </w:rPr>
-        <w:t xml:space="preserve">import </w:t>
-      </w:r>
-      <w:r>
-        <w:rPr>
-          <w:rFonts w:ascii="Courier New" w:eastAsia="Times New Roman" w:hAnsi="Courier New" w:cs="Courier New"/>
-          <w:color w:val="BCBEC4"/>
-          <w:sz w:val="23"/>
-          <w:szCs w:val="23"/>
-          <w:lang w:eastAsia="en-IN"/>
-        </w:rPr>
-        <w:t>com.aventstack.extentreports.reporter.ExtentSparkReporter;</w:t>
-      </w:r>
-      <w:r>
-        <w:rPr>
-          <w:rFonts w:ascii="Courier New" w:eastAsia="Times New Roman" w:hAnsi="Courier New" w:cs="Courier New"/>
-          <w:color w:val="BCBEC4"/>
-          <w:sz w:val="23"/>
-          <w:szCs w:val="23"/>
-          <w:lang w:eastAsia="en-IN"/>
-        </w:rPr>
-        <w:br/>
-      </w:r>
-      <w:r>
-        <w:rPr>
-          <w:rFonts w:ascii="Courier New" w:eastAsia="Times New Roman" w:hAnsi="Courier New" w:cs="Courier New"/>
-          <w:color w:val="CF8E6D"/>
-          <w:sz w:val="23"/>
-          <w:szCs w:val="23"/>
-          <w:lang w:eastAsia="en-IN"/>
-        </w:rPr>
-        <w:t xml:space="preserve">import </w:t>
-      </w:r>
-      <w:r>
-        <w:rPr>
-          <w:rFonts w:ascii="Courier New" w:eastAsia="Times New Roman" w:hAnsi="Courier New" w:cs="Courier New"/>
-          <w:color w:val="BCBEC4"/>
-          <w:sz w:val="23"/>
-          <w:szCs w:val="23"/>
-          <w:lang w:eastAsia="en-IN"/>
-        </w:rPr>
-        <w:t>com.aventstack.extentreports.reporter.configuration.Theme;</w:t>
-      </w:r>
-      <w:r>
-        <w:rPr>
-          <w:rFonts w:ascii="Courier New" w:eastAsia="Times New Roman" w:hAnsi="Courier New" w:cs="Courier New"/>
-          <w:color w:val="BCBEC4"/>
-          <w:sz w:val="23"/>
-          <w:szCs w:val="23"/>
-          <w:lang w:eastAsia="en-IN"/>
-        </w:rPr>
-        <w:br/>
-      </w:r>
-      <w:r>
-        <w:rPr>
-          <w:rFonts w:ascii="Courier New" w:eastAsia="Times New Roman" w:hAnsi="Courier New" w:cs="Courier New"/>
-          <w:color w:val="CF8E6D"/>
-          <w:sz w:val="23"/>
-          <w:szCs w:val="23"/>
-          <w:lang w:eastAsia="en-IN"/>
-        </w:rPr>
-        <w:t xml:space="preserve">import </w:t>
-      </w:r>
-      <w:r>
-        <w:rPr>
-          <w:rFonts w:ascii="Courier New" w:eastAsia="Times New Roman" w:hAnsi="Courier New" w:cs="Courier New"/>
-          <w:color w:val="BCBEC4"/>
-          <w:sz w:val="23"/>
-          <w:szCs w:val="23"/>
-          <w:lang w:eastAsia="en-IN"/>
-        </w:rPr>
-        <w:t>org.openqa.selenium.*;</w:t>
-      </w:r>
-      <w:r>
-        <w:rPr>
-          <w:rFonts w:ascii="Courier New" w:eastAsia="Times New Roman" w:hAnsi="Courier New" w:cs="Courier New"/>
-          <w:color w:val="BCBEC4"/>
-          <w:sz w:val="23"/>
-          <w:szCs w:val="23"/>
-          <w:lang w:eastAsia="en-IN"/>
-        </w:rPr>
-        <w:br/>
-      </w:r>
-      <w:r>
-        <w:rPr>
-          <w:rFonts w:ascii="Courier New" w:eastAsia="Times New Roman" w:hAnsi="Courier New" w:cs="Courier New"/>
-          <w:color w:val="CF8E6D"/>
-          <w:sz w:val="23"/>
-          <w:szCs w:val="23"/>
-          <w:lang w:eastAsia="en-IN"/>
-        </w:rPr>
-        <w:t xml:space="preserve">import </w:t>
-      </w:r>
-      <w:r>
-        <w:rPr>
-          <w:rFonts w:ascii="Courier New" w:eastAsia="Times New Roman" w:hAnsi="Courier New" w:cs="Courier New"/>
-          <w:color w:val="BCBEC4"/>
-          <w:sz w:val="23"/>
-          <w:szCs w:val="23"/>
-          <w:lang w:eastAsia="en-IN"/>
-        </w:rPr>
-        <w:t>org.openqa.selenium.chrome.ChromeDriver;</w:t>
-      </w:r>
-      <w:r>
-        <w:rPr>
-          <w:rFonts w:ascii="Courier New" w:eastAsia="Times New Roman" w:hAnsi="Courier New" w:cs="Courier New"/>
-          <w:color w:val="BCBEC4"/>
-          <w:sz w:val="23"/>
-          <w:szCs w:val="23"/>
-          <w:lang w:eastAsia="en-IN"/>
-        </w:rPr>
-        <w:br/>
-      </w:r>
-      <w:r>
-        <w:rPr>
-          <w:rFonts w:ascii="Courier New" w:eastAsia="Times New Roman" w:hAnsi="Courier New" w:cs="Courier New"/>
-          <w:color w:val="CF8E6D"/>
-          <w:sz w:val="23"/>
-          <w:szCs w:val="23"/>
-          <w:lang w:eastAsia="en-IN"/>
-        </w:rPr>
-        <w:t xml:space="preserve">import </w:t>
-      </w:r>
-      <w:r>
-        <w:rPr>
-          <w:rFonts w:ascii="Courier New" w:eastAsia="Times New Roman" w:hAnsi="Courier New" w:cs="Courier New"/>
-          <w:color w:val="BCBEC4"/>
-          <w:sz w:val="23"/>
-          <w:szCs w:val="23"/>
-          <w:lang w:eastAsia="en-IN"/>
-        </w:rPr>
-        <w:t>org.openqa.selenium.io.FileHandler;</w:t>
-      </w:r>
-      <w:r>
-        <w:rPr>
-          <w:rFonts w:ascii="Courier New" w:eastAsia="Times New Roman" w:hAnsi="Courier New" w:cs="Courier New"/>
-          <w:color w:val="BCBEC4"/>
-          <w:sz w:val="23"/>
-          <w:szCs w:val="23"/>
-          <w:lang w:eastAsia="en-IN"/>
-        </w:rPr>
-        <w:br/>
-      </w:r>
-      <w:r>
-        <w:rPr>
-          <w:rFonts w:ascii="Courier New" w:eastAsia="Times New Roman" w:hAnsi="Courier New" w:cs="Courier New"/>
-          <w:color w:val="BCBEC4"/>
-          <w:sz w:val="23"/>
-          <w:szCs w:val="23"/>
-          <w:lang w:eastAsia="en-IN"/>
-        </w:rPr>
-        <w:br/>
-      </w:r>
-      <w:r>
-        <w:rPr>
-          <w:rFonts w:ascii="Courier New" w:eastAsia="Times New Roman" w:hAnsi="Courier New" w:cs="Courier New"/>
-          <w:color w:val="CF8E6D"/>
-          <w:sz w:val="23"/>
-          <w:szCs w:val="23"/>
-          <w:lang w:eastAsia="en-IN"/>
-        </w:rPr>
-        <w:t xml:space="preserve">import </w:t>
-      </w:r>
-      <w:r>
-        <w:rPr>
-          <w:rFonts w:ascii="Courier New" w:eastAsia="Times New Roman" w:hAnsi="Courier New" w:cs="Courier New"/>
-          <w:color w:val="BCBEC4"/>
-          <w:sz w:val="23"/>
-          <w:szCs w:val="23"/>
-          <w:lang w:eastAsia="en-IN"/>
-        </w:rPr>
-        <w:t>java.io.File;</w:t>
-      </w:r>
-      <w:r>
-        <w:rPr>
-          <w:rFonts w:ascii="Courier New" w:eastAsia="Times New Roman" w:hAnsi="Courier New" w:cs="Courier New"/>
-          <w:color w:val="BCBEC4"/>
-          <w:sz w:val="23"/>
-          <w:szCs w:val="23"/>
-          <w:lang w:eastAsia="en-IN"/>
-        </w:rPr>
-        <w:br/>
-      </w:r>
-      <w:r>
-        <w:rPr>
-          <w:rFonts w:ascii="Courier New" w:eastAsia="Times New Roman" w:hAnsi="Courier New" w:cs="Courier New"/>
-          <w:color w:val="CF8E6D"/>
-          <w:sz w:val="23"/>
-          <w:szCs w:val="23"/>
-          <w:lang w:eastAsia="en-IN"/>
-        </w:rPr>
-        <w:t xml:space="preserve">import </w:t>
-      </w:r>
-      <w:r>
-        <w:rPr>
-          <w:rFonts w:ascii="Courier New" w:eastAsia="Times New Roman" w:hAnsi="Courier New" w:cs="Courier New"/>
-          <w:color w:val="BCBEC4"/>
-          <w:sz w:val="23"/>
-          <w:szCs w:val="23"/>
-          <w:lang w:eastAsia="en-IN"/>
-        </w:rPr>
-        <w:t>java.io.IOException;</w:t>
-      </w:r>
-      <w:r>
-        <w:rPr>
-          <w:rFonts w:ascii="Courier New" w:eastAsia="Times New Roman" w:hAnsi="Courier New" w:cs="Courier New"/>
-          <w:color w:val="BCBEC4"/>
-          <w:sz w:val="23"/>
-          <w:szCs w:val="23"/>
-          <w:lang w:eastAsia="en-IN"/>
-        </w:rPr>
-        <w:br/>
-      </w:r>
-      <w:r>
-        <w:rPr>
-          <w:rFonts w:ascii="Courier New" w:eastAsia="Times New Roman" w:hAnsi="Courier New" w:cs="Courier New"/>
-          <w:color w:val="CF8E6D"/>
-          <w:sz w:val="23"/>
-          <w:szCs w:val="23"/>
-          <w:lang w:eastAsia="en-IN"/>
-        </w:rPr>
-        <w:t xml:space="preserve">import </w:t>
-      </w:r>
-      <w:r>
-        <w:rPr>
-          <w:rFonts w:ascii="Courier New" w:eastAsia="Times New Roman" w:hAnsi="Courier New" w:cs="Courier New"/>
-          <w:color w:val="BCBEC4"/>
-          <w:sz w:val="23"/>
-          <w:szCs w:val="23"/>
-          <w:lang w:eastAsia="en-IN"/>
-        </w:rPr>
-        <w:t>java.time.Duration;</w:t>
-      </w:r>
-      <w:r>
-        <w:rPr>
-          <w:rFonts w:ascii="Courier New" w:eastAsia="Times New Roman" w:hAnsi="Courier New" w:cs="Courier New"/>
-          <w:color w:val="BCBEC4"/>
-          <w:sz w:val="23"/>
-          <w:szCs w:val="23"/>
-          <w:lang w:eastAsia="en-IN"/>
-        </w:rPr>
-        <w:br/>
-      </w:r>
-      <w:r>
-        <w:rPr>
-          <w:rFonts w:ascii="Courier New" w:eastAsia="Times New Roman" w:hAnsi="Courier New" w:cs="Courier New"/>
-          <w:color w:val="BCBEC4"/>
-          <w:sz w:val="23"/>
-          <w:szCs w:val="23"/>
-          <w:lang w:eastAsia="en-IN"/>
-        </w:rPr>
-        <w:br/>
-      </w:r>
-      <w:r>
-        <w:rPr>
-          <w:rFonts w:ascii="Courier New" w:eastAsia="Times New Roman" w:hAnsi="Courier New" w:cs="Courier New"/>
-          <w:color w:val="CF8E6D"/>
-          <w:sz w:val="23"/>
-          <w:szCs w:val="23"/>
-          <w:lang w:eastAsia="en-IN"/>
-        </w:rPr>
-        <w:t xml:space="preserve">public class </w:t>
-      </w:r>
-      <w:r>
-        <w:rPr>
-          <w:rFonts w:ascii="Courier New" w:eastAsia="Times New Roman" w:hAnsi="Courier New" w:cs="Courier New"/>
-          <w:color w:val="BCBEC4"/>
-          <w:sz w:val="23"/>
-          <w:szCs w:val="23"/>
-          <w:lang w:eastAsia="en-IN"/>
-        </w:rPr>
-        <w:t>D04SimpleExtentReport {</w:t>
-      </w:r>
-      <w:r>
-        <w:rPr>
-          <w:rFonts w:ascii="Courier New" w:eastAsia="Times New Roman" w:hAnsi="Courier New" w:cs="Courier New"/>
-          <w:color w:val="BCBEC4"/>
-          <w:sz w:val="23"/>
-          <w:szCs w:val="23"/>
-          <w:lang w:eastAsia="en-IN"/>
-        </w:rPr>
-        <w:br/>
-        <w:t xml:space="preserve">    </w:t>
-      </w:r>
-      <w:r>
-        <w:rPr>
-          <w:rFonts w:ascii="Courier New" w:eastAsia="Times New Roman" w:hAnsi="Courier New" w:cs="Courier New"/>
-          <w:color w:val="CF8E6D"/>
-          <w:sz w:val="23"/>
-          <w:szCs w:val="23"/>
-          <w:lang w:eastAsia="en-IN"/>
-        </w:rPr>
-        <w:t xml:space="preserve">public static void </w:t>
-      </w:r>
-      <w:r>
-        <w:rPr>
-          <w:rFonts w:ascii="Courier New" w:eastAsia="Times New Roman" w:hAnsi="Courier New" w:cs="Courier New"/>
-          <w:color w:val="56A8F5"/>
-          <w:sz w:val="23"/>
-          <w:szCs w:val="23"/>
-          <w:lang w:eastAsia="en-IN"/>
-        </w:rPr>
-        <w:t>main</w:t>
-      </w:r>
-      <w:r>
-        <w:rPr>
-          <w:rFonts w:ascii="Courier New" w:eastAsia="Times New Roman" w:hAnsi="Courier New" w:cs="Courier New"/>
-          <w:color w:val="BCBEC4"/>
-          <w:sz w:val="23"/>
-          <w:szCs w:val="23"/>
-          <w:lang w:eastAsia="en-IN"/>
-        </w:rPr>
-        <w:t xml:space="preserve">(String[] args) </w:t>
-      </w:r>
-      <w:r>
-        <w:rPr>
-          <w:rFonts w:ascii="Courier New" w:eastAsia="Times New Roman" w:hAnsi="Courier New" w:cs="Courier New"/>
-          <w:color w:val="CF8E6D"/>
-          <w:sz w:val="23"/>
-          <w:szCs w:val="23"/>
-          <w:lang w:eastAsia="en-IN"/>
-        </w:rPr>
-        <w:t xml:space="preserve">throws </w:t>
-      </w:r>
-      <w:r>
-        <w:rPr>
-          <w:rFonts w:ascii="Courier New" w:eastAsia="Times New Roman" w:hAnsi="Courier New" w:cs="Courier New"/>
-          <w:color w:val="BCBEC4"/>
-          <w:sz w:val="23"/>
-          <w:szCs w:val="23"/>
-          <w:lang w:eastAsia="en-IN"/>
-        </w:rPr>
-        <w:t>IOException {</w:t>
-      </w:r>
-      <w:r>
-        <w:rPr>
-          <w:rFonts w:ascii="Courier New" w:eastAsia="Times New Roman" w:hAnsi="Courier New" w:cs="Courier New"/>
-          <w:color w:val="BCBEC4"/>
-          <w:sz w:val="23"/>
-          <w:szCs w:val="23"/>
-          <w:lang w:eastAsia="en-IN"/>
-        </w:rPr>
-        <w:br/>
-        <w:t xml:space="preserve">        WebDriver driver;</w:t>
-      </w:r>
-      <w:r>
-        <w:rPr>
-          <w:rFonts w:ascii="Courier New" w:eastAsia="Times New Roman" w:hAnsi="Courier New" w:cs="Courier New"/>
-          <w:color w:val="BCBEC4"/>
-          <w:sz w:val="23"/>
-          <w:szCs w:val="23"/>
-          <w:lang w:eastAsia="en-IN"/>
-        </w:rPr>
-        <w:br/>
-        <w:t xml:space="preserve">        ExtentSparkReporter htmlReport = </w:t>
-      </w:r>
-      <w:r>
-        <w:rPr>
-          <w:rFonts w:ascii="Courier New" w:eastAsia="Times New Roman" w:hAnsi="Courier New" w:cs="Courier New"/>
-          <w:color w:val="CF8E6D"/>
-          <w:sz w:val="23"/>
-          <w:szCs w:val="23"/>
-          <w:lang w:eastAsia="en-IN"/>
-        </w:rPr>
-        <w:t xml:space="preserve">new </w:t>
-      </w:r>
-      <w:r>
-        <w:rPr>
-          <w:rFonts w:ascii="Courier New" w:eastAsia="Times New Roman" w:hAnsi="Courier New" w:cs="Courier New"/>
-          <w:color w:val="BCBEC4"/>
-          <w:sz w:val="23"/>
-          <w:szCs w:val="23"/>
-          <w:lang w:eastAsia="en-IN"/>
-        </w:rPr>
-        <w:t>ExtentSparkReporter(</w:t>
-      </w:r>
-      <w:r>
-        <w:rPr>
-          <w:rFonts w:ascii="Courier New" w:eastAsia="Times New Roman" w:hAnsi="Courier New" w:cs="Courier New"/>
-          <w:color w:val="6AAB73"/>
-          <w:sz w:val="23"/>
-          <w:szCs w:val="23"/>
-          <w:lang w:eastAsia="en-IN"/>
-        </w:rPr>
-        <w:t>"SimpleReport.html"</w:t>
-      </w:r>
-      <w:r>
-        <w:rPr>
-          <w:rFonts w:ascii="Courier New" w:eastAsia="Times New Roman" w:hAnsi="Courier New" w:cs="Courier New"/>
-          <w:color w:val="BCBEC4"/>
-          <w:sz w:val="23"/>
-          <w:szCs w:val="23"/>
-          <w:lang w:eastAsia="en-IN"/>
-        </w:rPr>
-        <w:t>);</w:t>
-      </w:r>
-      <w:r>
-        <w:rPr>
-          <w:rFonts w:ascii="Courier New" w:eastAsia="Times New Roman" w:hAnsi="Courier New" w:cs="Courier New"/>
-          <w:color w:val="BCBEC4"/>
-          <w:sz w:val="23"/>
-          <w:szCs w:val="23"/>
-          <w:lang w:eastAsia="en-IN"/>
-        </w:rPr>
-        <w:br/>
-        <w:t xml:space="preserve">        </w:t>
-      </w:r>
-      <w:r>
-        <w:rPr>
-          <w:rFonts w:ascii="Courier New" w:eastAsia="Times New Roman" w:hAnsi="Courier New" w:cs="Courier New"/>
-          <w:color w:val="7A7E85"/>
-          <w:sz w:val="23"/>
-          <w:szCs w:val="23"/>
-          <w:lang w:eastAsia="en-IN"/>
-        </w:rPr>
-        <w:t>//This object represents the HTML file in which we are storing the report</w:t>
-      </w:r>
-      <w:r>
-        <w:rPr>
-          <w:rFonts w:ascii="Courier New" w:eastAsia="Times New Roman" w:hAnsi="Courier New" w:cs="Courier New"/>
-          <w:color w:val="7A7E85"/>
-          <w:sz w:val="23"/>
-          <w:szCs w:val="23"/>
-          <w:lang w:eastAsia="en-IN"/>
-        </w:rPr>
-        <w:br/>
-        <w:t xml:space="preserve">        </w:t>
-      </w:r>
-      <w:r>
-        <w:rPr>
-          <w:rFonts w:ascii="Courier New" w:eastAsia="Times New Roman" w:hAnsi="Courier New" w:cs="Courier New"/>
-          <w:color w:val="BCBEC4"/>
-          <w:sz w:val="23"/>
-          <w:szCs w:val="23"/>
-          <w:lang w:eastAsia="en-IN"/>
-        </w:rPr>
-        <w:t xml:space="preserve">ExtentReports report = </w:t>
-      </w:r>
-      <w:r>
-        <w:rPr>
-          <w:rFonts w:ascii="Courier New" w:eastAsia="Times New Roman" w:hAnsi="Courier New" w:cs="Courier New"/>
-          <w:color w:val="CF8E6D"/>
-          <w:sz w:val="23"/>
-          <w:szCs w:val="23"/>
-          <w:lang w:eastAsia="en-IN"/>
-        </w:rPr>
-        <w:t xml:space="preserve">new </w:t>
-      </w:r>
-      <w:r>
-        <w:rPr>
-          <w:rFonts w:ascii="Courier New" w:eastAsia="Times New Roman" w:hAnsi="Courier New" w:cs="Courier New"/>
-          <w:color w:val="BCBEC4"/>
-          <w:sz w:val="23"/>
-          <w:szCs w:val="23"/>
-          <w:lang w:eastAsia="en-IN"/>
-        </w:rPr>
-        <w:t>ExtentReports();</w:t>
-      </w:r>
-      <w:r>
-        <w:rPr>
-          <w:rFonts w:ascii="Courier New" w:eastAsia="Times New Roman" w:hAnsi="Courier New" w:cs="Courier New"/>
-          <w:color w:val="BCBEC4"/>
-          <w:sz w:val="23"/>
-          <w:szCs w:val="23"/>
-          <w:lang w:eastAsia="en-IN"/>
-        </w:rPr>
-        <w:br/>
-        <w:t xml:space="preserve">        </w:t>
-      </w:r>
-      <w:r>
-        <w:rPr>
-          <w:rFonts w:ascii="Courier New" w:eastAsia="Times New Roman" w:hAnsi="Courier New" w:cs="Courier New"/>
-          <w:color w:val="7A7E85"/>
-          <w:sz w:val="23"/>
-          <w:szCs w:val="23"/>
-          <w:lang w:eastAsia="en-IN"/>
-        </w:rPr>
-        <w:t>//This object represents the report</w:t>
-      </w:r>
-      <w:r>
-        <w:rPr>
-          <w:rFonts w:ascii="Courier New" w:eastAsia="Times New Roman" w:hAnsi="Courier New" w:cs="Courier New"/>
-          <w:color w:val="7A7E85"/>
-          <w:sz w:val="23"/>
-          <w:szCs w:val="23"/>
-          <w:lang w:eastAsia="en-IN"/>
-        </w:rPr>
-        <w:br/>
-        <w:t xml:space="preserve">        </w:t>
-      </w:r>
-      <w:r>
-        <w:rPr>
-          <w:rFonts w:ascii="Courier New" w:eastAsia="Times New Roman" w:hAnsi="Courier New" w:cs="Courier New"/>
-          <w:color w:val="BCBEC4"/>
-          <w:sz w:val="23"/>
-          <w:szCs w:val="23"/>
-          <w:lang w:eastAsia="en-IN"/>
-        </w:rPr>
-        <w:t>ExtentTest test;</w:t>
-      </w:r>
-      <w:r>
-        <w:rPr>
-          <w:rFonts w:ascii="Courier New" w:eastAsia="Times New Roman" w:hAnsi="Courier New" w:cs="Courier New"/>
-          <w:color w:val="BCBEC4"/>
-          <w:sz w:val="23"/>
-          <w:szCs w:val="23"/>
-          <w:lang w:eastAsia="en-IN"/>
-        </w:rPr>
-        <w:br/>
-        <w:t xml:space="preserve">        </w:t>
-      </w:r>
-      <w:r>
-        <w:rPr>
-          <w:rFonts w:ascii="Courier New" w:eastAsia="Times New Roman" w:hAnsi="Courier New" w:cs="Courier New"/>
-          <w:color w:val="7A7E85"/>
-          <w:sz w:val="23"/>
-          <w:szCs w:val="23"/>
-          <w:lang w:eastAsia="en-IN"/>
-        </w:rPr>
-        <w:t>//This object represents the test case</w:t>
-      </w:r>
-      <w:r>
-        <w:rPr>
-          <w:rFonts w:ascii="Courier New" w:eastAsia="Times New Roman" w:hAnsi="Courier New" w:cs="Courier New"/>
-          <w:color w:val="7A7E85"/>
-          <w:sz w:val="23"/>
-          <w:szCs w:val="23"/>
-          <w:lang w:eastAsia="en-IN"/>
-        </w:rPr>
-        <w:br/>
-      </w:r>
-      <w:r>
-        <w:rPr>
-          <w:rFonts w:ascii="Courier New" w:eastAsia="Times New Roman" w:hAnsi="Courier New" w:cs="Courier New"/>
-          <w:color w:val="7A7E85"/>
-          <w:sz w:val="23"/>
-          <w:szCs w:val="23"/>
-          <w:lang w:eastAsia="en-IN"/>
-        </w:rPr>
-        <w:br/>
-        <w:t xml:space="preserve">        </w:t>
-      </w:r>
-      <w:r>
-        <w:rPr>
-          <w:rFonts w:ascii="Courier New" w:eastAsia="Times New Roman" w:hAnsi="Courier New" w:cs="Courier New"/>
-          <w:color w:val="BCBEC4"/>
-          <w:sz w:val="23"/>
-          <w:szCs w:val="23"/>
-          <w:lang w:eastAsia="en-IN"/>
-        </w:rPr>
-        <w:t>report.attachReporter(htmlReport);</w:t>
-      </w:r>
-      <w:r>
-        <w:rPr>
-          <w:rFonts w:ascii="Courier New" w:eastAsia="Times New Roman" w:hAnsi="Courier New" w:cs="Courier New"/>
-          <w:color w:val="BCBEC4"/>
-          <w:sz w:val="23"/>
-          <w:szCs w:val="23"/>
-          <w:lang w:eastAsia="en-IN"/>
-        </w:rPr>
-        <w:br/>
-        <w:t xml:space="preserve">        </w:t>
-      </w:r>
-      <w:r>
-        <w:rPr>
-          <w:rFonts w:ascii="Courier New" w:eastAsia="Times New Roman" w:hAnsi="Courier New" w:cs="Courier New"/>
-          <w:color w:val="7A7E85"/>
-          <w:sz w:val="23"/>
-          <w:szCs w:val="23"/>
-          <w:lang w:eastAsia="en-IN"/>
-        </w:rPr>
-        <w:t>//Store this report in the said HTML file</w:t>
-      </w:r>
-      <w:r>
-        <w:rPr>
-          <w:rFonts w:ascii="Courier New" w:eastAsia="Times New Roman" w:hAnsi="Courier New" w:cs="Courier New"/>
-          <w:color w:val="7A7E85"/>
-          <w:sz w:val="23"/>
-          <w:szCs w:val="23"/>
-          <w:lang w:eastAsia="en-IN"/>
-        </w:rPr>
-        <w:br/>
-      </w:r>
-      <w:r>
-        <w:rPr>
-          <w:rFonts w:ascii="Courier New" w:eastAsia="Times New Roman" w:hAnsi="Courier New" w:cs="Courier New"/>
-          <w:color w:val="7A7E85"/>
-          <w:sz w:val="23"/>
-          <w:szCs w:val="23"/>
-          <w:lang w:eastAsia="en-IN"/>
-        </w:rPr>
-        <w:br/>
-        <w:t xml:space="preserve">        //Set the environment details those will be displayed on the report</w:t>
-      </w:r>
-      <w:r>
-        <w:rPr>
-          <w:rFonts w:ascii="Courier New" w:eastAsia="Times New Roman" w:hAnsi="Courier New" w:cs="Courier New"/>
-          <w:color w:val="7A7E85"/>
-          <w:sz w:val="23"/>
-          <w:szCs w:val="23"/>
-          <w:lang w:eastAsia="en-IN"/>
-        </w:rPr>
-        <w:br/>
-        <w:t xml:space="preserve">        </w:t>
-      </w:r>
-      <w:r>
-        <w:rPr>
-          <w:rFonts w:ascii="Courier New" w:eastAsia="Times New Roman" w:hAnsi="Courier New" w:cs="Courier New"/>
-          <w:color w:val="BCBEC4"/>
-          <w:sz w:val="23"/>
-          <w:szCs w:val="23"/>
-          <w:lang w:eastAsia="en-IN"/>
-        </w:rPr>
-        <w:t>report.setSystemInfo(</w:t>
-      </w:r>
-      <w:r>
-        <w:rPr>
-          <w:rFonts w:ascii="Courier New" w:eastAsia="Times New Roman" w:hAnsi="Courier New" w:cs="Courier New"/>
-          <w:color w:val="6AAB73"/>
-          <w:sz w:val="23"/>
-          <w:szCs w:val="23"/>
-          <w:lang w:eastAsia="en-IN"/>
-        </w:rPr>
-        <w:t>"Application Name"</w:t>
-      </w:r>
-      <w:r>
-        <w:rPr>
-          <w:rFonts w:ascii="Courier New" w:eastAsia="Times New Roman" w:hAnsi="Courier New" w:cs="Courier New"/>
-          <w:color w:val="BCBEC4"/>
-          <w:sz w:val="23"/>
-          <w:szCs w:val="23"/>
-          <w:lang w:eastAsia="en-IN"/>
-        </w:rPr>
-        <w:t xml:space="preserve">, </w:t>
-      </w:r>
-      <w:r>
-        <w:rPr>
-          <w:rFonts w:ascii="Courier New" w:eastAsia="Times New Roman" w:hAnsi="Courier New" w:cs="Courier New"/>
-          <w:color w:val="6AAB73"/>
-          <w:sz w:val="23"/>
-          <w:szCs w:val="23"/>
-          <w:lang w:eastAsia="en-IN"/>
-        </w:rPr>
-        <w:t>"Google"</w:t>
-      </w:r>
-      <w:r>
-        <w:rPr>
-          <w:rFonts w:ascii="Courier New" w:eastAsia="Times New Roman" w:hAnsi="Courier New" w:cs="Courier New"/>
-          <w:color w:val="BCBEC4"/>
-          <w:sz w:val="23"/>
-          <w:szCs w:val="23"/>
-          <w:lang w:eastAsia="en-IN"/>
-        </w:rPr>
-        <w:t>);</w:t>
-      </w:r>
-      <w:r>
-        <w:rPr>
-          <w:rFonts w:ascii="Courier New" w:eastAsia="Times New Roman" w:hAnsi="Courier New" w:cs="Courier New"/>
-          <w:color w:val="BCBEC4"/>
-          <w:sz w:val="23"/>
-          <w:szCs w:val="23"/>
-          <w:lang w:eastAsia="en-IN"/>
-        </w:rPr>
-        <w:br/>
-        <w:t xml:space="preserve">        report.setSystemInfo(</w:t>
-      </w:r>
-      <w:r>
-        <w:rPr>
-          <w:rFonts w:ascii="Courier New" w:eastAsia="Times New Roman" w:hAnsi="Courier New" w:cs="Courier New"/>
-          <w:color w:val="6AAB73"/>
-          <w:sz w:val="23"/>
-          <w:szCs w:val="23"/>
-          <w:lang w:eastAsia="en-IN"/>
-        </w:rPr>
-        <w:t>"Operating System"</w:t>
-      </w:r>
-      <w:r>
-        <w:rPr>
-          <w:rFonts w:ascii="Courier New" w:eastAsia="Times New Roman" w:hAnsi="Courier New" w:cs="Courier New"/>
-          <w:color w:val="BCBEC4"/>
-          <w:sz w:val="23"/>
-          <w:szCs w:val="23"/>
-          <w:lang w:eastAsia="en-IN"/>
-        </w:rPr>
-        <w:t xml:space="preserve">, </w:t>
-      </w:r>
-      <w:r>
-        <w:rPr>
-          <w:rFonts w:ascii="Courier New" w:eastAsia="Times New Roman" w:hAnsi="Courier New" w:cs="Courier New"/>
-          <w:color w:val="6AAB73"/>
-          <w:sz w:val="23"/>
-          <w:szCs w:val="23"/>
-          <w:lang w:eastAsia="en-IN"/>
-        </w:rPr>
-        <w:t>"Windows 10"</w:t>
-      </w:r>
-      <w:r>
-        <w:rPr>
-          <w:rFonts w:ascii="Courier New" w:eastAsia="Times New Roman" w:hAnsi="Courier New" w:cs="Courier New"/>
-          <w:color w:val="BCBEC4"/>
-          <w:sz w:val="23"/>
-          <w:szCs w:val="23"/>
-          <w:lang w:eastAsia="en-IN"/>
-        </w:rPr>
-        <w:t>);</w:t>
-      </w:r>
-      <w:r>
-        <w:rPr>
-          <w:rFonts w:ascii="Courier New" w:eastAsia="Times New Roman" w:hAnsi="Courier New" w:cs="Courier New"/>
-          <w:color w:val="BCBEC4"/>
-          <w:sz w:val="23"/>
-          <w:szCs w:val="23"/>
-          <w:lang w:eastAsia="en-IN"/>
-        </w:rPr>
-        <w:br/>
-        <w:t xml:space="preserve">        report.setSystemInfo(</w:t>
-      </w:r>
-      <w:r>
-        <w:rPr>
-          <w:rFonts w:ascii="Courier New" w:eastAsia="Times New Roman" w:hAnsi="Courier New" w:cs="Courier New"/>
-          <w:color w:val="6AAB73"/>
-          <w:sz w:val="23"/>
-          <w:szCs w:val="23"/>
-          <w:lang w:eastAsia="en-IN"/>
-        </w:rPr>
-        <w:t>"User Name"</w:t>
-      </w:r>
-      <w:r>
-        <w:rPr>
-          <w:rFonts w:ascii="Courier New" w:eastAsia="Times New Roman" w:hAnsi="Courier New" w:cs="Courier New"/>
-          <w:color w:val="BCBEC4"/>
-          <w:sz w:val="23"/>
-          <w:szCs w:val="23"/>
-          <w:lang w:eastAsia="en-IN"/>
-        </w:rPr>
-        <w:t xml:space="preserve">, </w:t>
-      </w:r>
-      <w:r>
-        <w:rPr>
-          <w:rFonts w:ascii="Courier New" w:eastAsia="Times New Roman" w:hAnsi="Courier New" w:cs="Courier New"/>
-          <w:color w:val="6AAB73"/>
-          <w:sz w:val="23"/>
-          <w:szCs w:val="23"/>
-          <w:lang w:eastAsia="en-IN"/>
-        </w:rPr>
-        <w:t>"Ila V"</w:t>
-      </w:r>
-      <w:r>
-        <w:rPr>
-          <w:rFonts w:ascii="Courier New" w:eastAsia="Times New Roman" w:hAnsi="Courier New" w:cs="Courier New"/>
-          <w:color w:val="BCBEC4"/>
-          <w:sz w:val="23"/>
-          <w:szCs w:val="23"/>
-          <w:lang w:eastAsia="en-IN"/>
-        </w:rPr>
-        <w:t>);</w:t>
-      </w:r>
-      <w:r>
-        <w:rPr>
-          <w:rFonts w:ascii="Courier New" w:eastAsia="Times New Roman" w:hAnsi="Courier New" w:cs="Courier New"/>
-          <w:color w:val="BCBEC4"/>
-          <w:sz w:val="23"/>
-          <w:szCs w:val="23"/>
-          <w:lang w:eastAsia="en-IN"/>
-        </w:rPr>
-        <w:br/>
-        <w:t xml:space="preserve">        report.setSystemInfo(</w:t>
-      </w:r>
-      <w:r>
-        <w:rPr>
-          <w:rFonts w:ascii="Courier New" w:eastAsia="Times New Roman" w:hAnsi="Courier New" w:cs="Courier New"/>
-          <w:color w:val="6AAB73"/>
-          <w:sz w:val="23"/>
-          <w:szCs w:val="23"/>
-          <w:lang w:eastAsia="en-IN"/>
-        </w:rPr>
-        <w:t>"Browser"</w:t>
-      </w:r>
-      <w:r>
-        <w:rPr>
-          <w:rFonts w:ascii="Courier New" w:eastAsia="Times New Roman" w:hAnsi="Courier New" w:cs="Courier New"/>
-          <w:color w:val="BCBEC4"/>
-          <w:sz w:val="23"/>
-          <w:szCs w:val="23"/>
-          <w:lang w:eastAsia="en-IN"/>
-        </w:rPr>
-        <w:t xml:space="preserve">, </w:t>
-      </w:r>
-      <w:r>
-        <w:rPr>
-          <w:rFonts w:ascii="Courier New" w:eastAsia="Times New Roman" w:hAnsi="Courier New" w:cs="Courier New"/>
-          <w:color w:val="6AAB73"/>
-          <w:sz w:val="23"/>
-          <w:szCs w:val="23"/>
-          <w:lang w:eastAsia="en-IN"/>
-        </w:rPr>
-        <w:t>"Chrome"</w:t>
-      </w:r>
-      <w:r>
-        <w:rPr>
-          <w:rFonts w:ascii="Courier New" w:eastAsia="Times New Roman" w:hAnsi="Courier New" w:cs="Courier New"/>
-          <w:color w:val="BCBEC4"/>
-          <w:sz w:val="23"/>
-          <w:szCs w:val="23"/>
-          <w:lang w:eastAsia="en-IN"/>
-        </w:rPr>
-        <w:t>);</w:t>
-      </w:r>
-      <w:r>
-        <w:rPr>
-          <w:rFonts w:ascii="Courier New" w:eastAsia="Times New Roman" w:hAnsi="Courier New" w:cs="Courier New"/>
-          <w:color w:val="BCBEC4"/>
-          <w:sz w:val="23"/>
-          <w:szCs w:val="23"/>
-          <w:lang w:eastAsia="en-IN"/>
-        </w:rPr>
-        <w:br/>
-        <w:t xml:space="preserve">        report.setSystemInfo(</w:t>
-      </w:r>
-      <w:r>
-        <w:rPr>
-          <w:rFonts w:ascii="Courier New" w:eastAsia="Times New Roman" w:hAnsi="Courier New" w:cs="Courier New"/>
-          <w:color w:val="6AAB73"/>
-          <w:sz w:val="23"/>
-          <w:szCs w:val="23"/>
-          <w:lang w:eastAsia="en-IN"/>
-        </w:rPr>
-        <w:t>"Processor"</w:t>
-      </w:r>
-      <w:r>
-        <w:rPr>
-          <w:rFonts w:ascii="Courier New" w:eastAsia="Times New Roman" w:hAnsi="Courier New" w:cs="Courier New"/>
-          <w:color w:val="BCBEC4"/>
-          <w:sz w:val="23"/>
-          <w:szCs w:val="23"/>
-          <w:lang w:eastAsia="en-IN"/>
-        </w:rPr>
-        <w:t xml:space="preserve">, </w:t>
-      </w:r>
-      <w:r>
-        <w:rPr>
-          <w:rFonts w:ascii="Courier New" w:eastAsia="Times New Roman" w:hAnsi="Courier New" w:cs="Courier New"/>
-          <w:color w:val="6AAB73"/>
-          <w:sz w:val="23"/>
-          <w:szCs w:val="23"/>
-          <w:lang w:eastAsia="en-IN"/>
-        </w:rPr>
-        <w:t>"I5"</w:t>
-      </w:r>
-      <w:r>
-        <w:rPr>
-          <w:rFonts w:ascii="Courier New" w:eastAsia="Times New Roman" w:hAnsi="Courier New" w:cs="Courier New"/>
-          <w:color w:val="BCBEC4"/>
-          <w:sz w:val="23"/>
-          <w:szCs w:val="23"/>
-          <w:lang w:eastAsia="en-IN"/>
-        </w:rPr>
-        <w:t>);</w:t>
-      </w:r>
-      <w:r>
-        <w:rPr>
-          <w:rFonts w:ascii="Courier New" w:eastAsia="Times New Roman" w:hAnsi="Courier New" w:cs="Courier New"/>
-          <w:color w:val="BCBEC4"/>
-          <w:sz w:val="23"/>
-          <w:szCs w:val="23"/>
-          <w:lang w:eastAsia="en-IN"/>
-        </w:rPr>
-        <w:br/>
-      </w:r>
-      <w:r>
-        <w:rPr>
-          <w:rFonts w:ascii="Courier New" w:eastAsia="Times New Roman" w:hAnsi="Courier New" w:cs="Courier New"/>
-          <w:color w:val="BCBEC4"/>
-          <w:sz w:val="23"/>
-          <w:szCs w:val="23"/>
-          <w:lang w:eastAsia="en-IN"/>
-        </w:rPr>
-        <w:br/>
-        <w:t xml:space="preserve">        </w:t>
-      </w:r>
-      <w:r>
-        <w:rPr>
-          <w:rFonts w:ascii="Courier New" w:eastAsia="Times New Roman" w:hAnsi="Courier New" w:cs="Courier New"/>
-          <w:color w:val="7A7E85"/>
-          <w:sz w:val="23"/>
-          <w:szCs w:val="23"/>
-          <w:lang w:eastAsia="en-IN"/>
-        </w:rPr>
-        <w:t>//Configuration of look and feel of the report</w:t>
-      </w:r>
-      <w:r>
-        <w:rPr>
-          <w:rFonts w:ascii="Courier New" w:eastAsia="Times New Roman" w:hAnsi="Courier New" w:cs="Courier New"/>
-          <w:color w:val="7A7E85"/>
-          <w:sz w:val="23"/>
-          <w:szCs w:val="23"/>
-          <w:lang w:eastAsia="en-IN"/>
-        </w:rPr>
-        <w:br/>
-        <w:t xml:space="preserve">        </w:t>
-      </w:r>
-      <w:r>
-        <w:rPr>
-          <w:rFonts w:ascii="Courier New" w:eastAsia="Times New Roman" w:hAnsi="Courier New" w:cs="Courier New"/>
-          <w:color w:val="BCBEC4"/>
-          <w:sz w:val="23"/>
-          <w:szCs w:val="23"/>
-          <w:lang w:eastAsia="en-IN"/>
-        </w:rPr>
-        <w:t>htmlReport.config().setDocumentTitle(</w:t>
-      </w:r>
-      <w:r>
-        <w:rPr>
-          <w:rFonts w:ascii="Courier New" w:eastAsia="Times New Roman" w:hAnsi="Courier New" w:cs="Courier New"/>
-          <w:color w:val="6AAB73"/>
-          <w:sz w:val="23"/>
-          <w:szCs w:val="23"/>
-          <w:lang w:eastAsia="en-IN"/>
-        </w:rPr>
-        <w:t>"My First Extent Report"</w:t>
-      </w:r>
-      <w:r>
-        <w:rPr>
-          <w:rFonts w:ascii="Courier New" w:eastAsia="Times New Roman" w:hAnsi="Courier New" w:cs="Courier New"/>
-          <w:color w:val="BCBEC4"/>
-          <w:sz w:val="23"/>
-          <w:szCs w:val="23"/>
-          <w:lang w:eastAsia="en-IN"/>
-        </w:rPr>
-        <w:t>);</w:t>
-      </w:r>
-      <w:r>
-        <w:rPr>
-          <w:rFonts w:ascii="Courier New" w:eastAsia="Times New Roman" w:hAnsi="Courier New" w:cs="Courier New"/>
-          <w:color w:val="BCBEC4"/>
-          <w:sz w:val="23"/>
-          <w:szCs w:val="23"/>
-          <w:lang w:eastAsia="en-IN"/>
-        </w:rPr>
-        <w:br/>
-        <w:t xml:space="preserve">        htmlReport.config().setReportName(</w:t>
-      </w:r>
-      <w:r>
-        <w:rPr>
-          <w:rFonts w:ascii="Courier New" w:eastAsia="Times New Roman" w:hAnsi="Courier New" w:cs="Courier New"/>
-          <w:color w:val="6AAB73"/>
-          <w:sz w:val="23"/>
-          <w:szCs w:val="23"/>
-          <w:lang w:eastAsia="en-IN"/>
-        </w:rPr>
-        <w:t>"Google Report"</w:t>
-      </w:r>
-      <w:r>
-        <w:rPr>
-          <w:rFonts w:ascii="Courier New" w:eastAsia="Times New Roman" w:hAnsi="Courier New" w:cs="Courier New"/>
-          <w:color w:val="BCBEC4"/>
-          <w:sz w:val="23"/>
-          <w:szCs w:val="23"/>
-          <w:lang w:eastAsia="en-IN"/>
-        </w:rPr>
-        <w:t>);</w:t>
-      </w:r>
-      <w:r>
-        <w:rPr>
-          <w:rFonts w:ascii="Courier New" w:eastAsia="Times New Roman" w:hAnsi="Courier New" w:cs="Courier New"/>
-          <w:color w:val="BCBEC4"/>
-          <w:sz w:val="23"/>
-          <w:szCs w:val="23"/>
-          <w:lang w:eastAsia="en-IN"/>
-        </w:rPr>
-        <w:br/>
-        <w:t xml:space="preserve">        htmlReport.config().setTheme(Theme.</w:t>
-      </w:r>
-      <w:r>
-        <w:rPr>
-          <w:rFonts w:ascii="Courier New" w:eastAsia="Times New Roman" w:hAnsi="Courier New" w:cs="Courier New"/>
-          <w:i/>
-          <w:iCs/>
-          <w:color w:val="C77DBB"/>
-          <w:sz w:val="23"/>
-          <w:szCs w:val="23"/>
-          <w:lang w:eastAsia="en-IN"/>
-        </w:rPr>
-        <w:t>STANDARD</w:t>
-      </w:r>
-      <w:r>
-        <w:rPr>
-          <w:rFonts w:ascii="Courier New" w:eastAsia="Times New Roman" w:hAnsi="Courier New" w:cs="Courier New"/>
-          <w:color w:val="BCBEC4"/>
-          <w:sz w:val="23"/>
-          <w:szCs w:val="23"/>
-          <w:lang w:eastAsia="en-IN"/>
-        </w:rPr>
-        <w:t>);</w:t>
-      </w:r>
-      <w:r>
-        <w:rPr>
-          <w:rFonts w:ascii="Courier New" w:eastAsia="Times New Roman" w:hAnsi="Courier New" w:cs="Courier New"/>
-          <w:color w:val="BCBEC4"/>
-          <w:sz w:val="23"/>
-          <w:szCs w:val="23"/>
-          <w:lang w:eastAsia="en-IN"/>
-        </w:rPr>
-        <w:br/>
-        <w:t xml:space="preserve">        htmlReport.config().setTimeStampFormat(</w:t>
-      </w:r>
-      <w:r>
-        <w:rPr>
-          <w:rFonts w:ascii="Courier New" w:eastAsia="Times New Roman" w:hAnsi="Courier New" w:cs="Courier New"/>
-          <w:color w:val="6AAB73"/>
-          <w:sz w:val="23"/>
-          <w:szCs w:val="23"/>
-          <w:lang w:eastAsia="en-IN"/>
-        </w:rPr>
-        <w:t>"dd-MMM-yyyy"</w:t>
-      </w:r>
-      <w:r>
-        <w:rPr>
-          <w:rFonts w:ascii="Courier New" w:eastAsia="Times New Roman" w:hAnsi="Courier New" w:cs="Courier New"/>
-          <w:color w:val="BCBEC4"/>
-          <w:sz w:val="23"/>
-          <w:szCs w:val="23"/>
-          <w:lang w:eastAsia="en-IN"/>
-        </w:rPr>
-        <w:t>);</w:t>
-      </w:r>
-      <w:r>
-        <w:rPr>
-          <w:rFonts w:ascii="Courier New" w:eastAsia="Times New Roman" w:hAnsi="Courier New" w:cs="Courier New"/>
-          <w:color w:val="BCBEC4"/>
-          <w:sz w:val="23"/>
-          <w:szCs w:val="23"/>
-          <w:lang w:eastAsia="en-IN"/>
-        </w:rPr>
-        <w:br/>
-      </w:r>
-      <w:r>
-        <w:rPr>
-          <w:rFonts w:ascii="Courier New" w:eastAsia="Times New Roman" w:hAnsi="Courier New" w:cs="Courier New"/>
-          <w:color w:val="BCBEC4"/>
-          <w:sz w:val="23"/>
-          <w:szCs w:val="23"/>
-          <w:lang w:eastAsia="en-IN"/>
-        </w:rPr>
-        <w:br/>
-        <w:t xml:space="preserve">        test = report.createTest(</w:t>
-      </w:r>
-      <w:r>
-        <w:rPr>
-          <w:rFonts w:ascii="Courier New" w:eastAsia="Times New Roman" w:hAnsi="Courier New" w:cs="Courier New"/>
-          <w:color w:val="6AAB73"/>
-          <w:sz w:val="23"/>
-          <w:szCs w:val="23"/>
-          <w:lang w:eastAsia="en-IN"/>
-        </w:rPr>
-        <w:t>"Google Title Test"</w:t>
-      </w:r>
-      <w:r>
-        <w:rPr>
-          <w:rFonts w:ascii="Courier New" w:eastAsia="Times New Roman" w:hAnsi="Courier New" w:cs="Courier New"/>
-          <w:color w:val="BCBEC4"/>
-          <w:sz w:val="23"/>
-          <w:szCs w:val="23"/>
-          <w:lang w:eastAsia="en-IN"/>
-        </w:rPr>
-        <w:t>);</w:t>
-      </w:r>
-      <w:r>
-        <w:rPr>
-          <w:rFonts w:ascii="Courier New" w:eastAsia="Times New Roman" w:hAnsi="Courier New" w:cs="Courier New"/>
-          <w:color w:val="BCBEC4"/>
-          <w:sz w:val="23"/>
-          <w:szCs w:val="23"/>
-          <w:lang w:eastAsia="en-IN"/>
-        </w:rPr>
-        <w:br/>
-      </w:r>
-      <w:r>
-        <w:rPr>
-          <w:rFonts w:ascii="Courier New" w:eastAsia="Times New Roman" w:hAnsi="Courier New" w:cs="Courier New"/>
-          <w:color w:val="BCBEC4"/>
-          <w:sz w:val="23"/>
-          <w:szCs w:val="23"/>
-          <w:lang w:eastAsia="en-IN"/>
-        </w:rPr>
-        <w:br/>
-        <w:t xml:space="preserve">        driver = </w:t>
-      </w:r>
-      <w:r>
-        <w:rPr>
-          <w:rFonts w:ascii="Courier New" w:eastAsia="Times New Roman" w:hAnsi="Courier New" w:cs="Courier New"/>
-          <w:color w:val="CF8E6D"/>
-          <w:sz w:val="23"/>
-          <w:szCs w:val="23"/>
-          <w:lang w:eastAsia="en-IN"/>
-        </w:rPr>
-        <w:t xml:space="preserve">new </w:t>
-      </w:r>
-      <w:r>
-        <w:rPr>
-          <w:rFonts w:ascii="Courier New" w:eastAsia="Times New Roman" w:hAnsi="Courier New" w:cs="Courier New"/>
-          <w:color w:val="BCBEC4"/>
-          <w:sz w:val="23"/>
-          <w:szCs w:val="23"/>
-          <w:lang w:eastAsia="en-IN"/>
-        </w:rPr>
-        <w:t>ChromeDriver();</w:t>
-      </w:r>
-      <w:r>
-        <w:rPr>
-          <w:rFonts w:ascii="Courier New" w:eastAsia="Times New Roman" w:hAnsi="Courier New" w:cs="Courier New"/>
-          <w:color w:val="BCBEC4"/>
-          <w:sz w:val="23"/>
-          <w:szCs w:val="23"/>
-          <w:lang w:eastAsia="en-IN"/>
-        </w:rPr>
-        <w:br/>
-      </w:r>
-      <w:r>
-        <w:rPr>
-          <w:rFonts w:ascii="Courier New" w:eastAsia="Times New Roman" w:hAnsi="Courier New" w:cs="Courier New"/>
-          <w:color w:val="BCBEC4"/>
-          <w:sz w:val="23"/>
-          <w:szCs w:val="23"/>
-          <w:lang w:eastAsia="en-IN"/>
-        </w:rPr>
-        <w:lastRenderedPageBreak/>
-        <w:t xml:space="preserve">        driver.manage().window().maximize();</w:t>
-      </w:r>
-      <w:r>
-        <w:rPr>
-          <w:rFonts w:ascii="Courier New" w:eastAsia="Times New Roman" w:hAnsi="Courier New" w:cs="Courier New"/>
-          <w:color w:val="BCBEC4"/>
-          <w:sz w:val="23"/>
-          <w:szCs w:val="23"/>
-          <w:lang w:eastAsia="en-IN"/>
-        </w:rPr>
-        <w:br/>
-        <w:t xml:space="preserve">        driver.manage().timeouts().implicitlyWait(Duration.</w:t>
-      </w:r>
-      <w:r>
-        <w:rPr>
-          <w:rFonts w:ascii="Courier New" w:eastAsia="Times New Roman" w:hAnsi="Courier New" w:cs="Courier New"/>
-          <w:i/>
-          <w:iCs/>
-          <w:color w:val="BCBEC4"/>
-          <w:sz w:val="23"/>
-          <w:szCs w:val="23"/>
-          <w:lang w:eastAsia="en-IN"/>
-        </w:rPr>
-        <w:t>ofSeconds</w:t>
-      </w:r>
-      <w:r>
-        <w:rPr>
-          <w:rFonts w:ascii="Courier New" w:eastAsia="Times New Roman" w:hAnsi="Courier New" w:cs="Courier New"/>
-          <w:color w:val="BCBEC4"/>
-          <w:sz w:val="23"/>
-          <w:szCs w:val="23"/>
-          <w:lang w:eastAsia="en-IN"/>
-        </w:rPr>
-        <w:t>(</w:t>
-      </w:r>
-      <w:r>
-        <w:rPr>
-          <w:rFonts w:ascii="Courier New" w:eastAsia="Times New Roman" w:hAnsi="Courier New" w:cs="Courier New"/>
-          <w:color w:val="2AACB8"/>
-          <w:sz w:val="23"/>
-          <w:szCs w:val="23"/>
-          <w:lang w:eastAsia="en-IN"/>
-        </w:rPr>
-        <w:t>10</w:t>
-      </w:r>
-      <w:r>
-        <w:rPr>
-          <w:rFonts w:ascii="Courier New" w:eastAsia="Times New Roman" w:hAnsi="Courier New" w:cs="Courier New"/>
-          <w:color w:val="BCBEC4"/>
-          <w:sz w:val="23"/>
-          <w:szCs w:val="23"/>
-          <w:lang w:eastAsia="en-IN"/>
-        </w:rPr>
-        <w:t>));</w:t>
-      </w:r>
-      <w:r>
-        <w:rPr>
-          <w:rFonts w:ascii="Courier New" w:eastAsia="Times New Roman" w:hAnsi="Courier New" w:cs="Courier New"/>
-          <w:color w:val="BCBEC4"/>
-          <w:sz w:val="23"/>
-          <w:szCs w:val="23"/>
-          <w:lang w:eastAsia="en-IN"/>
-        </w:rPr>
-        <w:br/>
-      </w:r>
-      <w:r>
-        <w:rPr>
-          <w:rFonts w:ascii="Courier New" w:eastAsia="Times New Roman" w:hAnsi="Courier New" w:cs="Courier New"/>
-          <w:color w:val="BCBEC4"/>
-          <w:sz w:val="23"/>
-          <w:szCs w:val="23"/>
-          <w:lang w:eastAsia="en-IN"/>
-        </w:rPr>
-        <w:br/>
-        <w:t xml:space="preserve">        driver.get(</w:t>
-      </w:r>
-      <w:r>
-        <w:rPr>
-          <w:rFonts w:ascii="Courier New" w:eastAsia="Times New Roman" w:hAnsi="Courier New" w:cs="Courier New"/>
-          <w:color w:val="6AAB73"/>
-          <w:sz w:val="23"/>
-          <w:szCs w:val="23"/>
-          <w:lang w:eastAsia="en-IN"/>
-        </w:rPr>
-        <w:t>"https://www.google.com"</w:t>
-      </w:r>
-      <w:r>
-        <w:rPr>
-          <w:rFonts w:ascii="Courier New" w:eastAsia="Times New Roman" w:hAnsi="Courier New" w:cs="Courier New"/>
-          <w:color w:val="BCBEC4"/>
-          <w:sz w:val="23"/>
-          <w:szCs w:val="23"/>
-          <w:lang w:eastAsia="en-IN"/>
-        </w:rPr>
-        <w:t>);</w:t>
-      </w:r>
-      <w:r>
-        <w:rPr>
-          <w:rFonts w:ascii="Courier New" w:eastAsia="Times New Roman" w:hAnsi="Courier New" w:cs="Courier New"/>
-          <w:color w:val="BCBEC4"/>
-          <w:sz w:val="23"/>
-          <w:szCs w:val="23"/>
-          <w:lang w:eastAsia="en-IN"/>
-        </w:rPr>
-        <w:br/>
-        <w:t xml:space="preserve">        System.</w:t>
-      </w:r>
-      <w:r>
-        <w:rPr>
-          <w:rFonts w:ascii="Courier New" w:eastAsia="Times New Roman" w:hAnsi="Courier New" w:cs="Courier New"/>
-          <w:i/>
-          <w:iCs/>
-          <w:color w:val="C77DBB"/>
-          <w:sz w:val="23"/>
-          <w:szCs w:val="23"/>
-          <w:lang w:eastAsia="en-IN"/>
-        </w:rPr>
-        <w:t>out</w:t>
-      </w:r>
-      <w:r>
-        <w:rPr>
-          <w:rFonts w:ascii="Courier New" w:eastAsia="Times New Roman" w:hAnsi="Courier New" w:cs="Courier New"/>
-          <w:color w:val="BCBEC4"/>
-          <w:sz w:val="23"/>
-          <w:szCs w:val="23"/>
-          <w:lang w:eastAsia="en-IN"/>
-        </w:rPr>
-        <w:t>.println(</w:t>
-      </w:r>
-      <w:r>
-        <w:rPr>
-          <w:rFonts w:ascii="Courier New" w:eastAsia="Times New Roman" w:hAnsi="Courier New" w:cs="Courier New"/>
-          <w:color w:val="6AAB73"/>
-          <w:sz w:val="23"/>
-          <w:szCs w:val="23"/>
-          <w:lang w:eastAsia="en-IN"/>
-        </w:rPr>
-        <w:t xml:space="preserve">"Title: " </w:t>
-      </w:r>
-      <w:r>
-        <w:rPr>
-          <w:rFonts w:ascii="Courier New" w:eastAsia="Times New Roman" w:hAnsi="Courier New" w:cs="Courier New"/>
-          <w:color w:val="BCBEC4"/>
-          <w:sz w:val="23"/>
-          <w:szCs w:val="23"/>
-          <w:lang w:eastAsia="en-IN"/>
-        </w:rPr>
-        <w:t>+ driver.getTitle());</w:t>
-      </w:r>
-      <w:r>
-        <w:rPr>
-          <w:rFonts w:ascii="Courier New" w:eastAsia="Times New Roman" w:hAnsi="Courier New" w:cs="Courier New"/>
-          <w:color w:val="BCBEC4"/>
-          <w:sz w:val="23"/>
-          <w:szCs w:val="23"/>
-          <w:lang w:eastAsia="en-IN"/>
-        </w:rPr>
-        <w:br/>
-      </w:r>
-      <w:r>
-        <w:rPr>
-          <w:rFonts w:ascii="Courier New" w:eastAsia="Times New Roman" w:hAnsi="Courier New" w:cs="Courier New"/>
-          <w:color w:val="BCBEC4"/>
-          <w:sz w:val="23"/>
-          <w:szCs w:val="23"/>
-          <w:lang w:eastAsia="en-IN"/>
-        </w:rPr>
-        <w:br/>
-        <w:t xml:space="preserve">        driver.close();</w:t>
-      </w:r>
-      <w:r>
-        <w:rPr>
-          <w:rFonts w:ascii="Courier New" w:eastAsia="Times New Roman" w:hAnsi="Courier New" w:cs="Courier New"/>
-          <w:color w:val="BCBEC4"/>
-          <w:sz w:val="23"/>
-          <w:szCs w:val="23"/>
-          <w:lang w:eastAsia="en-IN"/>
-        </w:rPr>
-        <w:br/>
-      </w:r>
-      <w:r>
-        <w:rPr>
-          <w:rFonts w:ascii="Courier New" w:eastAsia="Times New Roman" w:hAnsi="Courier New" w:cs="Courier New"/>
-          <w:color w:val="BCBEC4"/>
-          <w:sz w:val="23"/>
-          <w:szCs w:val="23"/>
-          <w:lang w:eastAsia="en-IN"/>
-        </w:rPr>
-        <w:br/>
-        <w:t xml:space="preserve">        test.log(Status.</w:t>
-      </w:r>
-      <w:r>
-        <w:rPr>
-          <w:rFonts w:ascii="Courier New" w:eastAsia="Times New Roman" w:hAnsi="Courier New" w:cs="Courier New"/>
-          <w:i/>
-          <w:iCs/>
-          <w:color w:val="C77DBB"/>
-          <w:sz w:val="23"/>
-          <w:szCs w:val="23"/>
-          <w:lang w:eastAsia="en-IN"/>
-        </w:rPr>
-        <w:t>PASS</w:t>
-      </w:r>
-      <w:r>
-        <w:rPr>
-          <w:rFonts w:ascii="Courier New" w:eastAsia="Times New Roman" w:hAnsi="Courier New" w:cs="Courier New"/>
-          <w:color w:val="BCBEC4"/>
-          <w:sz w:val="23"/>
-          <w:szCs w:val="23"/>
-          <w:lang w:eastAsia="en-IN"/>
-        </w:rPr>
-        <w:t>, MarkupHelper.</w:t>
-      </w:r>
-      <w:r>
-        <w:rPr>
-          <w:rFonts w:ascii="Courier New" w:eastAsia="Times New Roman" w:hAnsi="Courier New" w:cs="Courier New"/>
-          <w:i/>
-          <w:iCs/>
-          <w:color w:val="BCBEC4"/>
-          <w:sz w:val="23"/>
-          <w:szCs w:val="23"/>
-          <w:lang w:eastAsia="en-IN"/>
-        </w:rPr>
-        <w:t>createLabel</w:t>
-      </w:r>
-      <w:r>
-        <w:rPr>
-          <w:rFonts w:ascii="Courier New" w:eastAsia="Times New Roman" w:hAnsi="Courier New" w:cs="Courier New"/>
-          <w:color w:val="BCBEC4"/>
-          <w:sz w:val="23"/>
-          <w:szCs w:val="23"/>
-          <w:lang w:eastAsia="en-IN"/>
-        </w:rPr>
-        <w:t>(</w:t>
-      </w:r>
-      <w:r>
-        <w:rPr>
-          <w:rFonts w:ascii="Courier New" w:eastAsia="Times New Roman" w:hAnsi="Courier New" w:cs="Courier New"/>
-          <w:color w:val="6AAB73"/>
-          <w:sz w:val="23"/>
-          <w:szCs w:val="23"/>
-          <w:lang w:eastAsia="en-IN"/>
-        </w:rPr>
-        <w:t>"Title Test"</w:t>
-      </w:r>
-      <w:r>
-        <w:rPr>
-          <w:rFonts w:ascii="Courier New" w:eastAsia="Times New Roman" w:hAnsi="Courier New" w:cs="Courier New"/>
-          <w:color w:val="BCBEC4"/>
-          <w:sz w:val="23"/>
-          <w:szCs w:val="23"/>
-          <w:lang w:eastAsia="en-IN"/>
-        </w:rPr>
-        <w:t>, ExtentColor.</w:t>
-      </w:r>
-      <w:r>
-        <w:rPr>
-          <w:rFonts w:ascii="Courier New" w:eastAsia="Times New Roman" w:hAnsi="Courier New" w:cs="Courier New"/>
-          <w:i/>
-          <w:iCs/>
-          <w:color w:val="C77DBB"/>
-          <w:sz w:val="23"/>
-          <w:szCs w:val="23"/>
-          <w:lang w:eastAsia="en-IN"/>
-        </w:rPr>
-        <w:t>GREEN</w:t>
-      </w:r>
-      <w:r>
-        <w:rPr>
-          <w:rFonts w:ascii="Courier New" w:eastAsia="Times New Roman" w:hAnsi="Courier New" w:cs="Courier New"/>
-          <w:color w:val="BCBEC4"/>
-          <w:sz w:val="23"/>
-          <w:szCs w:val="23"/>
-          <w:lang w:eastAsia="en-IN"/>
-        </w:rPr>
-        <w:t>));</w:t>
-      </w:r>
-      <w:r>
-        <w:rPr>
-          <w:rFonts w:ascii="Courier New" w:eastAsia="Times New Roman" w:hAnsi="Courier New" w:cs="Courier New"/>
-          <w:color w:val="BCBEC4"/>
-          <w:sz w:val="23"/>
-          <w:szCs w:val="23"/>
-          <w:lang w:eastAsia="en-IN"/>
-        </w:rPr>
-        <w:br/>
-      </w:r>
-      <w:r>
-        <w:rPr>
-          <w:rFonts w:ascii="Courier New" w:eastAsia="Times New Roman" w:hAnsi="Courier New" w:cs="Courier New"/>
-          <w:color w:val="BCBEC4"/>
-          <w:sz w:val="23"/>
-          <w:szCs w:val="23"/>
-          <w:lang w:eastAsia="en-IN"/>
-        </w:rPr>
-        <w:br/>
-        <w:t xml:space="preserve">        </w:t>
-      </w:r>
-      <w:r>
-        <w:rPr>
-          <w:rFonts w:ascii="Courier New" w:eastAsia="Times New Roman" w:hAnsi="Courier New" w:cs="Courier New"/>
-          <w:color w:val="7A7E85"/>
-          <w:sz w:val="23"/>
-          <w:szCs w:val="23"/>
-          <w:lang w:eastAsia="en-IN"/>
-        </w:rPr>
-        <w:t>//Create another test</w:t>
-      </w:r>
-      <w:r>
-        <w:rPr>
-          <w:rFonts w:ascii="Courier New" w:eastAsia="Times New Roman" w:hAnsi="Courier New" w:cs="Courier New"/>
-          <w:color w:val="7A7E85"/>
-          <w:sz w:val="23"/>
-          <w:szCs w:val="23"/>
-          <w:lang w:eastAsia="en-IN"/>
-        </w:rPr>
-        <w:br/>
-        <w:t xml:space="preserve">        </w:t>
-      </w:r>
-      <w:r>
-        <w:rPr>
-          <w:rFonts w:ascii="Courier New" w:eastAsia="Times New Roman" w:hAnsi="Courier New" w:cs="Courier New"/>
-          <w:color w:val="BCBEC4"/>
-          <w:sz w:val="23"/>
-          <w:szCs w:val="23"/>
-          <w:lang w:eastAsia="en-IN"/>
-        </w:rPr>
-        <w:t>test = report.createTest(</w:t>
-      </w:r>
-      <w:r>
-        <w:rPr>
-          <w:rFonts w:ascii="Courier New" w:eastAsia="Times New Roman" w:hAnsi="Courier New" w:cs="Courier New"/>
-          <w:color w:val="6AAB73"/>
-          <w:sz w:val="23"/>
-          <w:szCs w:val="23"/>
-          <w:lang w:eastAsia="en-IN"/>
-        </w:rPr>
-        <w:t>"Google Search Test"</w:t>
-      </w:r>
-      <w:r>
-        <w:rPr>
-          <w:rFonts w:ascii="Courier New" w:eastAsia="Times New Roman" w:hAnsi="Courier New" w:cs="Courier New"/>
-          <w:color w:val="BCBEC4"/>
-          <w:sz w:val="23"/>
-          <w:szCs w:val="23"/>
-          <w:lang w:eastAsia="en-IN"/>
-        </w:rPr>
-        <w:t>);</w:t>
-      </w:r>
-      <w:r>
-        <w:rPr>
-          <w:rFonts w:ascii="Courier New" w:eastAsia="Times New Roman" w:hAnsi="Courier New" w:cs="Courier New"/>
-          <w:color w:val="BCBEC4"/>
-          <w:sz w:val="23"/>
-          <w:szCs w:val="23"/>
-          <w:lang w:eastAsia="en-IN"/>
-        </w:rPr>
-        <w:br/>
-      </w:r>
-      <w:r>
-        <w:rPr>
-          <w:rFonts w:ascii="Courier New" w:eastAsia="Times New Roman" w:hAnsi="Courier New" w:cs="Courier New"/>
-          <w:color w:val="BCBEC4"/>
-          <w:sz w:val="23"/>
-          <w:szCs w:val="23"/>
-          <w:lang w:eastAsia="en-IN"/>
-        </w:rPr>
-        <w:br/>
-        <w:t xml:space="preserve">        driver = </w:t>
-      </w:r>
-      <w:r>
-        <w:rPr>
-          <w:rFonts w:ascii="Courier New" w:eastAsia="Times New Roman" w:hAnsi="Courier New" w:cs="Courier New"/>
-          <w:color w:val="CF8E6D"/>
-          <w:sz w:val="23"/>
-          <w:szCs w:val="23"/>
-          <w:lang w:eastAsia="en-IN"/>
-        </w:rPr>
-        <w:t xml:space="preserve">new </w:t>
-      </w:r>
-      <w:r>
-        <w:rPr>
-          <w:rFonts w:ascii="Courier New" w:eastAsia="Times New Roman" w:hAnsi="Courier New" w:cs="Courier New"/>
-          <w:color w:val="BCBEC4"/>
-          <w:sz w:val="23"/>
-          <w:szCs w:val="23"/>
-          <w:lang w:eastAsia="en-IN"/>
-        </w:rPr>
-        <w:t>ChromeDriver();</w:t>
-      </w:r>
-      <w:r>
-        <w:rPr>
-          <w:rFonts w:ascii="Courier New" w:eastAsia="Times New Roman" w:hAnsi="Courier New" w:cs="Courier New"/>
-          <w:color w:val="BCBEC4"/>
-          <w:sz w:val="23"/>
-          <w:szCs w:val="23"/>
-          <w:lang w:eastAsia="en-IN"/>
-        </w:rPr>
-        <w:br/>
-        <w:t xml:space="preserve">        driver.manage().window().maximize();</w:t>
-      </w:r>
-      <w:r>
-        <w:rPr>
-          <w:rFonts w:ascii="Courier New" w:eastAsia="Times New Roman" w:hAnsi="Courier New" w:cs="Courier New"/>
-          <w:color w:val="BCBEC4"/>
-          <w:sz w:val="23"/>
-          <w:szCs w:val="23"/>
-          <w:lang w:eastAsia="en-IN"/>
-        </w:rPr>
-        <w:br/>
-        <w:t xml:space="preserve">        driver.manage().timeouts().implicitlyWait(Duration.</w:t>
-      </w:r>
-      <w:r>
-        <w:rPr>
-          <w:rFonts w:ascii="Courier New" w:eastAsia="Times New Roman" w:hAnsi="Courier New" w:cs="Courier New"/>
-          <w:i/>
-          <w:iCs/>
-          <w:color w:val="BCBEC4"/>
-          <w:sz w:val="23"/>
-          <w:szCs w:val="23"/>
-          <w:lang w:eastAsia="en-IN"/>
-        </w:rPr>
-        <w:t>ofSeconds</w:t>
-      </w:r>
-      <w:r>
-        <w:rPr>
-          <w:rFonts w:ascii="Courier New" w:eastAsia="Times New Roman" w:hAnsi="Courier New" w:cs="Courier New"/>
-          <w:color w:val="BCBEC4"/>
-          <w:sz w:val="23"/>
-          <w:szCs w:val="23"/>
-          <w:lang w:eastAsia="en-IN"/>
-        </w:rPr>
-        <w:t>(</w:t>
-      </w:r>
-      <w:r>
-        <w:rPr>
-          <w:rFonts w:ascii="Courier New" w:eastAsia="Times New Roman" w:hAnsi="Courier New" w:cs="Courier New"/>
-          <w:color w:val="2AACB8"/>
-          <w:sz w:val="23"/>
-          <w:szCs w:val="23"/>
-          <w:lang w:eastAsia="en-IN"/>
-        </w:rPr>
-        <w:t>10</w:t>
-      </w:r>
-      <w:r>
-        <w:rPr>
-          <w:rFonts w:ascii="Courier New" w:eastAsia="Times New Roman" w:hAnsi="Courier New" w:cs="Courier New"/>
-          <w:color w:val="BCBEC4"/>
-          <w:sz w:val="23"/>
-          <w:szCs w:val="23"/>
-          <w:lang w:eastAsia="en-IN"/>
-        </w:rPr>
-        <w:t>));</w:t>
-      </w:r>
-      <w:r>
-        <w:rPr>
-          <w:rFonts w:ascii="Courier New" w:eastAsia="Times New Roman" w:hAnsi="Courier New" w:cs="Courier New"/>
-          <w:color w:val="BCBEC4"/>
-          <w:sz w:val="23"/>
-          <w:szCs w:val="23"/>
-          <w:lang w:eastAsia="en-IN"/>
-        </w:rPr>
-        <w:br/>
-      </w:r>
-      <w:r>
-        <w:rPr>
-          <w:rFonts w:ascii="Courier New" w:eastAsia="Times New Roman" w:hAnsi="Courier New" w:cs="Courier New"/>
-          <w:color w:val="BCBEC4"/>
-          <w:sz w:val="23"/>
-          <w:szCs w:val="23"/>
-          <w:lang w:eastAsia="en-IN"/>
-        </w:rPr>
-        <w:br/>
-        <w:t xml:space="preserve">        driver.get(</w:t>
-      </w:r>
-      <w:r>
-        <w:rPr>
-          <w:rFonts w:ascii="Courier New" w:eastAsia="Times New Roman" w:hAnsi="Courier New" w:cs="Courier New"/>
-          <w:color w:val="6AAB73"/>
-          <w:sz w:val="23"/>
-          <w:szCs w:val="23"/>
-          <w:lang w:eastAsia="en-IN"/>
-        </w:rPr>
-        <w:t>"https://www.google.com"</w:t>
-      </w:r>
-      <w:r>
-        <w:rPr>
-          <w:rFonts w:ascii="Courier New" w:eastAsia="Times New Roman" w:hAnsi="Courier New" w:cs="Courier New"/>
-          <w:color w:val="BCBEC4"/>
-          <w:sz w:val="23"/>
-          <w:szCs w:val="23"/>
-          <w:lang w:eastAsia="en-IN"/>
-        </w:rPr>
-        <w:t>);</w:t>
-      </w:r>
-      <w:r>
-        <w:rPr>
-          <w:rFonts w:ascii="Courier New" w:eastAsia="Times New Roman" w:hAnsi="Courier New" w:cs="Courier New"/>
-          <w:color w:val="BCBEC4"/>
-          <w:sz w:val="23"/>
-          <w:szCs w:val="23"/>
-          <w:lang w:eastAsia="en-IN"/>
-        </w:rPr>
-        <w:br/>
-      </w:r>
-      <w:r>
-        <w:rPr>
-          <w:rFonts w:ascii="Courier New" w:eastAsia="Times New Roman" w:hAnsi="Courier New" w:cs="Courier New"/>
-          <w:color w:val="BCBEC4"/>
-          <w:sz w:val="23"/>
-          <w:szCs w:val="23"/>
-          <w:lang w:eastAsia="en-IN"/>
-        </w:rPr>
-        <w:br/>
-        <w:t xml:space="preserve">        driver.findElement(By.</w:t>
-      </w:r>
-      <w:r>
-        <w:rPr>
-          <w:rFonts w:ascii="Courier New" w:eastAsia="Times New Roman" w:hAnsi="Courier New" w:cs="Courier New"/>
-          <w:i/>
-          <w:iCs/>
-          <w:color w:val="BCBEC4"/>
-          <w:sz w:val="23"/>
-          <w:szCs w:val="23"/>
-          <w:lang w:eastAsia="en-IN"/>
-        </w:rPr>
-        <w:t>name</w:t>
-      </w:r>
-      <w:r>
-        <w:rPr>
-          <w:rFonts w:ascii="Courier New" w:eastAsia="Times New Roman" w:hAnsi="Courier New" w:cs="Courier New"/>
-          <w:color w:val="BCBEC4"/>
-          <w:sz w:val="23"/>
-          <w:szCs w:val="23"/>
-          <w:lang w:eastAsia="en-IN"/>
-        </w:rPr>
-        <w:t>(</w:t>
-      </w:r>
-      <w:r>
-        <w:rPr>
-          <w:rFonts w:ascii="Courier New" w:eastAsia="Times New Roman" w:hAnsi="Courier New" w:cs="Courier New"/>
-          <w:color w:val="6AAB73"/>
-          <w:sz w:val="23"/>
-          <w:szCs w:val="23"/>
-          <w:lang w:eastAsia="en-IN"/>
-        </w:rPr>
-        <w:t>"q"</w:t>
-      </w:r>
-      <w:r>
-        <w:rPr>
-          <w:rFonts w:ascii="Courier New" w:eastAsia="Times New Roman" w:hAnsi="Courier New" w:cs="Courier New"/>
-          <w:color w:val="BCBEC4"/>
-          <w:sz w:val="23"/>
-          <w:szCs w:val="23"/>
-          <w:lang w:eastAsia="en-IN"/>
-        </w:rPr>
-        <w:t>)).sendKeys(</w:t>
-      </w:r>
-      <w:r>
-        <w:rPr>
-          <w:rFonts w:ascii="Courier New" w:eastAsia="Times New Roman" w:hAnsi="Courier New" w:cs="Courier New"/>
-          <w:color w:val="6AAB73"/>
-          <w:sz w:val="23"/>
-          <w:szCs w:val="23"/>
-          <w:lang w:eastAsia="en-IN"/>
-        </w:rPr>
-        <w:t>"Maven"</w:t>
-      </w:r>
-      <w:r>
-        <w:rPr>
-          <w:rFonts w:ascii="Courier New" w:eastAsia="Times New Roman" w:hAnsi="Courier New" w:cs="Courier New"/>
-          <w:color w:val="BCBEC4"/>
-          <w:sz w:val="23"/>
-          <w:szCs w:val="23"/>
-          <w:lang w:eastAsia="en-IN"/>
-        </w:rPr>
-        <w:t>, Keys.</w:t>
-      </w:r>
-      <w:r>
-        <w:rPr>
-          <w:rFonts w:ascii="Courier New" w:eastAsia="Times New Roman" w:hAnsi="Courier New" w:cs="Courier New"/>
-          <w:i/>
-          <w:iCs/>
-          <w:color w:val="C77DBB"/>
-          <w:sz w:val="23"/>
-          <w:szCs w:val="23"/>
-          <w:lang w:eastAsia="en-IN"/>
-        </w:rPr>
-        <w:t>ENTER</w:t>
-      </w:r>
-      <w:r>
-        <w:rPr>
-          <w:rFonts w:ascii="Courier New" w:eastAsia="Times New Roman" w:hAnsi="Courier New" w:cs="Courier New"/>
-          <w:color w:val="BCBEC4"/>
-          <w:sz w:val="23"/>
-          <w:szCs w:val="23"/>
-          <w:lang w:eastAsia="en-IN"/>
-        </w:rPr>
-        <w:t>);</w:t>
-      </w:r>
-      <w:r>
-        <w:rPr>
-          <w:rFonts w:ascii="Courier New" w:eastAsia="Times New Roman" w:hAnsi="Courier New" w:cs="Courier New"/>
-          <w:color w:val="BCBEC4"/>
-          <w:sz w:val="23"/>
-          <w:szCs w:val="23"/>
-          <w:lang w:eastAsia="en-IN"/>
-        </w:rPr>
-        <w:br/>
-      </w:r>
-      <w:r>
-        <w:rPr>
-          <w:rFonts w:ascii="Courier New" w:eastAsia="Times New Roman" w:hAnsi="Courier New" w:cs="Courier New"/>
-          <w:color w:val="BCBEC4"/>
-          <w:sz w:val="23"/>
-          <w:szCs w:val="23"/>
-          <w:lang w:eastAsia="en-IN"/>
-        </w:rPr>
-        <w:br/>
-        <w:t xml:space="preserve">        </w:t>
-      </w:r>
-      <w:r>
-        <w:rPr>
-          <w:rFonts w:ascii="Courier New" w:eastAsia="Times New Roman" w:hAnsi="Courier New" w:cs="Courier New"/>
-          <w:color w:val="7A7E85"/>
-          <w:sz w:val="23"/>
-          <w:szCs w:val="23"/>
-          <w:lang w:eastAsia="en-IN"/>
-        </w:rPr>
-        <w:t>//Taking screenshot</w:t>
-      </w:r>
-      <w:r>
-        <w:rPr>
-          <w:rFonts w:ascii="Courier New" w:eastAsia="Times New Roman" w:hAnsi="Courier New" w:cs="Courier New"/>
-          <w:color w:val="7A7E85"/>
-          <w:sz w:val="23"/>
-          <w:szCs w:val="23"/>
-          <w:lang w:eastAsia="en-IN"/>
-        </w:rPr>
-        <w:br/>
-        <w:t xml:space="preserve">        </w:t>
-      </w:r>
-      <w:r>
-        <w:rPr>
-          <w:rFonts w:ascii="Courier New" w:eastAsia="Times New Roman" w:hAnsi="Courier New" w:cs="Courier New"/>
-          <w:color w:val="BCBEC4"/>
-          <w:sz w:val="23"/>
-          <w:szCs w:val="23"/>
-          <w:lang w:eastAsia="en-IN"/>
-        </w:rPr>
-        <w:t>File ss = ((TakesScreenshot)driver).getScreenshotAs(OutputType.</w:t>
-      </w:r>
-      <w:r>
-        <w:rPr>
-          <w:rFonts w:ascii="Courier New" w:eastAsia="Times New Roman" w:hAnsi="Courier New" w:cs="Courier New"/>
-          <w:i/>
-          <w:iCs/>
-          <w:color w:val="C77DBB"/>
-          <w:sz w:val="23"/>
-          <w:szCs w:val="23"/>
-          <w:lang w:eastAsia="en-IN"/>
-        </w:rPr>
-        <w:t>FILE</w:t>
-      </w:r>
-      <w:r>
-        <w:rPr>
-          <w:rFonts w:ascii="Courier New" w:eastAsia="Times New Roman" w:hAnsi="Courier New" w:cs="Courier New"/>
-          <w:color w:val="BCBEC4"/>
-          <w:sz w:val="23"/>
-          <w:szCs w:val="23"/>
-          <w:lang w:eastAsia="en-IN"/>
-        </w:rPr>
-        <w:t>);</w:t>
-      </w:r>
-      <w:r>
-        <w:rPr>
-          <w:rFonts w:ascii="Courier New" w:eastAsia="Times New Roman" w:hAnsi="Courier New" w:cs="Courier New"/>
-          <w:color w:val="BCBEC4"/>
-          <w:sz w:val="23"/>
-          <w:szCs w:val="23"/>
-          <w:lang w:eastAsia="en-IN"/>
-        </w:rPr>
-        <w:br/>
-        <w:t xml:space="preserve">        FileHandler.</w:t>
-      </w:r>
-      <w:r>
-        <w:rPr>
-          <w:rFonts w:ascii="Courier New" w:eastAsia="Times New Roman" w:hAnsi="Courier New" w:cs="Courier New"/>
-          <w:i/>
-          <w:iCs/>
-          <w:color w:val="BCBEC4"/>
-          <w:sz w:val="23"/>
-          <w:szCs w:val="23"/>
-          <w:lang w:eastAsia="en-IN"/>
-        </w:rPr>
-        <w:t>copy</w:t>
-      </w:r>
-      <w:r>
-        <w:rPr>
-          <w:rFonts w:ascii="Courier New" w:eastAsia="Times New Roman" w:hAnsi="Courier New" w:cs="Courier New"/>
-          <w:color w:val="BCBEC4"/>
-          <w:sz w:val="23"/>
-          <w:szCs w:val="23"/>
-          <w:lang w:eastAsia="en-IN"/>
-        </w:rPr>
-        <w:t xml:space="preserve">(ss, </w:t>
-      </w:r>
-      <w:r>
-        <w:rPr>
-          <w:rFonts w:ascii="Courier New" w:eastAsia="Times New Roman" w:hAnsi="Courier New" w:cs="Courier New"/>
-          <w:color w:val="CF8E6D"/>
-          <w:sz w:val="23"/>
-          <w:szCs w:val="23"/>
-          <w:lang w:eastAsia="en-IN"/>
-        </w:rPr>
-        <w:t xml:space="preserve">new </w:t>
-      </w:r>
-      <w:r>
-        <w:rPr>
-          <w:rFonts w:ascii="Courier New" w:eastAsia="Times New Roman" w:hAnsi="Courier New" w:cs="Courier New"/>
-          <w:color w:val="BCBEC4"/>
-          <w:sz w:val="23"/>
-          <w:szCs w:val="23"/>
-          <w:lang w:eastAsia="en-IN"/>
-        </w:rPr>
-        <w:t>File(</w:t>
-      </w:r>
-      <w:r>
-        <w:rPr>
-          <w:rFonts w:ascii="Courier New" w:eastAsia="Times New Roman" w:hAnsi="Courier New" w:cs="Courier New"/>
-          <w:color w:val="6AAB73"/>
-          <w:sz w:val="23"/>
-          <w:szCs w:val="23"/>
-          <w:lang w:eastAsia="en-IN"/>
-        </w:rPr>
-        <w:t>"Trial.jpeg"</w:t>
-      </w:r>
-      <w:r>
-        <w:rPr>
-          <w:rFonts w:ascii="Courier New" w:eastAsia="Times New Roman" w:hAnsi="Courier New" w:cs="Courier New"/>
-          <w:color w:val="BCBEC4"/>
-          <w:sz w:val="23"/>
-          <w:szCs w:val="23"/>
-          <w:lang w:eastAsia="en-IN"/>
-        </w:rPr>
-        <w:t>));</w:t>
-      </w:r>
-      <w:r>
-        <w:rPr>
-          <w:rFonts w:ascii="Courier New" w:eastAsia="Times New Roman" w:hAnsi="Courier New" w:cs="Courier New"/>
-          <w:color w:val="BCBEC4"/>
-          <w:sz w:val="23"/>
-          <w:szCs w:val="23"/>
-          <w:lang w:eastAsia="en-IN"/>
-        </w:rPr>
-        <w:br/>
-        <w:t xml:space="preserve">        </w:t>
-      </w:r>
-      <w:r>
-        <w:rPr>
-          <w:rFonts w:ascii="Courier New" w:eastAsia="Times New Roman" w:hAnsi="Courier New" w:cs="Courier New"/>
-          <w:color w:val="BCBEC4"/>
-          <w:sz w:val="23"/>
-          <w:szCs w:val="23"/>
-          <w:lang w:eastAsia="en-IN"/>
-        </w:rPr>
-        <w:br/>
-        <w:t xml:space="preserve">        driver.close();</w:t>
-      </w:r>
-      <w:r>
-        <w:rPr>
-          <w:rFonts w:ascii="Courier New" w:eastAsia="Times New Roman" w:hAnsi="Courier New" w:cs="Courier New"/>
-          <w:color w:val="BCBEC4"/>
-          <w:sz w:val="23"/>
-          <w:szCs w:val="23"/>
-          <w:lang w:eastAsia="en-IN"/>
-        </w:rPr>
-        <w:br/>
-      </w:r>
-      <w:r>
-        <w:rPr>
-          <w:rFonts w:ascii="Courier New" w:eastAsia="Times New Roman" w:hAnsi="Courier New" w:cs="Courier New"/>
-          <w:color w:val="BCBEC4"/>
-          <w:sz w:val="23"/>
-          <w:szCs w:val="23"/>
-          <w:lang w:eastAsia="en-IN"/>
-        </w:rPr>
-        <w:br/>
-        <w:t xml:space="preserve">        </w:t>
-      </w:r>
-      <w:r>
-        <w:rPr>
-          <w:rFonts w:ascii="Courier New" w:eastAsia="Times New Roman" w:hAnsi="Courier New" w:cs="Courier New"/>
-          <w:color w:val="7A7E85"/>
-          <w:sz w:val="23"/>
-          <w:szCs w:val="23"/>
-          <w:lang w:eastAsia="en-IN"/>
-        </w:rPr>
-        <w:t>//Adding the screenshot in Report</w:t>
-      </w:r>
-      <w:r>
-        <w:rPr>
-          <w:rFonts w:ascii="Courier New" w:eastAsia="Times New Roman" w:hAnsi="Courier New" w:cs="Courier New"/>
-          <w:color w:val="7A7E85"/>
-          <w:sz w:val="23"/>
-          <w:szCs w:val="23"/>
-          <w:lang w:eastAsia="en-IN"/>
-        </w:rPr>
-        <w:br/>
-        <w:t xml:space="preserve">        </w:t>
-      </w:r>
-      <w:r>
-        <w:rPr>
-          <w:rFonts w:ascii="Courier New" w:eastAsia="Times New Roman" w:hAnsi="Courier New" w:cs="Courier New"/>
-          <w:color w:val="BCBEC4"/>
-          <w:sz w:val="23"/>
-          <w:szCs w:val="23"/>
-          <w:lang w:eastAsia="en-IN"/>
-        </w:rPr>
-        <w:t>test.log(Status.</w:t>
-      </w:r>
-      <w:r>
-        <w:rPr>
-          <w:rFonts w:ascii="Courier New" w:eastAsia="Times New Roman" w:hAnsi="Courier New" w:cs="Courier New"/>
-          <w:i/>
-          <w:iCs/>
-          <w:color w:val="C77DBB"/>
-          <w:sz w:val="23"/>
-          <w:szCs w:val="23"/>
-          <w:lang w:eastAsia="en-IN"/>
-        </w:rPr>
-        <w:t>FAIL</w:t>
-      </w:r>
-      <w:r>
-        <w:rPr>
-          <w:rFonts w:ascii="Courier New" w:eastAsia="Times New Roman" w:hAnsi="Courier New" w:cs="Courier New"/>
-          <w:color w:val="BCBEC4"/>
-          <w:sz w:val="23"/>
-          <w:szCs w:val="23"/>
-          <w:lang w:eastAsia="en-IN"/>
-        </w:rPr>
-        <w:t>, MarkupHelper.</w:t>
-      </w:r>
-      <w:r>
-        <w:rPr>
-          <w:rFonts w:ascii="Courier New" w:eastAsia="Times New Roman" w:hAnsi="Courier New" w:cs="Courier New"/>
-          <w:i/>
-          <w:iCs/>
-          <w:color w:val="BCBEC4"/>
-          <w:sz w:val="23"/>
-          <w:szCs w:val="23"/>
-          <w:lang w:eastAsia="en-IN"/>
-        </w:rPr>
-        <w:t>createLabel</w:t>
-      </w:r>
-      <w:r>
-        <w:rPr>
-          <w:rFonts w:ascii="Courier New" w:eastAsia="Times New Roman" w:hAnsi="Courier New" w:cs="Courier New"/>
-          <w:color w:val="BCBEC4"/>
-          <w:sz w:val="23"/>
-          <w:szCs w:val="23"/>
-          <w:lang w:eastAsia="en-IN"/>
-        </w:rPr>
-        <w:t>(</w:t>
-      </w:r>
-      <w:r>
-        <w:rPr>
-          <w:rFonts w:ascii="Courier New" w:eastAsia="Times New Roman" w:hAnsi="Courier New" w:cs="Courier New"/>
-          <w:color w:val="6AAB73"/>
-          <w:sz w:val="23"/>
-          <w:szCs w:val="23"/>
-          <w:lang w:eastAsia="en-IN"/>
-        </w:rPr>
-        <w:t>"Search Test"</w:t>
-      </w:r>
-      <w:r>
-        <w:rPr>
-          <w:rFonts w:ascii="Courier New" w:eastAsia="Times New Roman" w:hAnsi="Courier New" w:cs="Courier New"/>
-          <w:color w:val="BCBEC4"/>
-          <w:sz w:val="23"/>
-          <w:szCs w:val="23"/>
-          <w:lang w:eastAsia="en-IN"/>
-        </w:rPr>
-        <w:t>, ExtentColor.</w:t>
-      </w:r>
-      <w:r>
-        <w:rPr>
-          <w:rFonts w:ascii="Courier New" w:eastAsia="Times New Roman" w:hAnsi="Courier New" w:cs="Courier New"/>
-          <w:i/>
-          <w:iCs/>
-          <w:color w:val="C77DBB"/>
-          <w:sz w:val="23"/>
-          <w:szCs w:val="23"/>
-          <w:lang w:eastAsia="en-IN"/>
-        </w:rPr>
-        <w:t>RED</w:t>
-      </w:r>
-      <w:r>
-        <w:rPr>
-          <w:rFonts w:ascii="Courier New" w:eastAsia="Times New Roman" w:hAnsi="Courier New" w:cs="Courier New"/>
-          <w:color w:val="BCBEC4"/>
-          <w:sz w:val="23"/>
-          <w:szCs w:val="23"/>
-          <w:lang w:eastAsia="en-IN"/>
-        </w:rPr>
-        <w:t>));</w:t>
-      </w:r>
-      <w:r>
-        <w:rPr>
-          <w:rFonts w:ascii="Courier New" w:eastAsia="Times New Roman" w:hAnsi="Courier New" w:cs="Courier New"/>
-          <w:color w:val="BCBEC4"/>
-          <w:sz w:val="23"/>
-          <w:szCs w:val="23"/>
-          <w:lang w:eastAsia="en-IN"/>
-        </w:rPr>
-        <w:br/>
-        <w:t xml:space="preserve">        test.fail(</w:t>
-      </w:r>
-      <w:r>
-        <w:rPr>
-          <w:rFonts w:ascii="Courier New" w:eastAsia="Times New Roman" w:hAnsi="Courier New" w:cs="Courier New"/>
-          <w:color w:val="6AAB73"/>
-          <w:sz w:val="23"/>
-          <w:szCs w:val="23"/>
-          <w:lang w:eastAsia="en-IN"/>
-        </w:rPr>
-        <w:t>"Test Failed"</w:t>
-      </w:r>
-      <w:r>
-        <w:rPr>
-          <w:rFonts w:ascii="Courier New" w:eastAsia="Times New Roman" w:hAnsi="Courier New" w:cs="Courier New"/>
-          <w:color w:val="BCBEC4"/>
-          <w:sz w:val="23"/>
-          <w:szCs w:val="23"/>
-          <w:lang w:eastAsia="en-IN"/>
-        </w:rPr>
-        <w:t>, MediaEntityBuilder.</w:t>
-      </w:r>
-      <w:r>
-        <w:rPr>
-          <w:rFonts w:ascii="Courier New" w:eastAsia="Times New Roman" w:hAnsi="Courier New" w:cs="Courier New"/>
-          <w:i/>
-          <w:iCs/>
-          <w:color w:val="BCBEC4"/>
-          <w:sz w:val="23"/>
-          <w:szCs w:val="23"/>
-          <w:lang w:eastAsia="en-IN"/>
-        </w:rPr>
-        <w:t>createScreenCaptureFromPath</w:t>
-      </w:r>
-      <w:r>
-        <w:rPr>
-          <w:rFonts w:ascii="Courier New" w:eastAsia="Times New Roman" w:hAnsi="Courier New" w:cs="Courier New"/>
-          <w:color w:val="BCBEC4"/>
-          <w:sz w:val="23"/>
-          <w:szCs w:val="23"/>
-          <w:lang w:eastAsia="en-IN"/>
-        </w:rPr>
-        <w:t>(</w:t>
-      </w:r>
-      <w:r>
-        <w:rPr>
-          <w:rFonts w:ascii="Courier New" w:eastAsia="Times New Roman" w:hAnsi="Courier New" w:cs="Courier New"/>
-          <w:color w:val="6AAB73"/>
-          <w:sz w:val="23"/>
-          <w:szCs w:val="23"/>
-          <w:lang w:eastAsia="en-IN"/>
-        </w:rPr>
-        <w:t>"Trial.jpeg"</w:t>
-      </w:r>
-      <w:r>
-        <w:rPr>
-          <w:rFonts w:ascii="Courier New" w:eastAsia="Times New Roman" w:hAnsi="Courier New" w:cs="Courier New"/>
-          <w:color w:val="BCBEC4"/>
-          <w:sz w:val="23"/>
-          <w:szCs w:val="23"/>
-          <w:lang w:eastAsia="en-IN"/>
-        </w:rPr>
-        <w:t>).build());</w:t>
-      </w:r>
-      <w:r>
-        <w:rPr>
-          <w:rFonts w:ascii="Courier New" w:eastAsia="Times New Roman" w:hAnsi="Courier New" w:cs="Courier New"/>
-          <w:color w:val="BCBEC4"/>
-          <w:sz w:val="23"/>
-          <w:szCs w:val="23"/>
-          <w:lang w:eastAsia="en-IN"/>
-        </w:rPr>
-        <w:br/>
-      </w:r>
-      <w:r>
-        <w:rPr>
-          <w:rFonts w:ascii="Courier New" w:eastAsia="Times New Roman" w:hAnsi="Courier New" w:cs="Courier New"/>
-          <w:color w:val="BCBEC4"/>
-          <w:sz w:val="23"/>
-          <w:szCs w:val="23"/>
-          <w:lang w:eastAsia="en-IN"/>
-        </w:rPr>
-        <w:br/>
-      </w:r>
-      <w:r>
-        <w:rPr>
-          <w:rFonts w:ascii="Courier New" w:eastAsia="Times New Roman" w:hAnsi="Courier New" w:cs="Courier New"/>
-          <w:color w:val="BCBEC4"/>
-          <w:sz w:val="23"/>
-          <w:szCs w:val="23"/>
-          <w:lang w:eastAsia="en-IN"/>
-        </w:rPr>
-        <w:br/>
-        <w:t xml:space="preserve">        report.flush();</w:t>
-      </w:r>
-      <w:r>
-        <w:rPr>
-          <w:rFonts w:ascii="Courier New" w:eastAsia="Times New Roman" w:hAnsi="Courier New" w:cs="Courier New"/>
-          <w:color w:val="BCBEC4"/>
-          <w:sz w:val="23"/>
-          <w:szCs w:val="23"/>
-          <w:lang w:eastAsia="en-IN"/>
-        </w:rPr>
-        <w:br/>
-        <w:t xml:space="preserve">        </w:t>
-      </w:r>
-      <w:r>
-        <w:rPr>
-          <w:rFonts w:ascii="Courier New" w:eastAsia="Times New Roman" w:hAnsi="Courier New" w:cs="Courier New"/>
-          <w:color w:val="7A7E85"/>
-          <w:sz w:val="23"/>
-          <w:szCs w:val="23"/>
-          <w:lang w:eastAsia="en-IN"/>
-        </w:rPr>
-        <w:t>//This will create the report file</w:t>
-      </w:r>
-      <w:r>
-        <w:rPr>
-          <w:rFonts w:ascii="Courier New" w:eastAsia="Times New Roman" w:hAnsi="Courier New" w:cs="Courier New"/>
-          <w:color w:val="7A7E85"/>
-          <w:sz w:val="23"/>
-          <w:szCs w:val="23"/>
-          <w:lang w:eastAsia="en-IN"/>
-        </w:rPr>
-        <w:br/>
-        <w:t xml:space="preserve">    </w:t>
-      </w:r>
-      <w:r>
-        <w:rPr>
-          <w:rFonts w:ascii="Courier New" w:eastAsia="Times New Roman" w:hAnsi="Courier New" w:cs="Courier New"/>
-          <w:color w:val="BCBEC4"/>
-          <w:sz w:val="23"/>
-          <w:szCs w:val="23"/>
-          <w:lang w:eastAsia="en-IN"/>
-        </w:rPr>
-        <w:t>}</w:t>
-      </w:r>
-      <w:r>
-        <w:rPr>
-          <w:rFonts w:ascii="Courier New" w:eastAsia="Times New Roman" w:hAnsi="Courier New" w:cs="Courier New"/>
-          <w:color w:val="BCBEC4"/>
-          <w:sz w:val="23"/>
-          <w:szCs w:val="23"/>
-          <w:lang w:eastAsia="en-IN"/>
-        </w:rPr>
-        <w:br/>
-        <w:t>}</w:t>
-      </w:r>
-    </w:p>
-    <w:p>
-      <w:pPr>
-        <w:rPr>
-          <w:sz w:val="24"/>
-          <w:szCs w:val="22"/>
-          <w:lang w:val="en-US"/>
-        </w:rPr>
-      </w:pPr>
-    </w:p>
-    <w:p>
-      <w:pPr>
-        <w:rPr>
-          <w:sz w:val="24"/>
-          <w:szCs w:val="22"/>
-          <w:lang w:val="en-US"/>
-        </w:rPr>
-      </w:pPr>
-    </w:p>
-    <w:p>
-      <w:pPr>
-        <w:rPr>
-          <w:sz w:val="24"/>
-          <w:szCs w:val="22"/>
-          <w:lang w:val="en-US"/>
-        </w:rPr>
-      </w:pPr>
-    </w:p>
-    <w:p>
-      <w:pPr>
-        <w:rPr>
-          <w:sz w:val="24"/>
-          <w:szCs w:val="22"/>
-          <w:lang w:val="en-US"/>
-        </w:rPr>
-      </w:pPr>
-      <w:r>
-        <w:rPr>
-          <w:sz w:val="24"/>
-          <w:szCs w:val="22"/>
-          <w:lang w:val="en-US"/>
-        </w:rPr>
-        <w:t>dd - day 13</w:t>
-      </w:r>
-    </w:p>
-    <w:p>
-      <w:pPr>
-        <w:rPr>
-          <w:sz w:val="24"/>
-          <w:szCs w:val="22"/>
-          <w:lang w:val="en-US"/>
-        </w:rPr>
-      </w:pPr>
-      <w:r>
-        <w:rPr>
-          <w:sz w:val="24"/>
-          <w:szCs w:val="22"/>
-          <w:lang w:val="en-US"/>
-        </w:rPr>
-        <w:lastRenderedPageBreak/>
-        <w:t>mm - minutes</w:t>
-      </w:r>
-    </w:p>
-    <w:p>
-      <w:pPr>
-        <w:rPr>
-          <w:sz w:val="24"/>
-          <w:szCs w:val="22"/>
-          <w:lang w:val="en-US"/>
-        </w:rPr>
-      </w:pPr>
-      <w:r>
-        <w:rPr>
-          <w:sz w:val="24"/>
-          <w:szCs w:val="22"/>
-          <w:lang w:val="en-US"/>
-        </w:rPr>
-        <w:t>MM - month - 03</w:t>
-      </w:r>
-    </w:p>
-    <w:p>
-      <w:pPr>
-        <w:rPr>
-          <w:sz w:val="24"/>
-          <w:szCs w:val="22"/>
-          <w:lang w:val="en-US"/>
-        </w:rPr>
-      </w:pPr>
-      <w:r>
-        <w:rPr>
-          <w:sz w:val="24"/>
-          <w:szCs w:val="22"/>
-          <w:lang w:val="en-US"/>
-        </w:rPr>
-        <w:t>MMM - Month - Mar</w:t>
-      </w:r>
-    </w:p>
-    <w:p>
-      <w:pPr>
-        <w:rPr>
-          <w:sz w:val="24"/>
-          <w:szCs w:val="22"/>
-          <w:lang w:val="en-US"/>
-        </w:rPr>
-      </w:pPr>
-      <w:r>
-        <w:rPr>
-          <w:sz w:val="24"/>
-          <w:szCs w:val="22"/>
-          <w:lang w:val="en-US"/>
-        </w:rPr>
-        <w:t>MMMM - month - March</w:t>
-      </w:r>
-    </w:p>
-    <w:p>
-      <w:pPr>
-        <w:rPr>
-          <w:sz w:val="24"/>
-          <w:szCs w:val="22"/>
-          <w:lang w:val="en-US"/>
-        </w:rPr>
-      </w:pPr>
-      <w:r>
-        <w:rPr>
-          <w:sz w:val="24"/>
-          <w:szCs w:val="22"/>
-          <w:lang w:val="en-US"/>
-        </w:rPr>
-        <w:t>yy - year 26</w:t>
-      </w:r>
-    </w:p>
-    <w:p>
-      <w:pPr>
-        <w:rPr>
-          <w:sz w:val="24"/>
-          <w:szCs w:val="22"/>
-          <w:lang w:val="en-US"/>
-        </w:rPr>
-      </w:pPr>
-      <w:r>
-        <w:rPr>
-          <w:sz w:val="24"/>
-          <w:szCs w:val="22"/>
-          <w:lang w:val="en-US"/>
-        </w:rPr>
-        <w:t>yyy/ yyyy - year - 2026</w:t>
-      </w:r>
-    </w:p>
-    <w:p>
-      <w:pPr>
-        <w:rPr>
-          <w:sz w:val="24"/>
-          <w:szCs w:val="22"/>
-          <w:lang w:val="en-US"/>
-        </w:rPr>
-      </w:pPr>
-      <w:r>
-        <w:rPr>
-          <w:sz w:val="24"/>
-          <w:szCs w:val="22"/>
-          <w:lang w:val="en-US"/>
-        </w:rPr>
-        <w:t>EEE - DOW - Fri</w:t>
-      </w:r>
-    </w:p>
-    <w:p>
-      <w:pPr>
-        <w:rPr>
-          <w:sz w:val="24"/>
-          <w:szCs w:val="22"/>
-          <w:lang w:val="en-US"/>
-        </w:rPr>
-      </w:pPr>
-      <w:r>
-        <w:rPr>
-          <w:sz w:val="24"/>
-          <w:szCs w:val="22"/>
-          <w:lang w:val="en-US"/>
-        </w:rPr>
-        <w:t>EEEE - DOW - Friday</w:t>
-      </w:r>
-    </w:p>
-    <w:p>
-      <w:pPr>
-        <w:rPr>
-          <w:sz w:val="24"/>
-          <w:szCs w:val="22"/>
-          <w:lang w:val="en-US"/>
-        </w:rPr>
-      </w:pPr>
-      <w:r>
-        <w:rPr>
-          <w:sz w:val="24"/>
-          <w:szCs w:val="22"/>
-          <w:lang w:val="en-US"/>
-        </w:rPr>
-        <w:t>hh - hours</w:t>
-      </w:r>
-    </w:p>
-    <w:p>
-      <w:pPr>
-        <w:rPr>
-          <w:sz w:val="24"/>
-          <w:szCs w:val="22"/>
-          <w:lang w:val="en-US"/>
-        </w:rPr>
-      </w:pPr>
-      <w:r>
-        <w:rPr>
-          <w:sz w:val="24"/>
-          <w:szCs w:val="22"/>
-          <w:lang w:val="en-US"/>
-        </w:rPr>
-        <w:t>a - AM / PM</w:t>
-      </w:r>
-    </w:p>
-    <w:p>
-      <w:pPr>
-        <w:rPr>
-          <w:sz w:val="24"/>
-          <w:szCs w:val="22"/>
-          <w:lang w:val="en-US"/>
-        </w:rPr>
-      </w:pPr>
-      <w:r>
-        <w:rPr>
-          <w:sz w:val="24"/>
-          <w:szCs w:val="22"/>
-          <w:lang w:val="en-US"/>
-        </w:rPr>
-        <w:t>zzz - Time zone (IST)</w:t>
-      </w:r>
-    </w:p>
-    <w:p>
-      <w:pPr>
-        <w:rPr>
-          <w:sz w:val="24"/>
-          <w:szCs w:val="22"/>
-          <w:lang w:val="en-US"/>
-        </w:rPr>
-      </w:pPr>
-    </w:p>
-    <w:p>
-      <w:pPr>
-        <w:rPr>
-          <w:sz w:val="24"/>
-          <w:szCs w:val="22"/>
-          <w:lang w:val="en-US"/>
-        </w:rPr>
-      </w:pPr>
-      <w:bookmarkStart w:id="0" w:name="_GoBack"/>
-      <w:bookmarkEnd w:id="0"/>
+        <w:t>For sendKeys() method pass the name of file along with path as parameter.</w:t>
+      </w:r>
     </w:p>
     <w:sectPr>
       <w:pgSz w:w="11906" w:h="16838"/>
@@ -8887,6 +6912,119 @@
     </w:lvl>
   </w:abstractNum>
   <w:abstractNum w:abstractNumId="1">
+    <w:nsid w:val="064652BB"/>
+    <w:multiLevelType w:val="hybridMultilevel"/>
+    <w:tmpl w:val="135C20DE"/>
+    <w:lvl w:ilvl="0" w:tplc="40090001">
+      <w:start w:val="1"/>
+      <w:numFmt w:val="bullet"/>
+      <w:lvlText w:val=""/>
+      <w:lvlJc w:val="left"/>
+      <w:pPr>
+        <w:ind w:left="720" w:hanging="360"/>
+      </w:pPr>
+      <w:rPr>
+        <w:rFonts w:ascii="Symbol" w:hAnsi="Symbol" w:hint="default"/>
+      </w:rPr>
+    </w:lvl>
+    <w:lvl w:ilvl="1" w:tplc="40090003" w:tentative="1">
+      <w:start w:val="1"/>
+      <w:numFmt w:val="bullet"/>
+      <w:lvlText w:val="o"/>
+      <w:lvlJc w:val="left"/>
+      <w:pPr>
+        <w:ind w:left="1440" w:hanging="360"/>
+      </w:pPr>
+      <w:rPr>
+        <w:rFonts w:ascii="Courier New" w:hAnsi="Courier New" w:cs="Courier New" w:hint="default"/>
+      </w:rPr>
+    </w:lvl>
+    <w:lvl w:ilvl="2" w:tplc="40090005" w:tentative="1">
+      <w:start w:val="1"/>
+      <w:numFmt w:val="bullet"/>
+      <w:lvlText w:val=""/>
+      <w:lvlJc w:val="left"/>
+      <w:pPr>
+        <w:ind w:left="2160" w:hanging="360"/>
+      </w:pPr>
+      <w:rPr>
+        <w:rFonts w:ascii="Wingdings" w:hAnsi="Wingdings" w:hint="default"/>
+      </w:rPr>
+    </w:lvl>
+    <w:lvl w:ilvl="3" w:tplc="40090001" w:tentative="1">
+      <w:start w:val="1"/>
+      <w:numFmt w:val="bullet"/>
+      <w:lvlText w:val=""/>
+      <w:lvlJc w:val="left"/>
+      <w:pPr>
+        <w:ind w:left="2880" w:hanging="360"/>
+      </w:pPr>
+      <w:rPr>
+        <w:rFonts w:ascii="Symbol" w:hAnsi="Symbol" w:hint="default"/>
+      </w:rPr>
+    </w:lvl>
+    <w:lvl w:ilvl="4" w:tplc="40090003" w:tentative="1">
+      <w:start w:val="1"/>
+      <w:numFmt w:val="bullet"/>
+      <w:lvlText w:val="o"/>
+      <w:lvlJc w:val="left"/>
+      <w:pPr>
+        <w:ind w:left="3600" w:hanging="360"/>
+      </w:pPr>
+      <w:rPr>
+        <w:rFonts w:ascii="Courier New" w:hAnsi="Courier New" w:cs="Courier New" w:hint="default"/>
+      </w:rPr>
+    </w:lvl>
+    <w:lvl w:ilvl="5" w:tplc="40090005" w:tentative="1">
+      <w:start w:val="1"/>
+      <w:numFmt w:val="bullet"/>
+      <w:lvlText w:val=""/>
+      <w:lvlJc w:val="left"/>
+      <w:pPr>
+        <w:ind w:left="4320" w:hanging="360"/>
+      </w:pPr>
+      <w:rPr>
+        <w:rFonts w:ascii="Wingdings" w:hAnsi="Wingdings" w:hint="default"/>
+      </w:rPr>
+    </w:lvl>
+    <w:lvl w:ilvl="6" w:tplc="40090001" w:tentative="1">
+      <w:start w:val="1"/>
+      <w:numFmt w:val="bullet"/>
+      <w:lvlText w:val=""/>
+      <w:lvlJc w:val="left"/>
+      <w:pPr>
+        <w:ind w:left="5040" w:hanging="360"/>
+      </w:pPr>
+      <w:rPr>
+        <w:rFonts w:ascii="Symbol" w:hAnsi="Symbol" w:hint="default"/>
+      </w:rPr>
+    </w:lvl>
+    <w:lvl w:ilvl="7" w:tplc="40090003" w:tentative="1">
+      <w:start w:val="1"/>
+      <w:numFmt w:val="bullet"/>
+      <w:lvlText w:val="o"/>
+      <w:lvlJc w:val="left"/>
+      <w:pPr>
+        <w:ind w:left="5760" w:hanging="360"/>
+      </w:pPr>
+      <w:rPr>
+        <w:rFonts w:ascii="Courier New" w:hAnsi="Courier New" w:cs="Courier New" w:hint="default"/>
+      </w:rPr>
+    </w:lvl>
+    <w:lvl w:ilvl="8" w:tplc="40090005" w:tentative="1">
+      <w:start w:val="1"/>
+      <w:numFmt w:val="bullet"/>
+      <w:lvlText w:val=""/>
+      <w:lvlJc w:val="left"/>
+      <w:pPr>
+        <w:ind w:left="6480" w:hanging="360"/>
+      </w:pPr>
+      <w:rPr>
+        <w:rFonts w:ascii="Wingdings" w:hAnsi="Wingdings" w:hint="default"/>
+      </w:rPr>
+    </w:lvl>
+  </w:abstractNum>
+  <w:abstractNum w:abstractNumId="2">
     <w:nsid w:val="096D3E13"/>
     <w:multiLevelType w:val="hybridMultilevel"/>
     <w:tmpl w:val="218C79D8"/>
@@ -8999,7 +7137,7 @@
       </w:rPr>
     </w:lvl>
   </w:abstractNum>
-  <w:abstractNum w:abstractNumId="2">
+  <w:abstractNum w:abstractNumId="3">
     <w:nsid w:val="133644CC"/>
     <w:multiLevelType w:val="hybridMultilevel"/>
     <w:tmpl w:val="F2E60910"/>
@@ -9088,7 +7226,120 @@
       </w:pPr>
     </w:lvl>
   </w:abstractNum>
-  <w:abstractNum w:abstractNumId="3">
+  <w:abstractNum w:abstractNumId="4">
+    <w:nsid w:val="199F13F0"/>
+    <w:multiLevelType w:val="hybridMultilevel"/>
+    <w:tmpl w:val="4B02E550"/>
+    <w:lvl w:ilvl="0" w:tplc="40090001">
+      <w:start w:val="1"/>
+      <w:numFmt w:val="bullet"/>
+      <w:lvlText w:val=""/>
+      <w:lvlJc w:val="left"/>
+      <w:pPr>
+        <w:ind w:left="720" w:hanging="360"/>
+      </w:pPr>
+      <w:rPr>
+        <w:rFonts w:ascii="Symbol" w:hAnsi="Symbol" w:hint="default"/>
+      </w:rPr>
+    </w:lvl>
+    <w:lvl w:ilvl="1" w:tplc="40090003" w:tentative="1">
+      <w:start w:val="1"/>
+      <w:numFmt w:val="bullet"/>
+      <w:lvlText w:val="o"/>
+      <w:lvlJc w:val="left"/>
+      <w:pPr>
+        <w:ind w:left="1440" w:hanging="360"/>
+      </w:pPr>
+      <w:rPr>
+        <w:rFonts w:ascii="Courier New" w:hAnsi="Courier New" w:cs="Courier New" w:hint="default"/>
+      </w:rPr>
+    </w:lvl>
+    <w:lvl w:ilvl="2" w:tplc="40090005" w:tentative="1">
+      <w:start w:val="1"/>
+      <w:numFmt w:val="bullet"/>
+      <w:lvlText w:val=""/>
+      <w:lvlJc w:val="left"/>
+      <w:pPr>
+        <w:ind w:left="2160" w:hanging="360"/>
+      </w:pPr>
+      <w:rPr>
+        <w:rFonts w:ascii="Wingdings" w:hAnsi="Wingdings" w:hint="default"/>
+      </w:rPr>
+    </w:lvl>
+    <w:lvl w:ilvl="3" w:tplc="40090001" w:tentative="1">
+      <w:start w:val="1"/>
+      <w:numFmt w:val="bullet"/>
+      <w:lvlText w:val=""/>
+      <w:lvlJc w:val="left"/>
+      <w:pPr>
+        <w:ind w:left="2880" w:hanging="360"/>
+      </w:pPr>
+      <w:rPr>
+        <w:rFonts w:ascii="Symbol" w:hAnsi="Symbol" w:hint="default"/>
+      </w:rPr>
+    </w:lvl>
+    <w:lvl w:ilvl="4" w:tplc="40090003" w:tentative="1">
+      <w:start w:val="1"/>
+      <w:numFmt w:val="bullet"/>
+      <w:lvlText w:val="o"/>
+      <w:lvlJc w:val="left"/>
+      <w:pPr>
+        <w:ind w:left="3600" w:hanging="360"/>
+      </w:pPr>
+      <w:rPr>
+        <w:rFonts w:ascii="Courier New" w:hAnsi="Courier New" w:cs="Courier New" w:hint="default"/>
+      </w:rPr>
+    </w:lvl>
+    <w:lvl w:ilvl="5" w:tplc="40090005" w:tentative="1">
+      <w:start w:val="1"/>
+      <w:numFmt w:val="bullet"/>
+      <w:lvlText w:val=""/>
+      <w:lvlJc w:val="left"/>
+      <w:pPr>
+        <w:ind w:left="4320" w:hanging="360"/>
+      </w:pPr>
+      <w:rPr>
+        <w:rFonts w:ascii="Wingdings" w:hAnsi="Wingdings" w:hint="default"/>
+      </w:rPr>
+    </w:lvl>
+    <w:lvl w:ilvl="6" w:tplc="40090001" w:tentative="1">
+      <w:start w:val="1"/>
+      <w:numFmt w:val="bullet"/>
+      <w:lvlText w:val=""/>
+      <w:lvlJc w:val="left"/>
+      <w:pPr>
+        <w:ind w:left="5040" w:hanging="360"/>
+      </w:pPr>
+      <w:rPr>
+        <w:rFonts w:ascii="Symbol" w:hAnsi="Symbol" w:hint="default"/>
+      </w:rPr>
+    </w:lvl>
+    <w:lvl w:ilvl="7" w:tplc="40090003" w:tentative="1">
+      <w:start w:val="1"/>
+      <w:numFmt w:val="bullet"/>
+      <w:lvlText w:val="o"/>
+      <w:lvlJc w:val="left"/>
+      <w:pPr>
+        <w:ind w:left="5760" w:hanging="360"/>
+      </w:pPr>
+      <w:rPr>
+        <w:rFonts w:ascii="Courier New" w:hAnsi="Courier New" w:cs="Courier New" w:hint="default"/>
+      </w:rPr>
+    </w:lvl>
+    <w:lvl w:ilvl="8" w:tplc="40090005" w:tentative="1">
+      <w:start w:val="1"/>
+      <w:numFmt w:val="bullet"/>
+      <w:lvlText w:val=""/>
+      <w:lvlJc w:val="left"/>
+      <w:pPr>
+        <w:ind w:left="6480" w:hanging="360"/>
+      </w:pPr>
+      <w:rPr>
+        <w:rFonts w:ascii="Wingdings" w:hAnsi="Wingdings" w:hint="default"/>
+      </w:rPr>
+    </w:lvl>
+  </w:abstractNum>
+  <w:abstractNum w:abstractNumId="5">
     <w:nsid w:val="22CD3FE6"/>
     <w:multiLevelType w:val="hybridMultilevel"/>
     <w:tmpl w:val="431E3674"/>
@@ -9201,7 +7452,7 @@
       </w:rPr>
     </w:lvl>
   </w:abstractNum>
-  <w:abstractNum w:abstractNumId="4">
+  <w:abstractNum w:abstractNumId="6">
     <w:nsid w:val="25335F4F"/>
     <w:multiLevelType w:val="hybridMultilevel"/>
     <w:tmpl w:val="2EAE23BA"/>
@@ -9314,7 +7565,7 @@
       </w:rPr>
     </w:lvl>
   </w:abstractNum>
-  <w:abstractNum w:abstractNumId="5">
+  <w:abstractNum w:abstractNumId="7">
     <w:nsid w:val="268C0D27"/>
     <w:multiLevelType w:val="hybridMultilevel"/>
     <w:tmpl w:val="674E757A"/>
@@ -9427,7 +7678,7 @@
       </w:rPr>
     </w:lvl>
   </w:abstractNum>
-  <w:abstractNum w:abstractNumId="6">
+  <w:abstractNum w:abstractNumId="8">
     <w:nsid w:val="2C075435"/>
     <w:multiLevelType w:val="hybridMultilevel"/>
     <w:tmpl w:val="69AA0B26"/>
@@ -9540,7 +7791,7 @@
       </w:rPr>
     </w:lvl>
   </w:abstractNum>
-  <w:abstractNum w:abstractNumId="7">
+  <w:abstractNum w:abstractNumId="9">
     <w:nsid w:val="2D9B41A7"/>
     <w:multiLevelType w:val="hybridMultilevel"/>
     <w:tmpl w:val="C4EC2058"/>
@@ -9653,7 +7904,7 @@
       </w:rPr>
     </w:lvl>
   </w:abstractNum>
-  <w:abstractNum w:abstractNumId="8">
+  <w:abstractNum w:abstractNumId="10">
     <w:nsid w:val="369351E9"/>
     <w:multiLevelType w:val="hybridMultilevel"/>
     <w:tmpl w:val="0972A5CA"/>
@@ -9742,7 +7993,7 @@
       </w:pPr>
     </w:lvl>
   </w:abstractNum>
-  <w:abstractNum w:abstractNumId="9">
+  <w:abstractNum w:abstractNumId="11">
     <w:nsid w:val="379C2DB0"/>
     <w:multiLevelType w:val="hybridMultilevel"/>
     <w:tmpl w:val="097C3B70"/>
@@ -9855,7 +8106,7 @@
       </w:rPr>
     </w:lvl>
   </w:abstractNum>
-  <w:abstractNum w:abstractNumId="10">
+  <w:abstractNum w:abstractNumId="12">
     <w:nsid w:val="3B9A3EE0"/>
     <w:multiLevelType w:val="hybridMultilevel"/>
     <w:tmpl w:val="8B20B472"/>
@@ -9968,7 +8219,96 @@
       </w:rPr>
     </w:lvl>
   </w:abstractNum>
-  <w:abstractNum w:abstractNumId="11">
+  <w:abstractNum w:abstractNumId="13">
+    <w:nsid w:val="46875C90"/>
+    <w:multiLevelType w:val="hybridMultilevel"/>
+    <w:tmpl w:val="78C0CFB6"/>
+    <w:lvl w:ilvl="0" w:tplc="4009000F">
+      <w:start w:val="1"/>
+      <w:numFmt w:val="decimal"/>
+      <w:lvlText w:val="%1."/>
+      <w:lvlJc w:val="left"/>
+      <w:pPr>
+        <w:ind w:left="720" w:hanging="360"/>
+      </w:pPr>
+      <w:rPr>
+        <w:rFonts w:hint="default"/>
+      </w:rPr>
+    </w:lvl>
+    <w:lvl w:ilvl="1" w:tplc="40090019" w:tentative="1">
+      <w:start w:val="1"/>
+      <w:numFmt w:val="lowerLetter"/>
+      <w:lvlText w:val="%2."/>
+      <w:lvlJc w:val="left"/>
+      <w:pPr>
+        <w:ind w:left="1440" w:hanging="360"/>
+      </w:pPr>
+    </w:lvl>
+    <w:lvl w:ilvl="2" w:tplc="4009001B" w:tentative="1">
+      <w:start w:val="1"/>
+      <w:numFmt w:val="lowerRoman"/>
+      <w:lvlText w:val="%3."/>
+      <w:lvlJc w:val="right"/>
+      <w:pPr>
+        <w:ind w:left="2160" w:hanging="180"/>
+      </w:pPr>
+    </w:lvl>
+    <w:lvl w:ilvl="3" w:tplc="4009000F" w:tentative="1">
+      <w:start w:val="1"/>
+      <w:numFmt w:val="decimal"/>
+      <w:lvlText w:val="%4."/>
+      <w:lvlJc w:val="left"/>
+      <w:pPr>
+        <w:ind w:left="2880" w:hanging="360"/>
+      </w:pPr>
+    </w:lvl>
+    <w:lvl w:ilvl="4" w:tplc="40090019" w:tentative="1">
+      <w:start w:val="1"/>
+      <w:numFmt w:val="lowerLetter"/>
+      <w:lvlText w:val="%5."/>
+      <w:lvlJc w:val="left"/>
+      <w:pPr>
+        <w:ind w:left="3600" w:hanging="360"/>
+      </w:pPr>
+    </w:lvl>
+    <w:lvl w:ilvl="5" w:tplc="4009001B" w:tentative="1">
+      <w:start w:val="1"/>
+      <w:numFmt w:val="lowerRoman"/>
+      <w:lvlText w:val="%6."/>
+      <w:lvlJc w:val="right"/>
+      <w:pPr>
+        <w:ind w:left="4320" w:hanging="180"/>
+      </w:pPr>
+    </w:lvl>
+    <w:lvl w:ilvl="6" w:tplc="4009000F" w:tentative="1">
+      <w:start w:val="1"/>
+      <w:numFmt w:val="decimal"/>
+      <w:lvlText w:val="%7."/>
+      <w:lvlJc w:val="left"/>
+      <w:pPr>
+        <w:ind w:left="5040" w:hanging="360"/>
+      </w:pPr>
+    </w:lvl>
+    <w:lvl w:ilvl="7" w:tplc="40090019" w:tentative="1">
+      <w:start w:val="1"/>
+      <w:numFmt w:val="lowerLetter"/>
+      <w:lvlText w:val="%8."/>
+      <w:lvlJc w:val="left"/>
+      <w:pPr>
+        <w:ind w:left="5760" w:hanging="360"/>
+      </w:pPr>
+    </w:lvl>
+    <w:lvl w:ilvl="8" w:tplc="4009001B" w:tentative="1">
+      <w:start w:val="1"/>
+      <w:numFmt w:val="lowerRoman"/>
+      <w:lvlText w:val="%9."/>
+      <w:lvlJc w:val="right"/>
+      <w:pPr>
+        <w:ind w:left="6480" w:hanging="180"/>
+      </w:pPr>
+    </w:lvl>
+  </w:abstractNum>
+  <w:abstractNum w:abstractNumId="14">
     <w:nsid w:val="4E2A6329"/>
     <w:multiLevelType w:val="hybridMultilevel"/>
     <w:tmpl w:val="BC1628F2"/>
@@ -10081,7 +8421,7 @@
       </w:rPr>
     </w:lvl>
   </w:abstractNum>
-  <w:abstractNum w:abstractNumId="12">
+  <w:abstractNum w:abstractNumId="15">
     <w:nsid w:val="556E1B57"/>
     <w:multiLevelType w:val="hybridMultilevel"/>
     <w:tmpl w:val="26087466"/>
@@ -10194,7 +8534,7 @@
       </w:rPr>
     </w:lvl>
   </w:abstractNum>
-  <w:abstractNum w:abstractNumId="13">
+  <w:abstractNum w:abstractNumId="16">
     <w:nsid w:val="55D10A8D"/>
     <w:multiLevelType w:val="hybridMultilevel"/>
     <w:tmpl w:val="7312E058"/>
@@ -10283,7 +8623,7 @@
       </w:pPr>
     </w:lvl>
   </w:abstractNum>
-  <w:abstractNum w:abstractNumId="14">
+  <w:abstractNum w:abstractNumId="17">
     <w:nsid w:val="56165AD5"/>
     <w:multiLevelType w:val="hybridMultilevel"/>
     <w:tmpl w:val="E0B403D2"/>
@@ -10396,7 +8736,96 @@
       </w:rPr>
     </w:lvl>
   </w:abstractNum>
-  <w:abstractNum w:abstractNumId="15">
+  <w:abstractNum w:abstractNumId="18">
+    <w:nsid w:val="56F946E6"/>
+    <w:multiLevelType w:val="hybridMultilevel"/>
+    <w:tmpl w:val="287A5F26"/>
+    <w:lvl w:ilvl="0" w:tplc="4009000F">
+      <w:start w:val="1"/>
+      <w:numFmt w:val="decimal"/>
+      <w:lvlText w:val="%1."/>
+      <w:lvlJc w:val="left"/>
+      <w:pPr>
+        <w:ind w:left="720" w:hanging="360"/>
+      </w:pPr>
+      <w:rPr>
+        <w:rFonts w:hint="default"/>
+      </w:rPr>
+    </w:lvl>
+    <w:lvl w:ilvl="1" w:tplc="40090019" w:tentative="1">
+      <w:start w:val="1"/>
+      <w:numFmt w:val="lowerLetter"/>
+      <w:lvlText w:val="%2."/>
+      <w:lvlJc w:val="left"/>
+      <w:pPr>
+        <w:ind w:left="1440" w:hanging="360"/>
+      </w:pPr>
+    </w:lvl>
+    <w:lvl w:ilvl="2" w:tplc="4009001B" w:tentative="1">
+      <w:start w:val="1"/>
+      <w:numFmt w:val="lowerRoman"/>
+      <w:lvlText w:val="%3."/>
+      <w:lvlJc w:val="right"/>
+      <w:pPr>
+        <w:ind w:left="2160" w:hanging="180"/>
+      </w:pPr>
+    </w:lvl>
+    <w:lvl w:ilvl="3" w:tplc="4009000F" w:tentative="1">
+      <w:start w:val="1"/>
+      <w:numFmt w:val="decimal"/>
+      <w:lvlText w:val="%4."/>
+      <w:lvlJc w:val="left"/>
+      <w:pPr>
+        <w:ind w:left="2880" w:hanging="360"/>
+      </w:pPr>
+    </w:lvl>
+    <w:lvl w:ilvl="4" w:tplc="40090019" w:tentative="1">
+      <w:start w:val="1"/>
+      <w:numFmt w:val="lowerLetter"/>
+      <w:lvlText w:val="%5."/>
+      <w:lvlJc w:val="left"/>
+      <w:pPr>
+        <w:ind w:left="3600" w:hanging="360"/>
+      </w:pPr>
+    </w:lvl>
+    <w:lvl w:ilvl="5" w:tplc="4009001B" w:tentative="1">
+      <w:start w:val="1"/>
+      <w:numFmt w:val="lowerRoman"/>
+      <w:lvlText w:val="%6."/>
+      <w:lvlJc w:val="right"/>
+      <w:pPr>
+        <w:ind w:left="4320" w:hanging="180"/>
+      </w:pPr>
+    </w:lvl>
+    <w:lvl w:ilvl="6" w:tplc="4009000F" w:tentative="1">
+      <w:start w:val="1"/>
+      <w:numFmt w:val="decimal"/>
+      <w:lvlText w:val="%7."/>
+      <w:lvlJc w:val="left"/>
+      <w:pPr>
+        <w:ind w:left="5040" w:hanging="360"/>
+      </w:pPr>
+    </w:lvl>
+    <w:lvl w:ilvl="7" w:tplc="40090019" w:tentative="1">
+      <w:start w:val="1"/>
+      <w:numFmt w:val="lowerLetter"/>
+      <w:lvlText w:val="%8."/>
+      <w:lvlJc w:val="left"/>
+      <w:pPr>
+        <w:ind w:left="5760" w:hanging="360"/>
+      </w:pPr>
+    </w:lvl>
+    <w:lvl w:ilvl="8" w:tplc="4009001B" w:tentative="1">
+      <w:start w:val="1"/>
+      <w:numFmt w:val="lowerRoman"/>
+      <w:lvlText w:val="%9."/>
+      <w:lvlJc w:val="right"/>
+      <w:pPr>
+        <w:ind w:left="6480" w:hanging="180"/>
+      </w:pPr>
+    </w:lvl>
+  </w:abstractNum>
+  <w:abstractNum w:abstractNumId="19">
     <w:nsid w:val="5A897377"/>
     <w:multiLevelType w:val="hybridMultilevel"/>
     <w:tmpl w:val="F1F27818"/>
@@ -10509,7 +8938,7 @@
       </w:rPr>
     </w:lvl>
   </w:abstractNum>
-  <w:abstractNum w:abstractNumId="16">
+  <w:abstractNum w:abstractNumId="20">
     <w:nsid w:val="602D5BA0"/>
     <w:multiLevelType w:val="hybridMultilevel"/>
     <w:tmpl w:val="7EDAE732"/>
@@ -10622,7 +9051,7 @@
       </w:rPr>
     </w:lvl>
   </w:abstractNum>
-  <w:abstractNum w:abstractNumId="17">
+  <w:abstractNum w:abstractNumId="21">
     <w:nsid w:val="63DD59AE"/>
     <w:multiLevelType w:val="hybridMultilevel"/>
     <w:tmpl w:val="4F783448"/>
@@ -10735,7 +9164,7 @@
       </w:rPr>
     </w:lvl>
   </w:abstractNum>
-  <w:abstractNum w:abstractNumId="18">
+  <w:abstractNum w:abstractNumId="22">
     <w:nsid w:val="6B375CC6"/>
     <w:multiLevelType w:val="hybridMultilevel"/>
     <w:tmpl w:val="DD7A439E"/>
@@ -10848,7 +9277,7 @@
       </w:rPr>
     </w:lvl>
   </w:abstractNum>
-  <w:abstractNum w:abstractNumId="19">
+  <w:abstractNum w:abstractNumId="23">
     <w:nsid w:val="736235B6"/>
     <w:multiLevelType w:val="hybridMultilevel"/>
     <w:tmpl w:val="9338354A"/>
@@ -10961,7 +9390,7 @@
       </w:rPr>
     </w:lvl>
   </w:abstractNum>
-  <w:abstractNum w:abstractNumId="20">
+  <w:abstractNum w:abstractNumId="24">
     <w:nsid w:val="78C031D0"/>
     <w:multiLevelType w:val="hybridMultilevel"/>
     <w:tmpl w:val="65F4D1E2"/>
@@ -11074,7 +9503,7 @@
       </w:rPr>
     </w:lvl>
   </w:abstractNum>
-  <w:abstractNum w:abstractNumId="21">
+  <w:abstractNum w:abstractNumId="25">
     <w:nsid w:val="7DB56E55"/>
     <w:multiLevelType w:val="hybridMultilevel"/>
     <w:tmpl w:val="1B88A856"/>
@@ -11164,70 +9593,82 @@
     </w:lvl>
   </w:abstractNum>
   <w:num w:numId="1">
+    <w:abstractNumId w:val="21"/>
+  </w:num>
+  <w:num w:numId="2">
+    <w:abstractNumId w:val="7"/>
+  </w:num>
+  <w:num w:numId="3">
+    <w:abstractNumId w:val="14"/>
+  </w:num>
+  <w:num w:numId="4">
+    <w:abstractNumId w:val="2"/>
+  </w:num>
+  <w:num w:numId="5">
     <w:abstractNumId w:val="17"/>
   </w:num>
-  <w:num w:numId="2">
+  <w:num w:numId="6">
+    <w:abstractNumId w:val="15"/>
+  </w:num>
+  <w:num w:numId="7">
     <w:abstractNumId w:val="5"/>
   </w:num>
-  <w:num w:numId="3">
-    <w:abstractNumId w:val="11"/>
-  </w:num>
-  <w:num w:numId="4">
-    <w:abstractNumId w:val="1"/>
-  </w:num>
-  <w:num w:numId="5">
-    <w:abstractNumId w:val="14"/>
-  </w:num>
-  <w:num w:numId="6">
-    <w:abstractNumId w:val="12"/>
-  </w:num>
-  <w:num w:numId="7">
-    <w:abstractNumId w:val="3"/>
-  </w:num>
   <w:num w:numId="8">
-    <w:abstractNumId w:val="19"/>
+    <w:abstractNumId w:val="23"/>
   </w:num>
   <w:num w:numId="9">
-    <w:abstractNumId w:val="6"/>
+    <w:abstractNumId w:val="8"/>
   </w:num>
   <w:num w:numId="10">
     <w:abstractNumId w:val="0"/>
   </w:num>
   <w:num w:numId="11">
+    <w:abstractNumId w:val="11"/>
+  </w:num>
+  <w:num w:numId="12">
+    <w:abstractNumId w:val="19"/>
+  </w:num>
+  <w:num w:numId="13">
+    <w:abstractNumId w:val="3"/>
+  </w:num>
+  <w:num w:numId="14">
+    <w:abstractNumId w:val="10"/>
+  </w:num>
+  <w:num w:numId="15">
+    <w:abstractNumId w:val="25"/>
+  </w:num>
+  <w:num w:numId="16">
+    <w:abstractNumId w:val="22"/>
+  </w:num>
+  <w:num w:numId="17">
+    <w:abstractNumId w:val="24"/>
+  </w:num>
+  <w:num w:numId="18">
     <w:abstractNumId w:val="9"/>
   </w:num>
-  <w:num w:numId="12">
-    <w:abstractNumId w:val="15"/>
+  <w:num w:numId="19">
+    <w:abstractNumId w:val="20"/>
   </w:num>
-  <w:num w:numId="13">
-    <w:abstractNumId w:val="2"/>
+  <w:num w:numId="20">
+    <w:abstractNumId w:val="12"/>
   </w:num>
-  <w:num w:numId="14">
-    <w:abstractNumId w:val="8"/>
+  <w:num w:numId="21">
+    <w:abstractNumId w:val="6"/>
   </w:num>
-  <w:num w:numId="15">
-    <w:abstractNumId w:val="21"/>
+  <w:num w:numId="22">
+    <w:abstractNumId w:val="16"/>
   </w:num>
-  <w:num w:numId="16">
+  <w:num w:numId="23">
+    <w:abstractNumId w:val="1"/>
+  </w:num>
+  <w:num w:numId="24">
     <w:abstractNumId w:val="18"/>
   </w:num>
-  <w:num w:numId="17">
-    <w:abstractNumId w:val="20"/>
+  <w:num w:numId="25">
+    <w:abstractNumId w:val="13"/>
   </w:num>
-  <w:num w:numId="18">
-    <w:abstractNumId w:val="7"/>
-  </w:num>
-  <w:num w:numId="19">
-    <w:abstractNumId w:val="16"/>
-  </w:num>
-  <w:num w:numId="20">
-    <w:abstractNumId w:val="10"/>
-  </w:num>
-  <w:num w:numId="21">
+  <w:num w:numId="26">
     <w:abstractNumId w:val="4"/>
-  </w:num>
-  <w:num w:numId="22">
-    <w:abstractNumId w:val="13"/>
   </w:num>
 </w:numbering>
 </file>

</xml_diff>

<commit_message>
Date: 21 Mar 2026
</commit_message>
<xml_diff>
--- a/Selenium_Notes.docx
+++ b/Selenium_Notes.docx
@@ -3329,6 +3329,28 @@
           <w:szCs w:val="22"/>
           <w:lang w:val="en-US"/>
         </w:rPr>
+        <w:t>The control is not available on the page.</w:t>
+      </w:r>
+    </w:p>
+    <w:p>
+      <w:pPr>
+        <w:pStyle w:val="ListParagraph"/>
+        <w:numPr>
+          <w:ilvl w:val="1"/>
+          <w:numId w:val="15"/>
+        </w:numPr>
+        <w:rPr>
+          <w:sz w:val="24"/>
+          <w:szCs w:val="22"/>
+          <w:lang w:val="en-US"/>
+        </w:rPr>
+      </w:pPr>
+      <w:r>
+        <w:rPr>
+          <w:sz w:val="24"/>
+          <w:szCs w:val="22"/>
+          <w:lang w:val="en-US"/>
+        </w:rPr>
         <w:t>Synchronization issue</w:t>
       </w:r>
       <w:r>
@@ -3338,6 +3360,28 @@
           <w:lang w:val="en-US"/>
         </w:rPr>
         <w:t xml:space="preserve"> (The control might be taking time to load)</w:t>
+      </w:r>
+    </w:p>
+    <w:p>
+      <w:pPr>
+        <w:pStyle w:val="ListParagraph"/>
+        <w:numPr>
+          <w:ilvl w:val="1"/>
+          <w:numId w:val="15"/>
+        </w:numPr>
+        <w:rPr>
+          <w:sz w:val="24"/>
+          <w:szCs w:val="22"/>
+          <w:lang w:val="en-US"/>
+        </w:rPr>
+      </w:pPr>
+      <w:r>
+        <w:rPr>
+          <w:sz w:val="24"/>
+          <w:szCs w:val="22"/>
+          <w:lang w:val="en-US"/>
+        </w:rPr>
+        <w:t>The control may be inside frame / shadow-root</w:t>
       </w:r>
     </w:p>
     <w:p>
@@ -4079,6 +4123,46 @@
         </w:rPr>
         <w:t xml:space="preserve"> text form text box</w:t>
       </w:r>
+    </w:p>
+    <w:p>
+      <w:pPr>
+        <w:pStyle w:val="ListParagraph"/>
+        <w:numPr>
+          <w:ilvl w:val="1"/>
+          <w:numId w:val="16"/>
+        </w:numPr>
+        <w:rPr>
+          <w:sz w:val="24"/>
+          <w:szCs w:val="22"/>
+          <w:lang w:val="en-US"/>
+        </w:rPr>
+      </w:pPr>
+      <w:r>
+        <w:rPr>
+          <w:sz w:val="24"/>
+          <w:szCs w:val="22"/>
+          <w:lang w:val="en-US"/>
+        </w:rPr>
+        <w:t xml:space="preserve">getLocation() </w:t>
+      </w:r>
+      <w:r>
+        <w:rPr>
+          <w:sz w:val="24"/>
+          <w:szCs w:val="22"/>
+          <w:lang w:val="en-US"/>
+        </w:rPr>
+        <w:sym w:font="Wingdings" w:char="F0E0"/>
+      </w:r>
+      <w:r>
+        <w:rPr>
+          <w:sz w:val="24"/>
+          <w:szCs w:val="22"/>
+          <w:lang w:val="en-US"/>
+        </w:rPr>
+        <w:t xml:space="preserve"> Will return the location of any control. Via this you can easily get the X &amp; Y co-ordinates of any control. (Point)</w:t>
+      </w:r>
+      <w:bookmarkStart w:id="0" w:name="_GoBack"/>
+      <w:bookmarkEnd w:id="0"/>
     </w:p>
     <w:p>
       <w:pPr>
@@ -4221,6 +4305,7 @@
           <w:szCs w:val="22"/>
           <w:lang w:val="en-US"/>
         </w:rPr>
+        <w:lastRenderedPageBreak/>
         <w:t>Name</w:t>
       </w:r>
     </w:p>
@@ -4265,7 +4350,6 @@
           <w:szCs w:val="22"/>
           <w:lang w:val="en-US"/>
         </w:rPr>
-        <w:lastRenderedPageBreak/>
         <w:t>className</w:t>
       </w:r>
     </w:p>
@@ -5063,6 +5147,7 @@
           <w:szCs w:val="22"/>
           <w:lang w:val="en-US"/>
         </w:rPr>
+        <w:lastRenderedPageBreak/>
         <w:t>Absolute XPath</w:t>
       </w:r>
     </w:p>
@@ -5107,7 +5192,6 @@
           <w:szCs w:val="22"/>
           <w:lang w:val="en-US"/>
         </w:rPr>
-        <w:lastRenderedPageBreak/>
         <w:t>Relative XPath</w:t>
       </w:r>
     </w:p>
@@ -5970,6 +6054,7 @@
           <w:szCs w:val="22"/>
           <w:lang w:val="en-US"/>
         </w:rPr>
+        <w:lastRenderedPageBreak/>
         <w:t>It is applicable to single statement only.</w:t>
       </w:r>
     </w:p>
@@ -5992,7 +6077,6 @@
           <w:szCs w:val="22"/>
           <w:lang w:val="en-US"/>
         </w:rPr>
-        <w:lastRenderedPageBreak/>
         <w:t>We can handle some specific condition for wait (ElementToBeClickable, AlertToPresent, VisibilityOfElementLocateBy)</w:t>
       </w:r>
     </w:p>
@@ -6831,7 +6915,6 @@
           <w:szCs w:val="22"/>
           <w:lang w:val="en-US"/>
         </w:rPr>
-        <w:lastRenderedPageBreak/>
         <w:t>Handling File upload</w:t>
       </w:r>
     </w:p>
@@ -7221,8 +7304,96 @@
         </w:rPr>
         <w:t xml:space="preserve"> To perform the action.</w:t>
       </w:r>
-      <w:bookmarkStart w:id="0" w:name="_GoBack"/>
-      <w:bookmarkEnd w:id="0"/>
+    </w:p>
+    <w:p>
+      <w:pPr>
+        <w:pStyle w:val="ListParagraph"/>
+        <w:numPr>
+          <w:ilvl w:val="0"/>
+          <w:numId w:val="29"/>
+        </w:numPr>
+        <w:rPr>
+          <w:lang w:val="en-US"/>
+        </w:rPr>
+      </w:pPr>
+      <w:r>
+        <w:rPr>
+          <w:lang w:val="en-US"/>
+        </w:rPr>
+        <w:t xml:space="preserve">contextClick() </w:t>
+      </w:r>
+      <w:r>
+        <w:rPr>
+          <w:lang w:val="en-US"/>
+        </w:rPr>
+        <w:sym w:font="Wingdings" w:char="F0E0"/>
+      </w:r>
+      <w:r>
+        <w:rPr>
+          <w:lang w:val="en-US"/>
+        </w:rPr>
+        <w:t xml:space="preserve"> Will right click on the control.</w:t>
+      </w:r>
+    </w:p>
+    <w:p>
+      <w:pPr>
+        <w:pStyle w:val="ListParagraph"/>
+        <w:numPr>
+          <w:ilvl w:val="0"/>
+          <w:numId w:val="29"/>
+        </w:numPr>
+        <w:rPr>
+          <w:lang w:val="en-US"/>
+        </w:rPr>
+      </w:pPr>
+      <w:r>
+        <w:rPr>
+          <w:lang w:val="en-US"/>
+        </w:rPr>
+        <w:t xml:space="preserve">doubleClick() </w:t>
+      </w:r>
+      <w:r>
+        <w:rPr>
+          <w:lang w:val="en-US"/>
+        </w:rPr>
+        <w:sym w:font="Wingdings" w:char="F0E0"/>
+      </w:r>
+      <w:r>
+        <w:rPr>
+          <w:lang w:val="en-US"/>
+        </w:rPr>
+        <w:t xml:space="preserve"> Will double click on the control.</w:t>
+      </w:r>
+    </w:p>
+    <w:p>
+      <w:pPr>
+        <w:pStyle w:val="ListParagraph"/>
+        <w:numPr>
+          <w:ilvl w:val="0"/>
+          <w:numId w:val="29"/>
+        </w:numPr>
+        <w:rPr>
+          <w:lang w:val="en-US"/>
+        </w:rPr>
+      </w:pPr>
+      <w:r>
+        <w:rPr>
+          <w:lang w:val="en-US"/>
+        </w:rPr>
+        <w:t xml:space="preserve">dragAndDrop() </w:t>
+      </w:r>
+      <w:r>
+        <w:rPr>
+          <w:lang w:val="en-US"/>
+        </w:rPr>
+        <w:sym w:font="Wingdings" w:char="F0E0"/>
+      </w:r>
+      <w:r>
+        <w:rPr>
+          <w:lang w:val="en-US"/>
+        </w:rPr>
+        <w:t xml:space="preserve"> Will drag the source control and will drop on target control.</w:t>
+      </w:r>
     </w:p>
     <w:sectPr>
       <w:pgSz w:w="11906" w:h="16838"/>
@@ -10810,6 +10981,7 @@
   <w:style w:type="character" w:default="1" w:styleId="DefaultParagraphFont">
     <w:name w:val="Default Paragraph Font"/>
     <w:uiPriority w:val="1"/>
+    <w:semiHidden/>
     <w:unhideWhenUsed/>
   </w:style>
   <w:style w:type="table" w:default="1" w:styleId="TableNormal">

</xml_diff>

<commit_message>
Date: 28 Mar 2026
</commit_message>
<xml_diff>
--- a/Selenium_Notes.docx
+++ b/Selenium_Notes.docx
@@ -8117,13 +8117,44 @@
     </w:p>
     <w:p>
       <w:pPr>
-        <w:rPr>
-          <w:lang w:val="en-US"/>
-        </w:rPr>
-      </w:pPr>
-    </w:p>
-    <w:p>
-      <w:pPr>
+        <w:pStyle w:val="ListParagraph"/>
+        <w:numPr>
+          <w:ilvl w:val="0"/>
+          <w:numId w:val="31"/>
+        </w:numPr>
+        <w:rPr>
+          <w:lang w:val="en-US"/>
+        </w:rPr>
+      </w:pPr>
+      <w:r>
+        <w:rPr>
+          <w:lang w:val="en-US"/>
+        </w:rPr>
+        <w:t xml:space="preserve">@DataProvider </w:t>
+      </w:r>
+      <w:r>
+        <w:rPr>
+          <w:lang w:val="en-US"/>
+        </w:rPr>
+        <w:sym w:font="Wingdings" w:char="F0E0"/>
+      </w:r>
+      <w:r>
+        <w:rPr>
+          <w:lang w:val="en-US"/>
+        </w:rPr>
+        <w:t xml:space="preserve"> Used in Data Driven Testing. This method will send the data to @Test method. @Test method will get executed multiple times.</w:t>
+      </w:r>
+    </w:p>
+    <w:p>
+      <w:pPr>
+        <w:rPr>
+          <w:lang w:val="en-US"/>
+        </w:rPr>
+      </w:pPr>
+    </w:p>
+    <w:p>
+      <w:pPr>
+        <w:spacing w:line="240" w:lineRule="auto"/>
         <w:rPr>
           <w:lang w:val="en-US"/>
         </w:rPr>
@@ -8137,6 +8168,7 @@
     </w:p>
     <w:p>
       <w:pPr>
+        <w:spacing w:line="240" w:lineRule="auto"/>
         <w:rPr>
           <w:lang w:val="en-US"/>
         </w:rPr>
@@ -8151,14 +8183,16 @@
     </w:p>
     <w:p>
       <w:pPr>
-        <w:rPr>
-          <w:lang w:val="en-US"/>
-        </w:rPr>
-      </w:pPr>
-      <w:r>
-        <w:rPr>
-          <w:lang w:val="en-US"/>
-        </w:rPr>
+        <w:spacing w:line="240" w:lineRule="auto"/>
+        <w:rPr>
+          <w:lang w:val="en-US"/>
+        </w:rPr>
+      </w:pPr>
+      <w:r>
+        <w:rPr>
+          <w:lang w:val="en-US"/>
+        </w:rPr>
+        <w:lastRenderedPageBreak/>
         <w:tab/>
       </w:r>
       <w:r>
@@ -8171,6 +8205,7 @@
     </w:p>
     <w:p>
       <w:pPr>
+        <w:spacing w:line="240" w:lineRule="auto"/>
         <w:rPr>
           <w:lang w:val="en-US"/>
         </w:rPr>
@@ -8185,15 +8220,15 @@
     </w:p>
     <w:p>
       <w:pPr>
-        <w:rPr>
-          <w:lang w:val="en-US"/>
-        </w:rPr>
-      </w:pPr>
-      <w:r>
-        <w:rPr>
-          <w:lang w:val="en-US"/>
-        </w:rPr>
-        <w:lastRenderedPageBreak/>
+        <w:spacing w:line="240" w:lineRule="auto"/>
+        <w:rPr>
+          <w:lang w:val="en-US"/>
+        </w:rPr>
+      </w:pPr>
+      <w:r>
+        <w:rPr>
+          <w:lang w:val="en-US"/>
+        </w:rPr>
         <w:tab/>
         <w:t>BeforeMethod</w:t>
       </w:r>
@@ -8206,6 +8241,7 @@
     </w:p>
     <w:p>
       <w:pPr>
+        <w:spacing w:line="240" w:lineRule="auto"/>
         <w:ind w:left="720" w:firstLine="720"/>
         <w:rPr>
           <w:lang w:val="en-US"/>
@@ -8220,6 +8256,7 @@
     </w:p>
     <w:p>
       <w:pPr>
+        <w:spacing w:line="240" w:lineRule="auto"/>
         <w:rPr>
           <w:lang w:val="en-US"/>
         </w:rPr>
@@ -8234,6 +8271,7 @@
     </w:p>
     <w:p>
       <w:pPr>
+        <w:spacing w:line="240" w:lineRule="auto"/>
         <w:rPr>
           <w:lang w:val="en-US"/>
         </w:rPr>
@@ -8248,6 +8286,7 @@
     </w:p>
     <w:p>
       <w:pPr>
+        <w:spacing w:line="240" w:lineRule="auto"/>
         <w:rPr>
           <w:lang w:val="en-US"/>
         </w:rPr>
@@ -8268,6 +8307,7 @@
     </w:p>
     <w:p>
       <w:pPr>
+        <w:spacing w:line="240" w:lineRule="auto"/>
         <w:rPr>
           <w:lang w:val="en-US"/>
         </w:rPr>
@@ -8282,6 +8322,7 @@
     </w:p>
     <w:p>
       <w:pPr>
+        <w:spacing w:line="240" w:lineRule="auto"/>
         <w:rPr>
           <w:lang w:val="en-US"/>
         </w:rPr>
@@ -8302,6 +8343,7 @@
     </w:p>
     <w:p>
       <w:pPr>
+        <w:spacing w:line="240" w:lineRule="auto"/>
         <w:ind w:left="720" w:firstLine="720"/>
         <w:rPr>
           <w:lang w:val="en-US"/>
@@ -8316,6 +8358,7 @@
     </w:p>
     <w:p>
       <w:pPr>
+        <w:spacing w:line="240" w:lineRule="auto"/>
         <w:rPr>
           <w:lang w:val="en-US"/>
         </w:rPr>
@@ -8327,81 +8370,358 @@
         <w:tab/>
         <w:t>AfterMethod</w:t>
       </w:r>
+    </w:p>
+    <w:p>
+      <w:pPr>
+        <w:spacing w:line="240" w:lineRule="auto"/>
+        <w:rPr>
+          <w:lang w:val="en-US"/>
+        </w:rPr>
+      </w:pPr>
+      <w:r>
+        <w:rPr>
+          <w:lang w:val="en-US"/>
+        </w:rPr>
+        <w:t>AfterTest</w:t>
+      </w:r>
+    </w:p>
+    <w:p>
+      <w:pPr>
+        <w:rPr>
+          <w:lang w:val="en-US"/>
+        </w:rPr>
+      </w:pPr>
+    </w:p>
+    <w:p>
+      <w:pPr>
+        <w:rPr>
+          <w:b/>
+          <w:bCs/>
+          <w:lang w:val="en-US"/>
+        </w:rPr>
+      </w:pPr>
+      <w:r>
+        <w:rPr>
+          <w:b/>
+          <w:bCs/>
+          <w:lang w:val="en-US"/>
+        </w:rPr>
+        <w:t>Points to be noted about configuration methods</w:t>
+      </w:r>
+    </w:p>
+    <w:p>
+      <w:pPr>
+        <w:pStyle w:val="ListParagraph"/>
+        <w:numPr>
+          <w:ilvl w:val="0"/>
+          <w:numId w:val="32"/>
+        </w:numPr>
+        <w:rPr>
+          <w:lang w:val="en-US"/>
+        </w:rPr>
+      </w:pPr>
+      <w:r>
+        <w:rPr>
+          <w:lang w:val="en-US"/>
+        </w:rPr>
+        <w:t>They need not to be in pair</w:t>
+      </w:r>
+    </w:p>
+    <w:p>
+      <w:pPr>
+        <w:pStyle w:val="ListParagraph"/>
+        <w:numPr>
+          <w:ilvl w:val="0"/>
+          <w:numId w:val="32"/>
+        </w:numPr>
+        <w:rPr>
+          <w:lang w:val="en-US"/>
+        </w:rPr>
+      </w:pPr>
+      <w:r>
+        <w:rPr>
+          <w:lang w:val="en-US"/>
+        </w:rPr>
+        <w:t>The sequence of methods doesn’t matter</w:t>
+      </w:r>
+    </w:p>
+    <w:p>
+      <w:pPr>
+        <w:rPr>
+          <w:lang w:val="en-US"/>
+        </w:rPr>
+      </w:pPr>
+    </w:p>
+    <w:p>
+      <w:pPr>
+        <w:rPr>
+          <w:lang w:val="en-US"/>
+        </w:rPr>
+      </w:pPr>
+    </w:p>
+    <w:p>
+      <w:pPr>
+        <w:rPr>
+          <w:b/>
+          <w:bCs/>
+          <w:lang w:val="en-US"/>
+        </w:rPr>
+      </w:pPr>
+      <w:r>
+        <w:rPr>
+          <w:b/>
+          <w:bCs/>
+          <w:lang w:val="en-US"/>
+        </w:rPr>
+        <w:t>Data Driven Testing</w:t>
+      </w:r>
+    </w:p>
+    <w:p>
+      <w:pPr>
+        <w:pStyle w:val="ListParagraph"/>
+        <w:numPr>
+          <w:ilvl w:val="0"/>
+          <w:numId w:val="27"/>
+        </w:numPr>
+        <w:rPr>
+          <w:lang w:val="en-US"/>
+        </w:rPr>
+      </w:pPr>
+      <w:r>
+        <w:rPr>
+          <w:lang w:val="en-US"/>
+        </w:rPr>
+        <w:t>You can execute single test for multiple times with multiple data set.</w:t>
+      </w:r>
+    </w:p>
+    <w:p>
+      <w:pPr>
+        <w:pStyle w:val="ListParagraph"/>
+        <w:numPr>
+          <w:ilvl w:val="0"/>
+          <w:numId w:val="27"/>
+        </w:numPr>
+        <w:rPr>
+          <w:lang w:val="en-US"/>
+        </w:rPr>
+      </w:pPr>
+      <w:r>
+        <w:rPr>
+          <w:lang w:val="en-US"/>
+        </w:rPr>
+        <w:t>This can be implemented via @DataProvider annotation</w:t>
+      </w:r>
+    </w:p>
+    <w:p>
+      <w:pPr>
+        <w:rPr>
+          <w:lang w:val="en-US"/>
+        </w:rPr>
+      </w:pPr>
+    </w:p>
+    <w:p>
+      <w:pPr>
+        <w:rPr>
+          <w:b/>
+          <w:bCs/>
+          <w:lang w:val="en-US"/>
+        </w:rPr>
+      </w:pPr>
+      <w:r>
+        <w:rPr>
+          <w:b/>
+          <w:bCs/>
+          <w:lang w:val="en-US"/>
+        </w:rPr>
+        <w:t>Assertion</w:t>
+      </w:r>
+    </w:p>
+    <w:p>
+      <w:pPr>
+        <w:pStyle w:val="ListParagraph"/>
+        <w:numPr>
+          <w:ilvl w:val="0"/>
+          <w:numId w:val="33"/>
+        </w:numPr>
+        <w:rPr>
+          <w:lang w:val="en-US"/>
+        </w:rPr>
+      </w:pPr>
+      <w:r>
+        <w:rPr>
+          <w:lang w:val="en-US"/>
+        </w:rPr>
+        <w:t>It is a technique to mark any test case as pass or fail in the report</w:t>
+      </w:r>
+    </w:p>
+    <w:p>
+      <w:pPr>
+        <w:pStyle w:val="ListParagraph"/>
+        <w:numPr>
+          <w:ilvl w:val="0"/>
+          <w:numId w:val="33"/>
+        </w:numPr>
+        <w:rPr>
+          <w:lang w:val="en-US"/>
+        </w:rPr>
+      </w:pPr>
+      <w:r>
+        <w:rPr>
+          <w:lang w:val="en-US"/>
+        </w:rPr>
+        <w:t>If any test gets fail, TestNG will throw AssertError</w:t>
+      </w:r>
+    </w:p>
+    <w:p>
+      <w:pPr>
+        <w:pStyle w:val="ListParagraph"/>
+        <w:numPr>
+          <w:ilvl w:val="0"/>
+          <w:numId w:val="33"/>
+        </w:numPr>
+        <w:rPr>
+          <w:lang w:val="en-US"/>
+        </w:rPr>
+      </w:pPr>
+      <w:r>
+        <w:rPr>
+          <w:lang w:val="en-US"/>
+        </w:rPr>
+        <w:t>Types</w:t>
+      </w:r>
+    </w:p>
+    <w:p>
+      <w:pPr>
+        <w:rPr>
+          <w:lang w:val="en-US"/>
+        </w:rPr>
+      </w:pPr>
+    </w:p>
+    <w:p>
+      <w:pPr>
+        <w:rPr>
+          <w:lang w:val="en-US"/>
+        </w:rPr>
+      </w:pPr>
+    </w:p>
+    <w:p>
+      <w:pPr>
+        <w:rPr>
+          <w:b/>
+          <w:bCs/>
+          <w:lang w:val="en-US"/>
+        </w:rPr>
+      </w:pPr>
+      <w:r>
+        <w:rPr>
+          <w:b/>
+          <w:bCs/>
+          <w:lang w:val="en-US"/>
+        </w:rPr>
+        <w:t>Execution via XML File</w:t>
+      </w:r>
+    </w:p>
+    <w:p>
+      <w:pPr>
+        <w:pStyle w:val="ListParagraph"/>
+        <w:numPr>
+          <w:ilvl w:val="0"/>
+          <w:numId w:val="34"/>
+        </w:numPr>
+        <w:rPr>
+          <w:b/>
+          <w:bCs/>
+          <w:lang w:val="en-US"/>
+        </w:rPr>
+      </w:pPr>
+      <w:r>
+        <w:rPr>
+          <w:lang w:val="en-US"/>
+        </w:rPr>
+        <w:t>You can execute / skip single test / multiple tests via XML file</w:t>
+      </w:r>
+    </w:p>
+    <w:p>
+      <w:pPr>
+        <w:pStyle w:val="ListParagraph"/>
+        <w:numPr>
+          <w:ilvl w:val="0"/>
+          <w:numId w:val="34"/>
+        </w:numPr>
+        <w:rPr>
+          <w:b/>
+          <w:bCs/>
+          <w:lang w:val="en-US"/>
+        </w:rPr>
+      </w:pPr>
+      <w:r>
+        <w:rPr>
+          <w:lang w:val="en-US"/>
+        </w:rPr>
+        <w:t>While creating XML file note that</w:t>
+      </w:r>
+    </w:p>
+    <w:p>
+      <w:pPr>
+        <w:pStyle w:val="ListParagraph"/>
+        <w:numPr>
+          <w:ilvl w:val="1"/>
+          <w:numId w:val="34"/>
+        </w:numPr>
+        <w:rPr>
+          <w:b/>
+          <w:bCs/>
+          <w:lang w:val="en-US"/>
+        </w:rPr>
+      </w:pPr>
+      <w:r>
+        <w:rPr>
+          <w:lang w:val="en-US"/>
+        </w:rPr>
+        <w:t>All the tags are pre-defined</w:t>
+      </w:r>
+    </w:p>
+    <w:p>
+      <w:pPr>
+        <w:pStyle w:val="ListParagraph"/>
+        <w:numPr>
+          <w:ilvl w:val="1"/>
+          <w:numId w:val="34"/>
+        </w:numPr>
+        <w:rPr>
+          <w:b/>
+          <w:bCs/>
+          <w:lang w:val="en-US"/>
+        </w:rPr>
+      </w:pPr>
+      <w:r>
+        <w:rPr>
+          <w:lang w:val="en-US"/>
+        </w:rPr>
+        <w:t>Sequence can’t be altered</w:t>
+      </w:r>
+    </w:p>
+    <w:p>
+      <w:pPr>
+        <w:pStyle w:val="ListParagraph"/>
+        <w:numPr>
+          <w:ilvl w:val="1"/>
+          <w:numId w:val="34"/>
+        </w:numPr>
+        <w:rPr>
+          <w:b/>
+          <w:bCs/>
+          <w:lang w:val="en-US"/>
+        </w:rPr>
+      </w:pPr>
+      <w:r>
+        <w:rPr>
+          <w:lang w:val="en-US"/>
+        </w:rPr>
+        <w:t xml:space="preserve">Everything from this file is case sensitive </w:t>
+      </w:r>
       <w:bookmarkStart w:id="0" w:name="_GoBack"/>
       <w:bookmarkEnd w:id="0"/>
-    </w:p>
-    <w:p>
-      <w:pPr>
-        <w:rPr>
-          <w:lang w:val="en-US"/>
-        </w:rPr>
-      </w:pPr>
-      <w:r>
-        <w:rPr>
-          <w:lang w:val="en-US"/>
-        </w:rPr>
-        <w:t>AfterTest</w:t>
-      </w:r>
-    </w:p>
-    <w:p>
-      <w:pPr>
-        <w:rPr>
-          <w:lang w:val="en-US"/>
-        </w:rPr>
-      </w:pPr>
-    </w:p>
-    <w:p>
-      <w:pPr>
-        <w:rPr>
-          <w:b/>
-          <w:bCs/>
-          <w:lang w:val="en-US"/>
-        </w:rPr>
-      </w:pPr>
-      <w:r>
-        <w:rPr>
-          <w:b/>
-          <w:bCs/>
-          <w:lang w:val="en-US"/>
-        </w:rPr>
-        <w:t>Points to be noted about configuration methods</w:t>
-      </w:r>
-    </w:p>
-    <w:p>
-      <w:pPr>
-        <w:pStyle w:val="ListParagraph"/>
-        <w:numPr>
-          <w:ilvl w:val="0"/>
-          <w:numId w:val="32"/>
-        </w:numPr>
-        <w:rPr>
-          <w:lang w:val="en-US"/>
-        </w:rPr>
-      </w:pPr>
-      <w:r>
-        <w:rPr>
-          <w:lang w:val="en-US"/>
-        </w:rPr>
-        <w:t>They need not to be in pair</w:t>
-      </w:r>
-    </w:p>
-    <w:p>
-      <w:pPr>
-        <w:pStyle w:val="ListParagraph"/>
-        <w:numPr>
-          <w:ilvl w:val="0"/>
-          <w:numId w:val="32"/>
-        </w:numPr>
-        <w:rPr>
-          <w:lang w:val="en-US"/>
-        </w:rPr>
-      </w:pPr>
-      <w:r>
-        <w:rPr>
-          <w:lang w:val="en-US"/>
-        </w:rPr>
-        <w:t>The sequence of methods doesn’t matter</w:t>
-      </w:r>
     </w:p>
     <w:sectPr>
       <w:pgSz w:w="11906" w:h="16838"/>
@@ -8757,7 +9077,7 @@
   <w:abstractNum w:abstractNumId="3">
     <w:nsid w:val="122C5771"/>
     <w:multiLevelType w:val="hybridMultilevel"/>
-    <w:tmpl w:val="A85C8570"/>
+    <w:tmpl w:val="2B8CE2A0"/>
     <w:lvl w:ilvl="0" w:tplc="40090001">
       <w:start w:val="1"/>
       <w:numFmt w:val="bullet"/>
@@ -8957,6 +9277,119 @@
     </w:lvl>
   </w:abstractNum>
   <w:abstractNum w:abstractNumId="5">
+    <w:nsid w:val="151A469D"/>
+    <w:multiLevelType w:val="hybridMultilevel"/>
+    <w:tmpl w:val="6DCEE1A0"/>
+    <w:lvl w:ilvl="0" w:tplc="40090001">
+      <w:start w:val="1"/>
+      <w:numFmt w:val="bullet"/>
+      <w:lvlText w:val=""/>
+      <w:lvlJc w:val="left"/>
+      <w:pPr>
+        <w:ind w:left="720" w:hanging="360"/>
+      </w:pPr>
+      <w:rPr>
+        <w:rFonts w:ascii="Symbol" w:hAnsi="Symbol" w:hint="default"/>
+      </w:rPr>
+    </w:lvl>
+    <w:lvl w:ilvl="1" w:tplc="40090003">
+      <w:start w:val="1"/>
+      <w:numFmt w:val="bullet"/>
+      <w:lvlText w:val="o"/>
+      <w:lvlJc w:val="left"/>
+      <w:pPr>
+        <w:ind w:left="1440" w:hanging="360"/>
+      </w:pPr>
+      <w:rPr>
+        <w:rFonts w:ascii="Courier New" w:hAnsi="Courier New" w:cs="Courier New" w:hint="default"/>
+      </w:rPr>
+    </w:lvl>
+    <w:lvl w:ilvl="2" w:tplc="40090005" w:tentative="1">
+      <w:start w:val="1"/>
+      <w:numFmt w:val="bullet"/>
+      <w:lvlText w:val=""/>
+      <w:lvlJc w:val="left"/>
+      <w:pPr>
+        <w:ind w:left="2160" w:hanging="360"/>
+      </w:pPr>
+      <w:rPr>
+        <w:rFonts w:ascii="Wingdings" w:hAnsi="Wingdings" w:hint="default"/>
+      </w:rPr>
+    </w:lvl>
+    <w:lvl w:ilvl="3" w:tplc="40090001" w:tentative="1">
+      <w:start w:val="1"/>
+      <w:numFmt w:val="bullet"/>
+      <w:lvlText w:val=""/>
+      <w:lvlJc w:val="left"/>
+      <w:pPr>
+        <w:ind w:left="2880" w:hanging="360"/>
+      </w:pPr>
+      <w:rPr>
+        <w:rFonts w:ascii="Symbol" w:hAnsi="Symbol" w:hint="default"/>
+      </w:rPr>
+    </w:lvl>
+    <w:lvl w:ilvl="4" w:tplc="40090003" w:tentative="1">
+      <w:start w:val="1"/>
+      <w:numFmt w:val="bullet"/>
+      <w:lvlText w:val="o"/>
+      <w:lvlJc w:val="left"/>
+      <w:pPr>
+        <w:ind w:left="3600" w:hanging="360"/>
+      </w:pPr>
+      <w:rPr>
+        <w:rFonts w:ascii="Courier New" w:hAnsi="Courier New" w:cs="Courier New" w:hint="default"/>
+      </w:rPr>
+    </w:lvl>
+    <w:lvl w:ilvl="5" w:tplc="40090005" w:tentative="1">
+      <w:start w:val="1"/>
+      <w:numFmt w:val="bullet"/>
+      <w:lvlText w:val=""/>
+      <w:lvlJc w:val="left"/>
+      <w:pPr>
+        <w:ind w:left="4320" w:hanging="360"/>
+      </w:pPr>
+      <w:rPr>
+        <w:rFonts w:ascii="Wingdings" w:hAnsi="Wingdings" w:hint="default"/>
+      </w:rPr>
+    </w:lvl>
+    <w:lvl w:ilvl="6" w:tplc="40090001" w:tentative="1">
+      <w:start w:val="1"/>
+      <w:numFmt w:val="bullet"/>
+      <w:lvlText w:val=""/>
+      <w:lvlJc w:val="left"/>
+      <w:pPr>
+        <w:ind w:left="5040" w:hanging="360"/>
+      </w:pPr>
+      <w:rPr>
+        <w:rFonts w:ascii="Symbol" w:hAnsi="Symbol" w:hint="default"/>
+      </w:rPr>
+    </w:lvl>
+    <w:lvl w:ilvl="7" w:tplc="40090003" w:tentative="1">
+      <w:start w:val="1"/>
+      <w:numFmt w:val="bullet"/>
+      <w:lvlText w:val="o"/>
+      <w:lvlJc w:val="left"/>
+      <w:pPr>
+        <w:ind w:left="5760" w:hanging="360"/>
+      </w:pPr>
+      <w:rPr>
+        <w:rFonts w:ascii="Courier New" w:hAnsi="Courier New" w:cs="Courier New" w:hint="default"/>
+      </w:rPr>
+    </w:lvl>
+    <w:lvl w:ilvl="8" w:tplc="40090005" w:tentative="1">
+      <w:start w:val="1"/>
+      <w:numFmt w:val="bullet"/>
+      <w:lvlText w:val=""/>
+      <w:lvlJc w:val="left"/>
+      <w:pPr>
+        <w:ind w:left="6480" w:hanging="360"/>
+      </w:pPr>
+      <w:rPr>
+        <w:rFonts w:ascii="Wingdings" w:hAnsi="Wingdings" w:hint="default"/>
+      </w:rPr>
+    </w:lvl>
+  </w:abstractNum>
+  <w:abstractNum w:abstractNumId="6">
     <w:nsid w:val="199F13F0"/>
     <w:multiLevelType w:val="hybridMultilevel"/>
     <w:tmpl w:val="4B02E550"/>
@@ -9069,7 +9502,7 @@
       </w:rPr>
     </w:lvl>
   </w:abstractNum>
-  <w:abstractNum w:abstractNumId="6">
+  <w:abstractNum w:abstractNumId="7">
     <w:nsid w:val="22CD3FE6"/>
     <w:multiLevelType w:val="hybridMultilevel"/>
     <w:tmpl w:val="431E3674"/>
@@ -9182,7 +9615,7 @@
       </w:rPr>
     </w:lvl>
   </w:abstractNum>
-  <w:abstractNum w:abstractNumId="7">
+  <w:abstractNum w:abstractNumId="8">
     <w:nsid w:val="25335F4F"/>
     <w:multiLevelType w:val="hybridMultilevel"/>
     <w:tmpl w:val="2EAE23BA"/>
@@ -9295,7 +9728,7 @@
       </w:rPr>
     </w:lvl>
   </w:abstractNum>
-  <w:abstractNum w:abstractNumId="8">
+  <w:abstractNum w:abstractNumId="9">
     <w:nsid w:val="268C0D27"/>
     <w:multiLevelType w:val="hybridMultilevel"/>
     <w:tmpl w:val="674E757A"/>
@@ -9408,7 +9841,7 @@
       </w:rPr>
     </w:lvl>
   </w:abstractNum>
-  <w:abstractNum w:abstractNumId="9">
+  <w:abstractNum w:abstractNumId="10">
     <w:nsid w:val="2C075435"/>
     <w:multiLevelType w:val="hybridMultilevel"/>
     <w:tmpl w:val="69AA0B26"/>
@@ -9521,7 +9954,7 @@
       </w:rPr>
     </w:lvl>
   </w:abstractNum>
-  <w:abstractNum w:abstractNumId="10">
+  <w:abstractNum w:abstractNumId="11">
     <w:nsid w:val="2D9B41A7"/>
     <w:multiLevelType w:val="hybridMultilevel"/>
     <w:tmpl w:val="C4EC2058"/>
@@ -9634,7 +10067,7 @@
       </w:rPr>
     </w:lvl>
   </w:abstractNum>
-  <w:abstractNum w:abstractNumId="11">
+  <w:abstractNum w:abstractNumId="12">
     <w:nsid w:val="2E8016BE"/>
     <w:multiLevelType w:val="hybridMultilevel"/>
     <w:tmpl w:val="C494F916"/>
@@ -9723,7 +10156,7 @@
       </w:pPr>
     </w:lvl>
   </w:abstractNum>
-  <w:abstractNum w:abstractNumId="12">
+  <w:abstractNum w:abstractNumId="13">
     <w:nsid w:val="369351E9"/>
     <w:multiLevelType w:val="hybridMultilevel"/>
     <w:tmpl w:val="0972A5CA"/>
@@ -9812,7 +10245,7 @@
       </w:pPr>
     </w:lvl>
   </w:abstractNum>
-  <w:abstractNum w:abstractNumId="13">
+  <w:abstractNum w:abstractNumId="14">
     <w:nsid w:val="379C2DB0"/>
     <w:multiLevelType w:val="hybridMultilevel"/>
     <w:tmpl w:val="097C3B70"/>
@@ -9925,7 +10358,7 @@
       </w:rPr>
     </w:lvl>
   </w:abstractNum>
-  <w:abstractNum w:abstractNumId="14">
+  <w:abstractNum w:abstractNumId="15">
     <w:nsid w:val="3B9A3EE0"/>
     <w:multiLevelType w:val="hybridMultilevel"/>
     <w:tmpl w:val="8B20B472"/>
@@ -10038,7 +10471,7 @@
       </w:rPr>
     </w:lvl>
   </w:abstractNum>
-  <w:abstractNum w:abstractNumId="15">
+  <w:abstractNum w:abstractNumId="16">
     <w:nsid w:val="3D565FA3"/>
     <w:multiLevelType w:val="hybridMultilevel"/>
     <w:tmpl w:val="A8F8AFEE"/>
@@ -10127,7 +10560,7 @@
       </w:pPr>
     </w:lvl>
   </w:abstractNum>
-  <w:abstractNum w:abstractNumId="16">
+  <w:abstractNum w:abstractNumId="17">
     <w:nsid w:val="46875C90"/>
     <w:multiLevelType w:val="hybridMultilevel"/>
     <w:tmpl w:val="78C0CFB6"/>
@@ -10216,7 +10649,7 @@
       </w:pPr>
     </w:lvl>
   </w:abstractNum>
-  <w:abstractNum w:abstractNumId="17">
+  <w:abstractNum w:abstractNumId="18">
     <w:nsid w:val="471F3D0D"/>
     <w:multiLevelType w:val="hybridMultilevel"/>
     <w:tmpl w:val="D02CD718"/>
@@ -10305,7 +10738,7 @@
       </w:pPr>
     </w:lvl>
   </w:abstractNum>
-  <w:abstractNum w:abstractNumId="18">
+  <w:abstractNum w:abstractNumId="19">
     <w:nsid w:val="4E2A6329"/>
     <w:multiLevelType w:val="hybridMultilevel"/>
     <w:tmpl w:val="BC1628F2"/>
@@ -10418,7 +10851,7 @@
       </w:rPr>
     </w:lvl>
   </w:abstractNum>
-  <w:abstractNum w:abstractNumId="19">
+  <w:abstractNum w:abstractNumId="20">
     <w:nsid w:val="556E1B57"/>
     <w:multiLevelType w:val="hybridMultilevel"/>
     <w:tmpl w:val="26087466"/>
@@ -10531,7 +10964,7 @@
       </w:rPr>
     </w:lvl>
   </w:abstractNum>
-  <w:abstractNum w:abstractNumId="20">
+  <w:abstractNum w:abstractNumId="21">
     <w:nsid w:val="55D10A8D"/>
     <w:multiLevelType w:val="hybridMultilevel"/>
     <w:tmpl w:val="7312E058"/>
@@ -10620,7 +11053,7 @@
       </w:pPr>
     </w:lvl>
   </w:abstractNum>
-  <w:abstractNum w:abstractNumId="21">
+  <w:abstractNum w:abstractNumId="22">
     <w:nsid w:val="56165AD5"/>
     <w:multiLevelType w:val="hybridMultilevel"/>
     <w:tmpl w:val="E0B403D2"/>
@@ -10733,7 +11166,7 @@
       </w:rPr>
     </w:lvl>
   </w:abstractNum>
-  <w:abstractNum w:abstractNumId="22">
+  <w:abstractNum w:abstractNumId="23">
     <w:nsid w:val="56F946E6"/>
     <w:multiLevelType w:val="hybridMultilevel"/>
     <w:tmpl w:val="287A5F26"/>
@@ -10822,7 +11255,7 @@
       </w:pPr>
     </w:lvl>
   </w:abstractNum>
-  <w:abstractNum w:abstractNumId="23">
+  <w:abstractNum w:abstractNumId="24">
     <w:nsid w:val="5A897377"/>
     <w:multiLevelType w:val="hybridMultilevel"/>
     <w:tmpl w:val="F1F27818"/>
@@ -10935,7 +11368,7 @@
       </w:rPr>
     </w:lvl>
   </w:abstractNum>
-  <w:abstractNum w:abstractNumId="24">
+  <w:abstractNum w:abstractNumId="25">
     <w:nsid w:val="5D096968"/>
     <w:multiLevelType w:val="hybridMultilevel"/>
     <w:tmpl w:val="87A897FA"/>
@@ -11024,7 +11457,7 @@
       </w:pPr>
     </w:lvl>
   </w:abstractNum>
-  <w:abstractNum w:abstractNumId="25">
+  <w:abstractNum w:abstractNumId="26">
     <w:nsid w:val="602D5BA0"/>
     <w:multiLevelType w:val="hybridMultilevel"/>
     <w:tmpl w:val="7EDAE732"/>
@@ -11137,7 +11570,7 @@
       </w:rPr>
     </w:lvl>
   </w:abstractNum>
-  <w:abstractNum w:abstractNumId="26">
+  <w:abstractNum w:abstractNumId="27">
     <w:nsid w:val="63DD59AE"/>
     <w:multiLevelType w:val="hybridMultilevel"/>
     <w:tmpl w:val="4F783448"/>
@@ -11250,7 +11683,120 @@
       </w:rPr>
     </w:lvl>
   </w:abstractNum>
-  <w:abstractNum w:abstractNumId="27">
+  <w:abstractNum w:abstractNumId="28">
+    <w:nsid w:val="66F74F83"/>
+    <w:multiLevelType w:val="hybridMultilevel"/>
+    <w:tmpl w:val="47FE45C4"/>
+    <w:lvl w:ilvl="0" w:tplc="40090001">
+      <w:start w:val="1"/>
+      <w:numFmt w:val="bullet"/>
+      <w:lvlText w:val=""/>
+      <w:lvlJc w:val="left"/>
+      <w:pPr>
+        <w:ind w:left="720" w:hanging="360"/>
+      </w:pPr>
+      <w:rPr>
+        <w:rFonts w:ascii="Symbol" w:hAnsi="Symbol" w:hint="default"/>
+      </w:rPr>
+    </w:lvl>
+    <w:lvl w:ilvl="1" w:tplc="40090003">
+      <w:start w:val="1"/>
+      <w:numFmt w:val="bullet"/>
+      <w:lvlText w:val="o"/>
+      <w:lvlJc w:val="left"/>
+      <w:pPr>
+        <w:ind w:left="1440" w:hanging="360"/>
+      </w:pPr>
+      <w:rPr>
+        <w:rFonts w:ascii="Courier New" w:hAnsi="Courier New" w:cs="Courier New" w:hint="default"/>
+      </w:rPr>
+    </w:lvl>
+    <w:lvl w:ilvl="2" w:tplc="40090005" w:tentative="1">
+      <w:start w:val="1"/>
+      <w:numFmt w:val="bullet"/>
+      <w:lvlText w:val=""/>
+      <w:lvlJc w:val="left"/>
+      <w:pPr>
+        <w:ind w:left="2160" w:hanging="360"/>
+      </w:pPr>
+      <w:rPr>
+        <w:rFonts w:ascii="Wingdings" w:hAnsi="Wingdings" w:hint="default"/>
+      </w:rPr>
+    </w:lvl>
+    <w:lvl w:ilvl="3" w:tplc="40090001" w:tentative="1">
+      <w:start w:val="1"/>
+      <w:numFmt w:val="bullet"/>
+      <w:lvlText w:val=""/>
+      <w:lvlJc w:val="left"/>
+      <w:pPr>
+        <w:ind w:left="2880" w:hanging="360"/>
+      </w:pPr>
+      <w:rPr>
+        <w:rFonts w:ascii="Symbol" w:hAnsi="Symbol" w:hint="default"/>
+      </w:rPr>
+    </w:lvl>
+    <w:lvl w:ilvl="4" w:tplc="40090003" w:tentative="1">
+      <w:start w:val="1"/>
+      <w:numFmt w:val="bullet"/>
+      <w:lvlText w:val="o"/>
+      <w:lvlJc w:val="left"/>
+      <w:pPr>
+        <w:ind w:left="3600" w:hanging="360"/>
+      </w:pPr>
+      <w:rPr>
+        <w:rFonts w:ascii="Courier New" w:hAnsi="Courier New" w:cs="Courier New" w:hint="default"/>
+      </w:rPr>
+    </w:lvl>
+    <w:lvl w:ilvl="5" w:tplc="40090005" w:tentative="1">
+      <w:start w:val="1"/>
+      <w:numFmt w:val="bullet"/>
+      <w:lvlText w:val=""/>
+      <w:lvlJc w:val="left"/>
+      <w:pPr>
+        <w:ind w:left="4320" w:hanging="360"/>
+      </w:pPr>
+      <w:rPr>
+        <w:rFonts w:ascii="Wingdings" w:hAnsi="Wingdings" w:hint="default"/>
+      </w:rPr>
+    </w:lvl>
+    <w:lvl w:ilvl="6" w:tplc="40090001" w:tentative="1">
+      <w:start w:val="1"/>
+      <w:numFmt w:val="bullet"/>
+      <w:lvlText w:val=""/>
+      <w:lvlJc w:val="left"/>
+      <w:pPr>
+        <w:ind w:left="5040" w:hanging="360"/>
+      </w:pPr>
+      <w:rPr>
+        <w:rFonts w:ascii="Symbol" w:hAnsi="Symbol" w:hint="default"/>
+      </w:rPr>
+    </w:lvl>
+    <w:lvl w:ilvl="7" w:tplc="40090003" w:tentative="1">
+      <w:start w:val="1"/>
+      <w:numFmt w:val="bullet"/>
+      <w:lvlText w:val="o"/>
+      <w:lvlJc w:val="left"/>
+      <w:pPr>
+        <w:ind w:left="5760" w:hanging="360"/>
+      </w:pPr>
+      <w:rPr>
+        <w:rFonts w:ascii="Courier New" w:hAnsi="Courier New" w:cs="Courier New" w:hint="default"/>
+      </w:rPr>
+    </w:lvl>
+    <w:lvl w:ilvl="8" w:tplc="40090005" w:tentative="1">
+      <w:start w:val="1"/>
+      <w:numFmt w:val="bullet"/>
+      <w:lvlText w:val=""/>
+      <w:lvlJc w:val="left"/>
+      <w:pPr>
+        <w:ind w:left="6480" w:hanging="360"/>
+      </w:pPr>
+      <w:rPr>
+        <w:rFonts w:ascii="Wingdings" w:hAnsi="Wingdings" w:hint="default"/>
+      </w:rPr>
+    </w:lvl>
+  </w:abstractNum>
+  <w:abstractNum w:abstractNumId="29">
     <w:nsid w:val="6B375CC6"/>
     <w:multiLevelType w:val="hybridMultilevel"/>
     <w:tmpl w:val="DD7A439E"/>
@@ -11363,7 +11909,7 @@
       </w:rPr>
     </w:lvl>
   </w:abstractNum>
-  <w:abstractNum w:abstractNumId="28">
+  <w:abstractNum w:abstractNumId="30">
     <w:nsid w:val="736235B6"/>
     <w:multiLevelType w:val="hybridMultilevel"/>
     <w:tmpl w:val="9338354A"/>
@@ -11476,7 +12022,7 @@
       </w:rPr>
     </w:lvl>
   </w:abstractNum>
-  <w:abstractNum w:abstractNumId="29">
+  <w:abstractNum w:abstractNumId="31">
     <w:nsid w:val="77623988"/>
     <w:multiLevelType w:val="hybridMultilevel"/>
     <w:tmpl w:val="702CA274"/>
@@ -11565,7 +12111,7 @@
       </w:pPr>
     </w:lvl>
   </w:abstractNum>
-  <w:abstractNum w:abstractNumId="30">
+  <w:abstractNum w:abstractNumId="32">
     <w:nsid w:val="78C031D0"/>
     <w:multiLevelType w:val="hybridMultilevel"/>
     <w:tmpl w:val="65F4D1E2"/>
@@ -11678,7 +12224,7 @@
       </w:rPr>
     </w:lvl>
   </w:abstractNum>
-  <w:abstractNum w:abstractNumId="31">
+  <w:abstractNum w:abstractNumId="33">
     <w:nsid w:val="7DB56E55"/>
     <w:multiLevelType w:val="hybridMultilevel"/>
     <w:tmpl w:val="1B88A856"/>
@@ -11768,100 +12314,106 @@
     </w:lvl>
   </w:abstractNum>
   <w:num w:numId="1">
-    <w:abstractNumId w:val="26"/>
+    <w:abstractNumId w:val="27"/>
   </w:num>
   <w:num w:numId="2">
-    <w:abstractNumId w:val="8"/>
+    <w:abstractNumId w:val="9"/>
   </w:num>
   <w:num w:numId="3">
-    <w:abstractNumId w:val="18"/>
+    <w:abstractNumId w:val="19"/>
   </w:num>
   <w:num w:numId="4">
     <w:abstractNumId w:val="2"/>
   </w:num>
   <w:num w:numId="5">
-    <w:abstractNumId w:val="21"/>
+    <w:abstractNumId w:val="22"/>
   </w:num>
   <w:num w:numId="6">
-    <w:abstractNumId w:val="19"/>
+    <w:abstractNumId w:val="20"/>
   </w:num>
   <w:num w:numId="7">
-    <w:abstractNumId w:val="6"/>
+    <w:abstractNumId w:val="7"/>
   </w:num>
   <w:num w:numId="8">
-    <w:abstractNumId w:val="28"/>
+    <w:abstractNumId w:val="30"/>
   </w:num>
   <w:num w:numId="9">
-    <w:abstractNumId w:val="9"/>
+    <w:abstractNumId w:val="10"/>
   </w:num>
   <w:num w:numId="10">
     <w:abstractNumId w:val="0"/>
   </w:num>
   <w:num w:numId="11">
-    <w:abstractNumId w:val="13"/>
+    <w:abstractNumId w:val="14"/>
   </w:num>
   <w:num w:numId="12">
-    <w:abstractNumId w:val="23"/>
+    <w:abstractNumId w:val="24"/>
   </w:num>
   <w:num w:numId="13">
     <w:abstractNumId w:val="4"/>
   </w:num>
   <w:num w:numId="14">
-    <w:abstractNumId w:val="12"/>
+    <w:abstractNumId w:val="13"/>
   </w:num>
   <w:num w:numId="15">
-    <w:abstractNumId w:val="31"/>
+    <w:abstractNumId w:val="33"/>
   </w:num>
   <w:num w:numId="16">
-    <w:abstractNumId w:val="27"/>
+    <w:abstractNumId w:val="29"/>
   </w:num>
   <w:num w:numId="17">
-    <w:abstractNumId w:val="30"/>
+    <w:abstractNumId w:val="32"/>
   </w:num>
   <w:num w:numId="18">
-    <w:abstractNumId w:val="10"/>
+    <w:abstractNumId w:val="11"/>
   </w:num>
   <w:num w:numId="19">
-    <w:abstractNumId w:val="25"/>
+    <w:abstractNumId w:val="26"/>
   </w:num>
   <w:num w:numId="20">
-    <w:abstractNumId w:val="14"/>
+    <w:abstractNumId w:val="15"/>
   </w:num>
   <w:num w:numId="21">
-    <w:abstractNumId w:val="7"/>
+    <w:abstractNumId w:val="8"/>
   </w:num>
   <w:num w:numId="22">
-    <w:abstractNumId w:val="20"/>
+    <w:abstractNumId w:val="21"/>
   </w:num>
   <w:num w:numId="23">
     <w:abstractNumId w:val="1"/>
   </w:num>
   <w:num w:numId="24">
-    <w:abstractNumId w:val="22"/>
+    <w:abstractNumId w:val="23"/>
   </w:num>
   <w:num w:numId="25">
-    <w:abstractNumId w:val="16"/>
+    <w:abstractNumId w:val="17"/>
   </w:num>
   <w:num w:numId="26">
-    <w:abstractNumId w:val="5"/>
+    <w:abstractNumId w:val="6"/>
   </w:num>
   <w:num w:numId="27">
     <w:abstractNumId w:val="3"/>
   </w:num>
   <w:num w:numId="28">
-    <w:abstractNumId w:val="17"/>
+    <w:abstractNumId w:val="18"/>
   </w:num>
   <w:num w:numId="29">
-    <w:abstractNumId w:val="15"/>
+    <w:abstractNumId w:val="16"/>
   </w:num>
   <w:num w:numId="30">
-    <w:abstractNumId w:val="11"/>
+    <w:abstractNumId w:val="12"/>
   </w:num>
   <w:num w:numId="31">
-    <w:abstractNumId w:val="29"/>
+    <w:abstractNumId w:val="31"/>
   </w:num>
   <w:num w:numId="32">
-    <w:abstractNumId w:val="24"/>
+    <w:abstractNumId w:val="25"/>
+  </w:num>
+  <w:num w:numId="33">
+    <w:abstractNumId w:val="5"/>
+  </w:num>
+  <w:num w:numId="34">
+    <w:abstractNumId w:val="28"/>
   </w:num>
 </w:numbering>
 </file>

</xml_diff>

<commit_message>
Date: 04 Apr 2026
</commit_message>
<xml_diff>
--- a/Selenium_Notes.docx
+++ b/Selenium_Notes.docx
@@ -9396,6 +9396,24 @@
           </wp:inline>
         </w:drawing>
       </w:r>
+    </w:p>
+    <w:p>
+      <w:pPr>
+        <w:rPr>
+          <w:b/>
+          <w:bCs/>
+          <w:lang w:val="en-US"/>
+        </w:rPr>
+      </w:pPr>
+    </w:p>
+    <w:p>
+      <w:pPr>
+        <w:rPr>
+          <w:b/>
+          <w:bCs/>
+          <w:lang w:val="en-US"/>
+        </w:rPr>
+      </w:pPr>
       <w:bookmarkStart w:id="0" w:name="_GoBack"/>
       <w:bookmarkEnd w:id="0"/>
     </w:p>

</xml_diff>

<commit_message>
Date: 25 Apr 2026
</commit_message>
<xml_diff>
--- a/Selenium_Notes.docx
+++ b/Selenium_Notes.docx
@@ -9414,6 +9414,1052 @@
           <w:lang w:val="en-US"/>
         </w:rPr>
       </w:pPr>
+      <w:r>
+        <w:rPr>
+          <w:b/>
+          <w:bCs/>
+          <w:lang w:val="en-US"/>
+        </w:rPr>
+        <w:br w:type="page"/>
+      </w:r>
+    </w:p>
+    <w:p>
+      <w:pPr>
+        <w:rPr>
+          <w:b/>
+          <w:bCs/>
+          <w:lang w:val="en-US"/>
+        </w:rPr>
+      </w:pPr>
+      <w:r>
+        <w:rPr>
+          <w:b/>
+          <w:bCs/>
+          <w:lang w:val="en-US"/>
+        </w:rPr>
+        <w:lastRenderedPageBreak/>
+        <w:t>Maven</w:t>
+      </w:r>
+    </w:p>
+    <w:p>
+      <w:pPr>
+        <w:pStyle w:val="ListParagraph"/>
+        <w:numPr>
+          <w:ilvl w:val="0"/>
+          <w:numId w:val="35"/>
+        </w:numPr>
+        <w:rPr>
+          <w:lang w:val="en-US"/>
+        </w:rPr>
+      </w:pPr>
+      <w:r>
+        <w:rPr>
+          <w:lang w:val="en-US"/>
+        </w:rPr>
+        <w:t>Build management tool.</w:t>
+      </w:r>
+    </w:p>
+    <w:p>
+      <w:pPr>
+        <w:pStyle w:val="ListParagraph"/>
+        <w:numPr>
+          <w:ilvl w:val="0"/>
+          <w:numId w:val="35"/>
+        </w:numPr>
+        <w:rPr>
+          <w:lang w:val="en-US"/>
+        </w:rPr>
+      </w:pPr>
+      <w:r>
+        <w:rPr>
+          <w:lang w:val="en-US"/>
+        </w:rPr>
+        <w:t>Introduced by Apache group.</w:t>
+      </w:r>
+    </w:p>
+    <w:p>
+      <w:pPr>
+        <w:pStyle w:val="ListParagraph"/>
+        <w:numPr>
+          <w:ilvl w:val="0"/>
+          <w:numId w:val="35"/>
+        </w:numPr>
+        <w:rPr>
+          <w:lang w:val="en-US"/>
+        </w:rPr>
+      </w:pPr>
+      <w:r>
+        <w:rPr>
+          <w:lang w:val="en-US"/>
+        </w:rPr>
+        <w:t>Can be used by both developer and tester</w:t>
+      </w:r>
+    </w:p>
+    <w:p>
+      <w:pPr>
+        <w:pStyle w:val="ListParagraph"/>
+        <w:numPr>
+          <w:ilvl w:val="0"/>
+          <w:numId w:val="35"/>
+        </w:numPr>
+        <w:rPr>
+          <w:lang w:val="en-US"/>
+        </w:rPr>
+      </w:pPr>
+      <w:r>
+        <w:rPr>
+          <w:lang w:val="en-US"/>
+        </w:rPr>
+        <w:t>A single project can be used by both developer and tester</w:t>
+      </w:r>
+    </w:p>
+    <w:p>
+      <w:pPr>
+        <w:pStyle w:val="ListParagraph"/>
+        <w:numPr>
+          <w:ilvl w:val="0"/>
+          <w:numId w:val="35"/>
+        </w:numPr>
+        <w:rPr>
+          <w:lang w:val="en-US"/>
+        </w:rPr>
+      </w:pPr>
+      <w:r>
+        <w:rPr>
+          <w:lang w:val="en-US"/>
+        </w:rPr>
+        <w:t>Easy configuration via pom.xml file</w:t>
+      </w:r>
+    </w:p>
+    <w:p>
+      <w:pPr>
+        <w:pStyle w:val="ListParagraph"/>
+        <w:numPr>
+          <w:ilvl w:val="0"/>
+          <w:numId w:val="35"/>
+        </w:numPr>
+        <w:rPr>
+          <w:lang w:val="en-US"/>
+        </w:rPr>
+      </w:pPr>
+      <w:r>
+        <w:rPr>
+          <w:lang w:val="en-US"/>
+        </w:rPr>
+        <w:t>Uses dependency</w:t>
+      </w:r>
+    </w:p>
+    <w:p>
+      <w:pPr>
+        <w:pStyle w:val="ListParagraph"/>
+        <w:numPr>
+          <w:ilvl w:val="0"/>
+          <w:numId w:val="35"/>
+        </w:numPr>
+        <w:rPr>
+          <w:lang w:val="en-US"/>
+        </w:rPr>
+      </w:pPr>
+      <w:r>
+        <w:rPr>
+          <w:lang w:val="en-US"/>
+        </w:rPr>
+        <w:t>Easy execution</w:t>
+      </w:r>
+    </w:p>
+    <w:p>
+      <w:pPr>
+        <w:rPr>
+          <w:lang w:val="en-US"/>
+        </w:rPr>
+      </w:pPr>
+    </w:p>
+    <w:p>
+      <w:pPr>
+        <w:rPr>
+          <w:lang w:val="en-US"/>
+        </w:rPr>
+      </w:pPr>
+    </w:p>
+    <w:p>
+      <w:pPr>
+        <w:rPr>
+          <w:lang w:val="en-US"/>
+        </w:rPr>
+      </w:pPr>
+      <w:r>
+        <w:rPr>
+          <w:lang w:val="en-US"/>
+        </w:rPr>
+        <w:br w:type="page"/>
+      </w:r>
+    </w:p>
+    <w:p>
+      <w:pPr>
+        <w:rPr>
+          <w:b/>
+          <w:bCs/>
+          <w:lang w:val="en-US"/>
+        </w:rPr>
+      </w:pPr>
+      <w:r>
+        <w:rPr>
+          <w:b/>
+          <w:bCs/>
+          <w:lang w:val="en-US"/>
+        </w:rPr>
+        <w:lastRenderedPageBreak/>
+        <w:t>BDD Approach / Framework</w:t>
+      </w:r>
+    </w:p>
+    <w:p>
+      <w:pPr>
+        <w:pStyle w:val="ListParagraph"/>
+        <w:numPr>
+          <w:ilvl w:val="0"/>
+          <w:numId w:val="36"/>
+        </w:numPr>
+        <w:rPr>
+          <w:lang w:val="en-US"/>
+        </w:rPr>
+      </w:pPr>
+      <w:r>
+        <w:rPr>
+          <w:lang w:val="en-US"/>
+        </w:rPr>
+        <w:t>BA, QA team &amp; Development team will gather the requirements from client.</w:t>
+      </w:r>
+    </w:p>
+    <w:p>
+      <w:pPr>
+        <w:pStyle w:val="ListParagraph"/>
+        <w:numPr>
+          <w:ilvl w:val="0"/>
+          <w:numId w:val="36"/>
+        </w:numPr>
+        <w:rPr>
+          <w:lang w:val="en-US"/>
+        </w:rPr>
+      </w:pPr>
+      <w:r>
+        <w:rPr>
+          <w:lang w:val="en-US"/>
+        </w:rPr>
+        <w:t>Finalized requirements will be shared with QA team.</w:t>
+      </w:r>
+    </w:p>
+    <w:p>
+      <w:pPr>
+        <w:pStyle w:val="ListParagraph"/>
+        <w:numPr>
+          <w:ilvl w:val="0"/>
+          <w:numId w:val="36"/>
+        </w:numPr>
+        <w:rPr>
+          <w:lang w:val="en-US"/>
+        </w:rPr>
+      </w:pPr>
+      <w:r>
+        <w:rPr>
+          <w:lang w:val="en-US"/>
+        </w:rPr>
+        <w:t xml:space="preserve">QA team will create </w:t>
+      </w:r>
+      <w:r>
+        <w:rPr>
+          <w:b/>
+          <w:bCs/>
+          <w:lang w:val="en-US"/>
+        </w:rPr>
+        <w:t>Feature File (1</w:t>
+      </w:r>
+      <w:r>
+        <w:rPr>
+          <w:b/>
+          <w:bCs/>
+          <w:vertAlign w:val="superscript"/>
+          <w:lang w:val="en-US"/>
+        </w:rPr>
+        <w:t>st</w:t>
+      </w:r>
+      <w:r>
+        <w:rPr>
+          <w:b/>
+          <w:bCs/>
+          <w:lang w:val="en-US"/>
+        </w:rPr>
+        <w:t xml:space="preserve"> Component of BDD)</w:t>
+      </w:r>
+    </w:p>
+    <w:p>
+      <w:pPr>
+        <w:pStyle w:val="ListParagraph"/>
+        <w:numPr>
+          <w:ilvl w:val="1"/>
+          <w:numId w:val="36"/>
+        </w:numPr>
+        <w:rPr>
+          <w:lang w:val="en-US"/>
+        </w:rPr>
+      </w:pPr>
+      <w:r>
+        <w:rPr>
+          <w:lang w:val="en-US"/>
+        </w:rPr>
+        <w:t>Collection of Test Scenarios</w:t>
+      </w:r>
+    </w:p>
+    <w:p>
+      <w:pPr>
+        <w:pStyle w:val="ListParagraph"/>
+        <w:numPr>
+          <w:ilvl w:val="0"/>
+          <w:numId w:val="36"/>
+        </w:numPr>
+        <w:rPr>
+          <w:lang w:val="en-US"/>
+        </w:rPr>
+      </w:pPr>
+      <w:r>
+        <w:rPr>
+          <w:lang w:val="en-US"/>
+        </w:rPr>
+        <w:t xml:space="preserve">This feature file will be shared with </w:t>
+      </w:r>
+    </w:p>
+    <w:p>
+      <w:pPr>
+        <w:pStyle w:val="ListParagraph"/>
+        <w:numPr>
+          <w:ilvl w:val="1"/>
+          <w:numId w:val="36"/>
+        </w:numPr>
+        <w:rPr>
+          <w:lang w:val="en-US"/>
+        </w:rPr>
+      </w:pPr>
+      <w:r>
+        <w:rPr>
+          <w:lang w:val="en-US"/>
+        </w:rPr>
+        <w:t>Development team</w:t>
+      </w:r>
+    </w:p>
+    <w:p>
+      <w:pPr>
+        <w:pStyle w:val="ListParagraph"/>
+        <w:numPr>
+          <w:ilvl w:val="1"/>
+          <w:numId w:val="36"/>
+        </w:numPr>
+        <w:rPr>
+          <w:lang w:val="en-US"/>
+        </w:rPr>
+      </w:pPr>
+      <w:r>
+        <w:rPr>
+          <w:lang w:val="en-US"/>
+        </w:rPr>
+        <w:t>Manual Tester</w:t>
+      </w:r>
+    </w:p>
+    <w:p>
+      <w:pPr>
+        <w:pStyle w:val="ListParagraph"/>
+        <w:numPr>
+          <w:ilvl w:val="1"/>
+          <w:numId w:val="36"/>
+        </w:numPr>
+        <w:rPr>
+          <w:lang w:val="en-US"/>
+        </w:rPr>
+      </w:pPr>
+      <w:r>
+        <w:rPr>
+          <w:lang w:val="en-US"/>
+        </w:rPr>
+        <w:t>Automation Tester</w:t>
+      </w:r>
+    </w:p>
+    <w:p>
+      <w:pPr>
+        <w:pStyle w:val="ListParagraph"/>
+        <w:numPr>
+          <w:ilvl w:val="0"/>
+          <w:numId w:val="36"/>
+        </w:numPr>
+        <w:rPr>
+          <w:lang w:val="en-US"/>
+        </w:rPr>
+      </w:pPr>
+      <w:r>
+        <w:rPr>
+          <w:lang w:val="en-US"/>
+        </w:rPr>
+        <w:t xml:space="preserve">Automation tester will execute this feature file and they will get </w:t>
+      </w:r>
+      <w:r>
+        <w:rPr>
+          <w:b/>
+          <w:bCs/>
+          <w:lang w:val="en-US"/>
+        </w:rPr>
+        <w:t>Glue Code / Step Definition (2</w:t>
+      </w:r>
+      <w:r>
+        <w:rPr>
+          <w:b/>
+          <w:bCs/>
+          <w:vertAlign w:val="superscript"/>
+          <w:lang w:val="en-US"/>
+        </w:rPr>
+        <w:t>nd</w:t>
+      </w:r>
+      <w:r>
+        <w:rPr>
+          <w:b/>
+          <w:bCs/>
+          <w:lang w:val="en-US"/>
+        </w:rPr>
+        <w:t xml:space="preserve"> Component of BDD)</w:t>
+      </w:r>
+    </w:p>
+    <w:p>
+      <w:pPr>
+        <w:pStyle w:val="ListParagraph"/>
+        <w:numPr>
+          <w:ilvl w:val="1"/>
+          <w:numId w:val="36"/>
+        </w:numPr>
+        <w:rPr>
+          <w:lang w:val="en-US"/>
+        </w:rPr>
+      </w:pPr>
+      <w:r>
+        <w:rPr>
+          <w:lang w:val="en-US"/>
+        </w:rPr>
+        <w:t>Skeleton for automation script</w:t>
+      </w:r>
+    </w:p>
+    <w:p>
+      <w:pPr>
+        <w:pStyle w:val="ListParagraph"/>
+        <w:numPr>
+          <w:ilvl w:val="1"/>
+          <w:numId w:val="36"/>
+        </w:numPr>
+        <w:rPr>
+          <w:lang w:val="en-US"/>
+        </w:rPr>
+      </w:pPr>
+      <w:r>
+        <w:rPr>
+          <w:lang w:val="en-US"/>
+        </w:rPr>
+        <w:t>Java class</w:t>
+      </w:r>
+    </w:p>
+    <w:p>
+      <w:pPr>
+        <w:pStyle w:val="ListParagraph"/>
+        <w:numPr>
+          <w:ilvl w:val="0"/>
+          <w:numId w:val="36"/>
+        </w:numPr>
+        <w:rPr>
+          <w:lang w:val="en-US"/>
+        </w:rPr>
+      </w:pPr>
+      <w:r>
+        <w:rPr>
+          <w:b/>
+          <w:bCs/>
+          <w:lang w:val="en-US"/>
+        </w:rPr>
+        <w:t>Runner Class (3</w:t>
+      </w:r>
+      <w:r>
+        <w:rPr>
+          <w:b/>
+          <w:bCs/>
+          <w:vertAlign w:val="superscript"/>
+          <w:lang w:val="en-US"/>
+        </w:rPr>
+        <w:t>rd</w:t>
+      </w:r>
+      <w:r>
+        <w:rPr>
+          <w:b/>
+          <w:bCs/>
+          <w:lang w:val="en-US"/>
+        </w:rPr>
+        <w:t xml:space="preserve"> Component of BDD) </w:t>
+      </w:r>
+      <w:r>
+        <w:rPr>
+          <w:lang w:val="en-US"/>
+        </w:rPr>
+        <w:t xml:space="preserve">is used </w:t>
+      </w:r>
+      <w:r>
+        <w:rPr>
+          <w:lang w:val="en-US"/>
+        </w:rPr>
+        <w:t>to execute the automation script</w:t>
+      </w:r>
+    </w:p>
+    <w:p>
+      <w:pPr>
+        <w:pBdr>
+          <w:bottom w:val="single" w:sz="6" w:space="1" w:color="auto"/>
+        </w:pBdr>
+        <w:rPr>
+          <w:lang w:val="en-US"/>
+        </w:rPr>
+      </w:pPr>
+    </w:p>
+    <w:p>
+      <w:pPr>
+        <w:rPr>
+          <w:b/>
+          <w:bCs/>
+          <w:lang w:val="en-US"/>
+        </w:rPr>
+      </w:pPr>
+      <w:r>
+        <w:rPr>
+          <w:b/>
+          <w:bCs/>
+          <w:lang w:val="en-US"/>
+        </w:rPr>
+        <w:t>Cucumber is the tool which can be used to implementation of BDD</w:t>
+      </w:r>
+    </w:p>
+    <w:p>
+      <w:pPr>
+        <w:pBdr>
+          <w:bottom w:val="single" w:sz="6" w:space="1" w:color="auto"/>
+        </w:pBdr>
+        <w:rPr>
+          <w:b/>
+          <w:bCs/>
+          <w:lang w:val="en-US"/>
+        </w:rPr>
+      </w:pPr>
+    </w:p>
+    <w:p>
+      <w:pPr>
+        <w:rPr>
+          <w:lang w:val="en-US"/>
+        </w:rPr>
+      </w:pPr>
+      <w:r>
+        <w:rPr>
+          <w:b/>
+          <w:bCs/>
+          <w:lang w:val="en-US"/>
+        </w:rPr>
+        <w:t>Feature File</w:t>
+      </w:r>
+    </w:p>
+    <w:p>
+      <w:pPr>
+        <w:pStyle w:val="ListParagraph"/>
+        <w:numPr>
+          <w:ilvl w:val="0"/>
+          <w:numId w:val="37"/>
+        </w:numPr>
+        <w:rPr>
+          <w:lang w:val="en-US"/>
+        </w:rPr>
+      </w:pPr>
+      <w:r>
+        <w:rPr>
+          <w:lang w:val="en-US"/>
+        </w:rPr>
+        <w:t>Collection of Test Scenarios</w:t>
+      </w:r>
+    </w:p>
+    <w:p>
+      <w:pPr>
+        <w:pStyle w:val="ListParagraph"/>
+        <w:numPr>
+          <w:ilvl w:val="0"/>
+          <w:numId w:val="37"/>
+        </w:numPr>
+        <w:rPr>
+          <w:lang w:val="en-US"/>
+        </w:rPr>
+      </w:pPr>
+      <w:r>
+        <w:rPr>
+          <w:lang w:val="en-US"/>
+        </w:rPr>
+        <w:t>Created using Gherkin Language</w:t>
+      </w:r>
+    </w:p>
+    <w:p>
+      <w:pPr>
+        <w:pStyle w:val="ListParagraph"/>
+        <w:numPr>
+          <w:ilvl w:val="0"/>
+          <w:numId w:val="37"/>
+        </w:numPr>
+        <w:rPr>
+          <w:lang w:val="en-US"/>
+        </w:rPr>
+      </w:pPr>
+      <w:r>
+        <w:rPr>
+          <w:lang w:val="en-US"/>
+        </w:rPr>
+        <w:t>Having extension .feature</w:t>
+      </w:r>
+    </w:p>
+    <w:p>
+      <w:pPr>
+        <w:pStyle w:val="ListParagraph"/>
+        <w:numPr>
+          <w:ilvl w:val="0"/>
+          <w:numId w:val="37"/>
+        </w:numPr>
+        <w:rPr>
+          <w:lang w:val="en-US"/>
+        </w:rPr>
+      </w:pPr>
+      <w:r>
+        <w:rPr>
+          <w:lang w:val="en-US"/>
+        </w:rPr>
+        <w:t>Uses Keywords</w:t>
+      </w:r>
+    </w:p>
+    <w:p>
+      <w:pPr>
+        <w:pStyle w:val="ListParagraph"/>
+        <w:numPr>
+          <w:ilvl w:val="1"/>
+          <w:numId w:val="37"/>
+        </w:numPr>
+        <w:rPr>
+          <w:lang w:val="en-US"/>
+        </w:rPr>
+      </w:pPr>
+      <w:r>
+        <w:rPr>
+          <w:lang w:val="en-US"/>
+        </w:rPr>
+        <w:t xml:space="preserve">Feature: </w:t>
+      </w:r>
+      <w:r>
+        <w:rPr>
+          <w:lang w:val="en-US"/>
+        </w:rPr>
+        <w:sym w:font="Wingdings" w:char="F0E0"/>
+      </w:r>
+      <w:r>
+        <w:rPr>
+          <w:lang w:val="en-US"/>
+        </w:rPr>
+        <w:t xml:space="preserve"> Represents the requirement</w:t>
+      </w:r>
+    </w:p>
+    <w:p>
+      <w:pPr>
+        <w:pStyle w:val="ListParagraph"/>
+        <w:numPr>
+          <w:ilvl w:val="1"/>
+          <w:numId w:val="37"/>
+        </w:numPr>
+        <w:rPr>
+          <w:lang w:val="en-US"/>
+        </w:rPr>
+      </w:pPr>
+      <w:r>
+        <w:rPr>
+          <w:lang w:val="en-US"/>
+        </w:rPr>
+        <w:t xml:space="preserve">Scenario: </w:t>
+      </w:r>
+      <w:r>
+        <w:rPr>
+          <w:lang w:val="en-US"/>
+        </w:rPr>
+        <w:sym w:font="Wingdings" w:char="F0E0"/>
+      </w:r>
+      <w:r>
+        <w:rPr>
+          <w:lang w:val="en-US"/>
+        </w:rPr>
+        <w:t xml:space="preserve"> Represents the Test Condition / Objective</w:t>
+      </w:r>
+    </w:p>
+    <w:p>
+      <w:pPr>
+        <w:pStyle w:val="ListParagraph"/>
+        <w:numPr>
+          <w:ilvl w:val="1"/>
+          <w:numId w:val="37"/>
+        </w:numPr>
+        <w:rPr>
+          <w:lang w:val="en-US"/>
+        </w:rPr>
+      </w:pPr>
+      <w:r>
+        <w:rPr>
+          <w:lang w:val="en-US"/>
+        </w:rPr>
+        <w:t xml:space="preserve">Given </w:t>
+      </w:r>
+      <w:r>
+        <w:rPr>
+          <w:lang w:val="en-US"/>
+        </w:rPr>
+        <w:sym w:font="Wingdings" w:char="F0E0"/>
+      </w:r>
+      <w:r>
+        <w:rPr>
+          <w:lang w:val="en-US"/>
+        </w:rPr>
+        <w:t xml:space="preserve"> Represents Pre-Requisite</w:t>
+      </w:r>
+    </w:p>
+    <w:p>
+      <w:pPr>
+        <w:pStyle w:val="ListParagraph"/>
+        <w:numPr>
+          <w:ilvl w:val="1"/>
+          <w:numId w:val="37"/>
+        </w:numPr>
+        <w:rPr>
+          <w:lang w:val="en-US"/>
+        </w:rPr>
+      </w:pPr>
+      <w:r>
+        <w:rPr>
+          <w:lang w:val="en-US"/>
+        </w:rPr>
+        <w:t xml:space="preserve">When </w:t>
+      </w:r>
+      <w:r>
+        <w:rPr>
+          <w:lang w:val="en-US"/>
+        </w:rPr>
+        <w:sym w:font="Wingdings" w:char="F0E0"/>
+      </w:r>
+      <w:r>
+        <w:rPr>
+          <w:lang w:val="en-US"/>
+        </w:rPr>
+        <w:t xml:space="preserve"> Represents the step</w:t>
+      </w:r>
+    </w:p>
+    <w:p>
+      <w:pPr>
+        <w:pStyle w:val="ListParagraph"/>
+        <w:numPr>
+          <w:ilvl w:val="1"/>
+          <w:numId w:val="37"/>
+        </w:numPr>
+        <w:rPr>
+          <w:lang w:val="en-US"/>
+        </w:rPr>
+      </w:pPr>
+      <w:r>
+        <w:rPr>
+          <w:lang w:val="en-US"/>
+        </w:rPr>
+        <w:t xml:space="preserve">And </w:t>
+      </w:r>
+      <w:r>
+        <w:rPr>
+          <w:lang w:val="en-US"/>
+        </w:rPr>
+        <w:sym w:font="Wingdings" w:char="F0E0"/>
+      </w:r>
+      <w:r>
+        <w:rPr>
+          <w:lang w:val="en-US"/>
+        </w:rPr>
+        <w:t xml:space="preserve"> Can be used to combine two When statements</w:t>
+      </w:r>
+    </w:p>
+    <w:p>
+      <w:pPr>
+        <w:pStyle w:val="ListParagraph"/>
+        <w:numPr>
+          <w:ilvl w:val="1"/>
+          <w:numId w:val="37"/>
+        </w:numPr>
+        <w:rPr>
+          <w:lang w:val="en-US"/>
+        </w:rPr>
+      </w:pPr>
+      <w:r>
+        <w:rPr>
+          <w:lang w:val="en-US"/>
+        </w:rPr>
+        <w:t xml:space="preserve">Then </w:t>
+      </w:r>
+      <w:r>
+        <w:rPr>
+          <w:lang w:val="en-US"/>
+        </w:rPr>
+        <w:sym w:font="Wingdings" w:char="F0E0"/>
+      </w:r>
+      <w:r>
+        <w:rPr>
+          <w:lang w:val="en-US"/>
+        </w:rPr>
+        <w:t xml:space="preserve"> Represents the Expected Result</w:t>
+      </w:r>
+    </w:p>
+    <w:p>
+      <w:pPr>
+        <w:pStyle w:val="ListParagraph"/>
+        <w:numPr>
+          <w:ilvl w:val="1"/>
+          <w:numId w:val="37"/>
+        </w:numPr>
+        <w:rPr>
+          <w:lang w:val="en-US"/>
+        </w:rPr>
+      </w:pPr>
+      <w:r>
+        <w:rPr>
+          <w:lang w:val="en-US"/>
+        </w:rPr>
+        <w:t xml:space="preserve">Background: </w:t>
+      </w:r>
+      <w:r>
+        <w:rPr>
+          <w:lang w:val="en-US"/>
+        </w:rPr>
+        <w:sym w:font="Wingdings" w:char="F0E0"/>
+      </w:r>
+      <w:r>
+        <w:rPr>
+          <w:lang w:val="en-US"/>
+        </w:rPr>
+        <w:t xml:space="preserve"> Avoids multiple Given statement in multiple Scenarios</w:t>
+      </w:r>
+    </w:p>
+    <w:p>
+      <w:pPr>
+        <w:pStyle w:val="ListParagraph"/>
+        <w:numPr>
+          <w:ilvl w:val="1"/>
+          <w:numId w:val="37"/>
+        </w:numPr>
+        <w:rPr>
+          <w:lang w:val="en-US"/>
+        </w:rPr>
+      </w:pPr>
+      <w:r>
+        <w:rPr>
+          <w:lang w:val="en-US"/>
+        </w:rPr>
+        <w:t xml:space="preserve">Examples: </w:t>
+      </w:r>
+      <w:r>
+        <w:rPr>
+          <w:lang w:val="en-US"/>
+        </w:rPr>
+        <w:sym w:font="Wingdings" w:char="F0E0"/>
+      </w:r>
+      <w:r>
+        <w:rPr>
+          <w:lang w:val="en-US"/>
+        </w:rPr>
+        <w:t xml:space="preserve"> Used in Data Driven Testing (This is like @DataProvider in TestNG)</w:t>
+      </w:r>
+    </w:p>
+    <w:p>
+      <w:pPr>
+        <w:pStyle w:val="ListParagraph"/>
+        <w:numPr>
+          <w:ilvl w:val="1"/>
+          <w:numId w:val="37"/>
+        </w:numPr>
+        <w:rPr>
+          <w:lang w:val="en-US"/>
+        </w:rPr>
+      </w:pPr>
+      <w:r>
+        <w:rPr>
+          <w:lang w:val="en-US"/>
+        </w:rPr>
+        <w:t xml:space="preserve">Scenario Outline </w:t>
+      </w:r>
+      <w:r>
+        <w:rPr>
+          <w:lang w:val="en-US"/>
+        </w:rPr>
+        <w:sym w:font="Wingdings" w:char="F0E0"/>
+      </w:r>
+      <w:r>
+        <w:rPr>
+          <w:lang w:val="en-US"/>
+        </w:rPr>
+        <w:t xml:space="preserve"> Used in Data Driven Testing</w:t>
+      </w:r>
+    </w:p>
+    <w:p>
+      <w:pPr>
+        <w:pBdr>
+          <w:bottom w:val="single" w:sz="6" w:space="1" w:color="auto"/>
+        </w:pBdr>
+        <w:rPr>
+          <w:lang w:val="en-US"/>
+        </w:rPr>
+      </w:pPr>
+    </w:p>
+    <w:p>
+      <w:pPr>
+        <w:rPr>
+          <w:lang w:val="en-US"/>
+        </w:rPr>
+      </w:pPr>
+      <w:r>
+        <w:rPr>
+          <w:lang w:val="en-US"/>
+        </w:rPr>
+        <w:t>Requirement – Validate Title of Google</w:t>
+      </w:r>
+    </w:p>
+    <w:p>
+      <w:pPr>
+        <w:pStyle w:val="ListParagraph"/>
+        <w:numPr>
+          <w:ilvl w:val="0"/>
+          <w:numId w:val="38"/>
+        </w:numPr>
+        <w:rPr>
+          <w:lang w:val="en-US"/>
+        </w:rPr>
+      </w:pPr>
+      <w:r>
+        <w:rPr>
+          <w:lang w:val="en-US"/>
+        </w:rPr>
+        <w:t>Open Google</w:t>
+      </w:r>
+    </w:p>
+    <w:p>
+      <w:pPr>
+        <w:pStyle w:val="ListParagraph"/>
+        <w:numPr>
+          <w:ilvl w:val="0"/>
+          <w:numId w:val="38"/>
+        </w:numPr>
+        <w:rPr>
+          <w:lang w:val="en-US"/>
+        </w:rPr>
+      </w:pPr>
+      <w:r>
+        <w:rPr>
+          <w:lang w:val="en-US"/>
+        </w:rPr>
+        <w:t>Read the title</w:t>
+      </w:r>
+    </w:p>
+    <w:p>
+      <w:pPr>
+        <w:pStyle w:val="ListParagraph"/>
+        <w:numPr>
+          <w:ilvl w:val="0"/>
+          <w:numId w:val="38"/>
+        </w:numPr>
+        <w:rPr>
+          <w:lang w:val="en-US"/>
+        </w:rPr>
+      </w:pPr>
+      <w:r>
+        <w:rPr>
+          <w:lang w:val="en-US"/>
+        </w:rPr>
+        <w:t>Validate that title is Google</w:t>
+      </w:r>
+    </w:p>
+    <w:p>
+      <w:pPr>
+        <w:rPr>
+          <w:lang w:val="en-US"/>
+        </w:rPr>
+      </w:pPr>
+      <w:r>
+        <w:rPr>
+          <w:lang w:val="en-US"/>
+        </w:rPr>
+        <w:t>Feature File</w:t>
+      </w:r>
+    </w:p>
+    <w:p>
+      <w:pPr>
+        <w:rPr>
+          <w:lang w:val="en-US"/>
+        </w:rPr>
+      </w:pPr>
+      <w:r>
+        <w:rPr>
+          <w:lang w:val="en-US"/>
+        </w:rPr>
+        <w:t>Feature: Validate Google Title</w:t>
+      </w:r>
+    </w:p>
+    <w:p>
+      <w:pPr>
+        <w:rPr>
+          <w:lang w:val="en-US"/>
+        </w:rPr>
+      </w:pPr>
+      <w:r>
+        <w:rPr>
+          <w:lang w:val="en-US"/>
+        </w:rPr>
+        <w:t>Scenario: To validate title of Google</w:t>
+      </w:r>
+    </w:p>
+    <w:p>
+      <w:pPr>
+        <w:rPr>
+          <w:lang w:val="en-US"/>
+        </w:rPr>
+      </w:pPr>
+      <w:r>
+        <w:rPr>
+          <w:lang w:val="en-US"/>
+        </w:rPr>
+        <w:t>Given Open Google</w:t>
+      </w:r>
+    </w:p>
+    <w:p>
+      <w:pPr>
+        <w:rPr>
+          <w:lang w:val="en-US"/>
+        </w:rPr>
+      </w:pPr>
+      <w:r>
+        <w:rPr>
+          <w:lang w:val="en-US"/>
+        </w:rPr>
+        <w:lastRenderedPageBreak/>
+        <w:t>When Read the title</w:t>
+      </w:r>
+    </w:p>
+    <w:p>
+      <w:pPr>
+        <w:rPr>
+          <w:lang w:val="en-US"/>
+        </w:rPr>
+      </w:pPr>
+      <w:r>
+        <w:rPr>
+          <w:lang w:val="en-US"/>
+        </w:rPr>
+        <w:t>Then Title should be Google</w:t>
+      </w:r>
       <w:bookmarkStart w:id="0" w:name="_GoBack"/>
       <w:bookmarkEnd w:id="0"/>
     </w:p>
@@ -10197,6 +11243,119 @@
     </w:lvl>
   </w:abstractNum>
   <w:abstractNum w:abstractNumId="7">
+    <w:nsid w:val="20034965"/>
+    <w:multiLevelType w:val="hybridMultilevel"/>
+    <w:tmpl w:val="FC284AA2"/>
+    <w:lvl w:ilvl="0" w:tplc="40090001">
+      <w:start w:val="1"/>
+      <w:numFmt w:val="bullet"/>
+      <w:lvlText w:val=""/>
+      <w:lvlJc w:val="left"/>
+      <w:pPr>
+        <w:ind w:left="720" w:hanging="360"/>
+      </w:pPr>
+      <w:rPr>
+        <w:rFonts w:ascii="Symbol" w:hAnsi="Symbol" w:hint="default"/>
+      </w:rPr>
+    </w:lvl>
+    <w:lvl w:ilvl="1" w:tplc="40090003" w:tentative="1">
+      <w:start w:val="1"/>
+      <w:numFmt w:val="bullet"/>
+      <w:lvlText w:val="o"/>
+      <w:lvlJc w:val="left"/>
+      <w:pPr>
+        <w:ind w:left="1440" w:hanging="360"/>
+      </w:pPr>
+      <w:rPr>
+        <w:rFonts w:ascii="Courier New" w:hAnsi="Courier New" w:cs="Courier New" w:hint="default"/>
+      </w:rPr>
+    </w:lvl>
+    <w:lvl w:ilvl="2" w:tplc="40090005" w:tentative="1">
+      <w:start w:val="1"/>
+      <w:numFmt w:val="bullet"/>
+      <w:lvlText w:val=""/>
+      <w:lvlJc w:val="left"/>
+      <w:pPr>
+        <w:ind w:left="2160" w:hanging="360"/>
+      </w:pPr>
+      <w:rPr>
+        <w:rFonts w:ascii="Wingdings" w:hAnsi="Wingdings" w:hint="default"/>
+      </w:rPr>
+    </w:lvl>
+    <w:lvl w:ilvl="3" w:tplc="40090001" w:tentative="1">
+      <w:start w:val="1"/>
+      <w:numFmt w:val="bullet"/>
+      <w:lvlText w:val=""/>
+      <w:lvlJc w:val="left"/>
+      <w:pPr>
+        <w:ind w:left="2880" w:hanging="360"/>
+      </w:pPr>
+      <w:rPr>
+        <w:rFonts w:ascii="Symbol" w:hAnsi="Symbol" w:hint="default"/>
+      </w:rPr>
+    </w:lvl>
+    <w:lvl w:ilvl="4" w:tplc="40090003" w:tentative="1">
+      <w:start w:val="1"/>
+      <w:numFmt w:val="bullet"/>
+      <w:lvlText w:val="o"/>
+      <w:lvlJc w:val="left"/>
+      <w:pPr>
+        <w:ind w:left="3600" w:hanging="360"/>
+      </w:pPr>
+      <w:rPr>
+        <w:rFonts w:ascii="Courier New" w:hAnsi="Courier New" w:cs="Courier New" w:hint="default"/>
+      </w:rPr>
+    </w:lvl>
+    <w:lvl w:ilvl="5" w:tplc="40090005" w:tentative="1">
+      <w:start w:val="1"/>
+      <w:numFmt w:val="bullet"/>
+      <w:lvlText w:val=""/>
+      <w:lvlJc w:val="left"/>
+      <w:pPr>
+        <w:ind w:left="4320" w:hanging="360"/>
+      </w:pPr>
+      <w:rPr>
+        <w:rFonts w:ascii="Wingdings" w:hAnsi="Wingdings" w:hint="default"/>
+      </w:rPr>
+    </w:lvl>
+    <w:lvl w:ilvl="6" w:tplc="40090001" w:tentative="1">
+      <w:start w:val="1"/>
+      <w:numFmt w:val="bullet"/>
+      <w:lvlText w:val=""/>
+      <w:lvlJc w:val="left"/>
+      <w:pPr>
+        <w:ind w:left="5040" w:hanging="360"/>
+      </w:pPr>
+      <w:rPr>
+        <w:rFonts w:ascii="Symbol" w:hAnsi="Symbol" w:hint="default"/>
+      </w:rPr>
+    </w:lvl>
+    <w:lvl w:ilvl="7" w:tplc="40090003" w:tentative="1">
+      <w:start w:val="1"/>
+      <w:numFmt w:val="bullet"/>
+      <w:lvlText w:val="o"/>
+      <w:lvlJc w:val="left"/>
+      <w:pPr>
+        <w:ind w:left="5760" w:hanging="360"/>
+      </w:pPr>
+      <w:rPr>
+        <w:rFonts w:ascii="Courier New" w:hAnsi="Courier New" w:cs="Courier New" w:hint="default"/>
+      </w:rPr>
+    </w:lvl>
+    <w:lvl w:ilvl="8" w:tplc="40090005" w:tentative="1">
+      <w:start w:val="1"/>
+      <w:numFmt w:val="bullet"/>
+      <w:lvlText w:val=""/>
+      <w:lvlJc w:val="left"/>
+      <w:pPr>
+        <w:ind w:left="6480" w:hanging="360"/>
+      </w:pPr>
+      <w:rPr>
+        <w:rFonts w:ascii="Wingdings" w:hAnsi="Wingdings" w:hint="default"/>
+      </w:rPr>
+    </w:lvl>
+  </w:abstractNum>
+  <w:abstractNum w:abstractNumId="8">
     <w:nsid w:val="22CD3FE6"/>
     <w:multiLevelType w:val="hybridMultilevel"/>
     <w:tmpl w:val="431E3674"/>
@@ -10309,7 +11468,7 @@
       </w:rPr>
     </w:lvl>
   </w:abstractNum>
-  <w:abstractNum w:abstractNumId="8">
+  <w:abstractNum w:abstractNumId="9">
     <w:nsid w:val="25335F4F"/>
     <w:multiLevelType w:val="hybridMultilevel"/>
     <w:tmpl w:val="2EAE23BA"/>
@@ -10422,7 +11581,7 @@
       </w:rPr>
     </w:lvl>
   </w:abstractNum>
-  <w:abstractNum w:abstractNumId="9">
+  <w:abstractNum w:abstractNumId="10">
     <w:nsid w:val="268C0D27"/>
     <w:multiLevelType w:val="hybridMultilevel"/>
     <w:tmpl w:val="674E757A"/>
@@ -10535,7 +11694,7 @@
       </w:rPr>
     </w:lvl>
   </w:abstractNum>
-  <w:abstractNum w:abstractNumId="10">
+  <w:abstractNum w:abstractNumId="11">
     <w:nsid w:val="2C075435"/>
     <w:multiLevelType w:val="hybridMultilevel"/>
     <w:tmpl w:val="69AA0B26"/>
@@ -10648,7 +11807,7 @@
       </w:rPr>
     </w:lvl>
   </w:abstractNum>
-  <w:abstractNum w:abstractNumId="11">
+  <w:abstractNum w:abstractNumId="12">
     <w:nsid w:val="2D9B41A7"/>
     <w:multiLevelType w:val="hybridMultilevel"/>
     <w:tmpl w:val="C4EC2058"/>
@@ -10761,7 +11920,7 @@
       </w:rPr>
     </w:lvl>
   </w:abstractNum>
-  <w:abstractNum w:abstractNumId="12">
+  <w:abstractNum w:abstractNumId="13">
     <w:nsid w:val="2E8016BE"/>
     <w:multiLevelType w:val="hybridMultilevel"/>
     <w:tmpl w:val="C494F916"/>
@@ -10850,7 +12009,7 @@
       </w:pPr>
     </w:lvl>
   </w:abstractNum>
-  <w:abstractNum w:abstractNumId="13">
+  <w:abstractNum w:abstractNumId="14">
     <w:nsid w:val="369351E9"/>
     <w:multiLevelType w:val="hybridMultilevel"/>
     <w:tmpl w:val="0972A5CA"/>
@@ -10939,7 +12098,7 @@
       </w:pPr>
     </w:lvl>
   </w:abstractNum>
-  <w:abstractNum w:abstractNumId="14">
+  <w:abstractNum w:abstractNumId="15">
     <w:nsid w:val="379C2DB0"/>
     <w:multiLevelType w:val="hybridMultilevel"/>
     <w:tmpl w:val="097C3B70"/>
@@ -11052,7 +12211,120 @@
       </w:rPr>
     </w:lvl>
   </w:abstractNum>
-  <w:abstractNum w:abstractNumId="15">
+  <w:abstractNum w:abstractNumId="16">
+    <w:nsid w:val="3A29074B"/>
+    <w:multiLevelType w:val="hybridMultilevel"/>
+    <w:tmpl w:val="14B00ED2"/>
+    <w:lvl w:ilvl="0" w:tplc="40090001">
+      <w:start w:val="1"/>
+      <w:numFmt w:val="bullet"/>
+      <w:lvlText w:val=""/>
+      <w:lvlJc w:val="left"/>
+      <w:pPr>
+        <w:ind w:left="720" w:hanging="360"/>
+      </w:pPr>
+      <w:rPr>
+        <w:rFonts w:ascii="Symbol" w:hAnsi="Symbol" w:hint="default"/>
+      </w:rPr>
+    </w:lvl>
+    <w:lvl w:ilvl="1" w:tplc="40090003">
+      <w:start w:val="1"/>
+      <w:numFmt w:val="bullet"/>
+      <w:lvlText w:val="o"/>
+      <w:lvlJc w:val="left"/>
+      <w:pPr>
+        <w:ind w:left="1440" w:hanging="360"/>
+      </w:pPr>
+      <w:rPr>
+        <w:rFonts w:ascii="Courier New" w:hAnsi="Courier New" w:cs="Courier New" w:hint="default"/>
+      </w:rPr>
+    </w:lvl>
+    <w:lvl w:ilvl="2" w:tplc="40090005" w:tentative="1">
+      <w:start w:val="1"/>
+      <w:numFmt w:val="bullet"/>
+      <w:lvlText w:val=""/>
+      <w:lvlJc w:val="left"/>
+      <w:pPr>
+        <w:ind w:left="2160" w:hanging="360"/>
+      </w:pPr>
+      <w:rPr>
+        <w:rFonts w:ascii="Wingdings" w:hAnsi="Wingdings" w:hint="default"/>
+      </w:rPr>
+    </w:lvl>
+    <w:lvl w:ilvl="3" w:tplc="40090001" w:tentative="1">
+      <w:start w:val="1"/>
+      <w:numFmt w:val="bullet"/>
+      <w:lvlText w:val=""/>
+      <w:lvlJc w:val="left"/>
+      <w:pPr>
+        <w:ind w:left="2880" w:hanging="360"/>
+      </w:pPr>
+      <w:rPr>
+        <w:rFonts w:ascii="Symbol" w:hAnsi="Symbol" w:hint="default"/>
+      </w:rPr>
+    </w:lvl>
+    <w:lvl w:ilvl="4" w:tplc="40090003" w:tentative="1">
+      <w:start w:val="1"/>
+      <w:numFmt w:val="bullet"/>
+      <w:lvlText w:val="o"/>
+      <w:lvlJc w:val="left"/>
+      <w:pPr>
+        <w:ind w:left="3600" w:hanging="360"/>
+      </w:pPr>
+      <w:rPr>
+        <w:rFonts w:ascii="Courier New" w:hAnsi="Courier New" w:cs="Courier New" w:hint="default"/>
+      </w:rPr>
+    </w:lvl>
+    <w:lvl w:ilvl="5" w:tplc="40090005" w:tentative="1">
+      <w:start w:val="1"/>
+      <w:numFmt w:val="bullet"/>
+      <w:lvlText w:val=""/>
+      <w:lvlJc w:val="left"/>
+      <w:pPr>
+        <w:ind w:left="4320" w:hanging="360"/>
+      </w:pPr>
+      <w:rPr>
+        <w:rFonts w:ascii="Wingdings" w:hAnsi="Wingdings" w:hint="default"/>
+      </w:rPr>
+    </w:lvl>
+    <w:lvl w:ilvl="6" w:tplc="40090001" w:tentative="1">
+      <w:start w:val="1"/>
+      <w:numFmt w:val="bullet"/>
+      <w:lvlText w:val=""/>
+      <w:lvlJc w:val="left"/>
+      <w:pPr>
+        <w:ind w:left="5040" w:hanging="360"/>
+      </w:pPr>
+      <w:rPr>
+        <w:rFonts w:ascii="Symbol" w:hAnsi="Symbol" w:hint="default"/>
+      </w:rPr>
+    </w:lvl>
+    <w:lvl w:ilvl="7" w:tplc="40090003" w:tentative="1">
+      <w:start w:val="1"/>
+      <w:numFmt w:val="bullet"/>
+      <w:lvlText w:val="o"/>
+      <w:lvlJc w:val="left"/>
+      <w:pPr>
+        <w:ind w:left="5760" w:hanging="360"/>
+      </w:pPr>
+      <w:rPr>
+        <w:rFonts w:ascii="Courier New" w:hAnsi="Courier New" w:cs="Courier New" w:hint="default"/>
+      </w:rPr>
+    </w:lvl>
+    <w:lvl w:ilvl="8" w:tplc="40090005" w:tentative="1">
+      <w:start w:val="1"/>
+      <w:numFmt w:val="bullet"/>
+      <w:lvlText w:val=""/>
+      <w:lvlJc w:val="left"/>
+      <w:pPr>
+        <w:ind w:left="6480" w:hanging="360"/>
+      </w:pPr>
+      <w:rPr>
+        <w:rFonts w:ascii="Wingdings" w:hAnsi="Wingdings" w:hint="default"/>
+      </w:rPr>
+    </w:lvl>
+  </w:abstractNum>
+  <w:abstractNum w:abstractNumId="17">
     <w:nsid w:val="3B9A3EE0"/>
     <w:multiLevelType w:val="hybridMultilevel"/>
     <w:tmpl w:val="8B20B472"/>
@@ -11165,7 +12437,7 @@
       </w:rPr>
     </w:lvl>
   </w:abstractNum>
-  <w:abstractNum w:abstractNumId="16">
+  <w:abstractNum w:abstractNumId="18">
     <w:nsid w:val="3D565FA3"/>
     <w:multiLevelType w:val="hybridMultilevel"/>
     <w:tmpl w:val="A8F8AFEE"/>
@@ -11254,7 +12526,96 @@
       </w:pPr>
     </w:lvl>
   </w:abstractNum>
-  <w:abstractNum w:abstractNumId="17">
+  <w:abstractNum w:abstractNumId="19">
+    <w:nsid w:val="45B43CD4"/>
+    <w:multiLevelType w:val="hybridMultilevel"/>
+    <w:tmpl w:val="00A2ADA6"/>
+    <w:lvl w:ilvl="0" w:tplc="4009000F">
+      <w:start w:val="1"/>
+      <w:numFmt w:val="decimal"/>
+      <w:lvlText w:val="%1."/>
+      <w:lvlJc w:val="left"/>
+      <w:pPr>
+        <w:ind w:left="720" w:hanging="360"/>
+      </w:pPr>
+      <w:rPr>
+        <w:rFonts w:hint="default"/>
+      </w:rPr>
+    </w:lvl>
+    <w:lvl w:ilvl="1" w:tplc="40090019" w:tentative="1">
+      <w:start w:val="1"/>
+      <w:numFmt w:val="lowerLetter"/>
+      <w:lvlText w:val="%2."/>
+      <w:lvlJc w:val="left"/>
+      <w:pPr>
+        <w:ind w:left="1440" w:hanging="360"/>
+      </w:pPr>
+    </w:lvl>
+    <w:lvl w:ilvl="2" w:tplc="4009001B" w:tentative="1">
+      <w:start w:val="1"/>
+      <w:numFmt w:val="lowerRoman"/>
+      <w:lvlText w:val="%3."/>
+      <w:lvlJc w:val="right"/>
+      <w:pPr>
+        <w:ind w:left="2160" w:hanging="180"/>
+      </w:pPr>
+    </w:lvl>
+    <w:lvl w:ilvl="3" w:tplc="4009000F" w:tentative="1">
+      <w:start w:val="1"/>
+      <w:numFmt w:val="decimal"/>
+      <w:lvlText w:val="%4."/>
+      <w:lvlJc w:val="left"/>
+      <w:pPr>
+        <w:ind w:left="2880" w:hanging="360"/>
+      </w:pPr>
+    </w:lvl>
+    <w:lvl w:ilvl="4" w:tplc="40090019" w:tentative="1">
+      <w:start w:val="1"/>
+      <w:numFmt w:val="lowerLetter"/>
+      <w:lvlText w:val="%5."/>
+      <w:lvlJc w:val="left"/>
+      <w:pPr>
+        <w:ind w:left="3600" w:hanging="360"/>
+      </w:pPr>
+    </w:lvl>
+    <w:lvl w:ilvl="5" w:tplc="4009001B" w:tentative="1">
+      <w:start w:val="1"/>
+      <w:numFmt w:val="lowerRoman"/>
+      <w:lvlText w:val="%6."/>
+      <w:lvlJc w:val="right"/>
+      <w:pPr>
+        <w:ind w:left="4320" w:hanging="180"/>
+      </w:pPr>
+    </w:lvl>
+    <w:lvl w:ilvl="6" w:tplc="4009000F" w:tentative="1">
+      <w:start w:val="1"/>
+      <w:numFmt w:val="decimal"/>
+      <w:lvlText w:val="%7."/>
+      <w:lvlJc w:val="left"/>
+      <w:pPr>
+        <w:ind w:left="5040" w:hanging="360"/>
+      </w:pPr>
+    </w:lvl>
+    <w:lvl w:ilvl="7" w:tplc="40090019" w:tentative="1">
+      <w:start w:val="1"/>
+      <w:numFmt w:val="lowerLetter"/>
+      <w:lvlText w:val="%8."/>
+      <w:lvlJc w:val="left"/>
+      <w:pPr>
+        <w:ind w:left="5760" w:hanging="360"/>
+      </w:pPr>
+    </w:lvl>
+    <w:lvl w:ilvl="8" w:tplc="4009001B" w:tentative="1">
+      <w:start w:val="1"/>
+      <w:numFmt w:val="lowerRoman"/>
+      <w:lvlText w:val="%9."/>
+      <w:lvlJc w:val="right"/>
+      <w:pPr>
+        <w:ind w:left="6480" w:hanging="180"/>
+      </w:pPr>
+    </w:lvl>
+  </w:abstractNum>
+  <w:abstractNum w:abstractNumId="20">
     <w:nsid w:val="46875C90"/>
     <w:multiLevelType w:val="hybridMultilevel"/>
     <w:tmpl w:val="78C0CFB6"/>
@@ -11343,7 +12704,7 @@
       </w:pPr>
     </w:lvl>
   </w:abstractNum>
-  <w:abstractNum w:abstractNumId="18">
+  <w:abstractNum w:abstractNumId="21">
     <w:nsid w:val="471F3D0D"/>
     <w:multiLevelType w:val="hybridMultilevel"/>
     <w:tmpl w:val="D02CD718"/>
@@ -11432,7 +12793,120 @@
       </w:pPr>
     </w:lvl>
   </w:abstractNum>
-  <w:abstractNum w:abstractNumId="19">
+  <w:abstractNum w:abstractNumId="22">
+    <w:nsid w:val="4DA3299B"/>
+    <w:multiLevelType w:val="hybridMultilevel"/>
+    <w:tmpl w:val="A418A19A"/>
+    <w:lvl w:ilvl="0" w:tplc="40090001">
+      <w:start w:val="1"/>
+      <w:numFmt w:val="bullet"/>
+      <w:lvlText w:val=""/>
+      <w:lvlJc w:val="left"/>
+      <w:pPr>
+        <w:ind w:left="720" w:hanging="360"/>
+      </w:pPr>
+      <w:rPr>
+        <w:rFonts w:ascii="Symbol" w:hAnsi="Symbol" w:hint="default"/>
+      </w:rPr>
+    </w:lvl>
+    <w:lvl w:ilvl="1" w:tplc="40090003">
+      <w:start w:val="1"/>
+      <w:numFmt w:val="bullet"/>
+      <w:lvlText w:val="o"/>
+      <w:lvlJc w:val="left"/>
+      <w:pPr>
+        <w:ind w:left="1440" w:hanging="360"/>
+      </w:pPr>
+      <w:rPr>
+        <w:rFonts w:ascii="Courier New" w:hAnsi="Courier New" w:cs="Courier New" w:hint="default"/>
+      </w:rPr>
+    </w:lvl>
+    <w:lvl w:ilvl="2" w:tplc="40090005" w:tentative="1">
+      <w:start w:val="1"/>
+      <w:numFmt w:val="bullet"/>
+      <w:lvlText w:val=""/>
+      <w:lvlJc w:val="left"/>
+      <w:pPr>
+        <w:ind w:left="2160" w:hanging="360"/>
+      </w:pPr>
+      <w:rPr>
+        <w:rFonts w:ascii="Wingdings" w:hAnsi="Wingdings" w:hint="default"/>
+      </w:rPr>
+    </w:lvl>
+    <w:lvl w:ilvl="3" w:tplc="40090001" w:tentative="1">
+      <w:start w:val="1"/>
+      <w:numFmt w:val="bullet"/>
+      <w:lvlText w:val=""/>
+      <w:lvlJc w:val="left"/>
+      <w:pPr>
+        <w:ind w:left="2880" w:hanging="360"/>
+      </w:pPr>
+      <w:rPr>
+        <w:rFonts w:ascii="Symbol" w:hAnsi="Symbol" w:hint="default"/>
+      </w:rPr>
+    </w:lvl>
+    <w:lvl w:ilvl="4" w:tplc="40090003" w:tentative="1">
+      <w:start w:val="1"/>
+      <w:numFmt w:val="bullet"/>
+      <w:lvlText w:val="o"/>
+      <w:lvlJc w:val="left"/>
+      <w:pPr>
+        <w:ind w:left="3600" w:hanging="360"/>
+      </w:pPr>
+      <w:rPr>
+        <w:rFonts w:ascii="Courier New" w:hAnsi="Courier New" w:cs="Courier New" w:hint="default"/>
+      </w:rPr>
+    </w:lvl>
+    <w:lvl w:ilvl="5" w:tplc="40090005" w:tentative="1">
+      <w:start w:val="1"/>
+      <w:numFmt w:val="bullet"/>
+      <w:lvlText w:val=""/>
+      <w:lvlJc w:val="left"/>
+      <w:pPr>
+        <w:ind w:left="4320" w:hanging="360"/>
+      </w:pPr>
+      <w:rPr>
+        <w:rFonts w:ascii="Wingdings" w:hAnsi="Wingdings" w:hint="default"/>
+      </w:rPr>
+    </w:lvl>
+    <w:lvl w:ilvl="6" w:tplc="40090001" w:tentative="1">
+      <w:start w:val="1"/>
+      <w:numFmt w:val="bullet"/>
+      <w:lvlText w:val=""/>
+      <w:lvlJc w:val="left"/>
+      <w:pPr>
+        <w:ind w:left="5040" w:hanging="360"/>
+      </w:pPr>
+      <w:rPr>
+        <w:rFonts w:ascii="Symbol" w:hAnsi="Symbol" w:hint="default"/>
+      </w:rPr>
+    </w:lvl>
+    <w:lvl w:ilvl="7" w:tplc="40090003" w:tentative="1">
+      <w:start w:val="1"/>
+      <w:numFmt w:val="bullet"/>
+      <w:lvlText w:val="o"/>
+      <w:lvlJc w:val="left"/>
+      <w:pPr>
+        <w:ind w:left="5760" w:hanging="360"/>
+      </w:pPr>
+      <w:rPr>
+        <w:rFonts w:ascii="Courier New" w:hAnsi="Courier New" w:cs="Courier New" w:hint="default"/>
+      </w:rPr>
+    </w:lvl>
+    <w:lvl w:ilvl="8" w:tplc="40090005" w:tentative="1">
+      <w:start w:val="1"/>
+      <w:numFmt w:val="bullet"/>
+      <w:lvlText w:val=""/>
+      <w:lvlJc w:val="left"/>
+      <w:pPr>
+        <w:ind w:left="6480" w:hanging="360"/>
+      </w:pPr>
+      <w:rPr>
+        <w:rFonts w:ascii="Wingdings" w:hAnsi="Wingdings" w:hint="default"/>
+      </w:rPr>
+    </w:lvl>
+  </w:abstractNum>
+  <w:abstractNum w:abstractNumId="23">
     <w:nsid w:val="4E2A6329"/>
     <w:multiLevelType w:val="hybridMultilevel"/>
     <w:tmpl w:val="BC1628F2"/>
@@ -11545,7 +13019,7 @@
       </w:rPr>
     </w:lvl>
   </w:abstractNum>
-  <w:abstractNum w:abstractNumId="20">
+  <w:abstractNum w:abstractNumId="24">
     <w:nsid w:val="556E1B57"/>
     <w:multiLevelType w:val="hybridMultilevel"/>
     <w:tmpl w:val="26087466"/>
@@ -11658,7 +13132,7 @@
       </w:rPr>
     </w:lvl>
   </w:abstractNum>
-  <w:abstractNum w:abstractNumId="21">
+  <w:abstractNum w:abstractNumId="25">
     <w:nsid w:val="55D10A8D"/>
     <w:multiLevelType w:val="hybridMultilevel"/>
     <w:tmpl w:val="7312E058"/>
@@ -11747,7 +13221,7 @@
       </w:pPr>
     </w:lvl>
   </w:abstractNum>
-  <w:abstractNum w:abstractNumId="22">
+  <w:abstractNum w:abstractNumId="26">
     <w:nsid w:val="56165AD5"/>
     <w:multiLevelType w:val="hybridMultilevel"/>
     <w:tmpl w:val="E0B403D2"/>
@@ -11860,7 +13334,7 @@
       </w:rPr>
     </w:lvl>
   </w:abstractNum>
-  <w:abstractNum w:abstractNumId="23">
+  <w:abstractNum w:abstractNumId="27">
     <w:nsid w:val="56F946E6"/>
     <w:multiLevelType w:val="hybridMultilevel"/>
     <w:tmpl w:val="287A5F26"/>
@@ -11949,7 +13423,7 @@
       </w:pPr>
     </w:lvl>
   </w:abstractNum>
-  <w:abstractNum w:abstractNumId="24">
+  <w:abstractNum w:abstractNumId="28">
     <w:nsid w:val="5A897377"/>
     <w:multiLevelType w:val="hybridMultilevel"/>
     <w:tmpl w:val="F1F27818"/>
@@ -12062,7 +13536,7 @@
       </w:rPr>
     </w:lvl>
   </w:abstractNum>
-  <w:abstractNum w:abstractNumId="25">
+  <w:abstractNum w:abstractNumId="29">
     <w:nsid w:val="5D096968"/>
     <w:multiLevelType w:val="hybridMultilevel"/>
     <w:tmpl w:val="87A897FA"/>
@@ -12151,7 +13625,7 @@
       </w:pPr>
     </w:lvl>
   </w:abstractNum>
-  <w:abstractNum w:abstractNumId="26">
+  <w:abstractNum w:abstractNumId="30">
     <w:nsid w:val="602D5BA0"/>
     <w:multiLevelType w:val="hybridMultilevel"/>
     <w:tmpl w:val="7EDAE732"/>
@@ -12264,7 +13738,7 @@
       </w:rPr>
     </w:lvl>
   </w:abstractNum>
-  <w:abstractNum w:abstractNumId="27">
+  <w:abstractNum w:abstractNumId="31">
     <w:nsid w:val="63DD59AE"/>
     <w:multiLevelType w:val="hybridMultilevel"/>
     <w:tmpl w:val="4F783448"/>
@@ -12377,7 +13851,7 @@
       </w:rPr>
     </w:lvl>
   </w:abstractNum>
-  <w:abstractNum w:abstractNumId="28">
+  <w:abstractNum w:abstractNumId="32">
     <w:nsid w:val="66F74F83"/>
     <w:multiLevelType w:val="hybridMultilevel"/>
     <w:tmpl w:val="47FE45C4"/>
@@ -12490,7 +13964,7 @@
       </w:rPr>
     </w:lvl>
   </w:abstractNum>
-  <w:abstractNum w:abstractNumId="29">
+  <w:abstractNum w:abstractNumId="33">
     <w:nsid w:val="6B375CC6"/>
     <w:multiLevelType w:val="hybridMultilevel"/>
     <w:tmpl w:val="DD7A439E"/>
@@ -12603,7 +14077,7 @@
       </w:rPr>
     </w:lvl>
   </w:abstractNum>
-  <w:abstractNum w:abstractNumId="30">
+  <w:abstractNum w:abstractNumId="34">
     <w:nsid w:val="736235B6"/>
     <w:multiLevelType w:val="hybridMultilevel"/>
     <w:tmpl w:val="9338354A"/>
@@ -12716,7 +14190,7 @@
       </w:rPr>
     </w:lvl>
   </w:abstractNum>
-  <w:abstractNum w:abstractNumId="31">
+  <w:abstractNum w:abstractNumId="35">
     <w:nsid w:val="77623988"/>
     <w:multiLevelType w:val="hybridMultilevel"/>
     <w:tmpl w:val="702CA274"/>
@@ -12805,7 +14279,7 @@
       </w:pPr>
     </w:lvl>
   </w:abstractNum>
-  <w:abstractNum w:abstractNumId="32">
+  <w:abstractNum w:abstractNumId="36">
     <w:nsid w:val="78C031D0"/>
     <w:multiLevelType w:val="hybridMultilevel"/>
     <w:tmpl w:val="65F4D1E2"/>
@@ -12918,7 +14392,7 @@
       </w:rPr>
     </w:lvl>
   </w:abstractNum>
-  <w:abstractNum w:abstractNumId="33">
+  <w:abstractNum w:abstractNumId="37">
     <w:nsid w:val="7DB56E55"/>
     <w:multiLevelType w:val="hybridMultilevel"/>
     <w:tmpl w:val="1B88A856"/>
@@ -13008,79 +14482,79 @@
     </w:lvl>
   </w:abstractNum>
   <w:num w:numId="1">
-    <w:abstractNumId w:val="27"/>
+    <w:abstractNumId w:val="31"/>
   </w:num>
   <w:num w:numId="2">
-    <w:abstractNumId w:val="9"/>
+    <w:abstractNumId w:val="10"/>
   </w:num>
   <w:num w:numId="3">
-    <w:abstractNumId w:val="19"/>
+    <w:abstractNumId w:val="23"/>
   </w:num>
   <w:num w:numId="4">
     <w:abstractNumId w:val="2"/>
   </w:num>
   <w:num w:numId="5">
-    <w:abstractNumId w:val="22"/>
+    <w:abstractNumId w:val="26"/>
   </w:num>
   <w:num w:numId="6">
-    <w:abstractNumId w:val="20"/>
+    <w:abstractNumId w:val="24"/>
   </w:num>
   <w:num w:numId="7">
-    <w:abstractNumId w:val="7"/>
+    <w:abstractNumId w:val="8"/>
   </w:num>
   <w:num w:numId="8">
-    <w:abstractNumId w:val="30"/>
+    <w:abstractNumId w:val="34"/>
   </w:num>
   <w:num w:numId="9">
-    <w:abstractNumId w:val="10"/>
+    <w:abstractNumId w:val="11"/>
   </w:num>
   <w:num w:numId="10">
     <w:abstractNumId w:val="0"/>
   </w:num>
   <w:num w:numId="11">
-    <w:abstractNumId w:val="14"/>
+    <w:abstractNumId w:val="15"/>
   </w:num>
   <w:num w:numId="12">
-    <w:abstractNumId w:val="24"/>
+    <w:abstractNumId w:val="28"/>
   </w:num>
   <w:num w:numId="13">
     <w:abstractNumId w:val="4"/>
   </w:num>
   <w:num w:numId="14">
-    <w:abstractNumId w:val="13"/>
+    <w:abstractNumId w:val="14"/>
   </w:num>
   <w:num w:numId="15">
+    <w:abstractNumId w:val="37"/>
+  </w:num>
+  <w:num w:numId="16">
     <w:abstractNumId w:val="33"/>
   </w:num>
-  <w:num w:numId="16">
-    <w:abstractNumId w:val="29"/>
-  </w:num>
   <w:num w:numId="17">
-    <w:abstractNumId w:val="32"/>
+    <w:abstractNumId w:val="36"/>
   </w:num>
   <w:num w:numId="18">
-    <w:abstractNumId w:val="11"/>
+    <w:abstractNumId w:val="12"/>
   </w:num>
   <w:num w:numId="19">
-    <w:abstractNumId w:val="26"/>
+    <w:abstractNumId w:val="30"/>
   </w:num>
   <w:num w:numId="20">
-    <w:abstractNumId w:val="15"/>
+    <w:abstractNumId w:val="17"/>
   </w:num>
   <w:num w:numId="21">
-    <w:abstractNumId w:val="8"/>
+    <w:abstractNumId w:val="9"/>
   </w:num>
   <w:num w:numId="22">
-    <w:abstractNumId w:val="21"/>
+    <w:abstractNumId w:val="25"/>
   </w:num>
   <w:num w:numId="23">
     <w:abstractNumId w:val="1"/>
   </w:num>
   <w:num w:numId="24">
-    <w:abstractNumId w:val="23"/>
+    <w:abstractNumId w:val="27"/>
   </w:num>
   <w:num w:numId="25">
-    <w:abstractNumId w:val="17"/>
+    <w:abstractNumId w:val="20"/>
   </w:num>
   <w:num w:numId="26">
     <w:abstractNumId w:val="6"/>
@@ -13089,25 +14563,37 @@
     <w:abstractNumId w:val="3"/>
   </w:num>
   <w:num w:numId="28">
+    <w:abstractNumId w:val="21"/>
+  </w:num>
+  <w:num w:numId="29">
     <w:abstractNumId w:val="18"/>
   </w:num>
-  <w:num w:numId="29">
-    <w:abstractNumId w:val="16"/>
-  </w:num>
   <w:num w:numId="30">
-    <w:abstractNumId w:val="12"/>
+    <w:abstractNumId w:val="13"/>
   </w:num>
   <w:num w:numId="31">
-    <w:abstractNumId w:val="31"/>
+    <w:abstractNumId w:val="35"/>
   </w:num>
   <w:num w:numId="32">
-    <w:abstractNumId w:val="25"/>
+    <w:abstractNumId w:val="29"/>
   </w:num>
   <w:num w:numId="33">
     <w:abstractNumId w:val="5"/>
   </w:num>
   <w:num w:numId="34">
-    <w:abstractNumId w:val="28"/>
+    <w:abstractNumId w:val="32"/>
+  </w:num>
+  <w:num w:numId="35">
+    <w:abstractNumId w:val="7"/>
+  </w:num>
+  <w:num w:numId="36">
+    <w:abstractNumId w:val="16"/>
+  </w:num>
+  <w:num w:numId="37">
+    <w:abstractNumId w:val="22"/>
+  </w:num>
+  <w:num w:numId="38">
+    <w:abstractNumId w:val="19"/>
   </w:num>
 </w:numbering>
 </file>

</xml_diff>

<commit_message>
Date: 26 Apr 2026
</commit_message>
<xml_diff>
--- a/Selenium_Notes.docx
+++ b/Selenium_Notes.docx
@@ -1610,7 +1610,6 @@
           <w:lang w:val="en-US"/>
         </w:rPr>
       </w:pPr>
-      <w:proofErr w:type="spellStart"/>
       <w:r>
         <w:rPr>
           <w:sz w:val="24"/>
@@ -1619,7 +1618,6 @@
         </w:rPr>
         <w:t>JMeeter</w:t>
       </w:r>
-      <w:proofErr w:type="spellEnd"/>
     </w:p>
     <w:p>
       <w:pPr>
@@ -2090,18 +2088,8 @@
           <w:szCs w:val="22"/>
           <w:lang w:val="en-US"/>
         </w:rPr>
-        <w:t xml:space="preserve">Idea </w:t>
-      </w:r>
-      <w:proofErr w:type="spellStart"/>
-      <w:r>
-        <w:rPr>
-          <w:sz w:val="24"/>
-          <w:szCs w:val="22"/>
-          <w:lang w:val="en-US"/>
-        </w:rPr>
-        <w:t>Itellij</w:t>
-      </w:r>
-      <w:proofErr w:type="spellEnd"/>
+        <w:t>Idea Itellij</w:t>
+      </w:r>
     </w:p>
     <w:p>
       <w:pPr>
@@ -2230,7 +2218,6 @@
           <w:lang w:val="en-US"/>
         </w:rPr>
       </w:pPr>
-      <w:proofErr w:type="spellStart"/>
       <w:r>
         <w:rPr>
           <w:sz w:val="24"/>
@@ -2239,7 +2226,6 @@
         </w:rPr>
         <w:t>YourName_SeleniumDemos</w:t>
       </w:r>
-      <w:proofErr w:type="spellEnd"/>
     </w:p>
     <w:p>
       <w:pPr>
@@ -2283,25 +2269,7 @@
           <w:szCs w:val="22"/>
           <w:lang w:val="en-US"/>
         </w:rPr>
-        <w:t xml:space="preserve">Open </w:t>
-      </w:r>
-      <w:proofErr w:type="spellStart"/>
-      <w:r>
-        <w:rPr>
-          <w:sz w:val="24"/>
-          <w:szCs w:val="22"/>
-          <w:lang w:val="en-US"/>
-        </w:rPr>
-        <w:t>selenium.dev</w:t>
-      </w:r>
-      <w:proofErr w:type="spellEnd"/>
-      <w:r>
-        <w:rPr>
-          <w:sz w:val="24"/>
-          <w:szCs w:val="22"/>
-          <w:lang w:val="en-US"/>
-        </w:rPr>
-        <w:t xml:space="preserve"> site</w:t>
+        <w:t>Open selenium.dev site</w:t>
       </w:r>
     </w:p>
     <w:p>
@@ -2520,25 +2488,7 @@
           <w:szCs w:val="22"/>
           <w:lang w:val="en-US"/>
         </w:rPr>
-        <w:t>Create a Package inside this project (</w:t>
-      </w:r>
-      <w:proofErr w:type="spellStart"/>
-      <w:r>
-        <w:rPr>
-          <w:sz w:val="24"/>
-          <w:szCs w:val="22"/>
-          <w:lang w:val="en-US"/>
-        </w:rPr>
-        <w:t>com.WebDriverDemos</w:t>
-      </w:r>
-      <w:proofErr w:type="spellEnd"/>
-      <w:r>
-        <w:rPr>
-          <w:sz w:val="24"/>
-          <w:szCs w:val="22"/>
-          <w:lang w:val="en-US"/>
-        </w:rPr>
-        <w:t>)</w:t>
+        <w:t>Create a Package inside this project (com.WebDriverDemos)</w:t>
       </w:r>
     </w:p>
     <w:p>
@@ -2755,23 +2705,13 @@
           <w:lang w:val="en-US"/>
         </w:rPr>
       </w:pPr>
-      <w:proofErr w:type="gramStart"/>
-      <w:r>
-        <w:rPr>
-          <w:sz w:val="24"/>
-          <w:szCs w:val="22"/>
-          <w:lang w:val="en-US"/>
-        </w:rPr>
-        <w:t>get(</w:t>
-      </w:r>
-      <w:proofErr w:type="gramEnd"/>
-      <w:r>
-        <w:rPr>
-          <w:sz w:val="24"/>
-          <w:szCs w:val="22"/>
-          <w:lang w:val="en-US"/>
-        </w:rPr>
-        <w:t xml:space="preserve">) </w:t>
+      <w:r>
+        <w:rPr>
+          <w:sz w:val="24"/>
+          <w:szCs w:val="22"/>
+          <w:lang w:val="en-US"/>
+        </w:rPr>
+        <w:t xml:space="preserve">get() </w:t>
       </w:r>
       <w:r>
         <w:rPr>
@@ -2803,33 +2743,13 @@
           <w:lang w:val="en-US"/>
         </w:rPr>
       </w:pPr>
-      <w:proofErr w:type="spellStart"/>
-      <w:proofErr w:type="gramStart"/>
-      <w:r>
-        <w:rPr>
-          <w:sz w:val="24"/>
-          <w:szCs w:val="22"/>
-          <w:lang w:val="en-US"/>
-        </w:rPr>
-        <w:t>driver.manage</w:t>
-      </w:r>
-      <w:proofErr w:type="spellEnd"/>
-      <w:r>
-        <w:rPr>
-          <w:sz w:val="24"/>
-          <w:szCs w:val="22"/>
-          <w:lang w:val="en-US"/>
-        </w:rPr>
-        <w:t>(</w:t>
-      </w:r>
-      <w:proofErr w:type="gramEnd"/>
-      <w:r>
-        <w:rPr>
-          <w:sz w:val="24"/>
-          <w:szCs w:val="22"/>
-          <w:lang w:val="en-US"/>
-        </w:rPr>
-        <w:t xml:space="preserve">).window().maximize() </w:t>
+      <w:r>
+        <w:rPr>
+          <w:sz w:val="24"/>
+          <w:szCs w:val="22"/>
+          <w:lang w:val="en-US"/>
+        </w:rPr>
+        <w:t xml:space="preserve">driver.manage().window().maximize() </w:t>
       </w:r>
       <w:r>
         <w:rPr>
@@ -2861,23 +2781,13 @@
           <w:lang w:val="en-US"/>
         </w:rPr>
       </w:pPr>
-      <w:proofErr w:type="gramStart"/>
-      <w:r>
-        <w:rPr>
-          <w:sz w:val="24"/>
-          <w:szCs w:val="22"/>
-          <w:lang w:val="en-US"/>
-        </w:rPr>
-        <w:t>close(</w:t>
-      </w:r>
-      <w:proofErr w:type="gramEnd"/>
-      <w:r>
-        <w:rPr>
-          <w:sz w:val="24"/>
-          <w:szCs w:val="22"/>
-          <w:lang w:val="en-US"/>
-        </w:rPr>
-        <w:t xml:space="preserve">) </w:t>
+      <w:r>
+        <w:rPr>
+          <w:sz w:val="24"/>
+          <w:szCs w:val="22"/>
+          <w:lang w:val="en-US"/>
+        </w:rPr>
+        <w:t xml:space="preserve">close() </w:t>
       </w:r>
       <w:r>
         <w:rPr>
@@ -2935,23 +2845,13 @@
           <w:lang w:val="en-US"/>
         </w:rPr>
       </w:pPr>
-      <w:proofErr w:type="gramStart"/>
-      <w:r>
-        <w:rPr>
-          <w:sz w:val="24"/>
-          <w:szCs w:val="22"/>
-          <w:lang w:val="en-US"/>
-        </w:rPr>
-        <w:t>getTitle(</w:t>
-      </w:r>
-      <w:proofErr w:type="gramEnd"/>
-      <w:r>
-        <w:rPr>
-          <w:sz w:val="24"/>
-          <w:szCs w:val="22"/>
-          <w:lang w:val="en-US"/>
-        </w:rPr>
-        <w:t xml:space="preserve">) </w:t>
+      <w:r>
+        <w:rPr>
+          <w:sz w:val="24"/>
+          <w:szCs w:val="22"/>
+          <w:lang w:val="en-US"/>
+        </w:rPr>
+        <w:t xml:space="preserve">getTitle() </w:t>
       </w:r>
       <w:r>
         <w:rPr>
@@ -3021,23 +2921,13 @@
           <w:lang w:val="en-US"/>
         </w:rPr>
       </w:pPr>
-      <w:proofErr w:type="gramStart"/>
-      <w:r>
-        <w:rPr>
-          <w:sz w:val="24"/>
-          <w:szCs w:val="22"/>
-          <w:lang w:val="en-US"/>
-        </w:rPr>
-        <w:t>getPageSource(</w:t>
-      </w:r>
-      <w:proofErr w:type="gramEnd"/>
-      <w:r>
-        <w:rPr>
-          <w:sz w:val="24"/>
-          <w:szCs w:val="22"/>
-          <w:lang w:val="en-US"/>
-        </w:rPr>
-        <w:t xml:space="preserve">) </w:t>
+      <w:r>
+        <w:rPr>
+          <w:sz w:val="24"/>
+          <w:szCs w:val="22"/>
+          <w:lang w:val="en-US"/>
+        </w:rPr>
+        <w:t xml:space="preserve">getPageSource() </w:t>
       </w:r>
       <w:r>
         <w:rPr>
@@ -3069,23 +2959,13 @@
           <w:lang w:val="en-US"/>
         </w:rPr>
       </w:pPr>
-      <w:proofErr w:type="gramStart"/>
-      <w:r>
-        <w:rPr>
-          <w:sz w:val="24"/>
-          <w:szCs w:val="22"/>
-          <w:lang w:val="en-US"/>
-        </w:rPr>
-        <w:t>findElement(</w:t>
-      </w:r>
-      <w:proofErr w:type="gramEnd"/>
-      <w:r>
-        <w:rPr>
-          <w:sz w:val="24"/>
-          <w:szCs w:val="22"/>
-          <w:lang w:val="en-US"/>
-        </w:rPr>
-        <w:t xml:space="preserve">) </w:t>
+      <w:r>
+        <w:rPr>
+          <w:sz w:val="24"/>
+          <w:szCs w:val="22"/>
+          <w:lang w:val="en-US"/>
+        </w:rPr>
+        <w:t xml:space="preserve">findElement() </w:t>
       </w:r>
       <w:r>
         <w:rPr>
@@ -3201,23 +3081,13 @@
           <w:lang w:val="en-US"/>
         </w:rPr>
       </w:pPr>
-      <w:proofErr w:type="gramStart"/>
-      <w:r>
-        <w:rPr>
-          <w:sz w:val="24"/>
-          <w:szCs w:val="22"/>
-          <w:lang w:val="en-US"/>
-        </w:rPr>
-        <w:t>getWindowHandles(</w:t>
-      </w:r>
-      <w:proofErr w:type="gramEnd"/>
-      <w:r>
-        <w:rPr>
-          <w:sz w:val="24"/>
-          <w:szCs w:val="22"/>
-          <w:lang w:val="en-US"/>
-        </w:rPr>
-        <w:t xml:space="preserve">) </w:t>
+      <w:r>
+        <w:rPr>
+          <w:sz w:val="24"/>
+          <w:szCs w:val="22"/>
+          <w:lang w:val="en-US"/>
+        </w:rPr>
+        <w:t xml:space="preserve">getWindowHandles() </w:t>
       </w:r>
       <w:r>
         <w:rPr>
@@ -3249,23 +3119,13 @@
           <w:lang w:val="en-US"/>
         </w:rPr>
       </w:pPr>
-      <w:proofErr w:type="gramStart"/>
-      <w:r>
-        <w:rPr>
-          <w:sz w:val="24"/>
-          <w:szCs w:val="22"/>
-          <w:lang w:val="en-US"/>
-        </w:rPr>
-        <w:t>quit(</w:t>
-      </w:r>
-      <w:proofErr w:type="gramEnd"/>
-      <w:r>
-        <w:rPr>
-          <w:sz w:val="24"/>
-          <w:szCs w:val="22"/>
-          <w:lang w:val="en-US"/>
-        </w:rPr>
-        <w:t xml:space="preserve">) </w:t>
+      <w:r>
+        <w:rPr>
+          <w:sz w:val="24"/>
+          <w:szCs w:val="22"/>
+          <w:lang w:val="en-US"/>
+        </w:rPr>
+        <w:t xml:space="preserve">quit() </w:t>
       </w:r>
       <w:r>
         <w:rPr>
@@ -3643,35 +3503,7 @@
           <w:szCs w:val="22"/>
           <w:lang w:val="en-US"/>
         </w:rPr>
-        <w:t xml:space="preserve"> If the specific page (URL) is not getting loaded within 30 seconds while calling </w:t>
-      </w:r>
-      <w:proofErr w:type="spellStart"/>
-      <w:proofErr w:type="gramStart"/>
-      <w:r>
-        <w:rPr>
-          <w:sz w:val="24"/>
-          <w:szCs w:val="22"/>
-          <w:lang w:val="en-US"/>
-        </w:rPr>
-        <w:t>driver.get</w:t>
-      </w:r>
-      <w:proofErr w:type="spellEnd"/>
-      <w:r>
-        <w:rPr>
-          <w:sz w:val="24"/>
-          <w:szCs w:val="22"/>
-          <w:lang w:val="en-US"/>
-        </w:rPr>
-        <w:t>(</w:t>
-      </w:r>
-      <w:proofErr w:type="gramEnd"/>
-      <w:r>
-        <w:rPr>
-          <w:sz w:val="24"/>
-          <w:szCs w:val="22"/>
-          <w:lang w:val="en-US"/>
-        </w:rPr>
-        <w:t>).</w:t>
+        <w:t xml:space="preserve"> If the specific page (URL) is not getting loaded within 30 seconds while calling driver.get().</w:t>
       </w:r>
     </w:p>
     <w:p>
@@ -3969,23 +3801,13 @@
           <w:lang w:val="en-US"/>
         </w:rPr>
       </w:pPr>
-      <w:proofErr w:type="gramStart"/>
-      <w:r>
-        <w:rPr>
-          <w:sz w:val="24"/>
-          <w:szCs w:val="22"/>
-          <w:lang w:val="en-US"/>
-        </w:rPr>
-        <w:t>sendKeys(</w:t>
-      </w:r>
-      <w:proofErr w:type="gramEnd"/>
-      <w:r>
-        <w:rPr>
-          <w:sz w:val="24"/>
-          <w:szCs w:val="22"/>
-          <w:lang w:val="en-US"/>
-        </w:rPr>
-        <w:t xml:space="preserve">) </w:t>
+      <w:r>
+        <w:rPr>
+          <w:sz w:val="24"/>
+          <w:szCs w:val="22"/>
+          <w:lang w:val="en-US"/>
+        </w:rPr>
+        <w:t xml:space="preserve">sendKeys() </w:t>
       </w:r>
       <w:r>
         <w:rPr>
@@ -4025,23 +3847,13 @@
           <w:lang w:val="en-US"/>
         </w:rPr>
       </w:pPr>
-      <w:proofErr w:type="gramStart"/>
-      <w:r>
-        <w:rPr>
-          <w:sz w:val="24"/>
-          <w:szCs w:val="22"/>
-          <w:lang w:val="en-US"/>
-        </w:rPr>
-        <w:t>click(</w:t>
-      </w:r>
-      <w:proofErr w:type="gramEnd"/>
-      <w:r>
-        <w:rPr>
-          <w:sz w:val="24"/>
-          <w:szCs w:val="22"/>
-          <w:lang w:val="en-US"/>
-        </w:rPr>
-        <w:t xml:space="preserve">) </w:t>
+      <w:r>
+        <w:rPr>
+          <w:sz w:val="24"/>
+          <w:szCs w:val="22"/>
+          <w:lang w:val="en-US"/>
+        </w:rPr>
+        <w:t xml:space="preserve">click() </w:t>
       </w:r>
       <w:r>
         <w:rPr>
@@ -4073,23 +3885,13 @@
           <w:lang w:val="en-US"/>
         </w:rPr>
       </w:pPr>
-      <w:proofErr w:type="gramStart"/>
-      <w:r>
-        <w:rPr>
-          <w:sz w:val="24"/>
-          <w:szCs w:val="22"/>
-          <w:lang w:val="en-US"/>
-        </w:rPr>
-        <w:t>getText(</w:t>
-      </w:r>
-      <w:proofErr w:type="gramEnd"/>
-      <w:r>
-        <w:rPr>
-          <w:sz w:val="24"/>
-          <w:szCs w:val="22"/>
-          <w:lang w:val="en-US"/>
-        </w:rPr>
-        <w:t xml:space="preserve">) </w:t>
+      <w:r>
+        <w:rPr>
+          <w:sz w:val="24"/>
+          <w:szCs w:val="22"/>
+          <w:lang w:val="en-US"/>
+        </w:rPr>
+        <w:t xml:space="preserve">getText() </w:t>
       </w:r>
       <w:r>
         <w:rPr>
@@ -4121,23 +3923,13 @@
           <w:lang w:val="en-US"/>
         </w:rPr>
       </w:pPr>
-      <w:proofErr w:type="gramStart"/>
-      <w:r>
-        <w:rPr>
-          <w:sz w:val="24"/>
-          <w:szCs w:val="22"/>
-          <w:lang w:val="en-US"/>
-        </w:rPr>
-        <w:t>getAttribute(</w:t>
-      </w:r>
-      <w:proofErr w:type="gramEnd"/>
-      <w:r>
-        <w:rPr>
-          <w:sz w:val="24"/>
-          <w:szCs w:val="22"/>
-          <w:lang w:val="en-US"/>
-        </w:rPr>
-        <w:t xml:space="preserve">) / getDomAttribute() </w:t>
+      <w:r>
+        <w:rPr>
+          <w:sz w:val="24"/>
+          <w:szCs w:val="22"/>
+          <w:lang w:val="en-US"/>
+        </w:rPr>
+        <w:t xml:space="preserve">getAttribute() / getDomAttribute() </w:t>
       </w:r>
       <w:r>
         <w:rPr>
@@ -4345,23 +4137,13 @@
           <w:lang w:val="en-US"/>
         </w:rPr>
       </w:pPr>
-      <w:proofErr w:type="gramStart"/>
-      <w:r>
-        <w:rPr>
-          <w:sz w:val="24"/>
-          <w:szCs w:val="22"/>
-          <w:lang w:val="en-US"/>
-        </w:rPr>
-        <w:t>getLocation(</w:t>
-      </w:r>
-      <w:proofErr w:type="gramEnd"/>
-      <w:r>
-        <w:rPr>
-          <w:sz w:val="24"/>
-          <w:szCs w:val="22"/>
-          <w:lang w:val="en-US"/>
-        </w:rPr>
-        <w:t xml:space="preserve">) </w:t>
+      <w:r>
+        <w:rPr>
+          <w:sz w:val="24"/>
+          <w:szCs w:val="22"/>
+          <w:lang w:val="en-US"/>
+        </w:rPr>
+        <w:t xml:space="preserve">getLocation() </w:t>
       </w:r>
       <w:r>
         <w:rPr>
@@ -4899,25 +4681,7 @@
           <w:szCs w:val="22"/>
           <w:lang w:val="en-US"/>
         </w:rPr>
-        <w:t>data-</w:t>
-      </w:r>
-      <w:proofErr w:type="spellStart"/>
-      <w:r>
-        <w:rPr>
-          <w:sz w:val="24"/>
-          <w:szCs w:val="22"/>
-          <w:lang w:val="en-US"/>
-        </w:rPr>
-        <w:t>testid</w:t>
-      </w:r>
-      <w:proofErr w:type="spellEnd"/>
-      <w:r>
-        <w:rPr>
-          <w:sz w:val="24"/>
-          <w:szCs w:val="22"/>
-          <w:lang w:val="en-US"/>
-        </w:rPr>
-        <w:t>="royal-email"]</w:t>
+        <w:t>data-testid="royal-email"]</w:t>
       </w:r>
     </w:p>
     <w:p>
@@ -5522,25 +5286,7 @@
           <w:szCs w:val="22"/>
           <w:lang w:val="en-US"/>
         </w:rPr>
-        <w:t xml:space="preserve">Selenium has a special class to handle such a drop down list </w:t>
-      </w:r>
-      <w:proofErr w:type="spellStart"/>
-      <w:r>
-        <w:rPr>
-          <w:sz w:val="24"/>
-          <w:szCs w:val="22"/>
-          <w:lang w:val="en-US"/>
-        </w:rPr>
-        <w:t>ie</w:t>
-      </w:r>
-      <w:proofErr w:type="spellEnd"/>
-      <w:r>
-        <w:rPr>
-          <w:sz w:val="24"/>
-          <w:szCs w:val="22"/>
-          <w:lang w:val="en-US"/>
-        </w:rPr>
-        <w:t xml:space="preserve">. </w:t>
+        <w:t xml:space="preserve">Selenium has a special class to handle such a drop down list ie. </w:t>
       </w:r>
       <w:r>
         <w:rPr>
@@ -5628,23 +5374,13 @@
           <w:lang w:val="en-US"/>
         </w:rPr>
       </w:pPr>
-      <w:proofErr w:type="gramStart"/>
-      <w:r>
-        <w:rPr>
-          <w:sz w:val="24"/>
-          <w:szCs w:val="22"/>
-          <w:lang w:val="en-US"/>
-        </w:rPr>
-        <w:t>getOptions(</w:t>
-      </w:r>
-      <w:proofErr w:type="gramEnd"/>
-      <w:r>
-        <w:rPr>
-          <w:sz w:val="24"/>
-          <w:szCs w:val="22"/>
-          <w:lang w:val="en-US"/>
-        </w:rPr>
-        <w:t xml:space="preserve">) </w:t>
+      <w:r>
+        <w:rPr>
+          <w:sz w:val="24"/>
+          <w:szCs w:val="22"/>
+          <w:lang w:val="en-US"/>
+        </w:rPr>
+        <w:t xml:space="preserve">getOptions() </w:t>
       </w:r>
       <w:r>
         <w:rPr>
@@ -5752,23 +5488,13 @@
           <w:lang w:val="en-US"/>
         </w:rPr>
       </w:pPr>
-      <w:proofErr w:type="gramStart"/>
-      <w:r>
-        <w:rPr>
-          <w:sz w:val="24"/>
-          <w:szCs w:val="22"/>
-          <w:lang w:val="en-US"/>
-        </w:rPr>
-        <w:t>selectByValue(</w:t>
-      </w:r>
-      <w:proofErr w:type="gramEnd"/>
-      <w:r>
-        <w:rPr>
-          <w:sz w:val="24"/>
-          <w:szCs w:val="22"/>
-          <w:lang w:val="en-US"/>
-        </w:rPr>
-        <w:t xml:space="preserve">) </w:t>
+      <w:r>
+        <w:rPr>
+          <w:sz w:val="24"/>
+          <w:szCs w:val="22"/>
+          <w:lang w:val="en-US"/>
+        </w:rPr>
+        <w:t xml:space="preserve">selectByValue() </w:t>
       </w:r>
       <w:r>
         <w:rPr>
@@ -5838,23 +5564,13 @@
           <w:lang w:val="en-US"/>
         </w:rPr>
       </w:pPr>
-      <w:proofErr w:type="gramStart"/>
-      <w:r>
-        <w:rPr>
-          <w:sz w:val="24"/>
-          <w:szCs w:val="22"/>
-          <w:lang w:val="en-US"/>
-        </w:rPr>
-        <w:t>isMultiple(</w:t>
-      </w:r>
-      <w:proofErr w:type="gramEnd"/>
-      <w:r>
-        <w:rPr>
-          <w:sz w:val="24"/>
-          <w:szCs w:val="22"/>
-          <w:lang w:val="en-US"/>
-        </w:rPr>
-        <w:t xml:space="preserve">) </w:t>
+      <w:r>
+        <w:rPr>
+          <w:sz w:val="24"/>
+          <w:szCs w:val="22"/>
+          <w:lang w:val="en-US"/>
+        </w:rPr>
+        <w:t xml:space="preserve">isMultiple() </w:t>
       </w:r>
       <w:r>
         <w:rPr>
@@ -6058,23 +5774,13 @@
           <w:lang w:val="en-US"/>
         </w:rPr>
       </w:pPr>
-      <w:proofErr w:type="spellStart"/>
-      <w:r>
-        <w:rPr>
-          <w:sz w:val="24"/>
-          <w:szCs w:val="22"/>
-          <w:lang w:val="en-US"/>
-        </w:rPr>
-        <w:t>Thread.sleep</w:t>
-      </w:r>
-      <w:proofErr w:type="spellEnd"/>
-      <w:r>
-        <w:rPr>
-          <w:sz w:val="24"/>
-          <w:szCs w:val="22"/>
-          <w:lang w:val="en-US"/>
-        </w:rPr>
-        <w:t>()</w:t>
+      <w:r>
+        <w:rPr>
+          <w:sz w:val="24"/>
+          <w:szCs w:val="22"/>
+          <w:lang w:val="en-US"/>
+        </w:rPr>
+        <w:t>Thread.sleep()</w:t>
       </w:r>
       <w:r>
         <w:rPr>
@@ -6302,25 +6008,7 @@
           <w:szCs w:val="22"/>
           <w:lang w:val="en-US"/>
         </w:rPr>
-        <w:t xml:space="preserve"> It is combination of </w:t>
-      </w:r>
-      <w:proofErr w:type="spellStart"/>
-      <w:r>
-        <w:rPr>
-          <w:sz w:val="24"/>
-          <w:szCs w:val="22"/>
-          <w:lang w:val="en-US"/>
-        </w:rPr>
-        <w:t>Thread.sleep</w:t>
-      </w:r>
-      <w:proofErr w:type="spellEnd"/>
-      <w:r>
-        <w:rPr>
-          <w:sz w:val="24"/>
-          <w:szCs w:val="22"/>
-          <w:lang w:val="en-US"/>
-        </w:rPr>
-        <w:t xml:space="preserve"> &amp; Implicit Wait</w:t>
+        <w:t xml:space="preserve"> It is combination of Thread.sleep &amp; Implicit Wait</w:t>
       </w:r>
     </w:p>
     <w:p>
@@ -6387,43 +6075,7 @@
           <w:szCs w:val="22"/>
           <w:lang w:val="en-US"/>
         </w:rPr>
-        <w:t xml:space="preserve">We can handle some specific condition for wait (ElementToBeClickable, </w:t>
-      </w:r>
-      <w:proofErr w:type="spellStart"/>
-      <w:r>
-        <w:rPr>
-          <w:sz w:val="24"/>
-          <w:szCs w:val="22"/>
-          <w:lang w:val="en-US"/>
-        </w:rPr>
-        <w:t>AlertToPresent</w:t>
-      </w:r>
-      <w:proofErr w:type="spellEnd"/>
-      <w:r>
-        <w:rPr>
-          <w:sz w:val="24"/>
-          <w:szCs w:val="22"/>
-          <w:lang w:val="en-US"/>
-        </w:rPr>
-        <w:t xml:space="preserve">, </w:t>
-      </w:r>
-      <w:proofErr w:type="spellStart"/>
-      <w:r>
-        <w:rPr>
-          <w:sz w:val="24"/>
-          <w:szCs w:val="22"/>
-          <w:lang w:val="en-US"/>
-        </w:rPr>
-        <w:t>VisibilityOfElementLocateBy</w:t>
-      </w:r>
-      <w:proofErr w:type="spellEnd"/>
-      <w:r>
-        <w:rPr>
-          <w:sz w:val="24"/>
-          <w:szCs w:val="22"/>
-          <w:lang w:val="en-US"/>
-        </w:rPr>
-        <w:t>)</w:t>
+        <w:t>We can handle some specific condition for wait (ElementToBeClickable, AlertToPresent, VisibilityOfElementLocateBy)</w:t>
       </w:r>
     </w:p>
     <w:p>
@@ -6535,43 +6187,7 @@
           <w:szCs w:val="22"/>
           <w:lang w:val="en-US"/>
         </w:rPr>
-        <w:t xml:space="preserve">We can handle some specific condition for wait (ElementToBeClickable, </w:t>
-      </w:r>
-      <w:proofErr w:type="spellStart"/>
-      <w:r>
-        <w:rPr>
-          <w:sz w:val="24"/>
-          <w:szCs w:val="22"/>
-          <w:lang w:val="en-US"/>
-        </w:rPr>
-        <w:t>AlertToPresent</w:t>
-      </w:r>
-      <w:proofErr w:type="spellEnd"/>
-      <w:r>
-        <w:rPr>
-          <w:sz w:val="24"/>
-          <w:szCs w:val="22"/>
-          <w:lang w:val="en-US"/>
-        </w:rPr>
-        <w:t xml:space="preserve">, </w:t>
-      </w:r>
-      <w:proofErr w:type="spellStart"/>
-      <w:r>
-        <w:rPr>
-          <w:sz w:val="24"/>
-          <w:szCs w:val="22"/>
-          <w:lang w:val="en-US"/>
-        </w:rPr>
-        <w:t>VisibilityOfElementLocateBy</w:t>
-      </w:r>
-      <w:proofErr w:type="spellEnd"/>
-      <w:r>
-        <w:rPr>
-          <w:sz w:val="24"/>
-          <w:szCs w:val="22"/>
-          <w:lang w:val="en-US"/>
-        </w:rPr>
-        <w:t>)</w:t>
+        <w:t>We can handle some specific condition for wait (ElementToBeClickable, AlertToPresent, VisibilityOfElementLocateBy)</w:t>
       </w:r>
     </w:p>
     <w:p>
@@ -6653,23 +6269,13 @@
           <w:lang w:val="en-US"/>
         </w:rPr>
       </w:pPr>
-      <w:proofErr w:type="spellStart"/>
-      <w:r>
-        <w:rPr>
-          <w:sz w:val="24"/>
-          <w:szCs w:val="22"/>
-          <w:lang w:val="en-US"/>
-        </w:rPr>
-        <w:t>i</w:t>
-      </w:r>
-      <w:proofErr w:type="spellEnd"/>
-      <w:r>
-        <w:rPr>
-          <w:sz w:val="24"/>
-          <w:szCs w:val="22"/>
-          <w:lang w:val="en-US"/>
-        </w:rPr>
-        <w:t xml:space="preserve"> - ignoring</w:t>
+      <w:r>
+        <w:rPr>
+          <w:sz w:val="24"/>
+          <w:szCs w:val="22"/>
+          <w:lang w:val="en-US"/>
+        </w:rPr>
+        <w:t>i - ignoring</w:t>
       </w:r>
     </w:p>
     <w:p>
@@ -6751,23 +6357,13 @@
           <w:lang w:val="en-US"/>
         </w:rPr>
       </w:pPr>
-      <w:proofErr w:type="spellStart"/>
-      <w:r>
-        <w:rPr>
-          <w:sz w:val="24"/>
-          <w:szCs w:val="22"/>
-          <w:lang w:val="en-US"/>
-        </w:rPr>
-        <w:t>driver.get</w:t>
-      </w:r>
-      <w:proofErr w:type="spellEnd"/>
-      <w:r>
-        <w:rPr>
-          <w:sz w:val="24"/>
-          <w:szCs w:val="22"/>
-          <w:lang w:val="en-US"/>
-        </w:rPr>
-        <w:t>() is having implicit wait for 30 seconds</w:t>
+      <w:r>
+        <w:rPr>
+          <w:sz w:val="24"/>
+          <w:szCs w:val="22"/>
+          <w:lang w:val="en-US"/>
+        </w:rPr>
+        <w:t>driver.get() is having implicit wait for 30 seconds</w:t>
       </w:r>
     </w:p>
     <w:p>
@@ -7066,25 +6662,7 @@
           <w:szCs w:val="22"/>
           <w:lang w:val="en-US"/>
         </w:rPr>
-        <w:t xml:space="preserve">Selenium has provided a special interface to handle such alert </w:t>
-      </w:r>
-      <w:proofErr w:type="spellStart"/>
-      <w:r>
-        <w:rPr>
-          <w:sz w:val="24"/>
-          <w:szCs w:val="22"/>
-          <w:lang w:val="en-US"/>
-        </w:rPr>
-        <w:t>ie</w:t>
-      </w:r>
-      <w:proofErr w:type="spellEnd"/>
-      <w:r>
-        <w:rPr>
-          <w:sz w:val="24"/>
-          <w:szCs w:val="22"/>
-          <w:lang w:val="en-US"/>
-        </w:rPr>
-        <w:t xml:space="preserve">. </w:t>
+        <w:t xml:space="preserve">Selenium has provided a special interface to handle such alert ie. </w:t>
       </w:r>
       <w:r>
         <w:rPr>
@@ -7131,23 +6709,13 @@
           <w:lang w:val="en-US"/>
         </w:rPr>
       </w:pPr>
-      <w:proofErr w:type="spellStart"/>
-      <w:r>
-        <w:rPr>
-          <w:sz w:val="24"/>
-          <w:szCs w:val="22"/>
-          <w:lang w:val="en-US"/>
-        </w:rPr>
-        <w:t>driver.switchTo</w:t>
-      </w:r>
-      <w:proofErr w:type="spellEnd"/>
-      <w:r>
-        <w:rPr>
-          <w:sz w:val="24"/>
-          <w:szCs w:val="22"/>
-          <w:lang w:val="en-US"/>
-        </w:rPr>
-        <w:t xml:space="preserve">().alert() </w:t>
+      <w:r>
+        <w:rPr>
+          <w:sz w:val="24"/>
+          <w:szCs w:val="22"/>
+          <w:lang w:val="en-US"/>
+        </w:rPr>
+        <w:t xml:space="preserve">driver.switchTo().alert() </w:t>
       </w:r>
       <w:r>
         <w:rPr>
@@ -7179,23 +6747,13 @@
           <w:lang w:val="en-US"/>
         </w:rPr>
       </w:pPr>
-      <w:proofErr w:type="gramStart"/>
-      <w:r>
-        <w:rPr>
-          <w:sz w:val="24"/>
-          <w:szCs w:val="22"/>
-          <w:lang w:val="en-US"/>
-        </w:rPr>
-        <w:t>getText(</w:t>
-      </w:r>
-      <w:proofErr w:type="gramEnd"/>
-      <w:r>
-        <w:rPr>
-          <w:sz w:val="24"/>
-          <w:szCs w:val="22"/>
-          <w:lang w:val="en-US"/>
-        </w:rPr>
-        <w:t xml:space="preserve">) </w:t>
+      <w:r>
+        <w:rPr>
+          <w:sz w:val="24"/>
+          <w:szCs w:val="22"/>
+          <w:lang w:val="en-US"/>
+        </w:rPr>
+        <w:t xml:space="preserve">getText() </w:t>
       </w:r>
       <w:r>
         <w:rPr>
@@ -7399,25 +6957,7 @@
           <w:szCs w:val="22"/>
           <w:lang w:val="en-US"/>
         </w:rPr>
-        <w:t xml:space="preserve">WebElement’s </w:t>
-      </w:r>
-      <w:proofErr w:type="gramStart"/>
-      <w:r>
-        <w:rPr>
-          <w:sz w:val="24"/>
-          <w:szCs w:val="22"/>
-          <w:lang w:val="en-US"/>
-        </w:rPr>
-        <w:t>sendKeys(</w:t>
-      </w:r>
-      <w:proofErr w:type="gramEnd"/>
-      <w:r>
-        <w:rPr>
-          <w:sz w:val="24"/>
-          <w:szCs w:val="22"/>
-          <w:lang w:val="en-US"/>
-        </w:rPr>
-        <w:t>) is used to upload any file to such control.</w:t>
+        <w:t>WebElement’s sendKeys() is used to upload any file to such control.</w:t>
       </w:r>
     </w:p>
     <w:p>
@@ -7439,25 +6979,7 @@
           <w:szCs w:val="22"/>
           <w:lang w:val="en-US"/>
         </w:rPr>
-        <w:t xml:space="preserve">For </w:t>
-      </w:r>
-      <w:proofErr w:type="gramStart"/>
-      <w:r>
-        <w:rPr>
-          <w:sz w:val="24"/>
-          <w:szCs w:val="22"/>
-          <w:lang w:val="en-US"/>
-        </w:rPr>
-        <w:t>sendKeys(</w:t>
-      </w:r>
-      <w:proofErr w:type="gramEnd"/>
-      <w:r>
-        <w:rPr>
-          <w:sz w:val="24"/>
-          <w:szCs w:val="22"/>
-          <w:lang w:val="en-US"/>
-        </w:rPr>
-        <w:t>) method pass the name of file along with path as parameter.</w:t>
+        <w:t>For sendKeys() method pass the name of file along with path as parameter.</w:t>
       </w:r>
     </w:p>
     <w:p>
@@ -7732,19 +7254,11 @@
           <w:lang w:val="en-US"/>
         </w:rPr>
       </w:pPr>
-      <w:proofErr w:type="gramStart"/>
-      <w:r>
-        <w:rPr>
-          <w:lang w:val="en-US"/>
-        </w:rPr>
-        <w:t>moveToElement(</w:t>
-      </w:r>
-      <w:proofErr w:type="gramEnd"/>
-      <w:r>
-        <w:rPr>
-          <w:lang w:val="en-US"/>
-        </w:rPr>
-        <w:t xml:space="preserve">) </w:t>
+      <w:r>
+        <w:rPr>
+          <w:lang w:val="en-US"/>
+        </w:rPr>
+        <w:t xml:space="preserve">moveToElement() </w:t>
       </w:r>
       <w:r>
         <w:rPr>
@@ -7770,19 +7284,11 @@
           <w:lang w:val="en-US"/>
         </w:rPr>
       </w:pPr>
-      <w:proofErr w:type="gramStart"/>
-      <w:r>
-        <w:rPr>
-          <w:lang w:val="en-US"/>
-        </w:rPr>
-        <w:t>perform(</w:t>
-      </w:r>
-      <w:proofErr w:type="gramEnd"/>
-      <w:r>
-        <w:rPr>
-          <w:lang w:val="en-US"/>
-        </w:rPr>
-        <w:t xml:space="preserve">) </w:t>
+      <w:r>
+        <w:rPr>
+          <w:lang w:val="en-US"/>
+        </w:rPr>
+        <w:t xml:space="preserve">perform() </w:t>
       </w:r>
       <w:r>
         <w:rPr>
@@ -7808,19 +7314,11 @@
           <w:lang w:val="en-US"/>
         </w:rPr>
       </w:pPr>
-      <w:proofErr w:type="gramStart"/>
-      <w:r>
-        <w:rPr>
-          <w:lang w:val="en-US"/>
-        </w:rPr>
-        <w:t>contextClick(</w:t>
-      </w:r>
-      <w:proofErr w:type="gramEnd"/>
-      <w:r>
-        <w:rPr>
-          <w:lang w:val="en-US"/>
-        </w:rPr>
-        <w:t xml:space="preserve">) </w:t>
+      <w:r>
+        <w:rPr>
+          <w:lang w:val="en-US"/>
+        </w:rPr>
+        <w:t xml:space="preserve">contextClick() </w:t>
       </w:r>
       <w:r>
         <w:rPr>
@@ -7846,19 +7344,11 @@
           <w:lang w:val="en-US"/>
         </w:rPr>
       </w:pPr>
-      <w:proofErr w:type="gramStart"/>
-      <w:r>
-        <w:rPr>
-          <w:lang w:val="en-US"/>
-        </w:rPr>
-        <w:t>doubleClick(</w:t>
-      </w:r>
-      <w:proofErr w:type="gramEnd"/>
-      <w:r>
-        <w:rPr>
-          <w:lang w:val="en-US"/>
-        </w:rPr>
-        <w:t xml:space="preserve">) </w:t>
+      <w:r>
+        <w:rPr>
+          <w:lang w:val="en-US"/>
+        </w:rPr>
+        <w:t xml:space="preserve">doubleClick() </w:t>
       </w:r>
       <w:r>
         <w:rPr>
@@ -7884,19 +7374,11 @@
           <w:lang w:val="en-US"/>
         </w:rPr>
       </w:pPr>
-      <w:proofErr w:type="gramStart"/>
-      <w:r>
-        <w:rPr>
-          <w:lang w:val="en-US"/>
-        </w:rPr>
-        <w:t>dragAndDrop(</w:t>
-      </w:r>
-      <w:proofErr w:type="gramEnd"/>
-      <w:r>
-        <w:rPr>
-          <w:lang w:val="en-US"/>
-        </w:rPr>
-        <w:t xml:space="preserve">) </w:t>
+      <w:r>
+        <w:rPr>
+          <w:lang w:val="en-US"/>
+        </w:rPr>
+        <w:t xml:space="preserve">dragAndDrop() </w:t>
       </w:r>
       <w:r>
         <w:rPr>
@@ -9175,37 +8657,19 @@
         </w:rPr>
         <w:t xml:space="preserve"> will not terminate the execution rather it will continue the execution and exception will be thrown only when you will call </w:t>
       </w:r>
-      <w:proofErr w:type="gramStart"/>
       <w:r>
         <w:rPr>
           <w:b/>
           <w:bCs/>
           <w:lang w:val="en-US"/>
         </w:rPr>
-        <w:t>assertAll(</w:t>
-      </w:r>
-      <w:proofErr w:type="gramEnd"/>
-      <w:r>
-        <w:rPr>
-          <w:b/>
-          <w:bCs/>
-          <w:lang w:val="en-US"/>
-        </w:rPr>
-        <w:t xml:space="preserve">) </w:t>
-      </w:r>
-      <w:proofErr w:type="spellStart"/>
-      <w:r>
-        <w:rPr>
-          <w:lang w:val="en-US"/>
-        </w:rPr>
-        <w:t>metod</w:t>
-      </w:r>
-      <w:proofErr w:type="spellEnd"/>
-      <w:r>
-        <w:rPr>
-          <w:lang w:val="en-US"/>
-        </w:rPr>
-        <w:t>.</w:t>
+        <w:t xml:space="preserve">assertAll() </w:t>
+      </w:r>
+      <w:r>
+        <w:rPr>
+          <w:lang w:val="en-US"/>
+        </w:rPr>
+        <w:t>metod.</w:t>
       </w:r>
     </w:p>
     <w:p>
@@ -10460,8 +9924,132 @@
         </w:rPr>
         <w:t>Then Title should be Google</w:t>
       </w:r>
+    </w:p>
+    <w:p>
+      <w:pPr>
+        <w:rPr>
+          <w:lang w:val="en-US"/>
+        </w:rPr>
+      </w:pPr>
+    </w:p>
+    <w:p>
+      <w:pPr>
+        <w:pBdr>
+          <w:bottom w:val="single" w:sz="6" w:space="1" w:color="auto"/>
+        </w:pBdr>
+        <w:rPr>
+          <w:lang w:val="en-US"/>
+        </w:rPr>
+      </w:pPr>
+    </w:p>
+    <w:p>
+      <w:pPr>
+        <w:rPr>
+          <w:b/>
+          <w:bCs/>
+          <w:lang w:val="en-US"/>
+        </w:rPr>
+      </w:pPr>
+      <w:r>
+        <w:rPr>
+          <w:b/>
+          <w:bCs/>
+          <w:lang w:val="en-US"/>
+        </w:rPr>
+        <w:t>Tags in Cucumber</w:t>
+      </w:r>
+    </w:p>
+    <w:p>
+      <w:pPr>
+        <w:pStyle w:val="ListParagraph"/>
+        <w:numPr>
+          <w:ilvl w:val="0"/>
+          <w:numId w:val="39"/>
+        </w:numPr>
+        <w:rPr>
+          <w:lang w:val="en-US"/>
+        </w:rPr>
+      </w:pPr>
+      <w:r>
+        <w:rPr>
+          <w:lang w:val="en-US"/>
+        </w:rPr>
+        <w:t>Tags allows you to execute / skip single scenario / multiple scenarios</w:t>
+      </w:r>
+    </w:p>
+    <w:p>
+      <w:pPr>
+        <w:pStyle w:val="ListParagraph"/>
+        <w:numPr>
+          <w:ilvl w:val="0"/>
+          <w:numId w:val="39"/>
+        </w:numPr>
+        <w:rPr>
+          <w:lang w:val="en-US"/>
+        </w:rPr>
+      </w:pPr>
+      <w:r>
+        <w:rPr>
+          <w:lang w:val="en-US"/>
+        </w:rPr>
+        <w:t>Tags are special words which starts with @</w:t>
+      </w:r>
+    </w:p>
+    <w:p>
+      <w:pPr>
+        <w:pStyle w:val="ListParagraph"/>
+        <w:numPr>
+          <w:ilvl w:val="0"/>
+          <w:numId w:val="39"/>
+        </w:numPr>
+        <w:rPr>
+          <w:lang w:val="en-US"/>
+        </w:rPr>
+      </w:pPr>
+      <w:r>
+        <w:rPr>
+          <w:lang w:val="en-US"/>
+        </w:rPr>
+        <w:t>There no any rule for naming tags</w:t>
+      </w:r>
+    </w:p>
+    <w:p>
+      <w:pPr>
+        <w:pStyle w:val="ListParagraph"/>
+        <w:numPr>
+          <w:ilvl w:val="0"/>
+          <w:numId w:val="39"/>
+        </w:numPr>
+        <w:rPr>
+          <w:lang w:val="en-US"/>
+        </w:rPr>
+      </w:pPr>
+      <w:r>
+        <w:rPr>
+          <w:lang w:val="en-US"/>
+        </w:rPr>
+        <w:t>Tags needs to specified in .feature file only (Tag Definition)</w:t>
+      </w:r>
       <w:bookmarkStart w:id="0" w:name="_GoBack"/>
       <w:bookmarkEnd w:id="0"/>
+    </w:p>
+    <w:p>
+      <w:pPr>
+        <w:pStyle w:val="ListParagraph"/>
+        <w:numPr>
+          <w:ilvl w:val="0"/>
+          <w:numId w:val="39"/>
+        </w:numPr>
+        <w:rPr>
+          <w:lang w:val="en-US"/>
+        </w:rPr>
+      </w:pPr>
+      <w:r>
+        <w:rPr>
+          <w:lang w:val="en-US"/>
+        </w:rPr>
+        <w:t>And the execution criteria needs to specified in Runner class</w:t>
+      </w:r>
     </w:p>
     <w:sectPr>
       <w:pgSz w:w="11906" w:h="16838"/>
@@ -11808,6 +11396,119 @@
     </w:lvl>
   </w:abstractNum>
   <w:abstractNum w:abstractNumId="12">
+    <w:nsid w:val="2D5D0F12"/>
+    <w:multiLevelType w:val="hybridMultilevel"/>
+    <w:tmpl w:val="C65679B8"/>
+    <w:lvl w:ilvl="0" w:tplc="40090001">
+      <w:start w:val="1"/>
+      <w:numFmt w:val="bullet"/>
+      <w:lvlText w:val=""/>
+      <w:lvlJc w:val="left"/>
+      <w:pPr>
+        <w:ind w:left="720" w:hanging="360"/>
+      </w:pPr>
+      <w:rPr>
+        <w:rFonts w:ascii="Symbol" w:hAnsi="Symbol" w:hint="default"/>
+      </w:rPr>
+    </w:lvl>
+    <w:lvl w:ilvl="1" w:tplc="40090003" w:tentative="1">
+      <w:start w:val="1"/>
+      <w:numFmt w:val="bullet"/>
+      <w:lvlText w:val="o"/>
+      <w:lvlJc w:val="left"/>
+      <w:pPr>
+        <w:ind w:left="1440" w:hanging="360"/>
+      </w:pPr>
+      <w:rPr>
+        <w:rFonts w:ascii="Courier New" w:hAnsi="Courier New" w:cs="Courier New" w:hint="default"/>
+      </w:rPr>
+    </w:lvl>
+    <w:lvl w:ilvl="2" w:tplc="40090005" w:tentative="1">
+      <w:start w:val="1"/>
+      <w:numFmt w:val="bullet"/>
+      <w:lvlText w:val=""/>
+      <w:lvlJc w:val="left"/>
+      <w:pPr>
+        <w:ind w:left="2160" w:hanging="360"/>
+      </w:pPr>
+      <w:rPr>
+        <w:rFonts w:ascii="Wingdings" w:hAnsi="Wingdings" w:hint="default"/>
+      </w:rPr>
+    </w:lvl>
+    <w:lvl w:ilvl="3" w:tplc="40090001" w:tentative="1">
+      <w:start w:val="1"/>
+      <w:numFmt w:val="bullet"/>
+      <w:lvlText w:val=""/>
+      <w:lvlJc w:val="left"/>
+      <w:pPr>
+        <w:ind w:left="2880" w:hanging="360"/>
+      </w:pPr>
+      <w:rPr>
+        <w:rFonts w:ascii="Symbol" w:hAnsi="Symbol" w:hint="default"/>
+      </w:rPr>
+    </w:lvl>
+    <w:lvl w:ilvl="4" w:tplc="40090003" w:tentative="1">
+      <w:start w:val="1"/>
+      <w:numFmt w:val="bullet"/>
+      <w:lvlText w:val="o"/>
+      <w:lvlJc w:val="left"/>
+      <w:pPr>
+        <w:ind w:left="3600" w:hanging="360"/>
+      </w:pPr>
+      <w:rPr>
+        <w:rFonts w:ascii="Courier New" w:hAnsi="Courier New" w:cs="Courier New" w:hint="default"/>
+      </w:rPr>
+    </w:lvl>
+    <w:lvl w:ilvl="5" w:tplc="40090005" w:tentative="1">
+      <w:start w:val="1"/>
+      <w:numFmt w:val="bullet"/>
+      <w:lvlText w:val=""/>
+      <w:lvlJc w:val="left"/>
+      <w:pPr>
+        <w:ind w:left="4320" w:hanging="360"/>
+      </w:pPr>
+      <w:rPr>
+        <w:rFonts w:ascii="Wingdings" w:hAnsi="Wingdings" w:hint="default"/>
+      </w:rPr>
+    </w:lvl>
+    <w:lvl w:ilvl="6" w:tplc="40090001" w:tentative="1">
+      <w:start w:val="1"/>
+      <w:numFmt w:val="bullet"/>
+      <w:lvlText w:val=""/>
+      <w:lvlJc w:val="left"/>
+      <w:pPr>
+        <w:ind w:left="5040" w:hanging="360"/>
+      </w:pPr>
+      <w:rPr>
+        <w:rFonts w:ascii="Symbol" w:hAnsi="Symbol" w:hint="default"/>
+      </w:rPr>
+    </w:lvl>
+    <w:lvl w:ilvl="7" w:tplc="40090003" w:tentative="1">
+      <w:start w:val="1"/>
+      <w:numFmt w:val="bullet"/>
+      <w:lvlText w:val="o"/>
+      <w:lvlJc w:val="left"/>
+      <w:pPr>
+        <w:ind w:left="5760" w:hanging="360"/>
+      </w:pPr>
+      <w:rPr>
+        <w:rFonts w:ascii="Courier New" w:hAnsi="Courier New" w:cs="Courier New" w:hint="default"/>
+      </w:rPr>
+    </w:lvl>
+    <w:lvl w:ilvl="8" w:tplc="40090005" w:tentative="1">
+      <w:start w:val="1"/>
+      <w:numFmt w:val="bullet"/>
+      <w:lvlText w:val=""/>
+      <w:lvlJc w:val="left"/>
+      <w:pPr>
+        <w:ind w:left="6480" w:hanging="360"/>
+      </w:pPr>
+      <w:rPr>
+        <w:rFonts w:ascii="Wingdings" w:hAnsi="Wingdings" w:hint="default"/>
+      </w:rPr>
+    </w:lvl>
+  </w:abstractNum>
+  <w:abstractNum w:abstractNumId="13">
     <w:nsid w:val="2D9B41A7"/>
     <w:multiLevelType w:val="hybridMultilevel"/>
     <w:tmpl w:val="C4EC2058"/>
@@ -11920,7 +11621,7 @@
       </w:rPr>
     </w:lvl>
   </w:abstractNum>
-  <w:abstractNum w:abstractNumId="13">
+  <w:abstractNum w:abstractNumId="14">
     <w:nsid w:val="2E8016BE"/>
     <w:multiLevelType w:val="hybridMultilevel"/>
     <w:tmpl w:val="C494F916"/>
@@ -12009,7 +11710,7 @@
       </w:pPr>
     </w:lvl>
   </w:abstractNum>
-  <w:abstractNum w:abstractNumId="14">
+  <w:abstractNum w:abstractNumId="15">
     <w:nsid w:val="369351E9"/>
     <w:multiLevelType w:val="hybridMultilevel"/>
     <w:tmpl w:val="0972A5CA"/>
@@ -12098,7 +11799,7 @@
       </w:pPr>
     </w:lvl>
   </w:abstractNum>
-  <w:abstractNum w:abstractNumId="15">
+  <w:abstractNum w:abstractNumId="16">
     <w:nsid w:val="379C2DB0"/>
     <w:multiLevelType w:val="hybridMultilevel"/>
     <w:tmpl w:val="097C3B70"/>
@@ -12211,7 +11912,7 @@
       </w:rPr>
     </w:lvl>
   </w:abstractNum>
-  <w:abstractNum w:abstractNumId="16">
+  <w:abstractNum w:abstractNumId="17">
     <w:nsid w:val="3A29074B"/>
     <w:multiLevelType w:val="hybridMultilevel"/>
     <w:tmpl w:val="14B00ED2"/>
@@ -12324,7 +12025,7 @@
       </w:rPr>
     </w:lvl>
   </w:abstractNum>
-  <w:abstractNum w:abstractNumId="17">
+  <w:abstractNum w:abstractNumId="18">
     <w:nsid w:val="3B9A3EE0"/>
     <w:multiLevelType w:val="hybridMultilevel"/>
     <w:tmpl w:val="8B20B472"/>
@@ -12437,7 +12138,7 @@
       </w:rPr>
     </w:lvl>
   </w:abstractNum>
-  <w:abstractNum w:abstractNumId="18">
+  <w:abstractNum w:abstractNumId="19">
     <w:nsid w:val="3D565FA3"/>
     <w:multiLevelType w:val="hybridMultilevel"/>
     <w:tmpl w:val="A8F8AFEE"/>
@@ -12526,7 +12227,7 @@
       </w:pPr>
     </w:lvl>
   </w:abstractNum>
-  <w:abstractNum w:abstractNumId="19">
+  <w:abstractNum w:abstractNumId="20">
     <w:nsid w:val="45B43CD4"/>
     <w:multiLevelType w:val="hybridMultilevel"/>
     <w:tmpl w:val="00A2ADA6"/>
@@ -12615,7 +12316,7 @@
       </w:pPr>
     </w:lvl>
   </w:abstractNum>
-  <w:abstractNum w:abstractNumId="20">
+  <w:abstractNum w:abstractNumId="21">
     <w:nsid w:val="46875C90"/>
     <w:multiLevelType w:val="hybridMultilevel"/>
     <w:tmpl w:val="78C0CFB6"/>
@@ -12704,7 +12405,7 @@
       </w:pPr>
     </w:lvl>
   </w:abstractNum>
-  <w:abstractNum w:abstractNumId="21">
+  <w:abstractNum w:abstractNumId="22">
     <w:nsid w:val="471F3D0D"/>
     <w:multiLevelType w:val="hybridMultilevel"/>
     <w:tmpl w:val="D02CD718"/>
@@ -12793,7 +12494,7 @@
       </w:pPr>
     </w:lvl>
   </w:abstractNum>
-  <w:abstractNum w:abstractNumId="22">
+  <w:abstractNum w:abstractNumId="23">
     <w:nsid w:val="4DA3299B"/>
     <w:multiLevelType w:val="hybridMultilevel"/>
     <w:tmpl w:val="A418A19A"/>
@@ -12906,7 +12607,7 @@
       </w:rPr>
     </w:lvl>
   </w:abstractNum>
-  <w:abstractNum w:abstractNumId="23">
+  <w:abstractNum w:abstractNumId="24">
     <w:nsid w:val="4E2A6329"/>
     <w:multiLevelType w:val="hybridMultilevel"/>
     <w:tmpl w:val="BC1628F2"/>
@@ -13019,7 +12720,7 @@
       </w:rPr>
     </w:lvl>
   </w:abstractNum>
-  <w:abstractNum w:abstractNumId="24">
+  <w:abstractNum w:abstractNumId="25">
     <w:nsid w:val="556E1B57"/>
     <w:multiLevelType w:val="hybridMultilevel"/>
     <w:tmpl w:val="26087466"/>
@@ -13132,7 +12833,7 @@
       </w:rPr>
     </w:lvl>
   </w:abstractNum>
-  <w:abstractNum w:abstractNumId="25">
+  <w:abstractNum w:abstractNumId="26">
     <w:nsid w:val="55D10A8D"/>
     <w:multiLevelType w:val="hybridMultilevel"/>
     <w:tmpl w:val="7312E058"/>
@@ -13221,7 +12922,7 @@
       </w:pPr>
     </w:lvl>
   </w:abstractNum>
-  <w:abstractNum w:abstractNumId="26">
+  <w:abstractNum w:abstractNumId="27">
     <w:nsid w:val="56165AD5"/>
     <w:multiLevelType w:val="hybridMultilevel"/>
     <w:tmpl w:val="E0B403D2"/>
@@ -13334,7 +13035,7 @@
       </w:rPr>
     </w:lvl>
   </w:abstractNum>
-  <w:abstractNum w:abstractNumId="27">
+  <w:abstractNum w:abstractNumId="28">
     <w:nsid w:val="56F946E6"/>
     <w:multiLevelType w:val="hybridMultilevel"/>
     <w:tmpl w:val="287A5F26"/>
@@ -13423,7 +13124,7 @@
       </w:pPr>
     </w:lvl>
   </w:abstractNum>
-  <w:abstractNum w:abstractNumId="28">
+  <w:abstractNum w:abstractNumId="29">
     <w:nsid w:val="5A897377"/>
     <w:multiLevelType w:val="hybridMultilevel"/>
     <w:tmpl w:val="F1F27818"/>
@@ -13536,7 +13237,7 @@
       </w:rPr>
     </w:lvl>
   </w:abstractNum>
-  <w:abstractNum w:abstractNumId="29">
+  <w:abstractNum w:abstractNumId="30">
     <w:nsid w:val="5D096968"/>
     <w:multiLevelType w:val="hybridMultilevel"/>
     <w:tmpl w:val="87A897FA"/>
@@ -13625,7 +13326,7 @@
       </w:pPr>
     </w:lvl>
   </w:abstractNum>
-  <w:abstractNum w:abstractNumId="30">
+  <w:abstractNum w:abstractNumId="31">
     <w:nsid w:val="602D5BA0"/>
     <w:multiLevelType w:val="hybridMultilevel"/>
     <w:tmpl w:val="7EDAE732"/>
@@ -13738,7 +13439,7 @@
       </w:rPr>
     </w:lvl>
   </w:abstractNum>
-  <w:abstractNum w:abstractNumId="31">
+  <w:abstractNum w:abstractNumId="32">
     <w:nsid w:val="63DD59AE"/>
     <w:multiLevelType w:val="hybridMultilevel"/>
     <w:tmpl w:val="4F783448"/>
@@ -13851,7 +13552,7 @@
       </w:rPr>
     </w:lvl>
   </w:abstractNum>
-  <w:abstractNum w:abstractNumId="32">
+  <w:abstractNum w:abstractNumId="33">
     <w:nsid w:val="66F74F83"/>
     <w:multiLevelType w:val="hybridMultilevel"/>
     <w:tmpl w:val="47FE45C4"/>
@@ -13964,7 +13665,7 @@
       </w:rPr>
     </w:lvl>
   </w:abstractNum>
-  <w:abstractNum w:abstractNumId="33">
+  <w:abstractNum w:abstractNumId="34">
     <w:nsid w:val="6B375CC6"/>
     <w:multiLevelType w:val="hybridMultilevel"/>
     <w:tmpl w:val="DD7A439E"/>
@@ -14077,7 +13778,7 @@
       </w:rPr>
     </w:lvl>
   </w:abstractNum>
-  <w:abstractNum w:abstractNumId="34">
+  <w:abstractNum w:abstractNumId="35">
     <w:nsid w:val="736235B6"/>
     <w:multiLevelType w:val="hybridMultilevel"/>
     <w:tmpl w:val="9338354A"/>
@@ -14190,7 +13891,7 @@
       </w:rPr>
     </w:lvl>
   </w:abstractNum>
-  <w:abstractNum w:abstractNumId="35">
+  <w:abstractNum w:abstractNumId="36">
     <w:nsid w:val="77623988"/>
     <w:multiLevelType w:val="hybridMultilevel"/>
     <w:tmpl w:val="702CA274"/>
@@ -14279,7 +13980,7 @@
       </w:pPr>
     </w:lvl>
   </w:abstractNum>
-  <w:abstractNum w:abstractNumId="36">
+  <w:abstractNum w:abstractNumId="37">
     <w:nsid w:val="78C031D0"/>
     <w:multiLevelType w:val="hybridMultilevel"/>
     <w:tmpl w:val="65F4D1E2"/>
@@ -14392,7 +14093,7 @@
       </w:rPr>
     </w:lvl>
   </w:abstractNum>
-  <w:abstractNum w:abstractNumId="37">
+  <w:abstractNum w:abstractNumId="38">
     <w:nsid w:val="7DB56E55"/>
     <w:multiLevelType w:val="hybridMultilevel"/>
     <w:tmpl w:val="1B88A856"/>
@@ -14482,28 +14183,28 @@
     </w:lvl>
   </w:abstractNum>
   <w:num w:numId="1">
-    <w:abstractNumId w:val="31"/>
+    <w:abstractNumId w:val="32"/>
   </w:num>
   <w:num w:numId="2">
     <w:abstractNumId w:val="10"/>
   </w:num>
   <w:num w:numId="3">
-    <w:abstractNumId w:val="23"/>
+    <w:abstractNumId w:val="24"/>
   </w:num>
   <w:num w:numId="4">
     <w:abstractNumId w:val="2"/>
   </w:num>
   <w:num w:numId="5">
-    <w:abstractNumId w:val="26"/>
+    <w:abstractNumId w:val="27"/>
   </w:num>
   <w:num w:numId="6">
-    <w:abstractNumId w:val="24"/>
+    <w:abstractNumId w:val="25"/>
   </w:num>
   <w:num w:numId="7">
     <w:abstractNumId w:val="8"/>
   </w:num>
   <w:num w:numId="8">
-    <w:abstractNumId w:val="34"/>
+    <w:abstractNumId w:val="35"/>
   </w:num>
   <w:num w:numId="9">
     <w:abstractNumId w:val="11"/>
@@ -14512,49 +14213,49 @@
     <w:abstractNumId w:val="0"/>
   </w:num>
   <w:num w:numId="11">
-    <w:abstractNumId w:val="15"/>
+    <w:abstractNumId w:val="16"/>
   </w:num>
   <w:num w:numId="12">
-    <w:abstractNumId w:val="28"/>
+    <w:abstractNumId w:val="29"/>
   </w:num>
   <w:num w:numId="13">
     <w:abstractNumId w:val="4"/>
   </w:num>
   <w:num w:numId="14">
-    <w:abstractNumId w:val="14"/>
+    <w:abstractNumId w:val="15"/>
   </w:num>
   <w:num w:numId="15">
+    <w:abstractNumId w:val="38"/>
+  </w:num>
+  <w:num w:numId="16">
+    <w:abstractNumId w:val="34"/>
+  </w:num>
+  <w:num w:numId="17">
     <w:abstractNumId w:val="37"/>
   </w:num>
-  <w:num w:numId="16">
-    <w:abstractNumId w:val="33"/>
-  </w:num>
-  <w:num w:numId="17">
-    <w:abstractNumId w:val="36"/>
-  </w:num>
   <w:num w:numId="18">
-    <w:abstractNumId w:val="12"/>
+    <w:abstractNumId w:val="13"/>
   </w:num>
   <w:num w:numId="19">
-    <w:abstractNumId w:val="30"/>
+    <w:abstractNumId w:val="31"/>
   </w:num>
   <w:num w:numId="20">
-    <w:abstractNumId w:val="17"/>
+    <w:abstractNumId w:val="18"/>
   </w:num>
   <w:num w:numId="21">
     <w:abstractNumId w:val="9"/>
   </w:num>
   <w:num w:numId="22">
-    <w:abstractNumId w:val="25"/>
+    <w:abstractNumId w:val="26"/>
   </w:num>
   <w:num w:numId="23">
     <w:abstractNumId w:val="1"/>
   </w:num>
   <w:num w:numId="24">
-    <w:abstractNumId w:val="27"/>
+    <w:abstractNumId w:val="28"/>
   </w:num>
   <w:num w:numId="25">
-    <w:abstractNumId w:val="20"/>
+    <w:abstractNumId w:val="21"/>
   </w:num>
   <w:num w:numId="26">
     <w:abstractNumId w:val="6"/>
@@ -14563,37 +14264,40 @@
     <w:abstractNumId w:val="3"/>
   </w:num>
   <w:num w:numId="28">
-    <w:abstractNumId w:val="21"/>
+    <w:abstractNumId w:val="22"/>
   </w:num>
   <w:num w:numId="29">
-    <w:abstractNumId w:val="18"/>
+    <w:abstractNumId w:val="19"/>
   </w:num>
   <w:num w:numId="30">
-    <w:abstractNumId w:val="13"/>
+    <w:abstractNumId w:val="14"/>
   </w:num>
   <w:num w:numId="31">
-    <w:abstractNumId w:val="35"/>
+    <w:abstractNumId w:val="36"/>
   </w:num>
   <w:num w:numId="32">
-    <w:abstractNumId w:val="29"/>
+    <w:abstractNumId w:val="30"/>
   </w:num>
   <w:num w:numId="33">
     <w:abstractNumId w:val="5"/>
   </w:num>
   <w:num w:numId="34">
-    <w:abstractNumId w:val="32"/>
+    <w:abstractNumId w:val="33"/>
   </w:num>
   <w:num w:numId="35">
     <w:abstractNumId w:val="7"/>
   </w:num>
   <w:num w:numId="36">
-    <w:abstractNumId w:val="16"/>
+    <w:abstractNumId w:val="17"/>
   </w:num>
   <w:num w:numId="37">
-    <w:abstractNumId w:val="22"/>
+    <w:abstractNumId w:val="23"/>
   </w:num>
   <w:num w:numId="38">
-    <w:abstractNumId w:val="19"/>
+    <w:abstractNumId w:val="20"/>
+  </w:num>
+  <w:num w:numId="39">
+    <w:abstractNumId w:val="12"/>
   </w:num>
 </w:numbering>
 </file>

</xml_diff>

<commit_message>
Date: 02 May 2026
</commit_message>
<xml_diff>
--- a/Selenium_Notes.docx
+++ b/Selenium_Notes.docx
@@ -10030,26 +10030,196 @@
         </w:rPr>
         <w:t>Tags needs to specified in .feature file only (Tag Definition)</w:t>
       </w:r>
+    </w:p>
+    <w:p>
+      <w:pPr>
+        <w:pStyle w:val="ListParagraph"/>
+        <w:numPr>
+          <w:ilvl w:val="0"/>
+          <w:numId w:val="39"/>
+        </w:numPr>
+        <w:rPr>
+          <w:lang w:val="en-US"/>
+        </w:rPr>
+      </w:pPr>
+      <w:r>
+        <w:rPr>
+          <w:lang w:val="en-US"/>
+        </w:rPr>
+        <w:t>And the execution criteria needs to specified in Runner class</w:t>
+      </w:r>
+    </w:p>
+    <w:p>
+      <w:pPr>
+        <w:rPr>
+          <w:lang w:val="en-US"/>
+        </w:rPr>
+      </w:pPr>
+    </w:p>
+    <w:p>
+      <w:pPr>
+        <w:rPr>
+          <w:b/>
+          <w:bCs/>
+          <w:lang w:val="en-US"/>
+        </w:rPr>
+      </w:pPr>
+      <w:r>
+        <w:rPr>
+          <w:b/>
+          <w:bCs/>
+          <w:lang w:val="en-US"/>
+        </w:rPr>
+        <w:t>Hooks in Cucumber</w:t>
+      </w:r>
+    </w:p>
+    <w:p>
+      <w:pPr>
+        <w:pStyle w:val="ListParagraph"/>
+        <w:numPr>
+          <w:ilvl w:val="0"/>
+          <w:numId w:val="40"/>
+        </w:numPr>
+        <w:rPr>
+          <w:lang w:val="en-US"/>
+        </w:rPr>
+      </w:pPr>
+      <w:r>
+        <w:rPr>
+          <w:lang w:val="en-US"/>
+        </w:rPr>
+        <w:t xml:space="preserve">Hooks are the special methods those get executed before and after </w:t>
+      </w:r>
+      <w:r>
+        <w:rPr>
+          <w:b/>
+          <w:bCs/>
+          <w:lang w:val="en-US"/>
+        </w:rPr>
+        <w:t>every</w:t>
+      </w:r>
+      <w:r>
+        <w:rPr>
+          <w:lang w:val="en-US"/>
+        </w:rPr>
+        <w:t xml:space="preserve"> scenario.</w:t>
+      </w:r>
+    </w:p>
+    <w:p>
+      <w:pPr>
+        <w:pStyle w:val="ListParagraph"/>
+        <w:numPr>
+          <w:ilvl w:val="0"/>
+          <w:numId w:val="40"/>
+        </w:numPr>
+        <w:rPr>
+          <w:lang w:val="en-US"/>
+        </w:rPr>
+      </w:pPr>
+      <w:r>
+        <w:rPr>
+          <w:lang w:val="en-US"/>
+        </w:rPr>
+        <w:t>There are two hooks in Cucumber</w:t>
+      </w:r>
+    </w:p>
+    <w:p>
+      <w:pPr>
+        <w:pStyle w:val="ListParagraph"/>
+        <w:numPr>
+          <w:ilvl w:val="1"/>
+          <w:numId w:val="40"/>
+        </w:numPr>
+        <w:rPr>
+          <w:lang w:val="en-US"/>
+        </w:rPr>
+      </w:pPr>
+      <w:r>
+        <w:rPr>
+          <w:lang w:val="en-US"/>
+        </w:rPr>
+        <w:t xml:space="preserve">@Before </w:t>
+      </w:r>
+      <w:r>
+        <w:rPr>
+          <w:lang w:val="en-US"/>
+        </w:rPr>
+        <w:sym w:font="Wingdings" w:char="F0E0"/>
+      </w:r>
+      <w:r>
+        <w:rPr>
+          <w:lang w:val="en-US"/>
+        </w:rPr>
+        <w:t xml:space="preserve"> Executed before each scenario</w:t>
+      </w:r>
+    </w:p>
+    <w:p>
+      <w:pPr>
+        <w:pStyle w:val="ListParagraph"/>
+        <w:numPr>
+          <w:ilvl w:val="1"/>
+          <w:numId w:val="40"/>
+        </w:numPr>
+        <w:rPr>
+          <w:lang w:val="en-US"/>
+        </w:rPr>
+      </w:pPr>
+      <w:r>
+        <w:rPr>
+          <w:lang w:val="en-US"/>
+        </w:rPr>
+        <w:t xml:space="preserve">@After </w:t>
+      </w:r>
+      <w:r>
+        <w:rPr>
+          <w:lang w:val="en-US"/>
+        </w:rPr>
+        <w:sym w:font="Wingdings" w:char="F0E0"/>
+      </w:r>
+      <w:r>
+        <w:rPr>
+          <w:lang w:val="en-US"/>
+        </w:rPr>
+        <w:t xml:space="preserve"> Execute after each scenario</w:t>
+      </w:r>
+    </w:p>
+    <w:p>
+      <w:pPr>
+        <w:pStyle w:val="ListParagraph"/>
+        <w:numPr>
+          <w:ilvl w:val="0"/>
+          <w:numId w:val="40"/>
+        </w:numPr>
+        <w:rPr>
+          <w:lang w:val="en-US"/>
+        </w:rPr>
+      </w:pPr>
+      <w:r>
+        <w:rPr>
+          <w:lang w:val="en-US"/>
+        </w:rPr>
+        <w:t>You can put hooks either in Step Definition or even you can create separate class for the hooks</w:t>
+      </w:r>
+    </w:p>
+    <w:p>
+      <w:pPr>
+        <w:pStyle w:val="ListParagraph"/>
+        <w:numPr>
+          <w:ilvl w:val="0"/>
+          <w:numId w:val="40"/>
+        </w:numPr>
+        <w:rPr>
+          <w:lang w:val="en-US"/>
+        </w:rPr>
+      </w:pPr>
+      <w:r>
+        <w:rPr>
+          <w:lang w:val="en-US"/>
+        </w:rPr>
+        <w:t>Hooks are never the part of feature file.</w:t>
+      </w:r>
       <w:bookmarkStart w:id="0" w:name="_GoBack"/>
       <w:bookmarkEnd w:id="0"/>
-    </w:p>
-    <w:p>
-      <w:pPr>
-        <w:pStyle w:val="ListParagraph"/>
-        <w:numPr>
-          <w:ilvl w:val="0"/>
-          <w:numId w:val="39"/>
-        </w:numPr>
-        <w:rPr>
-          <w:lang w:val="en-US"/>
-        </w:rPr>
-      </w:pPr>
-      <w:r>
-        <w:rPr>
-          <w:lang w:val="en-US"/>
-        </w:rPr>
-        <w:t>And the execution criteria needs to specified in Runner class</w:t>
-      </w:r>
     </w:p>
     <w:sectPr>
       <w:pgSz w:w="11906" w:h="16838"/>
@@ -10177,6 +10347,119 @@
     </w:lvl>
   </w:abstractNum>
   <w:abstractNum w:abstractNumId="1">
+    <w:nsid w:val="029E2194"/>
+    <w:multiLevelType w:val="hybridMultilevel"/>
+    <w:tmpl w:val="C024A5F8"/>
+    <w:lvl w:ilvl="0" w:tplc="40090001">
+      <w:start w:val="1"/>
+      <w:numFmt w:val="bullet"/>
+      <w:lvlText w:val=""/>
+      <w:lvlJc w:val="left"/>
+      <w:pPr>
+        <w:ind w:left="720" w:hanging="360"/>
+      </w:pPr>
+      <w:rPr>
+        <w:rFonts w:ascii="Symbol" w:hAnsi="Symbol" w:hint="default"/>
+      </w:rPr>
+    </w:lvl>
+    <w:lvl w:ilvl="1" w:tplc="40090003">
+      <w:start w:val="1"/>
+      <w:numFmt w:val="bullet"/>
+      <w:lvlText w:val="o"/>
+      <w:lvlJc w:val="left"/>
+      <w:pPr>
+        <w:ind w:left="1440" w:hanging="360"/>
+      </w:pPr>
+      <w:rPr>
+        <w:rFonts w:ascii="Courier New" w:hAnsi="Courier New" w:cs="Courier New" w:hint="default"/>
+      </w:rPr>
+    </w:lvl>
+    <w:lvl w:ilvl="2" w:tplc="40090005" w:tentative="1">
+      <w:start w:val="1"/>
+      <w:numFmt w:val="bullet"/>
+      <w:lvlText w:val=""/>
+      <w:lvlJc w:val="left"/>
+      <w:pPr>
+        <w:ind w:left="2160" w:hanging="360"/>
+      </w:pPr>
+      <w:rPr>
+        <w:rFonts w:ascii="Wingdings" w:hAnsi="Wingdings" w:hint="default"/>
+      </w:rPr>
+    </w:lvl>
+    <w:lvl w:ilvl="3" w:tplc="40090001" w:tentative="1">
+      <w:start w:val="1"/>
+      <w:numFmt w:val="bullet"/>
+      <w:lvlText w:val=""/>
+      <w:lvlJc w:val="left"/>
+      <w:pPr>
+        <w:ind w:left="2880" w:hanging="360"/>
+      </w:pPr>
+      <w:rPr>
+        <w:rFonts w:ascii="Symbol" w:hAnsi="Symbol" w:hint="default"/>
+      </w:rPr>
+    </w:lvl>
+    <w:lvl w:ilvl="4" w:tplc="40090003" w:tentative="1">
+      <w:start w:val="1"/>
+      <w:numFmt w:val="bullet"/>
+      <w:lvlText w:val="o"/>
+      <w:lvlJc w:val="left"/>
+      <w:pPr>
+        <w:ind w:left="3600" w:hanging="360"/>
+      </w:pPr>
+      <w:rPr>
+        <w:rFonts w:ascii="Courier New" w:hAnsi="Courier New" w:cs="Courier New" w:hint="default"/>
+      </w:rPr>
+    </w:lvl>
+    <w:lvl w:ilvl="5" w:tplc="40090005" w:tentative="1">
+      <w:start w:val="1"/>
+      <w:numFmt w:val="bullet"/>
+      <w:lvlText w:val=""/>
+      <w:lvlJc w:val="left"/>
+      <w:pPr>
+        <w:ind w:left="4320" w:hanging="360"/>
+      </w:pPr>
+      <w:rPr>
+        <w:rFonts w:ascii="Wingdings" w:hAnsi="Wingdings" w:hint="default"/>
+      </w:rPr>
+    </w:lvl>
+    <w:lvl w:ilvl="6" w:tplc="40090001" w:tentative="1">
+      <w:start w:val="1"/>
+      <w:numFmt w:val="bullet"/>
+      <w:lvlText w:val=""/>
+      <w:lvlJc w:val="left"/>
+      <w:pPr>
+        <w:ind w:left="5040" w:hanging="360"/>
+      </w:pPr>
+      <w:rPr>
+        <w:rFonts w:ascii="Symbol" w:hAnsi="Symbol" w:hint="default"/>
+      </w:rPr>
+    </w:lvl>
+    <w:lvl w:ilvl="7" w:tplc="40090003" w:tentative="1">
+      <w:start w:val="1"/>
+      <w:numFmt w:val="bullet"/>
+      <w:lvlText w:val="o"/>
+      <w:lvlJc w:val="left"/>
+      <w:pPr>
+        <w:ind w:left="5760" w:hanging="360"/>
+      </w:pPr>
+      <w:rPr>
+        <w:rFonts w:ascii="Courier New" w:hAnsi="Courier New" w:cs="Courier New" w:hint="default"/>
+      </w:rPr>
+    </w:lvl>
+    <w:lvl w:ilvl="8" w:tplc="40090005" w:tentative="1">
+      <w:start w:val="1"/>
+      <w:numFmt w:val="bullet"/>
+      <w:lvlText w:val=""/>
+      <w:lvlJc w:val="left"/>
+      <w:pPr>
+        <w:ind w:left="6480" w:hanging="360"/>
+      </w:pPr>
+      <w:rPr>
+        <w:rFonts w:ascii="Wingdings" w:hAnsi="Wingdings" w:hint="default"/>
+      </w:rPr>
+    </w:lvl>
+  </w:abstractNum>
+  <w:abstractNum w:abstractNumId="2">
     <w:nsid w:val="064652BB"/>
     <w:multiLevelType w:val="hybridMultilevel"/>
     <w:tmpl w:val="135C20DE"/>
@@ -10289,7 +10572,7 @@
       </w:rPr>
     </w:lvl>
   </w:abstractNum>
-  <w:abstractNum w:abstractNumId="2">
+  <w:abstractNum w:abstractNumId="3">
     <w:nsid w:val="096D3E13"/>
     <w:multiLevelType w:val="hybridMultilevel"/>
     <w:tmpl w:val="218C79D8"/>
@@ -10402,7 +10685,7 @@
       </w:rPr>
     </w:lvl>
   </w:abstractNum>
-  <w:abstractNum w:abstractNumId="3">
+  <w:abstractNum w:abstractNumId="4">
     <w:nsid w:val="122C5771"/>
     <w:multiLevelType w:val="hybridMultilevel"/>
     <w:tmpl w:val="2B8CE2A0"/>
@@ -10515,7 +10798,7 @@
       </w:rPr>
     </w:lvl>
   </w:abstractNum>
-  <w:abstractNum w:abstractNumId="4">
+  <w:abstractNum w:abstractNumId="5">
     <w:nsid w:val="133644CC"/>
     <w:multiLevelType w:val="hybridMultilevel"/>
     <w:tmpl w:val="F2E60910"/>
@@ -10604,7 +10887,7 @@
       </w:pPr>
     </w:lvl>
   </w:abstractNum>
-  <w:abstractNum w:abstractNumId="5">
+  <w:abstractNum w:abstractNumId="6">
     <w:nsid w:val="151A469D"/>
     <w:multiLevelType w:val="hybridMultilevel"/>
     <w:tmpl w:val="6DCEE1A0"/>
@@ -10717,7 +11000,7 @@
       </w:rPr>
     </w:lvl>
   </w:abstractNum>
-  <w:abstractNum w:abstractNumId="6">
+  <w:abstractNum w:abstractNumId="7">
     <w:nsid w:val="199F13F0"/>
     <w:multiLevelType w:val="hybridMultilevel"/>
     <w:tmpl w:val="4B02E550"/>
@@ -10830,7 +11113,7 @@
       </w:rPr>
     </w:lvl>
   </w:abstractNum>
-  <w:abstractNum w:abstractNumId="7">
+  <w:abstractNum w:abstractNumId="8">
     <w:nsid w:val="20034965"/>
     <w:multiLevelType w:val="hybridMultilevel"/>
     <w:tmpl w:val="FC284AA2"/>
@@ -10943,7 +11226,7 @@
       </w:rPr>
     </w:lvl>
   </w:abstractNum>
-  <w:abstractNum w:abstractNumId="8">
+  <w:abstractNum w:abstractNumId="9">
     <w:nsid w:val="22CD3FE6"/>
     <w:multiLevelType w:val="hybridMultilevel"/>
     <w:tmpl w:val="431E3674"/>
@@ -11056,7 +11339,7 @@
       </w:rPr>
     </w:lvl>
   </w:abstractNum>
-  <w:abstractNum w:abstractNumId="9">
+  <w:abstractNum w:abstractNumId="10">
     <w:nsid w:val="25335F4F"/>
     <w:multiLevelType w:val="hybridMultilevel"/>
     <w:tmpl w:val="2EAE23BA"/>
@@ -11169,7 +11452,7 @@
       </w:rPr>
     </w:lvl>
   </w:abstractNum>
-  <w:abstractNum w:abstractNumId="10">
+  <w:abstractNum w:abstractNumId="11">
     <w:nsid w:val="268C0D27"/>
     <w:multiLevelType w:val="hybridMultilevel"/>
     <w:tmpl w:val="674E757A"/>
@@ -11282,7 +11565,7 @@
       </w:rPr>
     </w:lvl>
   </w:abstractNum>
-  <w:abstractNum w:abstractNumId="11">
+  <w:abstractNum w:abstractNumId="12">
     <w:nsid w:val="2C075435"/>
     <w:multiLevelType w:val="hybridMultilevel"/>
     <w:tmpl w:val="69AA0B26"/>
@@ -11395,7 +11678,7 @@
       </w:rPr>
     </w:lvl>
   </w:abstractNum>
-  <w:abstractNum w:abstractNumId="12">
+  <w:abstractNum w:abstractNumId="13">
     <w:nsid w:val="2D5D0F12"/>
     <w:multiLevelType w:val="hybridMultilevel"/>
     <w:tmpl w:val="C65679B8"/>
@@ -11508,7 +11791,7 @@
       </w:rPr>
     </w:lvl>
   </w:abstractNum>
-  <w:abstractNum w:abstractNumId="13">
+  <w:abstractNum w:abstractNumId="14">
     <w:nsid w:val="2D9B41A7"/>
     <w:multiLevelType w:val="hybridMultilevel"/>
     <w:tmpl w:val="C4EC2058"/>
@@ -11621,7 +11904,7 @@
       </w:rPr>
     </w:lvl>
   </w:abstractNum>
-  <w:abstractNum w:abstractNumId="14">
+  <w:abstractNum w:abstractNumId="15">
     <w:nsid w:val="2E8016BE"/>
     <w:multiLevelType w:val="hybridMultilevel"/>
     <w:tmpl w:val="C494F916"/>
@@ -11710,7 +11993,7 @@
       </w:pPr>
     </w:lvl>
   </w:abstractNum>
-  <w:abstractNum w:abstractNumId="15">
+  <w:abstractNum w:abstractNumId="16">
     <w:nsid w:val="369351E9"/>
     <w:multiLevelType w:val="hybridMultilevel"/>
     <w:tmpl w:val="0972A5CA"/>
@@ -11799,7 +12082,7 @@
       </w:pPr>
     </w:lvl>
   </w:abstractNum>
-  <w:abstractNum w:abstractNumId="16">
+  <w:abstractNum w:abstractNumId="17">
     <w:nsid w:val="379C2DB0"/>
     <w:multiLevelType w:val="hybridMultilevel"/>
     <w:tmpl w:val="097C3B70"/>
@@ -11912,7 +12195,7 @@
       </w:rPr>
     </w:lvl>
   </w:abstractNum>
-  <w:abstractNum w:abstractNumId="17">
+  <w:abstractNum w:abstractNumId="18">
     <w:nsid w:val="3A29074B"/>
     <w:multiLevelType w:val="hybridMultilevel"/>
     <w:tmpl w:val="14B00ED2"/>
@@ -12025,7 +12308,7 @@
       </w:rPr>
     </w:lvl>
   </w:abstractNum>
-  <w:abstractNum w:abstractNumId="18">
+  <w:abstractNum w:abstractNumId="19">
     <w:nsid w:val="3B9A3EE0"/>
     <w:multiLevelType w:val="hybridMultilevel"/>
     <w:tmpl w:val="8B20B472"/>
@@ -12138,7 +12421,7 @@
       </w:rPr>
     </w:lvl>
   </w:abstractNum>
-  <w:abstractNum w:abstractNumId="19">
+  <w:abstractNum w:abstractNumId="20">
     <w:nsid w:val="3D565FA3"/>
     <w:multiLevelType w:val="hybridMultilevel"/>
     <w:tmpl w:val="A8F8AFEE"/>
@@ -12227,7 +12510,7 @@
       </w:pPr>
     </w:lvl>
   </w:abstractNum>
-  <w:abstractNum w:abstractNumId="20">
+  <w:abstractNum w:abstractNumId="21">
     <w:nsid w:val="45B43CD4"/>
     <w:multiLevelType w:val="hybridMultilevel"/>
     <w:tmpl w:val="00A2ADA6"/>
@@ -12316,7 +12599,7 @@
       </w:pPr>
     </w:lvl>
   </w:abstractNum>
-  <w:abstractNum w:abstractNumId="21">
+  <w:abstractNum w:abstractNumId="22">
     <w:nsid w:val="46875C90"/>
     <w:multiLevelType w:val="hybridMultilevel"/>
     <w:tmpl w:val="78C0CFB6"/>
@@ -12405,7 +12688,7 @@
       </w:pPr>
     </w:lvl>
   </w:abstractNum>
-  <w:abstractNum w:abstractNumId="22">
+  <w:abstractNum w:abstractNumId="23">
     <w:nsid w:val="471F3D0D"/>
     <w:multiLevelType w:val="hybridMultilevel"/>
     <w:tmpl w:val="D02CD718"/>
@@ -12494,7 +12777,7 @@
       </w:pPr>
     </w:lvl>
   </w:abstractNum>
-  <w:abstractNum w:abstractNumId="23">
+  <w:abstractNum w:abstractNumId="24">
     <w:nsid w:val="4DA3299B"/>
     <w:multiLevelType w:val="hybridMultilevel"/>
     <w:tmpl w:val="A418A19A"/>
@@ -12607,7 +12890,7 @@
       </w:rPr>
     </w:lvl>
   </w:abstractNum>
-  <w:abstractNum w:abstractNumId="24">
+  <w:abstractNum w:abstractNumId="25">
     <w:nsid w:val="4E2A6329"/>
     <w:multiLevelType w:val="hybridMultilevel"/>
     <w:tmpl w:val="BC1628F2"/>
@@ -12720,7 +13003,7 @@
       </w:rPr>
     </w:lvl>
   </w:abstractNum>
-  <w:abstractNum w:abstractNumId="25">
+  <w:abstractNum w:abstractNumId="26">
     <w:nsid w:val="556E1B57"/>
     <w:multiLevelType w:val="hybridMultilevel"/>
     <w:tmpl w:val="26087466"/>
@@ -12833,7 +13116,7 @@
       </w:rPr>
     </w:lvl>
   </w:abstractNum>
-  <w:abstractNum w:abstractNumId="26">
+  <w:abstractNum w:abstractNumId="27">
     <w:nsid w:val="55D10A8D"/>
     <w:multiLevelType w:val="hybridMultilevel"/>
     <w:tmpl w:val="7312E058"/>
@@ -12922,7 +13205,7 @@
       </w:pPr>
     </w:lvl>
   </w:abstractNum>
-  <w:abstractNum w:abstractNumId="27">
+  <w:abstractNum w:abstractNumId="28">
     <w:nsid w:val="56165AD5"/>
     <w:multiLevelType w:val="hybridMultilevel"/>
     <w:tmpl w:val="E0B403D2"/>
@@ -13035,7 +13318,7 @@
       </w:rPr>
     </w:lvl>
   </w:abstractNum>
-  <w:abstractNum w:abstractNumId="28">
+  <w:abstractNum w:abstractNumId="29">
     <w:nsid w:val="56F946E6"/>
     <w:multiLevelType w:val="hybridMultilevel"/>
     <w:tmpl w:val="287A5F26"/>
@@ -13124,7 +13407,7 @@
       </w:pPr>
     </w:lvl>
   </w:abstractNum>
-  <w:abstractNum w:abstractNumId="29">
+  <w:abstractNum w:abstractNumId="30">
     <w:nsid w:val="5A897377"/>
     <w:multiLevelType w:val="hybridMultilevel"/>
     <w:tmpl w:val="F1F27818"/>
@@ -13237,7 +13520,7 @@
       </w:rPr>
     </w:lvl>
   </w:abstractNum>
-  <w:abstractNum w:abstractNumId="30">
+  <w:abstractNum w:abstractNumId="31">
     <w:nsid w:val="5D096968"/>
     <w:multiLevelType w:val="hybridMultilevel"/>
     <w:tmpl w:val="87A897FA"/>
@@ -13326,7 +13609,7 @@
       </w:pPr>
     </w:lvl>
   </w:abstractNum>
-  <w:abstractNum w:abstractNumId="31">
+  <w:abstractNum w:abstractNumId="32">
     <w:nsid w:val="602D5BA0"/>
     <w:multiLevelType w:val="hybridMultilevel"/>
     <w:tmpl w:val="7EDAE732"/>
@@ -13439,7 +13722,7 @@
       </w:rPr>
     </w:lvl>
   </w:abstractNum>
-  <w:abstractNum w:abstractNumId="32">
+  <w:abstractNum w:abstractNumId="33">
     <w:nsid w:val="63DD59AE"/>
     <w:multiLevelType w:val="hybridMultilevel"/>
     <w:tmpl w:val="4F783448"/>
@@ -13552,7 +13835,7 @@
       </w:rPr>
     </w:lvl>
   </w:abstractNum>
-  <w:abstractNum w:abstractNumId="33">
+  <w:abstractNum w:abstractNumId="34">
     <w:nsid w:val="66F74F83"/>
     <w:multiLevelType w:val="hybridMultilevel"/>
     <w:tmpl w:val="47FE45C4"/>
@@ -13665,7 +13948,7 @@
       </w:rPr>
     </w:lvl>
   </w:abstractNum>
-  <w:abstractNum w:abstractNumId="34">
+  <w:abstractNum w:abstractNumId="35">
     <w:nsid w:val="6B375CC6"/>
     <w:multiLevelType w:val="hybridMultilevel"/>
     <w:tmpl w:val="DD7A439E"/>
@@ -13778,7 +14061,7 @@
       </w:rPr>
     </w:lvl>
   </w:abstractNum>
-  <w:abstractNum w:abstractNumId="35">
+  <w:abstractNum w:abstractNumId="36">
     <w:nsid w:val="736235B6"/>
     <w:multiLevelType w:val="hybridMultilevel"/>
     <w:tmpl w:val="9338354A"/>
@@ -13891,7 +14174,7 @@
       </w:rPr>
     </w:lvl>
   </w:abstractNum>
-  <w:abstractNum w:abstractNumId="36">
+  <w:abstractNum w:abstractNumId="37">
     <w:nsid w:val="77623988"/>
     <w:multiLevelType w:val="hybridMultilevel"/>
     <w:tmpl w:val="702CA274"/>
@@ -13980,7 +14263,7 @@
       </w:pPr>
     </w:lvl>
   </w:abstractNum>
-  <w:abstractNum w:abstractNumId="37">
+  <w:abstractNum w:abstractNumId="38">
     <w:nsid w:val="78C031D0"/>
     <w:multiLevelType w:val="hybridMultilevel"/>
     <w:tmpl w:val="65F4D1E2"/>
@@ -14093,7 +14376,7 @@
       </w:rPr>
     </w:lvl>
   </w:abstractNum>
-  <w:abstractNum w:abstractNumId="38">
+  <w:abstractNum w:abstractNumId="39">
     <w:nsid w:val="7DB56E55"/>
     <w:multiLevelType w:val="hybridMultilevel"/>
     <w:tmpl w:val="1B88A856"/>
@@ -14183,121 +14466,124 @@
     </w:lvl>
   </w:abstractNum>
   <w:num w:numId="1">
-    <w:abstractNumId w:val="32"/>
+    <w:abstractNumId w:val="33"/>
   </w:num>
   <w:num w:numId="2">
-    <w:abstractNumId w:val="10"/>
+    <w:abstractNumId w:val="11"/>
   </w:num>
   <w:num w:numId="3">
-    <w:abstractNumId w:val="24"/>
+    <w:abstractNumId w:val="25"/>
   </w:num>
   <w:num w:numId="4">
-    <w:abstractNumId w:val="2"/>
+    <w:abstractNumId w:val="3"/>
   </w:num>
   <w:num w:numId="5">
-    <w:abstractNumId w:val="27"/>
+    <w:abstractNumId w:val="28"/>
   </w:num>
   <w:num w:numId="6">
-    <w:abstractNumId w:val="25"/>
+    <w:abstractNumId w:val="26"/>
   </w:num>
   <w:num w:numId="7">
-    <w:abstractNumId w:val="8"/>
+    <w:abstractNumId w:val="9"/>
   </w:num>
   <w:num w:numId="8">
-    <w:abstractNumId w:val="35"/>
+    <w:abstractNumId w:val="36"/>
   </w:num>
   <w:num w:numId="9">
-    <w:abstractNumId w:val="11"/>
+    <w:abstractNumId w:val="12"/>
   </w:num>
   <w:num w:numId="10">
     <w:abstractNumId w:val="0"/>
   </w:num>
   <w:num w:numId="11">
+    <w:abstractNumId w:val="17"/>
+  </w:num>
+  <w:num w:numId="12">
+    <w:abstractNumId w:val="30"/>
+  </w:num>
+  <w:num w:numId="13">
+    <w:abstractNumId w:val="5"/>
+  </w:num>
+  <w:num w:numId="14">
     <w:abstractNumId w:val="16"/>
   </w:num>
-  <w:num w:numId="12">
+  <w:num w:numId="15">
+    <w:abstractNumId w:val="39"/>
+  </w:num>
+  <w:num w:numId="16">
+    <w:abstractNumId w:val="35"/>
+  </w:num>
+  <w:num w:numId="17">
+    <w:abstractNumId w:val="38"/>
+  </w:num>
+  <w:num w:numId="18">
+    <w:abstractNumId w:val="14"/>
+  </w:num>
+  <w:num w:numId="19">
+    <w:abstractNumId w:val="32"/>
+  </w:num>
+  <w:num w:numId="20">
+    <w:abstractNumId w:val="19"/>
+  </w:num>
+  <w:num w:numId="21">
+    <w:abstractNumId w:val="10"/>
+  </w:num>
+  <w:num w:numId="22">
+    <w:abstractNumId w:val="27"/>
+  </w:num>
+  <w:num w:numId="23">
+    <w:abstractNumId w:val="2"/>
+  </w:num>
+  <w:num w:numId="24">
     <w:abstractNumId w:val="29"/>
   </w:num>
-  <w:num w:numId="13">
+  <w:num w:numId="25">
+    <w:abstractNumId w:val="22"/>
+  </w:num>
+  <w:num w:numId="26">
+    <w:abstractNumId w:val="7"/>
+  </w:num>
+  <w:num w:numId="27">
     <w:abstractNumId w:val="4"/>
   </w:num>
-  <w:num w:numId="14">
+  <w:num w:numId="28">
+    <w:abstractNumId w:val="23"/>
+  </w:num>
+  <w:num w:numId="29">
+    <w:abstractNumId w:val="20"/>
+  </w:num>
+  <w:num w:numId="30">
     <w:abstractNumId w:val="15"/>
   </w:num>
-  <w:num w:numId="15">
-    <w:abstractNumId w:val="38"/>
+  <w:num w:numId="31">
+    <w:abstractNumId w:val="37"/>
   </w:num>
-  <w:num w:numId="16">
+  <w:num w:numId="32">
+    <w:abstractNumId w:val="31"/>
+  </w:num>
+  <w:num w:numId="33">
+    <w:abstractNumId w:val="6"/>
+  </w:num>
+  <w:num w:numId="34">
     <w:abstractNumId w:val="34"/>
   </w:num>
-  <w:num w:numId="17">
-    <w:abstractNumId w:val="37"/>
+  <w:num w:numId="35">
+    <w:abstractNumId w:val="8"/>
   </w:num>
-  <w:num w:numId="18">
+  <w:num w:numId="36">
+    <w:abstractNumId w:val="18"/>
+  </w:num>
+  <w:num w:numId="37">
+    <w:abstractNumId w:val="24"/>
+  </w:num>
+  <w:num w:numId="38">
+    <w:abstractNumId w:val="21"/>
+  </w:num>
+  <w:num w:numId="39">
     <w:abstractNumId w:val="13"/>
   </w:num>
-  <w:num w:numId="19">
-    <w:abstractNumId w:val="31"/>
-  </w:num>
-  <w:num w:numId="20">
-    <w:abstractNumId w:val="18"/>
-  </w:num>
-  <w:num w:numId="21">
-    <w:abstractNumId w:val="9"/>
-  </w:num>
-  <w:num w:numId="22">
-    <w:abstractNumId w:val="26"/>
-  </w:num>
-  <w:num w:numId="23">
+  <w:num w:numId="40">
     <w:abstractNumId w:val="1"/>
-  </w:num>
-  <w:num w:numId="24">
-    <w:abstractNumId w:val="28"/>
-  </w:num>
-  <w:num w:numId="25">
-    <w:abstractNumId w:val="21"/>
-  </w:num>
-  <w:num w:numId="26">
-    <w:abstractNumId w:val="6"/>
-  </w:num>
-  <w:num w:numId="27">
-    <w:abstractNumId w:val="3"/>
-  </w:num>
-  <w:num w:numId="28">
-    <w:abstractNumId w:val="22"/>
-  </w:num>
-  <w:num w:numId="29">
-    <w:abstractNumId w:val="19"/>
-  </w:num>
-  <w:num w:numId="30">
-    <w:abstractNumId w:val="14"/>
-  </w:num>
-  <w:num w:numId="31">
-    <w:abstractNumId w:val="36"/>
-  </w:num>
-  <w:num w:numId="32">
-    <w:abstractNumId w:val="30"/>
-  </w:num>
-  <w:num w:numId="33">
-    <w:abstractNumId w:val="5"/>
-  </w:num>
-  <w:num w:numId="34">
-    <w:abstractNumId w:val="33"/>
-  </w:num>
-  <w:num w:numId="35">
-    <w:abstractNumId w:val="7"/>
-  </w:num>
-  <w:num w:numId="36">
-    <w:abstractNumId w:val="17"/>
-  </w:num>
-  <w:num w:numId="37">
-    <w:abstractNumId w:val="23"/>
-  </w:num>
-  <w:num w:numId="38">
-    <w:abstractNumId w:val="20"/>
-  </w:num>
-  <w:num w:numId="39">
-    <w:abstractNumId w:val="12"/>
   </w:num>
 </w:numbering>
 </file>

</xml_diff>